<commit_message>
Synchronize manuscript exports with the gradient-decoupling title
</commit_message>
<xml_diff>
--- a/paper/journal/DYU/Word/DYU_Journal_Manuscript.docx
+++ b/paper/journal/DYU/Word/DYU_Journal_Manuscript.docx
@@ -18,7 +18,7 @@
           <w:color w:val="000000"/>
           <w:sz w:val="36"/>
         </w:rPr>
-        <w:t xml:space="preserve">Gradient Routing and Temporal State in Inductive Link Prediction:</w:t>
+        <w:t xml:space="preserve">Gradient Decoupling for Inductive Temporal Link Prediction:</w:t>
       </w:r>
       <w:r>
         <w:rPr>
@@ -37,7 +37,7 @@
           <w:color w:val="000000"/>
           <w:sz w:val="36"/>
         </w:rPr>
-        <w:t xml:space="preserve">A Controlled Study of Decoupled SR-GNN</w:t>
+        <w:t xml:space="preserve">A Controlled Study of Stateful Representations</w:t>
       </w:r>
     </w:p>
     <w:p>
@@ -9771,7 +9771,7 @@
           <w:color w:val="000000"/>
           <w:sz w:val="36"/>
         </w:rPr>
-        <w:t xml:space="preserve">歸納式連結預測中的梯度路由與時序狀態：</w:t>
+        <w:t xml:space="preserve">歸納式時序連結預測中的梯度解耦：</w:t>
       </w:r>
       <w:r>
         <w:rPr>
@@ -9790,27 +9790,7 @@
           <w:color w:val="000000"/>
           <w:sz w:val="36"/>
         </w:rPr>
-        <w:t xml:space="preserve">解耦式</w:t>
-      </w:r>
-      <w:r>
-        <w:rPr>
-          <w:rFonts w:ascii="Times New Roman" w:hAnsi="Times New Roman" w:eastAsia="Songti TC"/>
-          <w:b/>
-          <w:bCs/>
-          <w:color w:val="000000"/>
-          <w:sz w:val="36"/>
-        </w:rPr>
-        <w:t xml:space="preserve"> SR-GNN </w:t>
-      </w:r>
-      <w:r>
-        <w:rPr>
-          <w:rFonts w:hint="eastAsia" w:ascii="Times New Roman" w:hAnsi="Times New Roman" w:eastAsia="Songti TC"/>
-          <w:b/>
-          <w:bCs/>
-          <w:color w:val="000000"/>
-          <w:sz w:val="36"/>
-        </w:rPr>
-        <w:t xml:space="preserve">的受控研究</w:t>
+        <w:t xml:space="preserve">具狀態表徵的受控研究</w:t>
       </w:r>
     </w:p>
     <w:p>

</xml_diff>

<commit_message>
Synchronize journal exports and evaluation discussion
Develop the discussion of evaluation protocols, calibration and information objectives with relevant sources. Preserve all reported experimental values, keep table captions with their tables, and regenerate the PDF, editable Word and Overleaf package.
</commit_message>
<xml_diff>
--- a/paper/journal/DYU/Word/DYU_Journal_Manuscript.docx
+++ b/paper/journal/DYU/Word/DYU_Journal_Manuscript.docx
@@ -225,7 +225,7 @@
           <w:color w:val="000000"/>
           <w:sz w:val="18"/>
         </w:rPr>
-        <w:t xml:space="preserve">Inductive temporal link prediction requires a model to score interactions involving entities absent from earlier observations. Jointly optimizing a temporal representation and its link readout is a natural design choice, but it need not be the most effective choice for a particular inductive protocol. This study investigates gradient routing in SR-GNN, a temporal model combining event encoding, recurrent node memory, deterministic pair-history signals and a hierarchical readout. We specify the scored gradient boundary, distinguish parameter learning from event-state evolution, and compare coupled and decoupled versions of the same registered readout. A separate freeze-then-probe procedure examines a different training trajectory. Experiments use chronological partitions of CoEdit, Wikipedia and MOOC and a fixed random-destination evaluation procedure. Checksum-bound results are reported as mean inductive average precision and sample standard deviation across the registered seeds. The observed decoupled arm has higher mean inductive average precision than the coupled arm on each corpus. This supports a bounded within-protocol comparison rather than a general claim that end-to-end learning is harmful. The analysis identifies important interpretation limits: CoEdit shares its source with Wikipedia, its event construction includes retrospective information, the candidate sampler is not destination-type constrained, and temporal memory follows mixed batch and sequential semantics. Historical experiments are reconciled at the level of configuration identity but are not pooled with the current results. The study contributes an explicit account of gradient routing and temporal evaluation that makes the observed comparison reproducible and its scope assessable.</w:t>
+        <w:t xml:space="preserve">Inductive temporal link prediction requires a model to score interactions involving entities absent from earlier observations. Jointly optimizing a temporal representation and its link readout is a natural design choice, but it need not be the most effective choice for a particular inductive protocol. This study investigates gradient routing in SR-GNN, a temporal model combining event encoding, recurrent node memory, deterministic pair-history signals and a hierarchical readout. We specify the scored gradient boundary, distinguish parameter learning from event-state evolution, and compare coupled and decoupled versions of the same registered readout. A separate freeze-then-probe procedure examines a different training trajectory. Experiments use chronological partitions of CoEdit, Wikipedia and MOOC and a fixed random-destination evaluation procedure. Checksum-bound results are reported as mean inductive average precision and sample standard deviation across the registered seeds. The observed decoupled arm has higher mean inductive average precision than the coupled arm on each corpus. This supports a bounded within-protocol comparison rather than a general claim that end-to-end learning is harmful. The analysis identifies important interpretation limits: CoEdit shares its source with Wikipedia, its event construction includes retrospective information, the candidate sampler is not destination-type constrained, and temporal memory follows mixed batch and sequential semantics. Retrospective experiments additionally examine design presets, predictor and gate ablations, harder candidate pools, backbone removal and frozen probes. They show that predictor choice and learned features matter in the recorded configurations, while remaining separate from the current same-readout comparison. The study contributes an explicit account of gradient routing and temporal evaluation that makes the observed comparison reproducible and its scope assessable.</w:t>
       </w:r>
     </w:p>
     <w:p>
@@ -384,7 +384,7 @@
           <w:color w:val="000000"/>
           <w:sz w:val="18"/>
         </w:rPr>
-        <w:t xml:space="preserve">We study this distinction in SR-GNN, the implementation provided by the accompanying research repository [13]. Its temporal representation combines an event encoder, recurrent node memory and a bank of pair-history signals. A hierarchical readout produces the scored link output. The primary experiment changes whether that readout receives detached features while preserving the registered readout configuration. A separate freeze-then-probe arm uses pretraining followed by a newly initialized prediction head. These are deliberately interpreted as different experimental procedures.</w:t>
+        <w:t xml:space="preserve">We study this distinction in SR-GNN, the implementation provided by the accompanying research repository [10]. Its temporal representation combines an event encoder, recurrent node memory and a bank of pair-history signals. A hierarchical readout produces the scored link output. The primary experiment changes whether that readout receives detached features while preserving the registered readout configuration. A separate freeze-then-probe arm uses pretraining followed by a newly initialized prediction head. These are deliberately interpreted as different experimental procedures.</w:t>
       </w:r>
     </w:p>
     <w:p>
@@ -405,7 +405,7 @@
       </w:r>
     </w:p>
     <w:bookmarkEnd w:id="18"/>
-    <w:bookmarkStart w:id="24" w:name="_c402fc6a47ec8bb5e751ab4b29e0fc7601a51bb"/>
+    <w:bookmarkStart w:id="22" w:name="_c402fc6a47ec8bb5e751ab4b29e0fc7601a51bb"/>
     <w:p>
       <w:pPr>
         <w:pStyle w:val="Heading1"/>
@@ -422,7 +422,7 @@
         <w:t>II. Related Work</w:t>
       </w:r>
     </w:p>
-    <w:bookmarkStart w:id="19" w:name="_ebf24ef9f08a6dd76e53508e88509bfbf5def6a"/>
+    <w:bookmarkStart w:id="19" w:name="_a10e243be91bee555ae5eac586400bd3e61c1b8"/>
     <w:p>
       <w:pPr>
         <w:pStyle w:val="Heading2"/>
@@ -436,7 +436,7 @@
           <w:b/>
           <w:sz w:val="18"/>
         </w:rPr>
-        <w:t>1. Structural representations and link readouts</w:t>
+        <w:t>1. Temporal representations and link prediction</w:t>
       </w:r>
     </w:p>
     <w:p>
@@ -453,7 +453,7 @@
           <w:color w:val="000000"/>
           <w:sz w:val="18"/>
         </w:rPr>
-        <w:t xml:space="preserve">Early graph embeddings learn a vector for each observed vertex. DeepWalk derives training contexts from truncated random walks [48]; node2vec biases those walks to change the neighborhoods preserved by an embedding [22]; LINE preserves proximity through an edge-based objective [54]. These approaches establish useful structural representations, but a learned vector lookup alone does not specify how an unseen endpoint should be represented. GraphSAGE addresses that problem by learning a shared neighborhood aggregation function [24]. This distinction between stored identity and a shared mapping motivates our focus on interactions involving previously unseen nodes.</w:t>
+        <w:t xml:space="preserve">Inductive graph models use shared functions to represent previously unseen nodes, as illustrated by GraphSAGE [16]. Link prediction also depends on the information supplied to the decoder: SEAL, for example, learns from the local subgraph around a candidate link [40]. In temporal graphs, both the representation and candidate context depend on the order of observations [18, 22].</w:t>
       </w:r>
     </w:p>
     <w:p>
@@ -470,7 +470,7 @@
           <w:color w:val="000000"/>
           <w:sz w:val="18"/>
         </w:rPr>
-        <w:t xml:space="preserve">Graph convolutional networks combine local structure with node features [37], while graph attention networks learn weights for neighboring features [61]. Message-passing neural networks provide a common description of neighborhood computation [18]. The expressivity analysis of Xu et al. shows that aggregation choices constrain which structures such models can distinguish [67]. These are forward-representation choices. Our intervention instead changes the backward path at a fixed scored boundary, so a favorable routing result does not imply greater structural expressivity.</w:t>
+        <w:t xml:space="preserve">Event-based architectures differ in how they retain this history. DyRep couples evolving representations with event occurrence [35]; JODIE models user and item trajectories [26]; Temporal Graph Networks organize computation around messages and node memory [32]. Their recurrent components build on gated sequence models [7], but the schedule of memory reads and writes remains an implementation choice. TGAT uses time-aware neighborhood attention [38], while causal anonymous walks capture temporally ordered structural patterns [36]. GraphMixer [8], NAT [28] and DyGFormer [39] provide alternatives based on interaction histories and neighborhood context. These architectural differences prevent a routing effect measured in one implementation from being assumed in another.</w:t>
       </w:r>
     </w:p>
     <w:p>
@@ -487,11 +487,11 @@
           <w:color w:val="000000"/>
           <w:sz w:val="18"/>
         </w:rPr>
-        <w:t xml:space="preserve">Link prediction also depends on the decoder and the information presented to it. A variational graph autoencoder combines a latent-variable encoder with a link decoder [38]; SEAL learns from subgraphs extracted around candidate links [71]. The former emphasizes latent node representations, whereas the latter makes a candidate’s local structure explicit. SR-GNN similarly supplies pair-history features to its readout, but on an ordered event stream. This creates a reason to examine whether link supervision should reshape the learned representation when candidate-level context already carries predictive information.</w:t>
+        <w:t xml:space="preserve">Our model combines learned event features and recurrent memory with deterministic pair histories. Its intensity-like channel follows a self-exciting recurrence inspired by Hawkes processes [17], and its running moments use Welford’s update [37]. We specify the actual inputs to these recurrences because source-node staleness and pair-specific inter-arrival time are different quantities. The former is used here.</w:t>
       </w:r>
     </w:p>
     <w:bookmarkEnd w:id="19"/>
-    <w:bookmarkStart w:id="20" w:name="_bda21c9f0eb9bca927af3c8b766cce87c6a36e0"/>
+    <w:bookmarkStart w:id="20" w:name="_06c9f6fac4e3069fb4efbea6fbaa5f6635c2a85"/>
     <w:p>
       <w:pPr>
         <w:pStyle w:val="Heading2"/>
@@ -505,7 +505,7 @@
           <w:b/>
           <w:sz w:val="18"/>
         </w:rPr>
-        <w:t>2. Representing change over time</w:t>
+        <w:t>2. Gradient routing and representation probes</w:t>
       </w:r>
     </w:p>
     <w:p>
@@ -522,7 +522,7 @@
           <w:color w:val="000000"/>
           <w:sz w:val="18"/>
         </w:rPr>
-        <w:t xml:space="preserve">Temporal-network analysis treats the ordering of contacts as part of the network, because an aggregated graph can admit paths that no time-respecting interaction sequence permits [28]. The survey by Kazemi et al. distinguishes dynamic graph encoders and decoders across changing nodes, attributes and edges [33]. A central modeling choice is whether change is represented through snapshots or through individual timestamped events.</w:t>
+        <w:t xml:space="preserve">A separately trained classifier can assess information available in a learned representation [1]. Kumar et al. show that fine-tuning can distort pretrained features and underperform a linear probe under distribution shift [25]. This motivates examining task adaptation, although their setting differs from an evolving temporal memory. Stop-gradient also appears in BYOL [14] and SimSiam [6], where it forms part of a self-supervised learning procedure. Those results do not predict the outcome of detaching a supervised temporal-link readout.</w:t>
       </w:r>
     </w:p>
     <w:p>
@@ -539,12 +539,30 @@
           <w:color w:val="000000"/>
           <w:sz w:val="18"/>
         </w:rPr>
-        <w:t xml:space="preserve">Among snapshot approaches, DynGEM incrementally adapts autoencoder-based embeddings [19], dyngraph2vec models transitions with dense and recurrent components [20], and dynnode2vec updates walk-based representations as the graph evolves [45]. DySAT applies attention to structural neighborhoods and temporal sequences [52]. EvolveGCN evolves graph-convolution parameters rather than maintaining a recurrent embedding trajectory for every node [46]. These methods preserve different forms of continuity; their state cannot be equated simply because each produces a time-indexed vector.</w:t>
-      </w:r>
-    </w:p>
-    <w:p>
-      <w:pPr>
-        <w:pStyle w:val="BodyText"/>
+        <w:t xml:space="preserve">The information bottleneck [34] and its deep variational formulation [2] motivate regularizing a representation while preserving predictive information. Such an interpretation needs care for deterministic neural representations [3]. In this study, a KL penalty is an optimization term; we do not measure removal of identity information. The main experiment instead compares the same scored readout with connected or detached features. Freeze-then-probe is a separate procedure because its representation has already followed a different training trajectory.</w:t>
+      </w:r>
+    </w:p>
+    <w:bookmarkEnd w:id="20"/>
+    <w:bookmarkStart w:id="21" w:name="_4044957735daca5ef7c2a53f32bb3a1324b31ab"/>
+    <w:p>
+      <w:pPr>
+        <w:pStyle w:val="Heading2"/>
+        <w:widowControl/>
+        <w:spacing w:before="160" w:after="60" w:line="270" w:lineRule="atLeast"/>
+        <w:ind w:firstLine="0"/>
+        <w:jc w:val="left"/>
+      </w:pPr>
+      <w:r>
+        <w:rPr>
+          <w:b/>
+          <w:sz w:val="18"/>
+        </w:rPr>
+        <w:t>3. Candidate sampling and evaluation</w:t>
+      </w:r>
+    </w:p>
+    <w:p>
+      <w:pPr>
+        <w:pStyle w:val="Normal"/>
         <w:widowControl/>
         <w:spacing w:before="0" w:after="0" w:line="270" w:lineRule="atLeast"/>
         <w:ind w:firstLine="270"/>
@@ -556,7 +574,7 @@
           <w:color w:val="000000"/>
           <w:sz w:val="18"/>
         </w:rPr>
-        <w:t xml:space="preserve">Event-based models retain finer timing information. Lee et al. construct time-respecting walks directly from edge streams [42]. Know-Evolve combines evolving entity representations with a point process for relational events [57], and DyRep jointly models dynamic representation learning and event occurrence [58]. JODIE learns co-evolving user and item trajectories [41]. Temporal Graph Networks organize event processing around memory, messages and temporal graph computation [51]. The recurrent gating used in such systems is related to gated recurrent sequence models [10], but an event store’s read and write schedule remains a separate implementation choice.</w:t>
+        <w:t xml:space="preserve">Poursafaei et al. demonstrate the importance of negative-candidate sampling and introduce EdgeBank as a memorization-based comparator [31]. TGB standardizes temporal datasets and evaluation [20], while DyGLib supports comparison of dynamic graph models under shared procedures [39]. These works motivate reporting the candidate population, novelty boundary and history available at scoring time alongside AP.</w:t>
       </w:r>
     </w:p>
     <w:p>
@@ -573,30 +591,12 @@
           <w:color w:val="000000"/>
           <w:sz w:val="18"/>
         </w:rPr>
-        <w:t xml:space="preserve">TGAT uses time-aware neighborhood attention [66], and causal anonymous walks encode temporally ordered structural patterns for inductive learning [64]. GraphMixer investigates simpler multilayer-perceptron components [11], while NAT constructs neighborhood-aware representations from dictionaries of recent interactions [44]. TCL uses a contrastive transformer formulation [63]; DyGFormer models interaction histories and accompanies the DyGLib evaluation library [69]. The Transformer supplies the underlying attention-based sequence-modeling framework [60]. These alternatives show why a routing intervention must be defined within each architecture: replacing a memory model by an attention model changes much more than its gradient boundary.</w:t>
-      </w:r>
-    </w:p>
-    <w:bookmarkEnd w:id="20"/>
-    <w:bookmarkStart w:id="21" w:name="_37a84e499a4c48440837ca876ae90e353a6e413"/>
-    <w:p>
-      <w:pPr>
-        <w:pStyle w:val="Heading2"/>
-        <w:widowControl/>
-        <w:spacing w:before="160" w:after="60" w:line="270" w:lineRule="atLeast"/>
-        <w:ind w:firstLine="0"/>
-        <w:jc w:val="left"/>
-      </w:pPr>
-      <w:r>
-        <w:rPr>
-          <w:b/>
-          <w:sz w:val="18"/>
-        </w:rPr>
-        <w:t>3. Objectives, probes and gradient routing</w:t>
-      </w:r>
-    </w:p>
-    <w:p>
-      <w:pPr>
-        <w:pStyle w:val="Normal"/>
+        <w:t xml:space="preserve">Model selection and run-to-run variability also affect reported comparisons [5, 4]. We report sample deviations over the retained seeds, rather than treating them as uncertainty over new graph populations. Leakage analysis requires checking which inputs would be available in the claimed prediction setting [21]. This matters for CoEdit’s retrospective construction. Likewise, a favorable inductive score alone cannot demonstrate that identity-related shortcuts have been removed [13]; that explanation would require direct feature measurements and interventions.</w:t>
+      </w:r>
+    </w:p>
+    <w:p>
+      <w:pPr>
+        <w:pStyle w:val="BodyText"/>
         <w:widowControl/>
         <w:spacing w:before="0" w:after="0" w:line="270" w:lineRule="atLeast"/>
         <w:ind w:firstLine="270"/>
@@ -608,201 +608,12 @@
           <w:color w:val="000000"/>
           <w:sz w:val="18"/>
         </w:rPr>
-        <w:t xml:space="preserve">A representation can be evaluated through a separately trained classifier, as in the probes of Alain and Bengio [1]. Kumar et al. show that fine-tuning can distort pretrained features in settings where a linear probe generalizes better out of distribution [40]. Their result motivates studying the cost of task adaptation, but their pretraining assumptions differ from the stateful temporal procedure here. Our freeze-then-probe arm also retrains a different head, so it answers a different question from the shared-readout detach comparison.</w:t>
-      </w:r>
-    </w:p>
-    <w:p>
-      <w:pPr>
-        <w:pStyle w:val="BodyText"/>
-        <w:widowControl/>
-        <w:spacing w:before="0" w:after="0" w:line="270" w:lineRule="atLeast"/>
-        <w:ind w:firstLine="270"/>
-        <w:jc w:val="both"/>
-      </w:pPr>
-      <w:r>
-        <w:rPr>
-          <w:rFonts w:ascii="Times New Roman" w:hAnsi="Times New Roman" w:eastAsia="Songti TC"/>
-          <w:color w:val="000000"/>
-          <w:sz w:val="18"/>
-        </w:rPr>
-        <w:t xml:space="preserve">Self-supervised learning offers several ways to shape an encoder without the downstream prediction loss. Contrastive Predictive Coding predicts future latent information using a contrastive objective [59]. SimCLR compares augmented views within a batch [8], and MoCo maintains a momentum-based representation dictionary [26]. Supervised contrastive learning incorporates class labels into the comparison objective [34]. These methods change the learning target and the comparison population. They should not be described as equivalent to removing a derivative from a supervised link score.</w:t>
-      </w:r>
-    </w:p>
-    <w:p>
-      <w:pPr>
-        <w:pStyle w:val="BodyText"/>
-        <w:widowControl/>
-        <w:spacing w:before="0" w:after="0" w:line="270" w:lineRule="atLeast"/>
-        <w:ind w:firstLine="270"/>
-        <w:jc w:val="both"/>
-      </w:pPr>
-      <w:r>
-        <w:rPr>
-          <w:rFonts w:ascii="Times New Roman" w:hAnsi="Times New Roman" w:eastAsia="Songti TC"/>
-          <w:color w:val="000000"/>
-          <w:sz w:val="18"/>
-        </w:rPr>
-        <w:t xml:space="preserve">BYOL learns by predicting a target representation [21], SimSiam examines a simpler Siamese design with stop-gradient [9], and DINO studies self-distillation in vision transformers [6]. Barlow Twins instead constrains cross-correlation between views [70], while VICReg explicitly regulates variance and covariance along with agreement [4]. Their different ways of avoiding representation collapse make the computational role of gradient asymmetry relevant. They do not supply a general theorem that detached temporal features should outperform jointly trained ones.</w:t>
-      </w:r>
-    </w:p>
-    <w:p>
-      <w:pPr>
-        <w:pStyle w:val="BodyText"/>
-        <w:widowControl/>
-        <w:spacing w:before="0" w:after="0" w:line="270" w:lineRule="atLeast"/>
-        <w:ind w:firstLine="270"/>
-        <w:jc w:val="both"/>
-      </w:pPr>
-      <w:r>
-        <w:rPr>
-          <w:rFonts w:ascii="Times New Roman" w:hAnsi="Times New Roman" w:eastAsia="Songti TC"/>
-          <w:color w:val="000000"/>
-          <w:sz w:val="18"/>
-        </w:rPr>
-        <w:t xml:space="preserve">Graph-specific objectives further separate representation learning from the downstream readout. Deep Graph Infomax relates local representations to graph summaries [62]; GraphCL studies graph augmentations [68]; GRACE contrasts node representations across perturbed graph views [72]. BGRL bootstraps alternative graph views without requiring contrastive negatives [55], and GraphMAE reconstructs masked node features [29]. These are possible sources of alternative pretraining for a future probe study. We do not benchmark them in the present matrix or infer their temporal behavior from static-graph evaluations.</w:t>
-      </w:r>
-    </w:p>
-    <w:p>
-      <w:pPr>
-        <w:pStyle w:val="BodyText"/>
-        <w:widowControl/>
-        <w:spacing w:before="0" w:after="0" w:line="270" w:lineRule="atLeast"/>
-        <w:ind w:firstLine="270"/>
-        <w:jc w:val="both"/>
-      </w:pPr>
-      <w:r>
-        <w:rPr>
-          <w:rFonts w:ascii="Times New Roman" w:hAnsi="Times New Roman" w:eastAsia="Songti TC"/>
-          <w:color w:val="000000"/>
-          <w:sz w:val="18"/>
-        </w:rPr>
-        <w:t xml:space="preserve">The information bottleneck formulates a tradeoff between retained input information and predictive information [56]. Its deep variational formulation [2] and variational autoencoding [36] motivate tractable regularization objectives. However, the bottleneck functional can have problematic behavior for deterministic neural representations [3], and variational mutual-information bounds have estimator-dependent bias and variance [49]. A KL penalty in SR-GNN therefore specifies an optimization term, not a measured removal of identity information. This is also distinct from dropout’s suppression of feature co-adaptation [27] and from decoupled weight decay in adaptive optimization [43].</w:t>
+        <w:t xml:space="preserve">Evaluation studies in graph learning and recommendation show that model rankings depend on the training protocol and the strength of tuned comparators [33, 11]. This is relevant to the historical TGAT proxy: reproducing its saved score establishes the arithmetic of that local experiment, but not parity with the published architecture. A benchmark claim would additionally require the intended model, a comparable tuning budget and a common evaluator.</w:t>
       </w:r>
     </w:p>
     <w:bookmarkEnd w:id="21"/>
-    <w:bookmarkStart w:id="22" w:name="_323ce425b3c6000e5b3d65d15fc3135d60cdb7f"/>
-    <w:p>
-      <w:pPr>
-        <w:pStyle w:val="Heading2"/>
-        <w:widowControl/>
-        <w:spacing w:before="160" w:after="60" w:line="270" w:lineRule="atLeast"/>
-        <w:ind w:firstLine="0"/>
-        <w:jc w:val="left"/>
-      </w:pPr>
-      <w:r>
-        <w:rPr>
-          <w:b/>
-          <w:sz w:val="18"/>
-        </w:rPr>
-        <w:t>4. Evaluation and transfer beyond the benchmark</w:t>
-      </w:r>
-    </w:p>
-    <w:p>
-      <w:pPr>
-        <w:pStyle w:val="Normal"/>
-        <w:widowControl/>
-        <w:spacing w:before="0" w:after="0" w:line="270" w:lineRule="atLeast"/>
-        <w:ind w:firstLine="270"/>
-        <w:jc w:val="both"/>
-      </w:pPr>
-      <w:r>
-        <w:rPr>
-          <w:rFonts w:ascii="Times New Roman" w:hAnsi="Times New Roman" w:eastAsia="Songti TC"/>
-          <w:color w:val="000000"/>
-          <w:sz w:val="18"/>
-        </w:rPr>
-        <w:t xml:space="preserve">Poursafaei et al. show that dynamic link-prediction evaluation depends strongly on candidate sampling and introduce EdgeBank as a memorization-based comparator [50]. TGB provides standardized temporal benchmarks [31], and TGB 2.0 extends evaluation to temporal knowledge graphs and heterogeneous graphs [16]. OGB addresses comparable dataset and evaluator conventions for graph learning more broadly [30]. These efforts support specifying endpoint roles, historical support and split boundaries alongside an accuracy measure.</w:t>
-      </w:r>
-    </w:p>
-    <w:p>
-      <w:pPr>
-        <w:pStyle w:val="BodyText"/>
-        <w:widowControl/>
-        <w:spacing w:before="0" w:after="0" w:line="270" w:lineRule="atLeast"/>
-        <w:ind w:firstLine="270"/>
-        <w:jc w:val="both"/>
-      </w:pPr>
-      <w:r>
-        <w:rPr>
-          <w:rFonts w:ascii="Times New Roman" w:hAnsi="Times New Roman" w:eastAsia="Songti TC"/>
-          <w:color w:val="000000"/>
-          <w:sz w:val="18"/>
-        </w:rPr>
-        <w:t xml:space="preserve">Fair comparisons also require aligned training and selection procedures. Shchur et al. document sensitivity of graph-model rankings to evaluation choices [53]. Dacrema et al. identify weaknesses in reproducibility and baseline tuning in neural recommendation research [14]. Cawley and Talbot analyze selection bias from optimizing a finite-sample model-selection criterion [7], while Bouthillier et al. examine multiple sources of benchmark variance [5]. Accordingly, our seed deviations describe the selected runs; they do not capture uncertainty over new datasets or a repeated hyperparameter search.</w:t>
-      </w:r>
-    </w:p>
-    <w:p>
-      <w:pPr>
-        <w:pStyle w:val="BodyText"/>
-        <w:widowControl/>
-        <w:spacing w:before="0" w:after="0" w:line="270" w:lineRule="atLeast"/>
-        <w:ind w:firstLine="270"/>
-        <w:jc w:val="both"/>
-      </w:pPr>
-      <w:r>
-        <w:rPr>
-          <w:rFonts w:ascii="Times New Roman" w:hAnsi="Times New Roman" w:eastAsia="Songti TC"/>
-          <w:color w:val="000000"/>
-          <w:sz w:val="18"/>
-        </w:rPr>
-        <w:t xml:space="preserve">Transfer raises questions that a held-out score alone cannot settle. Shortcut learning can exploit signals that fail under a harder test distribution [17]. Underspecification can leave models with similar held-out performance but different deployment behavior [12], and WILDS demonstrates the value of evaluating naturally occurring distribution shifts [39]. Leakage analysis further requires matching the information available to the claimed prediction setting [32]. These concerns are directly relevant to CoEdit’s midpoint timestamps and to the endpoint roles of sampled negatives. Finally, ranking quality and probability calibration are different properties [23]; average precision does not establish calibrated interaction probabilities.</w:t>
-      </w:r>
-    </w:p>
     <w:bookmarkEnd w:id="22"/>
-    <w:bookmarkStart w:id="23" w:name="_4718db1fa88dd2d4b72d6141a4fa1054b8e6497"/>
-    <w:p>
-      <w:pPr>
-        <w:pStyle w:val="Heading2"/>
-        <w:widowControl/>
-        <w:spacing w:before="160" w:after="60" w:line="270" w:lineRule="atLeast"/>
-        <w:ind w:firstLine="0"/>
-        <w:jc w:val="left"/>
-      </w:pPr>
-      <w:r>
-        <w:rPr>
-          <w:b/>
-          <w:sz w:val="18"/>
-        </w:rPr>
-        <w:t>5. Online history and implementation</w:t>
-      </w:r>
-    </w:p>
-    <w:p>
-      <w:pPr>
-        <w:pStyle w:val="Normal"/>
-        <w:widowControl/>
-        <w:spacing w:before="0" w:after="0" w:line="270" w:lineRule="atLeast"/>
-        <w:ind w:firstLine="270"/>
-        <w:jc w:val="both"/>
-      </w:pPr>
-      <w:r>
-        <w:rPr>
-          <w:rFonts w:ascii="Times New Roman" w:hAnsi="Times New Roman" w:eastAsia="Songti TC"/>
-          <w:color w:val="000000"/>
-          <w:sz w:val="18"/>
-        </w:rPr>
-        <w:t xml:space="preserve">Hawkes processes model self-exciting event behavior [25], and Welford’s recurrence updates running moments without retaining the full sample [65]. SR-GNN uses intensity-like and moment channels inspired by these ideas. Its supplied gap is source-node staleness, however, so the channels are not a fitted pair-specific generative point process. Their implemented semantics are specified below.</w:t>
-      </w:r>
-    </w:p>
-    <w:p>
-      <w:pPr>
-        <w:pStyle w:val="BodyText"/>
-        <w:widowControl/>
-        <w:spacing w:before="0" w:after="0" w:line="270" w:lineRule="atLeast"/>
-        <w:ind w:firstLine="270"/>
-        <w:jc w:val="both"/>
-      </w:pPr>
-      <w:r>
-        <w:rPr>
-          <w:rFonts w:ascii="Times New Roman" w:hAnsi="Times New Roman" w:eastAsia="Songti TC"/>
-          <w:color w:val="000000"/>
-          <w:sz w:val="18"/>
-        </w:rPr>
-        <w:t xml:space="preserve">PyTorch provides the automatic differentiation and stateful modules used by the implementation [47]. PyTorch Geometric illustrates how graph libraries package sparse operations and batching conventions [15]. Such libraries assist implementation, but do not by themselves define the historical information available at scoring time. The distinction matters here because deterministic pair accumulators and recurrent node memory follow different within-batch update schedules.</w:t>
-      </w:r>
-    </w:p>
-    <w:bookmarkEnd w:id="23"/>
-    <w:bookmarkEnd w:id="24"/>
-    <w:bookmarkStart w:id="31" w:name="_c866c5ff7cafa3e3016989e5d3a9db23d1686cf"/>
+    <w:bookmarkStart w:id="29" w:name="_c866c5ff7cafa3e3016989e5d3a9db23d1686cf"/>
     <w:p>
       <w:pPr>
         <w:pStyle w:val="Heading1"/>
@@ -819,7 +630,7 @@
         <w:t>III. Problem and Model Specification</w:t>
       </w:r>
     </w:p>
-    <w:bookmarkStart w:id="25" w:name="_ce4a8bc07a6e583c33681aebf76404fe2dd1c6d"/>
+    <w:bookmarkStart w:id="23" w:name="_ce4a8bc07a6e583c33681aebf76404fe2dd1c6d"/>
     <w:p>
       <w:pPr>
         <w:pStyle w:val="Heading2"/>
@@ -1702,8 +1513,8 @@
         <w:t xml:space="preserve">. In the implementation, candidate-specific positive and negative branches have corresponding representations and histories.</w:t>
       </w:r>
     </w:p>
-    <w:bookmarkEnd w:id="25"/>
-    <w:bookmarkStart w:id="26" w:name="_b0e81959ee7fced828f2a0d1e951ed022051e69"/>
+    <w:bookmarkEnd w:id="23"/>
+    <w:bookmarkStart w:id="24" w:name="_b0e81959ee7fced828f2a0d1e951ed022051e69"/>
     <w:p>
       <w:pPr>
         <w:pStyle w:val="Heading2"/>
@@ -3435,8 +3246,8 @@
         <w:t xml:space="preserve">The model also maintains learned node-memory and pair-representation components. Deterministic statistics offer a direct summary of observations, whereas learned transformations can adapt how the summaries and event attributes are combined. Decoupling the scored path changes the latter adaptation without deleting the former information. This is why an effective detached arm does not imply that a random or history-free encoder would be equally effective.</w:t>
       </w:r>
     </w:p>
-    <w:bookmarkEnd w:id="26"/>
-    <w:bookmarkStart w:id="27" w:name="_e7c16d1e24261db956728fefde4ae66c6a128b6"/>
+    <w:bookmarkEnd w:id="24"/>
+    <w:bookmarkStart w:id="25" w:name="_e7c16d1e24261db956728fefde4ae66c6a128b6"/>
     <w:p>
       <w:pPr>
         <w:pStyle w:val="Heading2"/>
@@ -4892,8 +4703,8 @@
         <w:t xml:space="preserve">Figure 1 identifies the boundary changed by the experiment. Auxiliary objectives and deterministic store writes are not drawn as scoring edges. Their omission from this diagram is a visual simplification, not a claim that they are absent from training. The forward representations of arms with identical parameters would agree at the boundary, but their learned trajectories need not agree after optimization.</w:t>
       </w:r>
     </w:p>
-    <w:bookmarkEnd w:id="27"/>
-    <w:bookmarkStart w:id="28" w:name="_2b98c368579b6302ca09951b507df83e7be4d54"/>
+    <w:bookmarkEnd w:id="25"/>
+    <w:bookmarkStart w:id="26" w:name="_2b98c368579b6302ca09951b507df83e7be4d54"/>
     <w:p>
       <w:pPr>
         <w:pStyle w:val="Heading2"/>
@@ -5652,8 +5463,25 @@
         <w:t xml:space="preserve">The auxiliary collection includes the active violation, transition, edge-state and entropy-related terms selected by the resolved profile. Disabled terms contribute nothing. The code, protocol and resolved configuration specify their actual inclusion and weights. Equation (10) is a dependency summary rather than a substitute for that operational specification.</w:t>
       </w:r>
     </w:p>
-    <w:bookmarkEnd w:id="28"/>
-    <w:bookmarkStart w:id="29" w:name="_1664075135fe207b36239dab558a4a024bc8b20"/>
+    <w:p>
+      <w:pPr>
+        <w:pStyle w:val="BodyText"/>
+        <w:widowControl/>
+        <w:spacing w:before="0" w:after="0" w:line="270" w:lineRule="atLeast"/>
+        <w:ind w:firstLine="270"/>
+        <w:jc w:val="both"/>
+      </w:pPr>
+      <w:r>
+        <w:rPr>
+          <w:rFonts w:ascii="Times New Roman" w:hAnsi="Times New Roman" w:eastAsia="Songti TC"/>
+          <w:color w:val="000000"/>
+          <w:sz w:val="18"/>
+        </w:rPr>
+        <w:t xml:space="preserve">Variational autoencoding uses a KL term within a specified latent-variable objective [24]. Connecting such regularization to information retained by an encoder requires identifying the distributions and approximation being optimized. Poole et al. analyze bias–variance tradeoffs among variational mutual-information bounds [30]. Here, the recorded objective does not provide an empirical estimate of identity information. A lower auxiliary loss would therefore not, by itself, establish that identity cues were removed or explain the observed AP difference. We use the objective to specify which parameters can receive gradients and leave the proposed statistical mechanism open.</w:t>
+      </w:r>
+    </w:p>
+    <w:bookmarkEnd w:id="26"/>
+    <w:bookmarkStart w:id="27" w:name="_1664075135fe207b36239dab558a4a024bc8b20"/>
     <w:p>
       <w:pPr>
         <w:pStyle w:val="Heading2"/>
@@ -5721,8 +5549,8 @@
         <w:t xml:space="preserve">Recurrent node memory follows a different registered convention. Candidate updates are computed from a batch snapshot, and collisions on a node index are resolved by committing the final candidate in stable input order. Thus the procedure combines sequential deterministic pair updates with batch-snapshot neural memory. This is a reproducible approximation whose batch size is part of the protocol. A comparison to fully event-sequential neural updates would require a separate experiment.</w:t>
       </w:r>
     </w:p>
-    <w:bookmarkEnd w:id="29"/>
-    <w:bookmarkStart w:id="30" w:name="_4bebeb2e43843c109daa736fcca355eb2fb34ad"/>
+    <w:bookmarkEnd w:id="27"/>
+    <w:bookmarkStart w:id="28" w:name="_4bebeb2e43843c109daa736fcca355eb2fb34ad"/>
     <w:p>
       <w:pPr>
         <w:pStyle w:val="Heading2"/>
@@ -5756,9 +5584,9 @@
         <w:t xml:space="preserve">The freeze-then-probe arm pretrains with the separate main prediction head, selects a validation checkpoint, freezes representation parameters and reinitializes the main head. The probe phase then trains the new head while forward event processing continues to update temporal stores. Its own validation selection determines the evaluated checkpoint. Freezing weights therefore differs from freezing a precomputed feature matrix.</w:t>
       </w:r>
     </w:p>
-    <w:bookmarkEnd w:id="30"/>
-    <w:bookmarkEnd w:id="31"/>
-    <w:bookmarkStart w:id="37" w:name="_3885457f8b6d6cee7d6a0e76f19f930c01119d7"/>
+    <w:bookmarkEnd w:id="28"/>
+    <w:bookmarkEnd w:id="29"/>
+    <w:bookmarkStart w:id="35" w:name="_3885457f8b6d6cee7d6a0e76f19f930c01119d7"/>
     <w:p>
       <w:pPr>
         <w:pStyle w:val="Heading1"/>
@@ -5775,7 +5603,7 @@
         <w:t>IV. Data and Experimental Protocol</w:t>
       </w:r>
     </w:p>
-    <w:bookmarkStart w:id="32" w:name="_83199fa1589ef55b36f4cb0a1abb2ddf4bb7289"/>
+    <w:bookmarkStart w:id="30" w:name="_83199fa1589ef55b36f4cb0a1abb2ddf4bb7289"/>
     <w:p>
       <w:pPr>
         <w:pStyle w:val="Heading2"/>
@@ -5806,7 +5634,7 @@
           <w:color w:val="000000"/>
           <w:sz w:val="18"/>
         </w:rPr>
-        <w:t xml:space="preserve">Wikipedia and MOOC are obtained from the public JODIE data sources [41]. They are bipartite streams whose endpoint roles have separate node-ID namespaces in the current preprocessing. The distinction prevents a user and an item with the same original integer label from sharing a memory row. CoEdit instead represents contributor-to-contributor interactions in a homogeneous namespace. Topology is a property of each registered corpus and is not inferred from whether source and destination integers happen to overlap.</w:t>
+        <w:t xml:space="preserve">Wikipedia and MOOC are obtained from the public JODIE data sources [26]. They are bipartite streams whose endpoint roles have separate node-ID namespaces in the current preprocessing. The distinction prevents a user and an item with the same original integer label from sharing a memory row. CoEdit instead represents contributor-to-contributor interactions in a homogeneous namespace. Topology is a property of each registered corpus and is not inferred from whether source and destination integers happen to overlap.</w:t>
       </w:r>
     </w:p>
     <w:p>
@@ -5860,8 +5688,8 @@
         <w:t xml:space="preserve">CoEdit and Wikipedia consequently do not provide independent source replications. They offer different graph constructions from a shared source, whereas MOOC supplies a separate interaction source. This distinction matters when assessing how broadly an observed ordering generalizes. An effect repeated across these corpora is more informative than an effect on a single graph construction, but it is not evidence from an equal number of independent data-generating environments.</w:t>
       </w:r>
     </w:p>
-    <w:bookmarkEnd w:id="32"/>
-    <w:bookmarkStart w:id="33" w:name="_74773627daf4590c20a0649678b563065f7dff5"/>
+    <w:bookmarkEnd w:id="30"/>
+    <w:bookmarkStart w:id="31" w:name="_74773627daf4590c20a0649678b563065f7dff5"/>
     <w:p>
       <w:pPr>
         <w:pStyle w:val="Heading2"/>
@@ -5929,8 +5757,8 @@
         <w:t xml:space="preserve">New-node initialization is part of the model behavior rather than a separate source of supervision. Shared functions can score a candidate with a new endpoint, but the memory available for that endpoint depends on which prior retained events touched it. An interaction involving an inductive node is not necessarily its first evaluated interaction. Repeated appearances within the test period can therefore contribute useful history even in the inductive metric.</w:t>
       </w:r>
     </w:p>
-    <w:bookmarkEnd w:id="33"/>
-    <w:bookmarkStart w:id="34" w:name="_d6161b88f35cfe5adb40b4f680f3e910817fd3e"/>
+    <w:bookmarkEnd w:id="31"/>
+    <w:bookmarkStart w:id="32" w:name="_d6161b88f35cfe5adb40b4f680f3e910817fd3e"/>
     <w:p>
       <w:pPr>
         <w:pStyle w:val="Heading2"/>
@@ -5998,8 +5826,8 @@
         <w:t xml:space="preserve">Negative candidates receive their own historical pair context and do not write themselves into memory as observed events. Reusing the positive pair’s history for a negative would erase the candidate distinction, while forcing every negative history to be empty would introduce another asymmetry. The implemented read-only lookup avoids these specific mistakes. It does not settle all potential leakage or candidate-validity questions.</w:t>
       </w:r>
     </w:p>
-    <w:bookmarkEnd w:id="34"/>
-    <w:bookmarkStart w:id="35" w:name="_827afdf16eb7158f3c823e0fe85bfe686e06122"/>
+    <w:bookmarkEnd w:id="32"/>
+    <w:bookmarkStart w:id="33" w:name="_827afdf16eb7158f3c823e0fe85bfe686e06122"/>
     <w:p>
       <w:pPr>
         <w:pStyle w:val="Heading2"/>
@@ -6030,7 +5858,7 @@
           <w:color w:val="000000"/>
           <w:sz w:val="18"/>
         </w:rPr>
-        <w:t xml:space="preserve">Table 1 summarizes the registered training configuration. The primary arms use the same backbone size, batch size, optimizer family and schedule. Adam is used for optimization [35]. The registered optimizer uses its weight-decay setting; it is not replaced by AdamW, whose decoupled decay changes the update rule [43]. Validation-based model selection takes place within the registered training procedure; the test endpoint is not used to select an epoch. The freeze-then-probe profile includes an additional probe phase and must not be described as having the same optimization trajectory as the primary arms.</w:t>
+        <w:t xml:space="preserve">Table 1 summarizes the registered training configuration. The primary arms use the same backbone size, batch size, optimizer family and schedule. Adam is used for optimization [23] in PyTorch [29]. The registered optimizer uses its weight-decay setting; it is not replaced by AdamW, whose decoupled decay changes the update rule [27]. Validation-based model selection takes place within the registered training procedure; the test endpoint is not used to select an epoch. The freeze-then-probe profile includes an additional probe phase and must not be described as having the same optimization trajectory as the primary arms.</w:t>
       </w:r>
     </w:p>
     <w:p>
@@ -6700,8 +6528,8 @@
         <w:t xml:space="preserve">The runtime warmup is state-neutral. Although a real training pass initializes the computational kernels, parameters, buffers, optimizer state, random streams and temporal stores are restored afterwards. This prevents initialization work from becoming hidden extra optimization. The runner also checks finite values and records failures rather than replacing invalid values or silently dropping failed tasks from an aggregate.</w:t>
       </w:r>
     </w:p>
-    <w:bookmarkEnd w:id="35"/>
-    <w:bookmarkStart w:id="36" w:name="_936902bec6b3ca6055eeef6cc014c15517a2afb"/>
+    <w:bookmarkEnd w:id="33"/>
+    <w:bookmarkStart w:id="34" w:name="_936902bec6b3ca6055eeef6cc014c15517a2afb"/>
     <w:p>
       <w:pPr>
         <w:pStyle w:val="Heading2"/>
@@ -7475,9 +7303,9 @@
         <w:t xml:space="preserve">A paired effect would be computed from matched per-seed differences, not by subtracting standard deviations from separate arms. Establishing a confidence interval for such an effect requires its own statistical specification and sufficient supporting data. The principal statement here is the observed ordering of the registered means. It does not require or imply a claim that every seed favors the same arm.</w:t>
       </w:r>
     </w:p>
-    <w:bookmarkEnd w:id="36"/>
-    <w:bookmarkEnd w:id="37"/>
-    <w:bookmarkStart w:id="41" w:name="_results"/>
+    <w:bookmarkEnd w:id="34"/>
+    <w:bookmarkEnd w:id="35"/>
+    <w:bookmarkStart w:id="42" w:name="_results"/>
     <w:p>
       <w:pPr>
         <w:pStyle w:val="Heading1"/>
@@ -7494,7 +7322,7 @@
         <w:t>V. Results</w:t>
       </w:r>
     </w:p>
-    <w:bookmarkStart w:id="38" w:name="_5e77b1af3363bd4f4fe5eb9e5bdb3adc354092f"/>
+    <w:bookmarkStart w:id="36" w:name="_5e77b1af3363bd4f4fe5eb9e5bdb3adc354092f"/>
     <w:p>
       <w:pPr>
         <w:pStyle w:val="Heading2"/>
@@ -8162,11 +7990,45 @@
           <w:color w:val="000000"/>
           <w:sz w:val="18"/>
         </w:rPr>
-        <w:t xml:space="preserve">Under the registered current-corpus protocol, the observed decoupled SR-GNN arm has higher mean inductive average precision than the coupled end-to-end arm on each registered corpus. This is a within-protocol arm comparison, not a baseline, state-of-the-art, architecture-general, or causal claim. The table also preserves the observed freeze-then-probe arm rather than replacing it with a qualitative label.</w:t>
-      </w:r>
-    </w:p>
-    <w:bookmarkEnd w:id="38"/>
-    <w:bookmarkStart w:id="39" w:name="_201bca1240f14b2cdc7025c15995586d09763aa"/>
+        <w:t xml:space="preserve">Under the registered current-corpus protocol, the observed decoupled SR-GNN arm has higher mean inductive average precision than the coupled end-to-end arm on each registered corpus. The observed differences apply to the shared-readout configurations and candidate population specified above.</w:t>
+      </w:r>
+    </w:p>
+    <w:p>
+      <w:pPr>
+        <w:pStyle w:val="BodyText"/>
+        <w:widowControl/>
+        <w:spacing w:before="0" w:after="0" w:line="270" w:lineRule="atLeast"/>
+        <w:ind w:firstLine="270"/>
+        <w:jc w:val="both"/>
+      </w:pPr>
+      <w:r>
+        <w:rPr>
+          <w:rFonts w:ascii="Times New Roman" w:hAnsi="Times New Roman" w:eastAsia="Songti TC"/>
+          <w:color w:val="000000"/>
+          <w:sz w:val="18"/>
+        </w:rPr>
+        <w:t xml:space="preserve">The probe follows a different pretraining and head-retraining trajectory. Its lower mean AP can reflect the pretrained features, head capacity or optimization budget; it does not establish irreversible representation damage.</w:t>
+      </w:r>
+    </w:p>
+    <w:p>
+      <w:pPr>
+        <w:pStyle w:val="BodyText"/>
+        <w:widowControl/>
+        <w:spacing w:before="0" w:after="0" w:line="270" w:lineRule="atLeast"/>
+        <w:ind w:firstLine="270"/>
+        <w:jc w:val="both"/>
+      </w:pPr>
+      <w:r>
+        <w:rPr>
+          <w:rFonts w:ascii="Times New Roman" w:hAnsi="Times New Roman" w:eastAsia="Songti TC"/>
+          <w:color w:val="000000"/>
+          <w:sz w:val="18"/>
+        </w:rPr>
+        <w:t xml:space="preserve">The current table uses the selected completed runs from the frozen matrix. Failed and superseded attempts remain in the accompanying execution ledger and are excluded from these aggregates. All displayed means and sample deviations are reconstructed from per-seed records; no new training was performed for this manuscript revision.</w:t>
+      </w:r>
+    </w:p>
+    <w:bookmarkEnd w:id="36"/>
+    <w:bookmarkStart w:id="37" w:name="_f4197ed55d0cf8a8faf4cfda449b039760f150f"/>
     <w:p>
       <w:pPr>
         <w:pStyle w:val="Heading2"/>
@@ -8180,7 +8042,7 @@
           <w:b/>
           <w:sz w:val="18"/>
         </w:rPr>
-        <w:t>2. Interpreting the probe arm</w:t>
+        <w:t>2. Retrospective experiments from model development</w:t>
       </w:r>
     </w:p>
     <w:p>
@@ -8197,7 +8059,7 @@
           <w:color w:val="000000"/>
           <w:sz w:val="18"/>
         </w:rPr>
-        <w:t xml:space="preserve">The probe rows characterize the specified pretraining and head-retraining procedure. Their interpretation depends on which representation was pretrained, how its checkpoint was selected, which parameters were frozen and which head was reinitialized. Those factors differ from simply reconnecting the shared primary readout. The result therefore does not isolate the gradient boundary with the same scope as the primary comparison.</w:t>
+        <w:t xml:space="preserve">The earlier study investigated a broader set of configurations than the shared-readout comparison. We retain those experiments here to examine predictor choice, candidate-pool sensitivity, learned-backbone contributions and recovery by a newly trained probe. Tables 3–7 reconstruct means and sample deviations directly from recovered per-seed records. The accompanying source map identifies each input file, checksum, selected observations and aggregation rule. All tables report mean AP and sample SD. The preset comparison uses five seeds; the remaining historical comparisons use three seeds per configuration. The backbone table retains six decimals to show its small nonzero Wikipedia deviation.</w:t>
       </w:r>
     </w:p>
     <w:p>
@@ -8214,11 +8076,11 @@
           <w:color w:val="000000"/>
           <w:sz w:val="18"/>
         </w:rPr>
-        <w:t xml:space="preserve">A probe can fail to reach another arm’s score because of its capacity, optimization schedule, initialization, objective, or the suitability of the pretrained features. These explanations are not mutually exclusive. Establishing irreversible damage would require showing that relevant recovery interventions fail under a meaningful and adequately explored criterion. The current procedure supports no such universal conclusion.</w:t>
-      </w:r>
-    </w:p>
-    <w:bookmarkEnd w:id="39"/>
-    <w:bookmarkStart w:id="40" w:name="_e604a77028aaa23851527b9cc8dd7de22c3ef0a"/>
+        <w:t xml:space="preserve">These are retrospective results. The recovered records describe chronological 70/15/15 partitions, a 20-epoch training budget and average-precision evaluation, but do not bind every run to its original data, source and environment as completely as the current matrix does. We consequently interpret each experimental family within its recorded configuration and do not pool it with Table 2. Separate repetitions of configuration B remain separate rather than selecting whichever repetition gives the largest contrast.</w:t>
+      </w:r>
+    </w:p>
+    <w:bookmarkEnd w:id="37"/>
+    <w:bookmarkStart w:id="38" w:name="_f8791e18fbeca089dc8958f45f2e84d604e53d1"/>
     <w:p>
       <w:pPr>
         <w:pStyle w:val="Heading2"/>
@@ -8232,7 +8094,7 @@
           <w:b/>
           <w:sz w:val="18"/>
         </w:rPr>
-        <w:t>3. Execution completeness and reconstruction</w:t>
+        <w:t>3. Preset comparison and predictor ablations</w:t>
       </w:r>
     </w:p>
     <w:p>
@@ -8249,9 +8111,281 @@
           <w:color w:val="000000"/>
           <w:sz w:val="18"/>
         </w:rPr>
-        <w:t xml:space="preserve">The selected scientific matrix covers 27 tasks. Its accounting retains 162 scientific attempts, including 57 failed and 48 cancelled attempts; 135 attempts are scientifically inadmissible. These accounting categories describe execution and selection history, not additional independent observations for a confidence calculation. The selected completed tasks determine the reported aggregates.</w:t>
-      </w:r>
-    </w:p>
+        <w:t xml:space="preserve">The five-seed CoEdit experiment in Table 3 recovers the earlier draft’s broad preset comparison. B uses the detached hierarchical scoring configuration, whereas C selects the alternative end-to-end design preset. The local TGAT-labeled implementation is a simplified proxy; its result describes that implementation and does not establish a comparison against a faithful reproduction of published TGAT.</w:t>
+      </w:r>
+    </w:p>
+    <w:p>
+      <w:pPr>
+        <w:pStyle w:val="BodyText"/>
+        <w:keepNext/>
+        <w:widowControl/>
+        <w:spacing w:before="120" w:after="100" w:line="270" w:lineRule="atLeast"/>
+        <w:ind w:firstLine="0"/>
+        <w:jc w:val="center"/>
+      </w:pPr>
+      <w:r>
+        <w:rPr>
+          <w:b/>
+        </w:rPr>
+        <w:t>Table 3. CoEdit preset comparison.</w:t>
+      </w:r>
+    </w:p>
+    <w:tbl>
+      <w:tblPr>
+        <w:tblW w:type="auto" w:w="0"/>
+        <w:tblLayout w:type="fixed"/>
+        <w:tblLook w:firstColumn="1" w:firstRow="1" w:lastColumn="0" w:lastRow="0" w:noHBand="0" w:noVBand="1" w:val="04A0"/>
+        <w:tblBorders>
+          <w:top w:val="single" w:sz="4" w:color="AAAAAA"/>
+          <w:bottom w:val="single" w:sz="4" w:color="AAAAAA"/>
+          <w:left w:val="single" w:sz="4" w:color="AAAAAA"/>
+          <w:right w:val="single" w:sz="4" w:color="AAAAAA"/>
+          <w:insideH w:val="single" w:sz="4" w:color="AAAAAA"/>
+          <w:insideV w:val="single" w:sz="4" w:color="AAAAAA"/>
+        </w:tblBorders>
+      </w:tblPr>
+      <w:tblGrid>
+        <w:gridCol w:w="1191"/>
+        <w:gridCol w:w="1474"/>
+        <w:gridCol w:w="1474"/>
+      </w:tblGrid>
+      <w:tr>
+        <w:trPr>
+          <w:cantSplit/>
+        </w:trPr>
+        <w:tc>
+          <w:tcPr>
+            <w:tcW w:type="dxa" w:w="1191"/>
+          </w:tcPr>
+          <w:p>
+            <w:pPr>
+              <w:keepNext/>
+              <w:spacing w:line="288" w:lineRule="auto" w:after="40" w:before="40"/>
+            </w:pPr>
+            <w:r>
+              <w:rPr>
+                <w:rFonts w:ascii="Times New Roman" w:hAnsi="Times New Roman"/>
+                <w:sz w:val="16"/>
+              </w:rPr>
+              <w:t>Configuration</w:t>
+            </w:r>
+          </w:p>
+        </w:tc>
+        <w:tc>
+          <w:tcPr>
+            <w:tcW w:type="dxa" w:w="1474"/>
+          </w:tcPr>
+          <w:p>
+            <w:pPr>
+              <w:keepNext/>
+              <w:spacing w:line="288" w:lineRule="auto" w:after="40" w:before="40"/>
+            </w:pPr>
+            <w:r>
+              <w:rPr>
+                <w:rFonts w:ascii="Times New Roman" w:hAnsi="Times New Roman"/>
+                <w:sz w:val="16"/>
+              </w:rPr>
+              <w:t>Inductive AP</w:t>
+            </w:r>
+          </w:p>
+        </w:tc>
+        <w:tc>
+          <w:tcPr>
+            <w:tcW w:type="dxa" w:w="1474"/>
+          </w:tcPr>
+          <w:p>
+            <w:pPr>
+              <w:keepNext/>
+              <w:spacing w:line="288" w:lineRule="auto" w:after="40" w:before="40"/>
+            </w:pPr>
+            <w:r>
+              <w:rPr>
+                <w:rFonts w:ascii="Times New Roman" w:hAnsi="Times New Roman"/>
+                <w:sz w:val="16"/>
+              </w:rPr>
+              <w:t>Transductive AP</w:t>
+            </w:r>
+          </w:p>
+        </w:tc>
+      </w:tr>
+      <w:tr>
+        <w:trPr>
+          <w:cantSplit/>
+        </w:trPr>
+        <w:tc>
+          <w:tcPr>
+            <w:tcW w:type="dxa" w:w="1191"/>
+          </w:tcPr>
+          <w:p>
+            <w:pPr>
+              <w:keepNext/>
+              <w:spacing w:line="288" w:lineRule="auto" w:after="40" w:before="40"/>
+            </w:pPr>
+            <w:r>
+              <w:rPr>
+                <w:rFonts w:ascii="Times New Roman" w:hAnsi="Times New Roman"/>
+                <w:sz w:val="16"/>
+              </w:rPr>
+              <w:t>B preset</w:t>
+            </w:r>
+          </w:p>
+        </w:tc>
+        <w:tc>
+          <w:tcPr>
+            <w:tcW w:type="dxa" w:w="1474"/>
+          </w:tcPr>
+          <w:p>
+            <w:pPr>
+              <w:keepNext/>
+              <w:spacing w:line="288" w:lineRule="auto" w:after="40" w:before="40"/>
+            </w:pPr>
+            <w:r>
+              <w:rPr>
+                <w:rFonts w:ascii="Times New Roman" w:hAnsi="Times New Roman"/>
+                <w:sz w:val="16"/>
+              </w:rPr>
+              <w:t>0.9876±0.0030</w:t>
+            </w:r>
+          </w:p>
+        </w:tc>
+        <w:tc>
+          <w:tcPr>
+            <w:tcW w:type="dxa" w:w="1474"/>
+          </w:tcPr>
+          <w:p>
+            <w:pPr>
+              <w:keepNext/>
+              <w:spacing w:line="288" w:lineRule="auto" w:after="40" w:before="40"/>
+            </w:pPr>
+            <w:r>
+              <w:rPr>
+                <w:rFonts w:ascii="Times New Roman" w:hAnsi="Times New Roman"/>
+                <w:sz w:val="16"/>
+              </w:rPr>
+              <w:t>0.9985±0.0003</w:t>
+            </w:r>
+          </w:p>
+        </w:tc>
+      </w:tr>
+      <w:tr>
+        <w:trPr>
+          <w:cantSplit/>
+        </w:trPr>
+        <w:tc>
+          <w:tcPr>
+            <w:tcW w:type="dxa" w:w="1191"/>
+          </w:tcPr>
+          <w:p>
+            <w:pPr>
+              <w:keepNext/>
+              <w:spacing w:line="288" w:lineRule="auto" w:after="40" w:before="40"/>
+            </w:pPr>
+            <w:r>
+              <w:rPr>
+                <w:rFonts w:ascii="Times New Roman" w:hAnsi="Times New Roman"/>
+                <w:sz w:val="16"/>
+              </w:rPr>
+              <w:t>C preset</w:t>
+            </w:r>
+          </w:p>
+        </w:tc>
+        <w:tc>
+          <w:tcPr>
+            <w:tcW w:type="dxa" w:w="1474"/>
+          </w:tcPr>
+          <w:p>
+            <w:pPr>
+              <w:keepNext/>
+              <w:spacing w:line="288" w:lineRule="auto" w:after="40" w:before="40"/>
+            </w:pPr>
+            <w:r>
+              <w:rPr>
+                <w:rFonts w:ascii="Times New Roman" w:hAnsi="Times New Roman"/>
+                <w:sz w:val="16"/>
+              </w:rPr>
+              <w:t>0.7593±0.0140</w:t>
+            </w:r>
+          </w:p>
+        </w:tc>
+        <w:tc>
+          <w:tcPr>
+            <w:tcW w:type="dxa" w:w="1474"/>
+          </w:tcPr>
+          <w:p>
+            <w:pPr>
+              <w:keepNext/>
+              <w:spacing w:line="288" w:lineRule="auto" w:after="40" w:before="40"/>
+            </w:pPr>
+            <w:r>
+              <w:rPr>
+                <w:rFonts w:ascii="Times New Roman" w:hAnsi="Times New Roman"/>
+                <w:sz w:val="16"/>
+              </w:rPr>
+              <w:t>0.9600±0.0044</w:t>
+            </w:r>
+          </w:p>
+        </w:tc>
+      </w:tr>
+      <w:tr>
+        <w:trPr>
+          <w:cantSplit/>
+        </w:trPr>
+        <w:tc>
+          <w:tcPr>
+            <w:tcW w:type="dxa" w:w="1191"/>
+          </w:tcPr>
+          <w:p>
+            <w:pPr>
+              <w:keepNext w:val="0"/>
+              <w:spacing w:line="288" w:lineRule="auto" w:after="40" w:before="40"/>
+            </w:pPr>
+            <w:r>
+              <w:rPr>
+                <w:rFonts w:ascii="Times New Roman" w:hAnsi="Times New Roman"/>
+                <w:sz w:val="16"/>
+              </w:rPr>
+              <w:t>TGAT proxy</w:t>
+            </w:r>
+          </w:p>
+        </w:tc>
+        <w:tc>
+          <w:tcPr>
+            <w:tcW w:type="dxa" w:w="1474"/>
+          </w:tcPr>
+          <w:p>
+            <w:pPr>
+              <w:keepNext w:val="0"/>
+              <w:spacing w:line="288" w:lineRule="auto" w:after="40" w:before="40"/>
+            </w:pPr>
+            <w:r>
+              <w:rPr>
+                <w:rFonts w:ascii="Times New Roman" w:hAnsi="Times New Roman"/>
+                <w:sz w:val="16"/>
+              </w:rPr>
+              <w:t>0.8466±0.0133</w:t>
+            </w:r>
+          </w:p>
+        </w:tc>
+        <w:tc>
+          <w:tcPr>
+            <w:tcW w:type="dxa" w:w="1474"/>
+          </w:tcPr>
+          <w:p>
+            <w:pPr>
+              <w:keepNext w:val="0"/>
+              <w:spacing w:line="288" w:lineRule="auto" w:after="40" w:before="40"/>
+            </w:pPr>
+            <w:r>
+              <w:rPr>
+                <w:rFonts w:ascii="Times New Roman" w:hAnsi="Times New Roman"/>
+                <w:sz w:val="16"/>
+              </w:rPr>
+              <w:t>0.8645±0.0083</w:t>
+            </w:r>
+          </w:p>
+        </w:tc>
+      </w:tr>
+    </w:tbl>
     <w:p>
       <w:pPr>
         <w:pStyle w:val="BodyText"/>
@@ -8266,7 +8400,7 @@
           <w:color w:val="000000"/>
           <w:sz w:val="18"/>
         </w:rPr>
-        <w:t xml:space="preserve">The release preserves failed and superseded attempts so that incomplete or unsuccessful work does not disappear from the experiment’s provenance. Means and sample deviations are reconstructed from the selected per-seed records. That reconstruction checks numerical consistency of the table with its underlying records. It is distinct from independently repeating training, and no new training is claimed as part of preparing this manuscript.</w:t>
+        <w:t xml:space="preserve">The B–C difference is much larger for inductive AP than for transductive AP. This observation motivated the routing question, but it cannot identify a gradient effect on its own: the presets change predictor and gating choices together. The current shared-readout experiment addresses a narrower question by preserving the readout while changing the scored-feature derivative path. The large historical preset gap should therefore not be used as its effect size.</w:t>
       </w:r>
     </w:p>
     <w:p>
@@ -8283,12 +8417,2219 @@
           <w:color w:val="000000"/>
           <w:sz w:val="18"/>
         </w:rPr>
-        <w:t xml:space="preserve">The recovered historical archive provides an additional audit trail for the earlier draft. It contains broader ablations, hard-negative runs, probes and proxy-model results, but not a complete current-release execution chain for each claim. Recovering those bytes is valuable because it permits configuration reconciliation. It does not justify adding their task counts to the current matrix or treating their outcomes as current confirmatory evidence.</w:t>
+        <w:t xml:space="preserve">Table 4 separates the preset changes. Relative to B, K1 enables the main predictor, K2 changes the compliance gate from soft to hard, and K3 sets the floor to zero. K2+K3 combines the gate changes, while C combines all three. The CoEdit study covers the full set; the Wikipedia and MOOC studies retain the B–K1 contrast.</w:t>
+      </w:r>
+    </w:p>
+    <w:p>
+      <w:pPr>
+        <w:pStyle w:val="BodyText"/>
+        <w:keepNext/>
+        <w:widowControl/>
+        <w:spacing w:before="120" w:after="100" w:line="270" w:lineRule="atLeast"/>
+        <w:ind w:firstLine="0"/>
+        <w:jc w:val="center"/>
+      </w:pPr>
+      <w:r>
+        <w:rPr>
+          <w:b/>
+        </w:rPr>
+        <w:t>Table 4. Predictor and gate ablations.</w:t>
+      </w:r>
+    </w:p>
+    <w:tbl>
+      <w:tblPr>
+        <w:tblW w:type="auto" w:w="0"/>
+        <w:tblLayout w:type="fixed"/>
+        <w:tblLook w:firstColumn="1" w:firstRow="1" w:lastColumn="0" w:lastRow="0" w:noHBand="0" w:noVBand="1" w:val="04A0"/>
+        <w:tblBorders>
+          <w:top w:val="single" w:sz="4" w:color="AAAAAA"/>
+          <w:bottom w:val="single" w:sz="4" w:color="AAAAAA"/>
+          <w:left w:val="single" w:sz="4" w:color="AAAAAA"/>
+          <w:right w:val="single" w:sz="4" w:color="AAAAAA"/>
+          <w:insideH w:val="single" w:sz="4" w:color="AAAAAA"/>
+          <w:insideV w:val="single" w:sz="4" w:color="AAAAAA"/>
+        </w:tblBorders>
+      </w:tblPr>
+      <w:tblGrid>
+        <w:gridCol w:w="964"/>
+        <w:gridCol w:w="1417"/>
+        <w:gridCol w:w="1757"/>
+      </w:tblGrid>
+      <w:tr>
+        <w:trPr>
+          <w:cantSplit/>
+        </w:trPr>
+        <w:tc>
+          <w:tcPr>
+            <w:tcW w:type="dxa" w:w="964"/>
+          </w:tcPr>
+          <w:p>
+            <w:pPr>
+              <w:keepNext/>
+              <w:spacing w:line="288" w:lineRule="auto" w:after="40" w:before="40"/>
+            </w:pPr>
+            <w:r>
+              <w:rPr>
+                <w:rFonts w:ascii="Times New Roman" w:hAnsi="Times New Roman"/>
+                <w:sz w:val="16"/>
+              </w:rPr>
+              <w:t>Corpus</w:t>
+            </w:r>
+          </w:p>
+        </w:tc>
+        <w:tc>
+          <w:tcPr>
+            <w:tcW w:type="dxa" w:w="1417"/>
+          </w:tcPr>
+          <w:p>
+            <w:pPr>
+              <w:keepNext/>
+              <w:spacing w:line="288" w:lineRule="auto" w:after="40" w:before="40"/>
+            </w:pPr>
+            <w:r>
+              <w:rPr>
+                <w:rFonts w:ascii="Times New Roman" w:hAnsi="Times New Roman"/>
+                <w:sz w:val="16"/>
+              </w:rPr>
+              <w:t>Configuration</w:t>
+            </w:r>
+          </w:p>
+        </w:tc>
+        <w:tc>
+          <w:tcPr>
+            <w:tcW w:type="dxa" w:w="1757"/>
+          </w:tcPr>
+          <w:p>
+            <w:pPr>
+              <w:keepNext/>
+              <w:spacing w:line="288" w:lineRule="auto" w:after="40" w:before="40"/>
+            </w:pPr>
+            <w:r>
+              <w:rPr>
+                <w:rFonts w:ascii="Times New Roman" w:hAnsi="Times New Roman"/>
+                <w:sz w:val="16"/>
+              </w:rPr>
+              <w:t>AP</w:t>
+            </w:r>
+          </w:p>
+        </w:tc>
+      </w:tr>
+      <w:tr>
+        <w:trPr>
+          <w:cantSplit/>
+        </w:trPr>
+        <w:tc>
+          <w:tcPr>
+            <w:tcW w:type="dxa" w:w="964"/>
+          </w:tcPr>
+          <w:p>
+            <w:pPr>
+              <w:keepNext/>
+              <w:spacing w:line="288" w:lineRule="auto" w:after="40" w:before="40"/>
+            </w:pPr>
+            <w:r>
+              <w:rPr>
+                <w:rFonts w:ascii="Times New Roman" w:hAnsi="Times New Roman"/>
+                <w:sz w:val="16"/>
+              </w:rPr>
+              <w:t>CoEdit</w:t>
+            </w:r>
+          </w:p>
+        </w:tc>
+        <w:tc>
+          <w:tcPr>
+            <w:tcW w:type="dxa" w:w="1417"/>
+          </w:tcPr>
+          <w:p>
+            <w:pPr>
+              <w:keepNext/>
+              <w:spacing w:line="288" w:lineRule="auto" w:after="40" w:before="40"/>
+            </w:pPr>
+            <w:r>
+              <w:rPr>
+                <w:rFonts w:ascii="Times New Roman" w:hAnsi="Times New Roman"/>
+                <w:sz w:val="16"/>
+              </w:rPr>
+              <w:t>B</w:t>
+            </w:r>
+          </w:p>
+        </w:tc>
+        <w:tc>
+          <w:tcPr>
+            <w:tcW w:type="dxa" w:w="1757"/>
+          </w:tcPr>
+          <w:p>
+            <w:pPr>
+              <w:keepNext/>
+              <w:spacing w:line="288" w:lineRule="auto" w:after="40" w:before="40"/>
+            </w:pPr>
+            <w:r>
+              <w:rPr>
+                <w:rFonts w:ascii="Times New Roman" w:hAnsi="Times New Roman"/>
+                <w:sz w:val="16"/>
+              </w:rPr>
+              <w:t>0.9899±0.0016</w:t>
+            </w:r>
+          </w:p>
+        </w:tc>
+      </w:tr>
+      <w:tr>
+        <w:trPr>
+          <w:cantSplit/>
+        </w:trPr>
+        <w:tc>
+          <w:tcPr>
+            <w:tcW w:type="dxa" w:w="964"/>
+          </w:tcPr>
+          <w:p>
+            <w:pPr>
+              <w:keepNext/>
+              <w:spacing w:line="288" w:lineRule="auto" w:after="40" w:before="40"/>
+            </w:pPr>
+            <w:r>
+              <w:rPr>
+                <w:rFonts w:ascii="Times New Roman" w:hAnsi="Times New Roman"/>
+                <w:sz w:val="16"/>
+              </w:rPr>
+            </w:r>
+          </w:p>
+        </w:tc>
+        <w:tc>
+          <w:tcPr>
+            <w:tcW w:type="dxa" w:w="1417"/>
+          </w:tcPr>
+          <w:p>
+            <w:pPr>
+              <w:keepNext/>
+              <w:spacing w:line="288" w:lineRule="auto" w:after="40" w:before="40"/>
+            </w:pPr>
+            <w:r>
+              <w:rPr>
+                <w:rFonts w:ascii="Times New Roman" w:hAnsi="Times New Roman"/>
+                <w:sz w:val="16"/>
+              </w:rPr>
+              <w:t>K1: predictor</w:t>
+            </w:r>
+          </w:p>
+        </w:tc>
+        <w:tc>
+          <w:tcPr>
+            <w:tcW w:type="dxa" w:w="1757"/>
+          </w:tcPr>
+          <w:p>
+            <w:pPr>
+              <w:keepNext/>
+              <w:spacing w:line="288" w:lineRule="auto" w:after="40" w:before="40"/>
+            </w:pPr>
+            <w:r>
+              <w:rPr>
+                <w:rFonts w:ascii="Times New Roman" w:hAnsi="Times New Roman"/>
+                <w:sz w:val="16"/>
+              </w:rPr>
+              <w:t>0.7788±0.0193</w:t>
+            </w:r>
+          </w:p>
+        </w:tc>
+      </w:tr>
+      <w:tr>
+        <w:trPr>
+          <w:cantSplit/>
+        </w:trPr>
+        <w:tc>
+          <w:tcPr>
+            <w:tcW w:type="dxa" w:w="964"/>
+          </w:tcPr>
+          <w:p>
+            <w:pPr>
+              <w:keepNext/>
+              <w:spacing w:line="288" w:lineRule="auto" w:after="40" w:before="40"/>
+            </w:pPr>
+            <w:r>
+              <w:rPr>
+                <w:rFonts w:ascii="Times New Roman" w:hAnsi="Times New Roman"/>
+                <w:sz w:val="16"/>
+              </w:rPr>
+            </w:r>
+          </w:p>
+        </w:tc>
+        <w:tc>
+          <w:tcPr>
+            <w:tcW w:type="dxa" w:w="1417"/>
+          </w:tcPr>
+          <w:p>
+            <w:pPr>
+              <w:keepNext/>
+              <w:spacing w:line="288" w:lineRule="auto" w:after="40" w:before="40"/>
+            </w:pPr>
+            <w:r>
+              <w:rPr>
+                <w:rFonts w:ascii="Times New Roman" w:hAnsi="Times New Roman"/>
+                <w:sz w:val="16"/>
+              </w:rPr>
+              <w:t>K2: hard gate</w:t>
+            </w:r>
+          </w:p>
+        </w:tc>
+        <w:tc>
+          <w:tcPr>
+            <w:tcW w:type="dxa" w:w="1757"/>
+          </w:tcPr>
+          <w:p>
+            <w:pPr>
+              <w:keepNext/>
+              <w:spacing w:line="288" w:lineRule="auto" w:after="40" w:before="40"/>
+            </w:pPr>
+            <w:r>
+              <w:rPr>
+                <w:rFonts w:ascii="Times New Roman" w:hAnsi="Times New Roman"/>
+                <w:sz w:val="16"/>
+              </w:rPr>
+              <w:t>0.9868±0.0014</w:t>
+            </w:r>
+          </w:p>
+        </w:tc>
+      </w:tr>
+      <w:tr>
+        <w:trPr>
+          <w:cantSplit/>
+        </w:trPr>
+        <w:tc>
+          <w:tcPr>
+            <w:tcW w:type="dxa" w:w="964"/>
+          </w:tcPr>
+          <w:p>
+            <w:pPr>
+              <w:keepNext/>
+              <w:spacing w:line="288" w:lineRule="auto" w:after="40" w:before="40"/>
+            </w:pPr>
+            <w:r>
+              <w:rPr>
+                <w:rFonts w:ascii="Times New Roman" w:hAnsi="Times New Roman"/>
+                <w:sz w:val="16"/>
+              </w:rPr>
+            </w:r>
+          </w:p>
+        </w:tc>
+        <w:tc>
+          <w:tcPr>
+            <w:tcW w:type="dxa" w:w="1417"/>
+          </w:tcPr>
+          <w:p>
+            <w:pPr>
+              <w:keepNext/>
+              <w:spacing w:line="288" w:lineRule="auto" w:after="40" w:before="40"/>
+            </w:pPr>
+            <w:r>
+              <w:rPr>
+                <w:rFonts w:ascii="Times New Roman" w:hAnsi="Times New Roman"/>
+                <w:sz w:val="16"/>
+              </w:rPr>
+              <w:t>K3: zero floor</w:t>
+            </w:r>
+          </w:p>
+        </w:tc>
+        <w:tc>
+          <w:tcPr>
+            <w:tcW w:type="dxa" w:w="1757"/>
+          </w:tcPr>
+          <w:p>
+            <w:pPr>
+              <w:keepNext/>
+              <w:spacing w:line="288" w:lineRule="auto" w:after="40" w:before="40"/>
+            </w:pPr>
+            <w:r>
+              <w:rPr>
+                <w:rFonts w:ascii="Times New Roman" w:hAnsi="Times New Roman"/>
+                <w:sz w:val="16"/>
+              </w:rPr>
+              <w:t>0.9889±0.0018</w:t>
+            </w:r>
+          </w:p>
+        </w:tc>
+      </w:tr>
+      <w:tr>
+        <w:trPr>
+          <w:cantSplit/>
+        </w:trPr>
+        <w:tc>
+          <w:tcPr>
+            <w:tcW w:type="dxa" w:w="964"/>
+          </w:tcPr>
+          <w:p>
+            <w:pPr>
+              <w:keepNext/>
+              <w:spacing w:line="288" w:lineRule="auto" w:after="40" w:before="40"/>
+            </w:pPr>
+            <w:r>
+              <w:rPr>
+                <w:rFonts w:ascii="Times New Roman" w:hAnsi="Times New Roman"/>
+                <w:sz w:val="16"/>
+              </w:rPr>
+            </w:r>
+          </w:p>
+        </w:tc>
+        <w:tc>
+          <w:tcPr>
+            <w:tcW w:type="dxa" w:w="1417"/>
+          </w:tcPr>
+          <w:p>
+            <w:pPr>
+              <w:keepNext/>
+              <w:spacing w:line="288" w:lineRule="auto" w:after="40" w:before="40"/>
+            </w:pPr>
+            <w:r>
+              <w:rPr>
+                <w:rFonts w:ascii="Times New Roman" w:hAnsi="Times New Roman"/>
+                <w:sz w:val="16"/>
+              </w:rPr>
+              <w:t>K2 + K3</w:t>
+            </w:r>
+          </w:p>
+        </w:tc>
+        <w:tc>
+          <w:tcPr>
+            <w:tcW w:type="dxa" w:w="1757"/>
+          </w:tcPr>
+          <w:p>
+            <w:pPr>
+              <w:keepNext/>
+              <w:spacing w:line="288" w:lineRule="auto" w:after="40" w:before="40"/>
+            </w:pPr>
+            <w:r>
+              <w:rPr>
+                <w:rFonts w:ascii="Times New Roman" w:hAnsi="Times New Roman"/>
+                <w:sz w:val="16"/>
+              </w:rPr>
+              <w:t>0.9870±0.0021</w:t>
+            </w:r>
+          </w:p>
+        </w:tc>
+      </w:tr>
+      <w:tr>
+        <w:trPr>
+          <w:cantSplit/>
+        </w:trPr>
+        <w:tc>
+          <w:tcPr>
+            <w:tcW w:type="dxa" w:w="964"/>
+          </w:tcPr>
+          <w:p>
+            <w:pPr>
+              <w:keepNext/>
+              <w:spacing w:line="288" w:lineRule="auto" w:after="40" w:before="40"/>
+            </w:pPr>
+            <w:r>
+              <w:rPr>
+                <w:rFonts w:ascii="Times New Roman" w:hAnsi="Times New Roman"/>
+                <w:sz w:val="16"/>
+              </w:rPr>
+            </w:r>
+          </w:p>
+        </w:tc>
+        <w:tc>
+          <w:tcPr>
+            <w:tcW w:type="dxa" w:w="1417"/>
+          </w:tcPr>
+          <w:p>
+            <w:pPr>
+              <w:keepNext/>
+              <w:spacing w:line="288" w:lineRule="auto" w:after="40" w:before="40"/>
+            </w:pPr>
+            <w:r>
+              <w:rPr>
+                <w:rFonts w:ascii="Times New Roman" w:hAnsi="Times New Roman"/>
+                <w:sz w:val="16"/>
+              </w:rPr>
+              <w:t>C: K1 + K2 + K3</w:t>
+            </w:r>
+          </w:p>
+        </w:tc>
+        <w:tc>
+          <w:tcPr>
+            <w:tcW w:type="dxa" w:w="1757"/>
+          </w:tcPr>
+          <w:p>
+            <w:pPr>
+              <w:keepNext/>
+              <w:spacing w:line="288" w:lineRule="auto" w:after="40" w:before="40"/>
+            </w:pPr>
+            <w:r>
+              <w:rPr>
+                <w:rFonts w:ascii="Times New Roman" w:hAnsi="Times New Roman"/>
+                <w:sz w:val="16"/>
+              </w:rPr>
+              <w:t>0.7798±0.0221</w:t>
+            </w:r>
+          </w:p>
+        </w:tc>
+      </w:tr>
+      <w:tr>
+        <w:trPr>
+          <w:cantSplit/>
+        </w:trPr>
+        <w:tc>
+          <w:tcPr>
+            <w:tcW w:type="dxa" w:w="964"/>
+          </w:tcPr>
+          <w:p>
+            <w:pPr>
+              <w:keepNext/>
+              <w:spacing w:line="288" w:lineRule="auto" w:after="40" w:before="40"/>
+            </w:pPr>
+            <w:r>
+              <w:rPr>
+                <w:rFonts w:ascii="Times New Roman" w:hAnsi="Times New Roman"/>
+                <w:sz w:val="16"/>
+              </w:rPr>
+              <w:t>Wikipedia</w:t>
+            </w:r>
+          </w:p>
+        </w:tc>
+        <w:tc>
+          <w:tcPr>
+            <w:tcW w:type="dxa" w:w="1417"/>
+          </w:tcPr>
+          <w:p>
+            <w:pPr>
+              <w:keepNext/>
+              <w:spacing w:line="288" w:lineRule="auto" w:after="40" w:before="40"/>
+            </w:pPr>
+            <w:r>
+              <w:rPr>
+                <w:rFonts w:ascii="Times New Roman" w:hAnsi="Times New Roman"/>
+                <w:sz w:val="16"/>
+              </w:rPr>
+              <w:t>B</w:t>
+            </w:r>
+          </w:p>
+        </w:tc>
+        <w:tc>
+          <w:tcPr>
+            <w:tcW w:type="dxa" w:w="1757"/>
+          </w:tcPr>
+          <w:p>
+            <w:pPr>
+              <w:keepNext/>
+              <w:spacing w:line="288" w:lineRule="auto" w:after="40" w:before="40"/>
+            </w:pPr>
+            <w:r>
+              <w:rPr>
+                <w:rFonts w:ascii="Times New Roman" w:hAnsi="Times New Roman"/>
+                <w:sz w:val="16"/>
+              </w:rPr>
+              <w:t>0.9981±0.0002</w:t>
+            </w:r>
+          </w:p>
+        </w:tc>
+      </w:tr>
+      <w:tr>
+        <w:trPr>
+          <w:cantSplit/>
+        </w:trPr>
+        <w:tc>
+          <w:tcPr>
+            <w:tcW w:type="dxa" w:w="964"/>
+          </w:tcPr>
+          <w:p>
+            <w:pPr>
+              <w:keepNext/>
+              <w:spacing w:line="288" w:lineRule="auto" w:after="40" w:before="40"/>
+            </w:pPr>
+            <w:r>
+              <w:rPr>
+                <w:rFonts w:ascii="Times New Roman" w:hAnsi="Times New Roman"/>
+                <w:sz w:val="16"/>
+              </w:rPr>
+            </w:r>
+          </w:p>
+        </w:tc>
+        <w:tc>
+          <w:tcPr>
+            <w:tcW w:type="dxa" w:w="1417"/>
+          </w:tcPr>
+          <w:p>
+            <w:pPr>
+              <w:keepNext/>
+              <w:spacing w:line="288" w:lineRule="auto" w:after="40" w:before="40"/>
+            </w:pPr>
+            <w:r>
+              <w:rPr>
+                <w:rFonts w:ascii="Times New Roman" w:hAnsi="Times New Roman"/>
+                <w:sz w:val="16"/>
+              </w:rPr>
+              <w:t>K1: predictor</w:t>
+            </w:r>
+          </w:p>
+        </w:tc>
+        <w:tc>
+          <w:tcPr>
+            <w:tcW w:type="dxa" w:w="1757"/>
+          </w:tcPr>
+          <w:p>
+            <w:pPr>
+              <w:keepNext/>
+              <w:spacing w:line="288" w:lineRule="auto" w:after="40" w:before="40"/>
+            </w:pPr>
+            <w:r>
+              <w:rPr>
+                <w:rFonts w:ascii="Times New Roman" w:hAnsi="Times New Roman"/>
+                <w:sz w:val="16"/>
+              </w:rPr>
+              <w:t>0.9490±0.0072</w:t>
+            </w:r>
+          </w:p>
+        </w:tc>
+      </w:tr>
+      <w:tr>
+        <w:trPr>
+          <w:cantSplit/>
+        </w:trPr>
+        <w:tc>
+          <w:tcPr>
+            <w:tcW w:type="dxa" w:w="964"/>
+          </w:tcPr>
+          <w:p>
+            <w:pPr>
+              <w:keepNext/>
+              <w:spacing w:line="288" w:lineRule="auto" w:after="40" w:before="40"/>
+            </w:pPr>
+            <w:r>
+              <w:rPr>
+                <w:rFonts w:ascii="Times New Roman" w:hAnsi="Times New Roman"/>
+                <w:sz w:val="16"/>
+              </w:rPr>
+              <w:t>MOOC</w:t>
+            </w:r>
+          </w:p>
+        </w:tc>
+        <w:tc>
+          <w:tcPr>
+            <w:tcW w:type="dxa" w:w="1417"/>
+          </w:tcPr>
+          <w:p>
+            <w:pPr>
+              <w:keepNext/>
+              <w:spacing w:line="288" w:lineRule="auto" w:after="40" w:before="40"/>
+            </w:pPr>
+            <w:r>
+              <w:rPr>
+                <w:rFonts w:ascii="Times New Roman" w:hAnsi="Times New Roman"/>
+                <w:sz w:val="16"/>
+              </w:rPr>
+              <w:t>B</w:t>
+            </w:r>
+          </w:p>
+        </w:tc>
+        <w:tc>
+          <w:tcPr>
+            <w:tcW w:type="dxa" w:w="1757"/>
+          </w:tcPr>
+          <w:p>
+            <w:pPr>
+              <w:keepNext/>
+              <w:spacing w:line="288" w:lineRule="auto" w:after="40" w:before="40"/>
+            </w:pPr>
+            <w:r>
+              <w:rPr>
+                <w:rFonts w:ascii="Times New Roman" w:hAnsi="Times New Roman"/>
+                <w:sz w:val="16"/>
+              </w:rPr>
+              <w:t>0.9935±0.0008</w:t>
+            </w:r>
+          </w:p>
+        </w:tc>
+      </w:tr>
+      <w:tr>
+        <w:trPr>
+          <w:cantSplit/>
+        </w:trPr>
+        <w:tc>
+          <w:tcPr>
+            <w:tcW w:type="dxa" w:w="964"/>
+          </w:tcPr>
+          <w:p>
+            <w:pPr>
+              <w:keepNext w:val="0"/>
+              <w:spacing w:line="288" w:lineRule="auto" w:after="40" w:before="40"/>
+            </w:pPr>
+            <w:r>
+              <w:rPr>
+                <w:rFonts w:ascii="Times New Roman" w:hAnsi="Times New Roman"/>
+                <w:sz w:val="16"/>
+              </w:rPr>
+            </w:r>
+          </w:p>
+        </w:tc>
+        <w:tc>
+          <w:tcPr>
+            <w:tcW w:type="dxa" w:w="1417"/>
+          </w:tcPr>
+          <w:p>
+            <w:pPr>
+              <w:keepNext w:val="0"/>
+              <w:spacing w:line="288" w:lineRule="auto" w:after="40" w:before="40"/>
+            </w:pPr>
+            <w:r>
+              <w:rPr>
+                <w:rFonts w:ascii="Times New Roman" w:hAnsi="Times New Roman"/>
+                <w:sz w:val="16"/>
+              </w:rPr>
+              <w:t>K1: predictor</w:t>
+            </w:r>
+          </w:p>
+        </w:tc>
+        <w:tc>
+          <w:tcPr>
+            <w:tcW w:type="dxa" w:w="1757"/>
+          </w:tcPr>
+          <w:p>
+            <w:pPr>
+              <w:keepNext w:val="0"/>
+              <w:spacing w:line="288" w:lineRule="auto" w:after="40" w:before="40"/>
+            </w:pPr>
+            <w:r>
+              <w:rPr>
+                <w:rFonts w:ascii="Times New Roman" w:hAnsi="Times New Roman"/>
+                <w:sz w:val="16"/>
+              </w:rPr>
+              <w:t>0.9844±0.0017</w:t>
+            </w:r>
+          </w:p>
+        </w:tc>
+      </w:tr>
+    </w:tbl>
+    <w:p>
+      <w:pPr>
+        <w:pStyle w:val="BodyText"/>
+        <w:widowControl/>
+        <w:spacing w:before="0" w:after="0" w:line="270" w:lineRule="atLeast"/>
+        <w:ind w:firstLine="270"/>
+        <w:jc w:val="both"/>
+      </w:pPr>
+      <w:r>
+        <w:rPr>
+          <w:rFonts w:ascii="Times New Roman" w:hAnsi="Times New Roman" w:eastAsia="Songti TC"/>
+          <w:color w:val="000000"/>
+          <w:sz w:val="18"/>
+        </w:rPr>
+        <w:t xml:space="preserve">On CoEdit, enabling the main predictor produces the largest observed reduction, whereas the gate-only variants remain close to B. The combined C preset also lies near K1. The corresponding B–K1 ordering appears on Wikipedia and MOOC, with smaller differences. This pattern points to predictor choice as an important part of the earlier result. It does not establish that gate changes are universally irrelevant: only the recorded settings and budgets were tested, and interactions can depend on the readout. In particular, K1 is not the same intervention as reconnecting the scored features of an otherwise unchanged hierarchical head.</w:t>
+      </w:r>
+    </w:p>
+    <w:bookmarkEnd w:id="38"/>
+    <w:bookmarkStart w:id="39" w:name="_08fb06979748610b4ace46a526af3bd41272715"/>
+    <w:p>
+      <w:pPr>
+        <w:pStyle w:val="Heading2"/>
+        <w:widowControl/>
+        <w:spacing w:before="160" w:after="60" w:line="270" w:lineRule="atLeast"/>
+        <w:ind w:firstLine="0"/>
+        <w:jc w:val="left"/>
+      </w:pPr>
+      <w:r>
+        <w:rPr>
+          <w:b/>
+          <w:sz w:val="18"/>
+        </w:rPr>
+        <w:t>4. Sensitivity to harder candidate pools</w:t>
+      </w:r>
+    </w:p>
+    <w:p>
+      <w:pPr>
+        <w:pStyle w:val="Normal"/>
+        <w:widowControl/>
+        <w:spacing w:before="0" w:after="0" w:line="270" w:lineRule="atLeast"/>
+        <w:ind w:firstLine="270"/>
+        <w:jc w:val="both"/>
+      </w:pPr>
+      <w:r>
+        <w:rPr>
+          <w:rFonts w:ascii="Times New Roman" w:hAnsi="Times New Roman" w:eastAsia="Songti TC"/>
+          <w:color w:val="000000"/>
+          <w:sz w:val="18"/>
+        </w:rPr>
+        <w:t xml:space="preserve">Table 5 restores the harder-negative experiment. Each trained model is evaluated under three candidate-pool rules; these evaluations are repeated measurements of that model, not independent retrainings. The records specify a fixed evaluation seed for pairing B and K1.</w:t>
+      </w:r>
+    </w:p>
+    <w:p>
+      <w:pPr>
+        <w:pStyle w:val="BodyText"/>
+        <w:widowControl/>
+        <w:spacing w:before="0" w:after="0" w:line="270" w:lineRule="atLeast"/>
+        <w:ind w:firstLine="270"/>
+        <w:jc w:val="both"/>
+      </w:pPr>
+      <w:r>
+        <w:rPr>
+          <w:rFonts w:ascii="Times New Roman" w:hAnsi="Times New Roman" w:eastAsia="Songti TC"/>
+          <w:color w:val="000000"/>
+          <w:sz w:val="18"/>
+        </w:rPr>
+        <w:t xml:space="preserve">The sampler labels require a precise interpretation. In the accompanying implementation, the historical pool is a multiset of training destinations, and the inductive pool is a multiset of destinations belonging to test pairs absent from training. Candidates are drawn from these destination pools and combined with the evaluated source. Thus, a historical candidate need not be a previously observed partner of that particular source, and inductive here does not mean exclusively unseen nodes. The legacy field named</w:t>
+      </w:r>
+      <w:r>
+        <w:rPr>
+          <w:rFonts w:ascii="Times New Roman" w:hAnsi="Times New Roman" w:eastAsia="Songti TC"/>
+          <w:color w:val="000000"/>
+          <w:sz w:val="18"/>
+        </w:rPr>
+        <w:t xml:space="preserve"> </w:t>
+      </w:r>
+      <w:r>
+        <w:rPr>
+          <w:rStyle w:val="VerbatimChar"/>
+          <w:rFonts w:ascii="Times New Roman" w:hAnsi="Times New Roman" w:eastAsia="Songti TC"/>
+          <w:color w:val="000000"/>
+          <w:sz w:val="18"/>
+        </w:rPr>
+        <w:t xml:space="preserve">indpool_from_train</w:t>
+      </w:r>
+      <w:r>
+        <w:rPr>
+          <w:rFonts w:ascii="Times New Roman" w:hAnsi="Times New Roman" w:eastAsia="Songti TC"/>
+          <w:color w:val="000000"/>
+          <w:sz w:val="18"/>
+        </w:rPr>
+        <w:t xml:space="preserve"> </w:t>
+      </w:r>
+      <w:r>
+        <w:rPr>
+          <w:rFonts w:ascii="Times New Roman" w:hAnsi="Times New Roman" w:eastAsia="Songti TC"/>
+          <w:color w:val="000000"/>
+          <w:sz w:val="18"/>
+        </w:rPr>
+        <w:t xml:space="preserve">denotes a nonempty test-only pool in the corrected implementation. Its name should not be read as the pool definition.</w:t>
+      </w:r>
+    </w:p>
+    <w:p>
+      <w:pPr>
+        <w:pStyle w:val="BodyText"/>
+        <w:keepNext/>
+        <w:widowControl/>
+        <w:spacing w:before="120" w:after="100" w:line="270" w:lineRule="atLeast"/>
+        <w:ind w:firstLine="0"/>
+        <w:jc w:val="center"/>
+      </w:pPr>
+      <w:r>
+        <w:rPr>
+          <w:b/>
+        </w:rPr>
+        <w:t>Table 5. Candidate-pool sensitivity.</w:t>
+      </w:r>
+    </w:p>
+    <w:tbl>
+      <w:tblPr>
+        <w:tblW w:type="auto" w:w="0"/>
+        <w:tblLayout w:type="fixed"/>
+        <w:tblLook w:firstColumn="1" w:firstRow="1" w:lastColumn="0" w:lastRow="0" w:noHBand="0" w:noVBand="1" w:val="04A0"/>
+        <w:tblBorders>
+          <w:top w:val="single" w:sz="4" w:color="AAAAAA"/>
+          <w:bottom w:val="single" w:sz="4" w:color="AAAAAA"/>
+          <w:left w:val="single" w:sz="4" w:color="AAAAAA"/>
+          <w:right w:val="single" w:sz="4" w:color="AAAAAA"/>
+          <w:insideH w:val="single" w:sz="4" w:color="AAAAAA"/>
+          <w:insideV w:val="single" w:sz="4" w:color="AAAAAA"/>
+        </w:tblBorders>
+      </w:tblPr>
+      <w:tblGrid>
+        <w:gridCol w:w="935"/>
+        <w:gridCol w:w="935"/>
+        <w:gridCol w:w="1304"/>
+        <w:gridCol w:w="1304"/>
+      </w:tblGrid>
+      <w:tr>
+        <w:trPr>
+          <w:cantSplit/>
+        </w:trPr>
+        <w:tc>
+          <w:tcPr>
+            <w:tcW w:type="dxa" w:w="935"/>
+          </w:tcPr>
+          <w:p>
+            <w:pPr>
+              <w:keepNext/>
+              <w:spacing w:line="288" w:lineRule="auto" w:after="40" w:before="40"/>
+            </w:pPr>
+            <w:r>
+              <w:rPr>
+                <w:rFonts w:ascii="Times New Roman" w:hAnsi="Times New Roman"/>
+                <w:sz w:val="16"/>
+              </w:rPr>
+              <w:t>Corpus</w:t>
+            </w:r>
+          </w:p>
+        </w:tc>
+        <w:tc>
+          <w:tcPr>
+            <w:tcW w:type="dxa" w:w="935"/>
+          </w:tcPr>
+          <w:p>
+            <w:pPr>
+              <w:keepNext/>
+              <w:spacing w:line="288" w:lineRule="auto" w:after="40" w:before="40"/>
+            </w:pPr>
+            <w:r>
+              <w:rPr>
+                <w:rFonts w:ascii="Times New Roman" w:hAnsi="Times New Roman"/>
+                <w:sz w:val="16"/>
+              </w:rPr>
+              <w:t>Pool</w:t>
+            </w:r>
+          </w:p>
+        </w:tc>
+        <w:tc>
+          <w:tcPr>
+            <w:tcW w:type="dxa" w:w="1304"/>
+          </w:tcPr>
+          <w:p>
+            <w:pPr>
+              <w:keepNext/>
+              <w:spacing w:line="288" w:lineRule="auto" w:after="40" w:before="40"/>
+            </w:pPr>
+            <w:r>
+              <w:rPr>
+                <w:rFonts w:ascii="Times New Roman" w:hAnsi="Times New Roman"/>
+                <w:sz w:val="16"/>
+              </w:rPr>
+              <w:t>B</w:t>
+            </w:r>
+          </w:p>
+        </w:tc>
+        <w:tc>
+          <w:tcPr>
+            <w:tcW w:type="dxa" w:w="1304"/>
+          </w:tcPr>
+          <w:p>
+            <w:pPr>
+              <w:keepNext/>
+              <w:spacing w:line="288" w:lineRule="auto" w:after="40" w:before="40"/>
+            </w:pPr>
+            <w:r>
+              <w:rPr>
+                <w:rFonts w:ascii="Times New Roman" w:hAnsi="Times New Roman"/>
+                <w:sz w:val="16"/>
+              </w:rPr>
+              <w:t>K1</w:t>
+            </w:r>
+          </w:p>
+        </w:tc>
+      </w:tr>
+      <w:tr>
+        <w:trPr>
+          <w:cantSplit/>
+        </w:trPr>
+        <w:tc>
+          <w:tcPr>
+            <w:tcW w:type="dxa" w:w="935"/>
+          </w:tcPr>
+          <w:p>
+            <w:pPr>
+              <w:keepNext/>
+              <w:spacing w:line="288" w:lineRule="auto" w:after="40" w:before="40"/>
+            </w:pPr>
+            <w:r>
+              <w:rPr>
+                <w:rFonts w:ascii="Times New Roman" w:hAnsi="Times New Roman"/>
+                <w:sz w:val="16"/>
+              </w:rPr>
+              <w:t>CoEdit</w:t>
+            </w:r>
+          </w:p>
+        </w:tc>
+        <w:tc>
+          <w:tcPr>
+            <w:tcW w:type="dxa" w:w="935"/>
+          </w:tcPr>
+          <w:p>
+            <w:pPr>
+              <w:keepNext/>
+              <w:spacing w:line="288" w:lineRule="auto" w:after="40" w:before="40"/>
+            </w:pPr>
+            <w:r>
+              <w:rPr>
+                <w:rFonts w:ascii="Times New Roman" w:hAnsi="Times New Roman"/>
+                <w:sz w:val="16"/>
+              </w:rPr>
+              <w:t>Random</w:t>
+            </w:r>
+          </w:p>
+        </w:tc>
+        <w:tc>
+          <w:tcPr>
+            <w:tcW w:type="dxa" w:w="1304"/>
+          </w:tcPr>
+          <w:p>
+            <w:pPr>
+              <w:keepNext/>
+              <w:spacing w:line="288" w:lineRule="auto" w:after="40" w:before="40"/>
+            </w:pPr>
+            <w:r>
+              <w:rPr>
+                <w:rFonts w:ascii="Times New Roman" w:hAnsi="Times New Roman"/>
+                <w:sz w:val="16"/>
+              </w:rPr>
+              <w:t>0.9898±0.0012</w:t>
+            </w:r>
+          </w:p>
+        </w:tc>
+        <w:tc>
+          <w:tcPr>
+            <w:tcW w:type="dxa" w:w="1304"/>
+          </w:tcPr>
+          <w:p>
+            <w:pPr>
+              <w:keepNext/>
+              <w:spacing w:line="288" w:lineRule="auto" w:after="40" w:before="40"/>
+            </w:pPr>
+            <w:r>
+              <w:rPr>
+                <w:rFonts w:ascii="Times New Roman" w:hAnsi="Times New Roman"/>
+                <w:sz w:val="16"/>
+              </w:rPr>
+              <w:t>0.7899±0.0545</w:t>
+            </w:r>
+          </w:p>
+        </w:tc>
+      </w:tr>
+      <w:tr>
+        <w:trPr>
+          <w:cantSplit/>
+        </w:trPr>
+        <w:tc>
+          <w:tcPr>
+            <w:tcW w:type="dxa" w:w="935"/>
+          </w:tcPr>
+          <w:p>
+            <w:pPr>
+              <w:keepNext/>
+              <w:spacing w:line="288" w:lineRule="auto" w:after="40" w:before="40"/>
+            </w:pPr>
+            <w:r>
+              <w:rPr>
+                <w:rFonts w:ascii="Times New Roman" w:hAnsi="Times New Roman"/>
+                <w:sz w:val="16"/>
+              </w:rPr>
+            </w:r>
+          </w:p>
+        </w:tc>
+        <w:tc>
+          <w:tcPr>
+            <w:tcW w:type="dxa" w:w="935"/>
+          </w:tcPr>
+          <w:p>
+            <w:pPr>
+              <w:keepNext/>
+              <w:spacing w:line="288" w:lineRule="auto" w:after="40" w:before="40"/>
+            </w:pPr>
+            <w:r>
+              <w:rPr>
+                <w:rFonts w:ascii="Times New Roman" w:hAnsi="Times New Roman"/>
+                <w:sz w:val="16"/>
+              </w:rPr>
+              <w:t>Historical</w:t>
+            </w:r>
+          </w:p>
+        </w:tc>
+        <w:tc>
+          <w:tcPr>
+            <w:tcW w:type="dxa" w:w="1304"/>
+          </w:tcPr>
+          <w:p>
+            <w:pPr>
+              <w:keepNext/>
+              <w:spacing w:line="288" w:lineRule="auto" w:after="40" w:before="40"/>
+            </w:pPr>
+            <w:r>
+              <w:rPr>
+                <w:rFonts w:ascii="Times New Roman" w:hAnsi="Times New Roman"/>
+                <w:sz w:val="16"/>
+              </w:rPr>
+              <w:t>0.9573±0.0031</w:t>
+            </w:r>
+          </w:p>
+        </w:tc>
+        <w:tc>
+          <w:tcPr>
+            <w:tcW w:type="dxa" w:w="1304"/>
+          </w:tcPr>
+          <w:p>
+            <w:pPr>
+              <w:keepNext/>
+              <w:spacing w:line="288" w:lineRule="auto" w:after="40" w:before="40"/>
+            </w:pPr>
+            <w:r>
+              <w:rPr>
+                <w:rFonts w:ascii="Times New Roman" w:hAnsi="Times New Roman"/>
+                <w:sz w:val="16"/>
+              </w:rPr>
+              <w:t>0.5294±0.0276</w:t>
+            </w:r>
+          </w:p>
+        </w:tc>
+      </w:tr>
+      <w:tr>
+        <w:trPr>
+          <w:cantSplit/>
+        </w:trPr>
+        <w:tc>
+          <w:tcPr>
+            <w:tcW w:type="dxa" w:w="935"/>
+          </w:tcPr>
+          <w:p>
+            <w:pPr>
+              <w:keepNext/>
+              <w:spacing w:line="288" w:lineRule="auto" w:after="40" w:before="40"/>
+            </w:pPr>
+            <w:r>
+              <w:rPr>
+                <w:rFonts w:ascii="Times New Roman" w:hAnsi="Times New Roman"/>
+                <w:sz w:val="16"/>
+              </w:rPr>
+            </w:r>
+          </w:p>
+        </w:tc>
+        <w:tc>
+          <w:tcPr>
+            <w:tcW w:type="dxa" w:w="935"/>
+          </w:tcPr>
+          <w:p>
+            <w:pPr>
+              <w:keepNext/>
+              <w:spacing w:line="288" w:lineRule="auto" w:after="40" w:before="40"/>
+            </w:pPr>
+            <w:r>
+              <w:rPr>
+                <w:rFonts w:ascii="Times New Roman" w:hAnsi="Times New Roman"/>
+                <w:sz w:val="16"/>
+              </w:rPr>
+              <w:t>Inductive</w:t>
+            </w:r>
+          </w:p>
+        </w:tc>
+        <w:tc>
+          <w:tcPr>
+            <w:tcW w:type="dxa" w:w="1304"/>
+          </w:tcPr>
+          <w:p>
+            <w:pPr>
+              <w:keepNext/>
+              <w:spacing w:line="288" w:lineRule="auto" w:after="40" w:before="40"/>
+            </w:pPr>
+            <w:r>
+              <w:rPr>
+                <w:rFonts w:ascii="Times New Roman" w:hAnsi="Times New Roman"/>
+                <w:sz w:val="16"/>
+              </w:rPr>
+              <w:t>0.9625±0.0024</w:t>
+            </w:r>
+          </w:p>
+        </w:tc>
+        <w:tc>
+          <w:tcPr>
+            <w:tcW w:type="dxa" w:w="1304"/>
+          </w:tcPr>
+          <w:p>
+            <w:pPr>
+              <w:keepNext/>
+              <w:spacing w:line="288" w:lineRule="auto" w:after="40" w:before="40"/>
+            </w:pPr>
+            <w:r>
+              <w:rPr>
+                <w:rFonts w:ascii="Times New Roman" w:hAnsi="Times New Roman"/>
+                <w:sz w:val="16"/>
+              </w:rPr>
+              <w:t>0.5579±0.0215</w:t>
+            </w:r>
+          </w:p>
+        </w:tc>
+      </w:tr>
+      <w:tr>
+        <w:trPr>
+          <w:cantSplit/>
+        </w:trPr>
+        <w:tc>
+          <w:tcPr>
+            <w:tcW w:type="dxa" w:w="935"/>
+          </w:tcPr>
+          <w:p>
+            <w:pPr>
+              <w:keepNext/>
+              <w:spacing w:line="288" w:lineRule="auto" w:after="40" w:before="40"/>
+            </w:pPr>
+            <w:r>
+              <w:rPr>
+                <w:rFonts w:ascii="Times New Roman" w:hAnsi="Times New Roman"/>
+                <w:sz w:val="16"/>
+              </w:rPr>
+              <w:t>Wikipedia</w:t>
+            </w:r>
+          </w:p>
+        </w:tc>
+        <w:tc>
+          <w:tcPr>
+            <w:tcW w:type="dxa" w:w="935"/>
+          </w:tcPr>
+          <w:p>
+            <w:pPr>
+              <w:keepNext/>
+              <w:spacing w:line="288" w:lineRule="auto" w:after="40" w:before="40"/>
+            </w:pPr>
+            <w:r>
+              <w:rPr>
+                <w:rFonts w:ascii="Times New Roman" w:hAnsi="Times New Roman"/>
+                <w:sz w:val="16"/>
+              </w:rPr>
+              <w:t>Random</w:t>
+            </w:r>
+          </w:p>
+        </w:tc>
+        <w:tc>
+          <w:tcPr>
+            <w:tcW w:type="dxa" w:w="1304"/>
+          </w:tcPr>
+          <w:p>
+            <w:pPr>
+              <w:keepNext/>
+              <w:spacing w:line="288" w:lineRule="auto" w:after="40" w:before="40"/>
+            </w:pPr>
+            <w:r>
+              <w:rPr>
+                <w:rFonts w:ascii="Times New Roman" w:hAnsi="Times New Roman"/>
+                <w:sz w:val="16"/>
+              </w:rPr>
+              <w:t>0.9968±0.0005</w:t>
+            </w:r>
+          </w:p>
+        </w:tc>
+        <w:tc>
+          <w:tcPr>
+            <w:tcW w:type="dxa" w:w="1304"/>
+          </w:tcPr>
+          <w:p>
+            <w:pPr>
+              <w:keepNext/>
+              <w:spacing w:line="288" w:lineRule="auto" w:after="40" w:before="40"/>
+            </w:pPr>
+            <w:r>
+              <w:rPr>
+                <w:rFonts w:ascii="Times New Roman" w:hAnsi="Times New Roman"/>
+                <w:sz w:val="16"/>
+              </w:rPr>
+              <w:t>0.9011±0.0106</w:t>
+            </w:r>
+          </w:p>
+        </w:tc>
+      </w:tr>
+      <w:tr>
+        <w:trPr>
+          <w:cantSplit/>
+        </w:trPr>
+        <w:tc>
+          <w:tcPr>
+            <w:tcW w:type="dxa" w:w="935"/>
+          </w:tcPr>
+          <w:p>
+            <w:pPr>
+              <w:keepNext/>
+              <w:spacing w:line="288" w:lineRule="auto" w:after="40" w:before="40"/>
+            </w:pPr>
+            <w:r>
+              <w:rPr>
+                <w:rFonts w:ascii="Times New Roman" w:hAnsi="Times New Roman"/>
+                <w:sz w:val="16"/>
+              </w:rPr>
+            </w:r>
+          </w:p>
+        </w:tc>
+        <w:tc>
+          <w:tcPr>
+            <w:tcW w:type="dxa" w:w="935"/>
+          </w:tcPr>
+          <w:p>
+            <w:pPr>
+              <w:keepNext/>
+              <w:spacing w:line="288" w:lineRule="auto" w:after="40" w:before="40"/>
+            </w:pPr>
+            <w:r>
+              <w:rPr>
+                <w:rFonts w:ascii="Times New Roman" w:hAnsi="Times New Roman"/>
+                <w:sz w:val="16"/>
+              </w:rPr>
+              <w:t>Historical</w:t>
+            </w:r>
+          </w:p>
+        </w:tc>
+        <w:tc>
+          <w:tcPr>
+            <w:tcW w:type="dxa" w:w="1304"/>
+          </w:tcPr>
+          <w:p>
+            <w:pPr>
+              <w:keepNext/>
+              <w:spacing w:line="288" w:lineRule="auto" w:after="40" w:before="40"/>
+            </w:pPr>
+            <w:r>
+              <w:rPr>
+                <w:rFonts w:ascii="Times New Roman" w:hAnsi="Times New Roman"/>
+                <w:sz w:val="16"/>
+              </w:rPr>
+              <w:t>0.9744±0.0047</w:t>
+            </w:r>
+          </w:p>
+        </w:tc>
+        <w:tc>
+          <w:tcPr>
+            <w:tcW w:type="dxa" w:w="1304"/>
+          </w:tcPr>
+          <w:p>
+            <w:pPr>
+              <w:keepNext/>
+              <w:spacing w:line="288" w:lineRule="auto" w:after="40" w:before="40"/>
+            </w:pPr>
+            <w:r>
+              <w:rPr>
+                <w:rFonts w:ascii="Times New Roman" w:hAnsi="Times New Roman"/>
+                <w:sz w:val="16"/>
+              </w:rPr>
+              <w:t>0.5585±0.0147</w:t>
+            </w:r>
+          </w:p>
+        </w:tc>
+      </w:tr>
+      <w:tr>
+        <w:trPr>
+          <w:cantSplit/>
+        </w:trPr>
+        <w:tc>
+          <w:tcPr>
+            <w:tcW w:type="dxa" w:w="935"/>
+          </w:tcPr>
+          <w:p>
+            <w:pPr>
+              <w:keepNext w:val="0"/>
+              <w:spacing w:line="288" w:lineRule="auto" w:after="40" w:before="40"/>
+            </w:pPr>
+            <w:r>
+              <w:rPr>
+                <w:rFonts w:ascii="Times New Roman" w:hAnsi="Times New Roman"/>
+                <w:sz w:val="16"/>
+              </w:rPr>
+            </w:r>
+          </w:p>
+        </w:tc>
+        <w:tc>
+          <w:tcPr>
+            <w:tcW w:type="dxa" w:w="935"/>
+          </w:tcPr>
+          <w:p>
+            <w:pPr>
+              <w:keepNext w:val="0"/>
+              <w:spacing w:line="288" w:lineRule="auto" w:after="40" w:before="40"/>
+            </w:pPr>
+            <w:r>
+              <w:rPr>
+                <w:rFonts w:ascii="Times New Roman" w:hAnsi="Times New Roman"/>
+                <w:sz w:val="16"/>
+              </w:rPr>
+              <w:t>Inductive</w:t>
+            </w:r>
+          </w:p>
+        </w:tc>
+        <w:tc>
+          <w:tcPr>
+            <w:tcW w:type="dxa" w:w="1304"/>
+          </w:tcPr>
+          <w:p>
+            <w:pPr>
+              <w:keepNext w:val="0"/>
+              <w:spacing w:line="288" w:lineRule="auto" w:after="40" w:before="40"/>
+            </w:pPr>
+            <w:r>
+              <w:rPr>
+                <w:rFonts w:ascii="Times New Roman" w:hAnsi="Times New Roman"/>
+                <w:sz w:val="16"/>
+              </w:rPr>
+              <w:t>0.9682±0.0035</w:t>
+            </w:r>
+          </w:p>
+        </w:tc>
+        <w:tc>
+          <w:tcPr>
+            <w:tcW w:type="dxa" w:w="1304"/>
+          </w:tcPr>
+          <w:p>
+            <w:pPr>
+              <w:keepNext w:val="0"/>
+              <w:spacing w:line="288" w:lineRule="auto" w:after="40" w:before="40"/>
+            </w:pPr>
+            <w:r>
+              <w:rPr>
+                <w:rFonts w:ascii="Times New Roman" w:hAnsi="Times New Roman"/>
+                <w:sz w:val="16"/>
+              </w:rPr>
+              <w:t>0.5423±0.0032</w:t>
+            </w:r>
+          </w:p>
+        </w:tc>
+      </w:tr>
+    </w:tbl>
+    <w:p>
+      <w:pPr>
+        <w:pStyle w:val="BodyText"/>
+        <w:widowControl/>
+        <w:spacing w:before="0" w:after="0" w:line="270" w:lineRule="atLeast"/>
+        <w:ind w:firstLine="270"/>
+        <w:jc w:val="both"/>
+      </w:pPr>
+      <w:r>
+        <w:rPr>
+          <w:rFonts w:ascii="Times New Roman" w:hAnsi="Times New Roman" w:eastAsia="Songti TC"/>
+          <w:color w:val="000000"/>
+          <w:sz w:val="18"/>
+        </w:rPr>
+        <w:t xml:space="preserve">Both configurations lose AP under the harder pools, but K1 loses substantially more. B retains the higher mean in every reported corpus–pool combination. This extends the descriptive B–K1 ordering beyond the random-destination setting used in those records. It does not establish equivalent behavior for the current same-readout detach contrast, which was not evaluated under these archived pools.</w:t>
+      </w:r>
+    </w:p>
+    <w:p>
+      <w:pPr>
+        <w:pStyle w:val="BodyText"/>
+        <w:widowControl/>
+        <w:spacing w:before="0" w:after="0" w:line="270" w:lineRule="atLeast"/>
+        <w:ind w:firstLine="270"/>
+        <w:jc w:val="both"/>
+      </w:pPr>
+      <w:r>
+        <w:rPr>
+          <w:rFonts w:ascii="Times New Roman" w:hAnsi="Times New Roman" w:eastAsia="Songti TC"/>
+          <w:color w:val="000000"/>
+          <w:sz w:val="18"/>
+        </w:rPr>
+        <w:t xml:space="preserve">There are further limits to this sensitivity test. The inductive pool uses test-split membership to construct an offline evaluation population. The rejection loop checks against positive pairs from the evaluation split but stops after a bounded number of retries, so it does not guarantee that every sampled negative is valid. The retained summaries do not count residual collisions. Accordingly, these results characterize the implemented pool perturbations, rather than certify benchmark parity or a fully causal online candidate-generation policy.</w:t>
+      </w:r>
+    </w:p>
+    <w:bookmarkEnd w:id="39"/>
+    <w:bookmarkStart w:id="40" w:name="_b3cfa227b7d0e9ce73782872bfd61889e241cb0"/>
+    <w:p>
+      <w:pPr>
+        <w:pStyle w:val="Heading2"/>
+        <w:widowControl/>
+        <w:spacing w:before="160" w:after="60" w:line="270" w:lineRule="atLeast"/>
+        <w:ind w:firstLine="0"/>
+        <w:jc w:val="left"/>
+      </w:pPr>
+      <w:r>
+        <w:rPr>
+          <w:b/>
+          <w:sz w:val="18"/>
+        </w:rPr>
+        <w:t>5. Contribution of the learned backbone</w:t>
+      </w:r>
+    </w:p>
+    <w:p>
+      <w:pPr>
+        <w:pStyle w:val="Normal"/>
+        <w:widowControl/>
+        <w:spacing w:before="0" w:after="0" w:line="270" w:lineRule="atLeast"/>
+        <w:ind w:firstLine="270"/>
+        <w:jc w:val="both"/>
+      </w:pPr>
+      <w:r>
+        <w:rPr>
+          <w:rFonts w:ascii="Times New Roman" w:hAnsi="Times New Roman" w:eastAsia="Songti TC"/>
+          <w:color w:val="000000"/>
+          <w:sz w:val="18"/>
+        </w:rPr>
+        <w:t xml:space="preserve">The backbone-removal experiment asks whether deterministic pair histories alone explain the performance of B. The reduced arm bypasses the event encoder and recurrent-memory contribution, keeps the memory unchanged, and supplies zero learned edge features to the scoring head. Pair-history channels remain available. The scoring head is still trainable, so this is a deterministic-feature representation with a learned readout, not a globally parameter-free model.</w:t>
+      </w:r>
+    </w:p>
+    <w:p>
+      <w:pPr>
+        <w:pStyle w:val="BodyText"/>
+        <w:keepNext/>
+        <w:widowControl/>
+        <w:spacing w:before="120" w:after="100" w:line="270" w:lineRule="atLeast"/>
+        <w:ind w:firstLine="0"/>
+        <w:jc w:val="center"/>
+      </w:pPr>
+      <w:r>
+        <w:rPr>
+          <w:b/>
+        </w:rPr>
+        <w:t>Table 6. Learned-backbone contribution.</w:t>
+      </w:r>
+    </w:p>
+    <w:tbl>
+      <w:tblPr>
+        <w:tblW w:type="auto" w:w="0"/>
+        <w:tblLayout w:type="fixed"/>
+        <w:tblLook w:firstColumn="1" w:firstRow="1" w:lastColumn="0" w:lastRow="0" w:noHBand="0" w:noVBand="1" w:val="04A0"/>
+        <w:tblBorders>
+          <w:top w:val="single" w:sz="4" w:color="AAAAAA"/>
+          <w:bottom w:val="single" w:sz="4" w:color="AAAAAA"/>
+          <w:left w:val="single" w:sz="4" w:color="AAAAAA"/>
+          <w:right w:val="single" w:sz="4" w:color="AAAAAA"/>
+          <w:insideH w:val="single" w:sz="4" w:color="AAAAAA"/>
+          <w:insideV w:val="single" w:sz="4" w:color="AAAAAA"/>
+        </w:tblBorders>
+      </w:tblPr>
+      <w:tblGrid>
+        <w:gridCol w:w="964"/>
+        <w:gridCol w:w="1417"/>
+        <w:gridCol w:w="1757"/>
+      </w:tblGrid>
+      <w:tr>
+        <w:trPr>
+          <w:cantSplit/>
+        </w:trPr>
+        <w:tc>
+          <w:tcPr>
+            <w:tcW w:type="dxa" w:w="964"/>
+          </w:tcPr>
+          <w:p>
+            <w:pPr>
+              <w:keepNext/>
+              <w:spacing w:line="288" w:lineRule="auto" w:after="40" w:before="40"/>
+            </w:pPr>
+            <w:r>
+              <w:rPr>
+                <w:rFonts w:ascii="Times New Roman" w:hAnsi="Times New Roman"/>
+                <w:sz w:val="16"/>
+              </w:rPr>
+              <w:t>Corpus</w:t>
+            </w:r>
+          </w:p>
+        </w:tc>
+        <w:tc>
+          <w:tcPr>
+            <w:tcW w:type="dxa" w:w="1417"/>
+          </w:tcPr>
+          <w:p>
+            <w:pPr>
+              <w:keepNext/>
+              <w:spacing w:line="288" w:lineRule="auto" w:after="40" w:before="40"/>
+            </w:pPr>
+            <w:r>
+              <w:rPr>
+                <w:rFonts w:ascii="Times New Roman" w:hAnsi="Times New Roman"/>
+                <w:sz w:val="16"/>
+              </w:rPr>
+              <w:t>Representation</w:t>
+            </w:r>
+          </w:p>
+        </w:tc>
+        <w:tc>
+          <w:tcPr>
+            <w:tcW w:type="dxa" w:w="1757"/>
+          </w:tcPr>
+          <w:p>
+            <w:pPr>
+              <w:keepNext/>
+              <w:spacing w:line="288" w:lineRule="auto" w:after="40" w:before="40"/>
+            </w:pPr>
+            <w:r>
+              <w:rPr>
+                <w:rFonts w:ascii="Times New Roman" w:hAnsi="Times New Roman"/>
+                <w:sz w:val="16"/>
+              </w:rPr>
+              <w:t>Inductive AP</w:t>
+            </w:r>
+          </w:p>
+        </w:tc>
+      </w:tr>
+      <w:tr>
+        <w:trPr>
+          <w:cantSplit/>
+        </w:trPr>
+        <w:tc>
+          <w:tcPr>
+            <w:tcW w:type="dxa" w:w="964"/>
+          </w:tcPr>
+          <w:p>
+            <w:pPr>
+              <w:keepNext/>
+              <w:spacing w:line="288" w:lineRule="auto" w:after="40" w:before="40"/>
+            </w:pPr>
+            <w:r>
+              <w:rPr>
+                <w:rFonts w:ascii="Times New Roman" w:hAnsi="Times New Roman"/>
+                <w:sz w:val="16"/>
+              </w:rPr>
+              <w:t>CoEdit</w:t>
+            </w:r>
+          </w:p>
+        </w:tc>
+        <w:tc>
+          <w:tcPr>
+            <w:tcW w:type="dxa" w:w="1417"/>
+          </w:tcPr>
+          <w:p>
+            <w:pPr>
+              <w:keepNext/>
+              <w:spacing w:line="288" w:lineRule="auto" w:after="40" w:before="40"/>
+            </w:pPr>
+            <w:r>
+              <w:rPr>
+                <w:rFonts w:ascii="Times New Roman" w:hAnsi="Times New Roman"/>
+                <w:sz w:val="16"/>
+              </w:rPr>
+              <w:t>Full B</w:t>
+            </w:r>
+          </w:p>
+        </w:tc>
+        <w:tc>
+          <w:tcPr>
+            <w:tcW w:type="dxa" w:w="1757"/>
+          </w:tcPr>
+          <w:p>
+            <w:pPr>
+              <w:keepNext/>
+              <w:spacing w:line="288" w:lineRule="auto" w:after="40" w:before="40"/>
+            </w:pPr>
+            <w:r>
+              <w:rPr>
+                <w:rFonts w:ascii="Times New Roman" w:hAnsi="Times New Roman"/>
+                <w:sz w:val="16"/>
+              </w:rPr>
+              <w:t>0.988326±0.002338</w:t>
+            </w:r>
+          </w:p>
+        </w:tc>
+      </w:tr>
+      <w:tr>
+        <w:trPr>
+          <w:cantSplit/>
+        </w:trPr>
+        <w:tc>
+          <w:tcPr>
+            <w:tcW w:type="dxa" w:w="964"/>
+          </w:tcPr>
+          <w:p>
+            <w:pPr>
+              <w:keepNext/>
+              <w:spacing w:line="288" w:lineRule="auto" w:after="40" w:before="40"/>
+            </w:pPr>
+            <w:r>
+              <w:rPr>
+                <w:rFonts w:ascii="Times New Roman" w:hAnsi="Times New Roman"/>
+                <w:sz w:val="16"/>
+              </w:rPr>
+            </w:r>
+          </w:p>
+        </w:tc>
+        <w:tc>
+          <w:tcPr>
+            <w:tcW w:type="dxa" w:w="1417"/>
+          </w:tcPr>
+          <w:p>
+            <w:pPr>
+              <w:keepNext/>
+              <w:spacing w:line="288" w:lineRule="auto" w:after="40" w:before="40"/>
+            </w:pPr>
+            <w:r>
+              <w:rPr>
+                <w:rFonts w:ascii="Times New Roman" w:hAnsi="Times New Roman"/>
+                <w:sz w:val="16"/>
+              </w:rPr>
+              <w:t>Pair statistics</w:t>
+            </w:r>
+          </w:p>
+        </w:tc>
+        <w:tc>
+          <w:tcPr>
+            <w:tcW w:type="dxa" w:w="1757"/>
+          </w:tcPr>
+          <w:p>
+            <w:pPr>
+              <w:keepNext/>
+              <w:spacing w:line="288" w:lineRule="auto" w:after="40" w:before="40"/>
+            </w:pPr>
+            <w:r>
+              <w:rPr>
+                <w:rFonts w:ascii="Times New Roman" w:hAnsi="Times New Roman"/>
+                <w:sz w:val="16"/>
+              </w:rPr>
+              <w:t>0.920500±0.001668</w:t>
+            </w:r>
+          </w:p>
+        </w:tc>
+      </w:tr>
+      <w:tr>
+        <w:trPr>
+          <w:cantSplit/>
+        </w:trPr>
+        <w:tc>
+          <w:tcPr>
+            <w:tcW w:type="dxa" w:w="964"/>
+          </w:tcPr>
+          <w:p>
+            <w:pPr>
+              <w:keepNext/>
+              <w:spacing w:line="288" w:lineRule="auto" w:after="40" w:before="40"/>
+            </w:pPr>
+            <w:r>
+              <w:rPr>
+                <w:rFonts w:ascii="Times New Roman" w:hAnsi="Times New Roman"/>
+                <w:sz w:val="16"/>
+              </w:rPr>
+              <w:t>Wikipedia</w:t>
+            </w:r>
+          </w:p>
+        </w:tc>
+        <w:tc>
+          <w:tcPr>
+            <w:tcW w:type="dxa" w:w="1417"/>
+          </w:tcPr>
+          <w:p>
+            <w:pPr>
+              <w:keepNext/>
+              <w:spacing w:line="288" w:lineRule="auto" w:after="40" w:before="40"/>
+            </w:pPr>
+            <w:r>
+              <w:rPr>
+                <w:rFonts w:ascii="Times New Roman" w:hAnsi="Times New Roman"/>
+                <w:sz w:val="16"/>
+              </w:rPr>
+              <w:t>Full B</w:t>
+            </w:r>
+          </w:p>
+        </w:tc>
+        <w:tc>
+          <w:tcPr>
+            <w:tcW w:type="dxa" w:w="1757"/>
+          </w:tcPr>
+          <w:p>
+            <w:pPr>
+              <w:keepNext/>
+              <w:spacing w:line="288" w:lineRule="auto" w:after="40" w:before="40"/>
+            </w:pPr>
+            <w:r>
+              <w:rPr>
+                <w:rFonts w:ascii="Times New Roman" w:hAnsi="Times New Roman"/>
+                <w:sz w:val="16"/>
+              </w:rPr>
+              <w:t>0.996296±0.000872</w:t>
+            </w:r>
+          </w:p>
+        </w:tc>
+      </w:tr>
+      <w:tr>
+        <w:trPr>
+          <w:cantSplit/>
+        </w:trPr>
+        <w:tc>
+          <w:tcPr>
+            <w:tcW w:type="dxa" w:w="964"/>
+          </w:tcPr>
+          <w:p>
+            <w:pPr>
+              <w:keepNext w:val="0"/>
+              <w:spacing w:line="288" w:lineRule="auto" w:after="40" w:before="40"/>
+            </w:pPr>
+            <w:r>
+              <w:rPr>
+                <w:rFonts w:ascii="Times New Roman" w:hAnsi="Times New Roman"/>
+                <w:sz w:val="16"/>
+              </w:rPr>
+            </w:r>
+          </w:p>
+        </w:tc>
+        <w:tc>
+          <w:tcPr>
+            <w:tcW w:type="dxa" w:w="1417"/>
+          </w:tcPr>
+          <w:p>
+            <w:pPr>
+              <w:keepNext w:val="0"/>
+              <w:spacing w:line="288" w:lineRule="auto" w:after="40" w:before="40"/>
+            </w:pPr>
+            <w:r>
+              <w:rPr>
+                <w:rFonts w:ascii="Times New Roman" w:hAnsi="Times New Roman"/>
+                <w:sz w:val="16"/>
+              </w:rPr>
+              <w:t>Pair statistics</w:t>
+            </w:r>
+          </w:p>
+        </w:tc>
+        <w:tc>
+          <w:tcPr>
+            <w:tcW w:type="dxa" w:w="1757"/>
+          </w:tcPr>
+          <w:p>
+            <w:pPr>
+              <w:keepNext w:val="0"/>
+              <w:spacing w:line="288" w:lineRule="auto" w:after="40" w:before="40"/>
+            </w:pPr>
+            <w:r>
+              <w:rPr>
+                <w:rFonts w:ascii="Times New Roman" w:hAnsi="Times New Roman"/>
+                <w:sz w:val="16"/>
+              </w:rPr>
+              <w:t>0.896506±0.000004</w:t>
+            </w:r>
+          </w:p>
+        </w:tc>
+      </w:tr>
+    </w:tbl>
+    <w:p>
+      <w:pPr>
+        <w:pStyle w:val="BodyText"/>
+        <w:widowControl/>
+        <w:spacing w:before="0" w:after="0" w:line="270" w:lineRule="atLeast"/>
+        <w:ind w:firstLine="270"/>
+        <w:jc w:val="both"/>
+      </w:pPr>
+      <w:r>
+        <w:rPr>
+          <w:rFonts w:ascii="Times New Roman" w:hAnsi="Times New Roman" w:eastAsia="Songti TC"/>
+          <w:color w:val="000000"/>
+          <w:sz w:val="18"/>
+        </w:rPr>
+        <w:t xml:space="preserve">The full representation has higher mean AP on both corpora. At the same time, the reduced representation retains substantial predictive performance, consistent with pair histories providing useful information. Together these observations favor a combined account: deterministic channels contribute useful signals, while the learned backbone adds information in these recorded configurations. Removing multiple components at once does not isolate the contribution of the event encoder, recurrent memory or auxiliary objective individually. A factorial study would be needed to separate those contributions.</w:t>
       </w:r>
     </w:p>
     <w:bookmarkEnd w:id="40"/>
+    <w:bookmarkStart w:id="41" w:name="_0719cd6919648bd06a872772c8ce0f671c39ee5"/>
+    <w:p>
+      <w:pPr>
+        <w:pStyle w:val="Heading2"/>
+        <w:widowControl/>
+        <w:spacing w:before="160" w:after="60" w:line="270" w:lineRule="atLeast"/>
+        <w:ind w:firstLine="0"/>
+        <w:jc w:val="left"/>
+      </w:pPr>
+      <w:r>
+        <w:rPr>
+          <w:b/>
+          <w:sz w:val="18"/>
+        </w:rPr>
+        <w:t>6. Historical freeze-then-probe experiments</w:t>
+      </w:r>
+    </w:p>
+    <w:p>
+      <w:pPr>
+        <w:pStyle w:val="Normal"/>
+        <w:widowControl/>
+        <w:spacing w:before="0" w:after="0" w:line="270" w:lineRule="atLeast"/>
+        <w:ind w:firstLine="270"/>
+        <w:jc w:val="both"/>
+      </w:pPr>
+      <w:r>
+        <w:rPr>
+          <w:rFonts w:ascii="Times New Roman" w:hAnsi="Times New Roman" w:eastAsia="Songti TC"/>
+          <w:color w:val="000000"/>
+          <w:sz w:val="18"/>
+        </w:rPr>
+        <w:t xml:space="preserve">The recovered probe records compare a decoupled training trajectory with a freeze-then-probe trajectory. Table 7 reports the two procedures separately for CoEdit and Wikipedia. It also preserves an explicitly ID-corrected Wikipedia probe record as a distinct version. That record contains all three seeds; it is not merged with the earlier Wikipedia probe or treated as a matched correction experiment without a version-matched control.</w:t>
+      </w:r>
+    </w:p>
+    <w:p>
+      <w:pPr>
+        <w:pStyle w:val="BodyText"/>
+        <w:keepNext/>
+        <w:widowControl/>
+        <w:spacing w:before="120" w:after="100" w:line="270" w:lineRule="atLeast"/>
+        <w:ind w:firstLine="0"/>
+        <w:jc w:val="center"/>
+      </w:pPr>
+      <w:r>
+        <w:rPr>
+          <w:b/>
+        </w:rPr>
+        <w:t>Table 7. Freeze-then-probe comparison.</w:t>
+      </w:r>
+    </w:p>
+    <w:tbl>
+      <w:tblPr>
+        <w:tblW w:type="auto" w:w="0"/>
+        <w:tblLayout w:type="fixed"/>
+        <w:tblLook w:firstColumn="1" w:firstRow="1" w:lastColumn="0" w:lastRow="0" w:noHBand="0" w:noVBand="1" w:val="04A0"/>
+        <w:tblBorders>
+          <w:top w:val="single" w:sz="4" w:color="AAAAAA"/>
+          <w:bottom w:val="single" w:sz="4" w:color="AAAAAA"/>
+          <w:left w:val="single" w:sz="4" w:color="AAAAAA"/>
+          <w:right w:val="single" w:sz="4" w:color="AAAAAA"/>
+          <w:insideH w:val="single" w:sz="4" w:color="AAAAAA"/>
+          <w:insideV w:val="single" w:sz="4" w:color="AAAAAA"/>
+        </w:tblBorders>
+      </w:tblPr>
+      <w:tblGrid>
+        <w:gridCol w:w="964"/>
+        <w:gridCol w:w="1417"/>
+        <w:gridCol w:w="1757"/>
+      </w:tblGrid>
+      <w:tr>
+        <w:trPr>
+          <w:cantSplit/>
+        </w:trPr>
+        <w:tc>
+          <w:tcPr>
+            <w:tcW w:type="dxa" w:w="964"/>
+          </w:tcPr>
+          <w:p>
+            <w:pPr>
+              <w:keepNext/>
+              <w:spacing w:line="288" w:lineRule="auto" w:after="40" w:before="40"/>
+            </w:pPr>
+            <w:r>
+              <w:rPr>
+                <w:rFonts w:ascii="Times New Roman" w:hAnsi="Times New Roman"/>
+                <w:sz w:val="16"/>
+              </w:rPr>
+              <w:t>Corpus</w:t>
+            </w:r>
+          </w:p>
+        </w:tc>
+        <w:tc>
+          <w:tcPr>
+            <w:tcW w:type="dxa" w:w="1417"/>
+          </w:tcPr>
+          <w:p>
+            <w:pPr>
+              <w:keepNext/>
+              <w:spacing w:line="288" w:lineRule="auto" w:after="40" w:before="40"/>
+            </w:pPr>
+            <w:r>
+              <w:rPr>
+                <w:rFonts w:ascii="Times New Roman" w:hAnsi="Times New Roman"/>
+                <w:sz w:val="16"/>
+              </w:rPr>
+              <w:t>Procedure</w:t>
+            </w:r>
+          </w:p>
+        </w:tc>
+        <w:tc>
+          <w:tcPr>
+            <w:tcW w:type="dxa" w:w="1757"/>
+          </w:tcPr>
+          <w:p>
+            <w:pPr>
+              <w:keepNext/>
+              <w:spacing w:line="288" w:lineRule="auto" w:after="40" w:before="40"/>
+            </w:pPr>
+            <w:r>
+              <w:rPr>
+                <w:rFonts w:ascii="Times New Roman" w:hAnsi="Times New Roman"/>
+                <w:sz w:val="16"/>
+              </w:rPr>
+              <w:t>Inductive AP</w:t>
+            </w:r>
+          </w:p>
+        </w:tc>
+      </w:tr>
+      <w:tr>
+        <w:trPr>
+          <w:cantSplit/>
+        </w:trPr>
+        <w:tc>
+          <w:tcPr>
+            <w:tcW w:type="dxa" w:w="964"/>
+          </w:tcPr>
+          <w:p>
+            <w:pPr>
+              <w:keepNext/>
+              <w:spacing w:line="288" w:lineRule="auto" w:after="40" w:before="40"/>
+            </w:pPr>
+            <w:r>
+              <w:rPr>
+                <w:rFonts w:ascii="Times New Roman" w:hAnsi="Times New Roman"/>
+                <w:sz w:val="16"/>
+              </w:rPr>
+              <w:t>CoEdit</w:t>
+            </w:r>
+          </w:p>
+        </w:tc>
+        <w:tc>
+          <w:tcPr>
+            <w:tcW w:type="dxa" w:w="1417"/>
+          </w:tcPr>
+          <w:p>
+            <w:pPr>
+              <w:keepNext/>
+              <w:spacing w:line="288" w:lineRule="auto" w:after="40" w:before="40"/>
+            </w:pPr>
+            <w:r>
+              <w:rPr>
+                <w:rFonts w:ascii="Times New Roman" w:hAnsi="Times New Roman"/>
+                <w:sz w:val="16"/>
+              </w:rPr>
+              <w:t>Decoupled</w:t>
+            </w:r>
+          </w:p>
+        </w:tc>
+        <w:tc>
+          <w:tcPr>
+            <w:tcW w:type="dxa" w:w="1757"/>
+          </w:tcPr>
+          <w:p>
+            <w:pPr>
+              <w:keepNext/>
+              <w:spacing w:line="288" w:lineRule="auto" w:after="40" w:before="40"/>
+            </w:pPr>
+            <w:r>
+              <w:rPr>
+                <w:rFonts w:ascii="Times New Roman" w:hAnsi="Times New Roman"/>
+                <w:sz w:val="16"/>
+              </w:rPr>
+              <w:t>0.9883±0.0028</w:t>
+            </w:r>
+          </w:p>
+        </w:tc>
+      </w:tr>
+      <w:tr>
+        <w:trPr>
+          <w:cantSplit/>
+        </w:trPr>
+        <w:tc>
+          <w:tcPr>
+            <w:tcW w:type="dxa" w:w="964"/>
+          </w:tcPr>
+          <w:p>
+            <w:pPr>
+              <w:keepNext/>
+              <w:spacing w:line="288" w:lineRule="auto" w:after="40" w:before="40"/>
+            </w:pPr>
+            <w:r>
+              <w:rPr>
+                <w:rFonts w:ascii="Times New Roman" w:hAnsi="Times New Roman"/>
+                <w:sz w:val="16"/>
+              </w:rPr>
+            </w:r>
+          </w:p>
+        </w:tc>
+        <w:tc>
+          <w:tcPr>
+            <w:tcW w:type="dxa" w:w="1417"/>
+          </w:tcPr>
+          <w:p>
+            <w:pPr>
+              <w:keepNext/>
+              <w:spacing w:line="288" w:lineRule="auto" w:after="40" w:before="40"/>
+            </w:pPr>
+            <w:r>
+              <w:rPr>
+                <w:rFonts w:ascii="Times New Roman" w:hAnsi="Times New Roman"/>
+                <w:sz w:val="16"/>
+              </w:rPr>
+              <w:t>Freeze then probe</w:t>
+            </w:r>
+          </w:p>
+        </w:tc>
+        <w:tc>
+          <w:tcPr>
+            <w:tcW w:type="dxa" w:w="1757"/>
+          </w:tcPr>
+          <w:p>
+            <w:pPr>
+              <w:keepNext/>
+              <w:spacing w:line="288" w:lineRule="auto" w:after="40" w:before="40"/>
+            </w:pPr>
+            <w:r>
+              <w:rPr>
+                <w:rFonts w:ascii="Times New Roman" w:hAnsi="Times New Roman"/>
+                <w:sz w:val="16"/>
+              </w:rPr>
+              <w:t>0.7684±0.0064</w:t>
+            </w:r>
+          </w:p>
+        </w:tc>
+      </w:tr>
+      <w:tr>
+        <w:trPr>
+          <w:cantSplit/>
+        </w:trPr>
+        <w:tc>
+          <w:tcPr>
+            <w:tcW w:type="dxa" w:w="964"/>
+          </w:tcPr>
+          <w:p>
+            <w:pPr>
+              <w:keepNext/>
+              <w:spacing w:line="288" w:lineRule="auto" w:after="40" w:before="40"/>
+            </w:pPr>
+            <w:r>
+              <w:rPr>
+                <w:rFonts w:ascii="Times New Roman" w:hAnsi="Times New Roman"/>
+                <w:sz w:val="16"/>
+              </w:rPr>
+              <w:t>Wikipedia</w:t>
+            </w:r>
+          </w:p>
+        </w:tc>
+        <w:tc>
+          <w:tcPr>
+            <w:tcW w:type="dxa" w:w="1417"/>
+          </w:tcPr>
+          <w:p>
+            <w:pPr>
+              <w:keepNext/>
+              <w:spacing w:line="288" w:lineRule="auto" w:after="40" w:before="40"/>
+            </w:pPr>
+            <w:r>
+              <w:rPr>
+                <w:rFonts w:ascii="Times New Roman" w:hAnsi="Times New Roman"/>
+                <w:sz w:val="16"/>
+              </w:rPr>
+              <w:t>Decoupled</w:t>
+            </w:r>
+          </w:p>
+        </w:tc>
+        <w:tc>
+          <w:tcPr>
+            <w:tcW w:type="dxa" w:w="1757"/>
+          </w:tcPr>
+          <w:p>
+            <w:pPr>
+              <w:keepNext/>
+              <w:spacing w:line="288" w:lineRule="auto" w:after="40" w:before="40"/>
+            </w:pPr>
+            <w:r>
+              <w:rPr>
+                <w:rFonts w:ascii="Times New Roman" w:hAnsi="Times New Roman"/>
+                <w:sz w:val="16"/>
+              </w:rPr>
+              <w:t>0.9961±0.0014</w:t>
+            </w:r>
+          </w:p>
+        </w:tc>
+      </w:tr>
+      <w:tr>
+        <w:trPr>
+          <w:cantSplit/>
+        </w:trPr>
+        <w:tc>
+          <w:tcPr>
+            <w:tcW w:type="dxa" w:w="964"/>
+          </w:tcPr>
+          <w:p>
+            <w:pPr>
+              <w:keepNext/>
+              <w:spacing w:line="288" w:lineRule="auto" w:after="40" w:before="40"/>
+            </w:pPr>
+            <w:r>
+              <w:rPr>
+                <w:rFonts w:ascii="Times New Roman" w:hAnsi="Times New Roman"/>
+                <w:sz w:val="16"/>
+              </w:rPr>
+            </w:r>
+          </w:p>
+        </w:tc>
+        <w:tc>
+          <w:tcPr>
+            <w:tcW w:type="dxa" w:w="1417"/>
+          </w:tcPr>
+          <w:p>
+            <w:pPr>
+              <w:keepNext/>
+              <w:spacing w:line="288" w:lineRule="auto" w:after="40" w:before="40"/>
+            </w:pPr>
+            <w:r>
+              <w:rPr>
+                <w:rFonts w:ascii="Times New Roman" w:hAnsi="Times New Roman"/>
+                <w:sz w:val="16"/>
+              </w:rPr>
+              <w:t>Freeze then probe</w:t>
+            </w:r>
+          </w:p>
+        </w:tc>
+        <w:tc>
+          <w:tcPr>
+            <w:tcW w:type="dxa" w:w="1757"/>
+          </w:tcPr>
+          <w:p>
+            <w:pPr>
+              <w:keepNext/>
+              <w:spacing w:line="288" w:lineRule="auto" w:after="40" w:before="40"/>
+            </w:pPr>
+            <w:r>
+              <w:rPr>
+                <w:rFonts w:ascii="Times New Roman" w:hAnsi="Times New Roman"/>
+                <w:sz w:val="16"/>
+              </w:rPr>
+              <w:t>0.9027±0.0177</w:t>
+            </w:r>
+          </w:p>
+        </w:tc>
+      </w:tr>
+      <w:tr>
+        <w:trPr>
+          <w:cantSplit/>
+        </w:trPr>
+        <w:tc>
+          <w:tcPr>
+            <w:tcW w:type="dxa" w:w="964"/>
+          </w:tcPr>
+          <w:p>
+            <w:pPr>
+              <w:keepNext w:val="0"/>
+              <w:spacing w:line="288" w:lineRule="auto" w:after="40" w:before="40"/>
+            </w:pPr>
+            <w:r>
+              <w:rPr>
+                <w:rFonts w:ascii="Times New Roman" w:hAnsi="Times New Roman"/>
+                <w:sz w:val="16"/>
+              </w:rPr>
+              <w:t>Wikipedia</w:t>
+            </w:r>
+          </w:p>
+        </w:tc>
+        <w:tc>
+          <w:tcPr>
+            <w:tcW w:type="dxa" w:w="1417"/>
+          </w:tcPr>
+          <w:p>
+            <w:pPr>
+              <w:keepNext w:val="0"/>
+              <w:spacing w:line="288" w:lineRule="auto" w:after="40" w:before="40"/>
+            </w:pPr>
+            <w:r>
+              <w:rPr>
+                <w:rFonts w:ascii="Times New Roman" w:hAnsi="Times New Roman"/>
+                <w:sz w:val="16"/>
+              </w:rPr>
+              <w:t>Probe, ID-corrected</w:t>
+            </w:r>
+          </w:p>
+        </w:tc>
+        <w:tc>
+          <w:tcPr>
+            <w:tcW w:type="dxa" w:w="1757"/>
+          </w:tcPr>
+          <w:p>
+            <w:pPr>
+              <w:keepNext w:val="0"/>
+              <w:spacing w:line="288" w:lineRule="auto" w:after="40" w:before="40"/>
+            </w:pPr>
+            <w:r>
+              <w:rPr>
+                <w:rFonts w:ascii="Times New Roman" w:hAnsi="Times New Roman"/>
+                <w:sz w:val="16"/>
+              </w:rPr>
+              <w:t>0.9513±0.0030</w:t>
+            </w:r>
+          </w:p>
+        </w:tc>
+      </w:tr>
+    </w:tbl>
+    <w:p>
+      <w:pPr>
+        <w:pStyle w:val="BodyText"/>
+        <w:widowControl/>
+        <w:spacing w:before="0" w:after="0" w:line="270" w:lineRule="atLeast"/>
+        <w:ind w:firstLine="270"/>
+        <w:jc w:val="both"/>
+      </w:pPr>
+      <w:r>
+        <w:rPr>
+          <w:rFonts w:ascii="Times New Roman" w:hAnsi="Times New Roman" w:eastAsia="Songti TC"/>
+          <w:color w:val="000000"/>
+          <w:sz w:val="18"/>
+        </w:rPr>
+        <w:t xml:space="preserve">In the earlier records, the probe remains below the decoupled procedure on both corpora. The ID-corrected Wikipedia probe has a different endpoint from the earlier probe, illustrating why dataset and configuration identity matter to this comparison. Neither contrast demonstrates irreversible representation damage. A finite probe budget tests a particular recovery procedure, and differences can reflect the pretrained features, head capacity, optimization or data version. The current probe results in Table 2 provide a separately specified comparison and should retain their own interpretation.</w:t>
+      </w:r>
+    </w:p>
     <w:bookmarkEnd w:id="41"/>
-    <w:bookmarkStart w:id="46" w:name="_discussion"/>
+    <w:bookmarkEnd w:id="42"/>
+    <w:bookmarkStart w:id="48" w:name="_discussion"/>
     <w:p>
       <w:pPr>
         <w:pStyle w:val="Heading1"/>
@@ -8305,7 +10646,7 @@
         <w:t>VI. Discussion</w:t>
       </w:r>
     </w:p>
-    <w:bookmarkStart w:id="42" w:name="_28b11745e469d2d3e175241c874d60ab98eae35"/>
+    <w:bookmarkStart w:id="43" w:name="_28b11745e469d2d3e175241c874d60ab98eae35"/>
     <w:p>
       <w:pPr>
         <w:pStyle w:val="Heading2"/>
@@ -8353,7 +10694,7 @@
           <w:color w:val="000000"/>
           <w:sz w:val="18"/>
         </w:rPr>
-        <w:t xml:space="preserve">One possible explanation is adaptation to identity-related shortcuts [17]. Direct evidence would require measuring identity-related information, testing its relationship to performance, and intervening on the relevant features while holding other factors stable. A high inductive score and a favorable detached-arm ordering do not by themselves reveal which feature caused that ordering. They are outcomes to be explained, not measurements of the proposed mechanism.</w:t>
+        <w:t xml:space="preserve">One possible explanation is adaptation to identity-related shortcuts [13]. Direct evidence would require measuring identity-related information, testing its relationship to performance, and intervening on the relevant features while holding other factors stable. A high inductive score and a favorable detached-arm ordering do not by themselves reveal which feature caused that ordering. They are outcomes to be explained, not measurements of the proposed mechanism.</w:t>
       </w:r>
     </w:p>
     <w:p>
@@ -8370,11 +10711,11 @@
           <w:color w:val="000000"/>
           <w:sz w:val="18"/>
         </w:rPr>
-        <w:t xml:space="preserve">The deterministic channels offer another interpretation. When recurrence and cadence already supply useful signals, preserving them may reduce the need for task-driven transformation. However, performance could also depend on learned event features and recurrent memory. A complete decomposition would compare a deterministic-only representation, a learned representation without pair statistics, and controlled combinations under the same current protocol. Historical ablations provide design context but cannot substitute for those aligned measurements.</w:t>
-      </w:r>
-    </w:p>
-    <w:bookmarkEnd w:id="42"/>
-    <w:bookmarkStart w:id="43" w:name="_410f5b5d2c9859087acf917f26ebbca6ef02698"/>
+        <w:t xml:space="preserve">The deterministic channels offer another interpretation. When recurrence and cadence already supply useful signals, preserving them may reduce the need for task-driven transformation. However, performance could also depend on learned event features and recurrent memory. A complete decomposition would compare a deterministic-only representation, a learned representation without pair statistics, and controlled combinations under the same current protocol. The backbone-removal results in Table 6 show that the recorded full representation outperforms a learned readout over pair statistics alone. They support the usefulness of the combined representation, while leaving the individual learned components and their interaction with the current routing intervention unresolved.</w:t>
+      </w:r>
+    </w:p>
+    <w:bookmarkEnd w:id="43"/>
+    <w:bookmarkStart w:id="44" w:name="_410f5b5d2c9859087acf917f26ebbca6ef02698"/>
     <w:p>
       <w:pPr>
         <w:pStyle w:val="Heading2"/>
@@ -8422,11 +10763,11 @@
           <w:color w:val="000000"/>
           <w:sz w:val="18"/>
         </w:rPr>
-        <w:t xml:space="preserve">The current shared-readout experiment makes the narrower comparison explicit. Both primary profiles keep the main-predictor switch off, and the detach setting distinguishes the scored representation path. This accounts for why one should not carry the earlier draft’s headline magnitude directly into the current result table. A manuscript can develop an earlier research question while correcting its intervention definition.</w:t>
-      </w:r>
-    </w:p>
-    <w:bookmarkEnd w:id="43"/>
-    <w:bookmarkStart w:id="44" w:name="_fa63a5bdce7920cbb5f557c1dccc9b4c9a01df8"/>
+        <w:t xml:space="preserve">The current shared-readout experiment makes the narrower comparison explicit. Both primary profiles keep the main-predictor switch off, and the detach setting distinguishes the scored representation path. The historical preset gap therefore measures a broader configuration change than the current routing contrast.</w:t>
+      </w:r>
+    </w:p>
+    <w:bookmarkEnd w:id="44"/>
+    <w:bookmarkStart w:id="45" w:name="_fa63a5bdce7920cbb5f557c1dccc9b4c9a01df8"/>
     <w:p>
       <w:pPr>
         <w:pStyle w:val="Heading2"/>
@@ -8494,8 +10835,8 @@
         <w:t xml:space="preserve">For prospective forecasting, the temporal availability of event attributes is equally important. In a constructed corpus, an attribute can be attached to a timestamp even though it is known only after another event occurs. Preventing post-score memory writes does not correct that input-level availability issue. Deployment claims therefore require both a causally ordered state procedure and a causally available input construction.</w:t>
       </w:r>
     </w:p>
-    <w:bookmarkEnd w:id="44"/>
-    <w:bookmarkStart w:id="45" w:name="_e2e3305b1ccf27b369e6afda61db2ba647a3eb3"/>
+    <w:bookmarkEnd w:id="45"/>
+    <w:bookmarkStart w:id="46" w:name="_7c3304031558e369cafbef513eab2be981510ab"/>
     <w:p>
       <w:pPr>
         <w:pStyle w:val="Heading2"/>
@@ -8509,7 +10850,7 @@
           <w:b/>
           <w:sz w:val="18"/>
         </w:rPr>
-        <w:t>4. Limitations and next experiments</w:t>
+        <w:t>4. Interpreting scores beyond the sampled task</w:t>
       </w:r>
     </w:p>
     <w:p>
@@ -8526,7 +10867,7 @@
           <w:color w:val="000000"/>
           <w:sz w:val="18"/>
         </w:rPr>
-        <w:t xml:space="preserve">The study has a limited seed budget and a restricted set of corpora and model profiles. The reported uncertainty concerns selected seed variation rather than sampling of independent environments. CoEdit’s shared origin with Wikipedia and its construction order further constrain external validity. These limits remain even when all recorded hashes and aggregate computations agree.</w:t>
+        <w:t xml:space="preserve">AP evaluates the ordering of positive and sampled-negative scores. Probability calibration asks a different question: whether a predicted probability agrees with the frequency of the event [15]. A model may preserve its ranking while its numerical probabilities change. Consequently, the high AP in the current matrix does not justify applying a probability threshold to an operational stream without checking the event prevalence and candidate-generation policy. That check would require a deployment-specific sample and a separate calibration analysis.</w:t>
       </w:r>
     </w:p>
     <w:p>
@@ -8543,7 +10884,7 @@
           <w:color w:val="000000"/>
           <w:sz w:val="18"/>
         </w:rPr>
-        <w:t xml:space="preserve">The primary evaluation uses random destinations. Stronger tests should include destination-valid alternatives and clearly specified harder-negative regimes. They should preserve matched draws across arms, record pool support and avoid silent fallbacks when a requested pool is empty. A failed or degenerate pool should remain visible as an evaluation outcome rather than being interpreted as evidence of robustness.</w:t>
+        <w:t xml:space="preserve">Benchmark design also determines what transfer is being tested. OGB emphasizes standardized graph datasets and evaluators [19]; TGB 2.0 extends temporal evaluation to multi-relational and heterogeneous settings [12]. These settings would test whether the observed routing behavior survives changes in endpoint roles, edge types and historical support. They cannot be represented by adding the present corpora to a larger pooled mean. Each setting needs a valid candidate population and an architecture-specific definition of the detached boundary.</w:t>
       </w:r>
     </w:p>
     <w:p>
@@ -8560,12 +10901,30 @@
           <w:color w:val="000000"/>
           <w:sz w:val="18"/>
         </w:rPr>
-        <w:t xml:space="preserve">The intervention should also be replicated within faithful implementations of other temporal architectures. A sound replication must preserve each model’s forward computation and change a well-defined gradient boundary. Replacing a published architecture by a simplified local approximation would answer a different question. Probe extensions should vary head capacity and recovery budget before proposing an explanation based on irreversibility.</w:t>
-      </w:r>
-    </w:p>
-    <w:p>
-      <w:pPr>
-        <w:pStyle w:val="BodyText"/>
+        <w:t xml:space="preserve">Finally, comparable held-out scores can conceal different behavior under deployment conditions, a problem examined as underspecification [9]. For a stateful model, useful stress tests would vary the retained history, repeated-interaction frequency and time gaps while preserving valid temporal inputs. Such tests could distinguish sensitivity to event memory from sensitivity to pair-history statistics. They would complement the current endpoint comparison rather than turn its small set of training seeds into evidence about all future graph populations.</w:t>
+      </w:r>
+    </w:p>
+    <w:bookmarkEnd w:id="46"/>
+    <w:bookmarkStart w:id="47" w:name="_e2e3305b1ccf27b369e6afda61db2ba647a3eb3"/>
+    <w:p>
+      <w:pPr>
+        <w:pStyle w:val="Heading2"/>
+        <w:widowControl/>
+        <w:spacing w:before="160" w:after="60" w:line="270" w:lineRule="atLeast"/>
+        <w:ind w:firstLine="0"/>
+        <w:jc w:val="left"/>
+      </w:pPr>
+      <w:r>
+        <w:rPr>
+          <w:b/>
+          <w:sz w:val="18"/>
+        </w:rPr>
+        <w:t>5. Limitations and next experiments</w:t>
+      </w:r>
+    </w:p>
+    <w:p>
+      <w:pPr>
+        <w:pStyle w:val="Normal"/>
         <w:widowControl/>
         <w:spacing w:before="0" w:after="0" w:line="270" w:lineRule="atLeast"/>
         <w:ind w:firstLine="270"/>
@@ -8577,12 +10936,63 @@
           <w:color w:val="000000"/>
           <w:sz w:val="18"/>
         </w:rPr>
+        <w:t xml:space="preserve">The study has a limited seed budget and a restricted set of corpora and model profiles. The reported uncertainty concerns selected seed variation rather than sampling of independent environments. CoEdit’s shared origin with Wikipedia and its construction order further constrain external validity. These limits remain even when all recorded hashes and aggregate computations agree.</w:t>
+      </w:r>
+    </w:p>
+    <w:p>
+      <w:pPr>
+        <w:pStyle w:val="BodyText"/>
+        <w:widowControl/>
+        <w:spacing w:before="0" w:after="0" w:line="270" w:lineRule="atLeast"/>
+        <w:ind w:firstLine="270"/>
+        <w:jc w:val="both"/>
+      </w:pPr>
+      <w:r>
+        <w:rPr>
+          <w:rFonts w:ascii="Times New Roman" w:hAnsi="Times New Roman" w:eastAsia="Songti TC"/>
+          <w:color w:val="000000"/>
+          <w:sz w:val="18"/>
+        </w:rPr>
+        <w:t xml:space="preserve">The primary evaluation uses random destinations. The historical harder-pool results extend the B–K1 configuration comparison, but their pool construction and bounded rejection introduce additional limitations. Further tests should apply destination-valid and strictly checked harder-negative regimes to the current same-readout intervention. They should preserve matched draws across arms, record pool support and avoid silent fallbacks when a requested pool is empty. A failed or degenerate pool should remain visible as an evaluation outcome rather than being interpreted as evidence of robustness.</w:t>
+      </w:r>
+    </w:p>
+    <w:p>
+      <w:pPr>
+        <w:pStyle w:val="BodyText"/>
+        <w:widowControl/>
+        <w:spacing w:before="0" w:after="0" w:line="270" w:lineRule="atLeast"/>
+        <w:ind w:firstLine="270"/>
+        <w:jc w:val="both"/>
+      </w:pPr>
+      <w:r>
+        <w:rPr>
+          <w:rFonts w:ascii="Times New Roman" w:hAnsi="Times New Roman" w:eastAsia="Songti TC"/>
+          <w:color w:val="000000"/>
+          <w:sz w:val="18"/>
+        </w:rPr>
+        <w:t xml:space="preserve">The intervention should also be replicated within faithful implementations of other temporal architectures. A sound replication must preserve each model’s forward computation and change a well-defined gradient boundary. Replacing a published architecture by a simplified local approximation would answer a different question. Probe extensions should vary head capacity and recovery budget before proposing an explanation based on irreversibility.</w:t>
+      </w:r>
+    </w:p>
+    <w:p>
+      <w:pPr>
+        <w:pStyle w:val="BodyText"/>
+        <w:widowControl/>
+        <w:spacing w:before="0" w:after="0" w:line="270" w:lineRule="atLeast"/>
+        <w:ind w:firstLine="270"/>
+        <w:jc w:val="both"/>
+      </w:pPr>
+      <w:r>
+        <w:rPr>
+          <w:rFonts w:ascii="Times New Roman" w:hAnsi="Times New Roman" w:eastAsia="Songti TC"/>
+          <w:color w:val="000000"/>
+          <w:sz w:val="18"/>
+        </w:rPr>
         <w:t xml:space="preserve">Finally, a full gradient audit should examine both scored-output ancestry and the complete weighted objective. It should include candidate branches and auxiliary dependencies, and separate parameter gradients from event-state writes. Such an audit can establish a computational property for a specific configuration. It cannot by itself determine the statistical reason for an observed generalization difference.</w:t>
       </w:r>
     </w:p>
-    <w:bookmarkEnd w:id="45"/>
-    <w:bookmarkEnd w:id="46"/>
-    <w:bookmarkStart w:id="47" w:name="_conclusion"/>
+    <w:bookmarkEnd w:id="47"/>
+    <w:bookmarkEnd w:id="48"/>
+    <w:bookmarkStart w:id="49" w:name="_conclusion"/>
     <w:p>
       <w:pPr>
         <w:pStyle w:val="Heading1"/>
@@ -8633,8 +11043,8 @@
         <w:t xml:space="preserve">The fuller specification distinguishes scored derivatives, auxiliary optimization, recurrent memory and deterministic pair-history updates. It also exposes the role of filtered test history, candidate validity and attribute availability in interpreting a temporal result. The observed probe arm remains a separate training procedure, and historical configurations remain distinguishable from the current shared-readout comparison. These distinctions provide a basis for further experiments without turning a bounded performance observation into a universal or causal claim.</w:t>
       </w:r>
     </w:p>
-    <w:bookmarkEnd w:id="47"/>
-    <w:bookmarkStart w:id="98" w:name="_a8b5c4607db57e1b14676ded3051c99817d8653"/>
+    <w:bookmarkEnd w:id="49"/>
+    <w:bookmarkStart w:id="70" w:name="_a8b5c4607db57e1b14676ded3051c99817d8653"/>
     <w:p>
       <w:pPr>
         <w:pStyle w:val="Heading1"/>
@@ -8710,7 +11120,7 @@
         <w:rPr>
           <w:sz w:val="18"/>
         </w:rPr>
-        <w:t>4. Bardes, A., J. Ponce and Y. LeCun (2021) VICReg: Variance-Invariance-Covariance Regularization for Self-Supervised Learning. arXiv:2105.04906.</w:t>
+        <w:t>4. Bouthillier, X., P. Delaunay, M. Bronzi, A. Trofimov, B. Nichyporuk, J. Szeto, et al. (2021) Accounting for Variance in Machine Learning Benchmarks. arXiv:2103.03098.</w:t>
       </w:r>
     </w:p>
     <w:p>
@@ -8725,7 +11135,7 @@
         <w:rPr>
           <w:sz w:val="18"/>
         </w:rPr>
-        <w:t>5. Bouthillier, X., P. Delaunay, M. Bronzi, A. Trofimov, B. Nichyporuk, J. Szeto, et al. (2021) Accounting for Variance in Machine Learning Benchmarks. arXiv:2103.03098.</w:t>
+        <w:t>5. Cawley, G. C. and N. L. C. Talbot (2010) On Over-fitting in Model Selection and Subsequent Selection Bias in Performance Evaluation. Journal of Machine Learning Research, 11, 2079–2107.</w:t>
       </w:r>
     </w:p>
     <w:p>
@@ -8740,7 +11150,7 @@
         <w:rPr>
           <w:sz w:val="18"/>
         </w:rPr>
-        <w:t>6. Caron, M., H. Touvron, I. Misra, H. Jégou, J. Mairal, P. Bojanowski and A. Joulin (2021) Emerging properties in self-supervised vision transformers. IEEE/CVF International Conference on Computer Vision, 9650–9660.</w:t>
+        <w:t>6. Chen, X. and K. He (2021) Exploring simple Siamese representation learning. IEEE/CVF Conference on Computer Vision and Pattern Recognition, 15750–15758.</w:t>
       </w:r>
     </w:p>
     <w:p>
@@ -8755,7 +11165,7 @@
         <w:rPr>
           <w:sz w:val="18"/>
         </w:rPr>
-        <w:t>7. Cawley, G. C. and N. L. C. Talbot (2010) On Over-fitting in Model Selection and Subsequent Selection Bias in Performance Evaluation. Journal of Machine Learning Research, 11, 2079–2107.</w:t>
+        <w:t>7. Cho, K., B. van Merrienboer, C. Gulcehre, D. Bahdanau, F. Bougares, H. Schwenk, et al. (2014) Learning Phrase Representations using RNN Encoder-Decoder for Statistical Machine Translation. Proceedings of the 2014 Conference on Empirical Methods in Natural Language Processing (EMNLP), 1724-1734. doi:10.3115/v1/d14-1179.</w:t>
       </w:r>
     </w:p>
     <w:p>
@@ -8770,7 +11180,7 @@
         <w:rPr>
           <w:sz w:val="18"/>
         </w:rPr>
-        <w:t>8. Chen, T., S. Kornblith, M. Norouzi and G. Hinton (2020) A Simple Framework for Contrastive Learning of Visual Representations. arXiv:2002.05709.</w:t>
+        <w:t>8. Cong, W., S. Zhang, J. Kang, B. Yuan, H. Wu, X. Zhou, H. Tong and M. Mahdavi (2023) Do we really need complicated model architectures for temporal networks? International Conference on Learning Representations. arXiv:2302.11636.</w:t>
       </w:r>
     </w:p>
     <w:p>
@@ -8785,7 +11195,7 @@
         <w:rPr>
           <w:sz w:val="18"/>
         </w:rPr>
-        <w:t>9. Chen, X. and K. He (2021) Exploring simple Siamese representation learning. IEEE/CVF Conference on Computer Vision and Pattern Recognition, 15750–15758.</w:t>
+        <w:t>9. D’Amour, A., K. Heller, D. Moldovan, B. Adlam, B. Alipanahi, A. Beutel, et al. (2020) Underspecification Presents Challenges for Credibility in Modern Machine Learning. arXiv:2011.03395.</w:t>
       </w:r>
     </w:p>
     <w:p>
@@ -8800,7 +11210,7 @@
         <w:rPr>
           <w:sz w:val="18"/>
         </w:rPr>
-        <w:t>10. Cho, K., B. van Merrienboer, C. Gulcehre, D. Bahdanau, F. Bougares, H. Schwenk, et al. (2014) Learning Phrase Representations using RNN Encoder-Decoder for Statistical Machine Translation. Proceedings of the 2014 Conference on Empirical Methods in Natural Language Processing (EMNLP), 1724-1734. doi:10.3115/v1/d14-1179.</w:t>
+        <w:t>10. Duong, V. H. and L.-M. Shih (2026) Temporal link decoupling: source, protocol and scientific evidence. Research repository. https://github.com/hoangduong6210/temporal-link-decoupling.</w:t>
       </w:r>
     </w:p>
     <w:p>
@@ -8815,7 +11225,7 @@
         <w:rPr>
           <w:sz w:val="18"/>
         </w:rPr>
-        <w:t>11. Cong, W., S. Zhang, J. Kang, B. Yuan, H. Wu, X. Zhou, H. Tong and M. Mahdavi (2023) Do we really need complicated model architectures for temporal networks? International Conference on Learning Representations. arXiv:2302.11636.</w:t>
+        <w:t>11. Ferrari Dacrema, M., P. Cremonesi and D. Jannach (2019) Are We Really Making Much Progress? A Worrying Analysis of Recent Neural Recommendation Approaches. Proceedings of the 13th ACM Conference on Recommender Systems. doi:10.1145/3298689.3347058.</w:t>
       </w:r>
     </w:p>
     <w:p>
@@ -8830,7 +11240,7 @@
         <w:rPr>
           <w:sz w:val="18"/>
         </w:rPr>
-        <w:t>12. D’Amour, A., K. Heller, D. Moldovan, B. Adlam, B. Alipanahi, A. Beutel, et al. (2020) Underspecification Presents Challenges for Credibility in Modern Machine Learning. arXiv:2011.03395.</w:t>
+        <w:t>12. Gastinger, J., S. Huang, M. Galkin, E. Loghmani, A. Parviz, F. Poursafaei, et al. (2024) TGB 2.0: A Benchmark for Learning on Temporal Knowledge Graphs and Heterogeneous Graphs. arXiv:2406.09639.</w:t>
       </w:r>
     </w:p>
     <w:p>
@@ -8845,7 +11255,7 @@
         <w:rPr>
           <w:sz w:val="18"/>
         </w:rPr>
-        <w:t>13. Duong, V. H. and L.-M. Shih (2026) Temporal link decoupling: source, protocol and scientific evidence. Research repository. https://github.com/hoangduong6210/temporal-link-decoupling.</w:t>
+        <w:t>13. Geirhos, R., J. Jacobsen, C. Michaelis, R. Zemel, W. Brendel, M. Bethge, et al. (2020) Shortcut Learning in Deep Neural Networks. arXiv:2004.07780.</w:t>
       </w:r>
     </w:p>
     <w:p>
@@ -8860,7 +11270,7 @@
         <w:rPr>
           <w:sz w:val="18"/>
         </w:rPr>
-        <w:t>14. Ferrari Dacrema, M., P. Cremonesi and D. Jannach (2019) Are We Really Making Much Progress? A Worrying Analysis of Recent Neural Recommendation Approaches. Proceedings of the 13th ACM Conference on Recommender Systems. doi:10.1145/3298689.3347058.</w:t>
+        <w:t>14. Grill, J., F. Strub, F. Altché, C. Tallec, P. H. Richemond, E. Buchatskaya, et al. (2020) Bootstrap your own latent: A new approach to self-supervised Learning. arXiv:2006.07733.</w:t>
       </w:r>
     </w:p>
     <w:p>
@@ -8875,7 +11285,7 @@
         <w:rPr>
           <w:sz w:val="18"/>
         </w:rPr>
-        <w:t>15. Fey, M. and J. E. Lenssen (2019) Fast Graph Representation Learning with PyTorch Geometric. arXiv:1903.02428.</w:t>
+        <w:t>15. Guo, C., G. Pleiss, Y. Sun and K. Q. Weinberger (2017) On Calibration of Modern Neural Networks. arXiv:1706.04599.</w:t>
       </w:r>
     </w:p>
     <w:p>
@@ -8890,7 +11300,7 @@
         <w:rPr>
           <w:sz w:val="18"/>
         </w:rPr>
-        <w:t>16. Gastinger, J., S. Huang, M. Galkin, E. Loghmani, A. Parviz, F. Poursafaei, et al. (2024) TGB 2.0: A Benchmark for Learning on Temporal Knowledge Graphs and Heterogeneous Graphs. arXiv:2406.09639.</w:t>
+        <w:t>16. Hamilton, W. L., R. Ying and J. Leskovec (2017) Inductive Representation Learning on Large Graphs. arXiv:1706.02216.</w:t>
       </w:r>
     </w:p>
     <w:p>
@@ -8905,7 +11315,7 @@
         <w:rPr>
           <w:sz w:val="18"/>
         </w:rPr>
-        <w:t>17. Geirhos, R., J. Jacobsen, C. Michaelis, R. Zemel, W. Brendel, M. Bethge, et al. (2020) Shortcut Learning in Deep Neural Networks. arXiv:2004.07780.</w:t>
+        <w:t>17. Hawkes, A. G. (1971) Spectra of some self-exciting and mutually exciting point processes. Biometrika, 58(1), 83–90.</w:t>
       </w:r>
     </w:p>
     <w:p>
@@ -8920,7 +11330,7 @@
         <w:rPr>
           <w:sz w:val="18"/>
         </w:rPr>
-        <w:t>18. Gilmer, J., S. S. Schoenholz, P. F. Riley, O. Vinyals and G. E. Dahl (2017) Neural Message Passing for Quantum Chemistry. arXiv:1704.01212.</w:t>
+        <w:t>18. Holme, P. and J. Saramäki (2012) Temporal Networks. Physics Reports, 519(3), 97–125. doi:10.1016/j.physrep.2012.03.001.</w:t>
       </w:r>
     </w:p>
     <w:p>
@@ -8935,7 +11345,7 @@
         <w:rPr>
           <w:sz w:val="18"/>
         </w:rPr>
-        <w:t>19. Goyal, P., N. Kamra, X. He and Y. Liu (2018) DynGEM: Deep Embedding Method for Dynamic Graphs. arXiv:1805.11273.</w:t>
+        <w:t>19. Hu, W., M. Fey, M. Zitnik, Y. Dong, H. Ren, B. Liu, et al. (2020) Open Graph Benchmark: Datasets for Machine Learning on Graphs. arXiv:2005.00687.</w:t>
       </w:r>
     </w:p>
     <w:p>
@@ -8950,7 +11360,7 @@
         <w:rPr>
           <w:sz w:val="18"/>
         </w:rPr>
-        <w:t>20. Goyal, P., S. R. Chhetri and A. Canedo (2020) dyngraph2vec: Capturing Network Dynamics using Dynamic Graph Representation Learning. Knowledge-Based Systems, 187, 104816. doi:10.1016/j.knosys.2019.06.024.</w:t>
+        <w:t>20. Huang, S., F. Poursafaei, J. Danovitch, M. Fey, W. Hu, E. Rossi, J. Leskovec, M. Bronstein, G. Rabusseau and R. Rabbany (2023) Temporal graph benchmark for machine learning on temporal graphs. Advances in Neural Information Processing Systems, 36. arXiv:2307.01026.</w:t>
       </w:r>
     </w:p>
     <w:p>
@@ -8965,7 +11375,7 @@
         <w:rPr>
           <w:sz w:val="18"/>
         </w:rPr>
-        <w:t>21. Grill, J., F. Strub, F. Altché, C. Tallec, P. H. Richemond, E. Buchatskaya, et al. (2020) Bootstrap your own latent: A new approach to self-supervised Learning. arXiv:2006.07733.</w:t>
+        <w:t>21. Kapoor, S. and A. Narayanan (2022) Leakage and the Reproducibility Crisis in ML-based Science. arXiv:2207.07048.</w:t>
       </w:r>
     </w:p>
     <w:p>
@@ -8980,7 +11390,7 @@
         <w:rPr>
           <w:sz w:val="18"/>
         </w:rPr>
-        <w:t>22. Grover, A. and J. Leskovec (2016) node2vec: Scalable Feature Learning for Networks. arXiv:1607.00653.</w:t>
+        <w:t>22. Kazemi, S. M., R. Goel, K. Jain, I. Kobyzev, A. Sethi, P. Forsyth, et al. (2019) Representation Learning for Dynamic Graphs: A Survey. arXiv:1905.11485.</w:t>
       </w:r>
     </w:p>
     <w:p>
@@ -8995,7 +11405,7 @@
         <w:rPr>
           <w:sz w:val="18"/>
         </w:rPr>
-        <w:t>23. Guo, C., G. Pleiss, Y. Sun and K. Q. Weinberger (2017) On Calibration of Modern Neural Networks. arXiv:1706.04599.</w:t>
+        <w:t>23. Kingma, D. P. and J. Ba (2015) Adam: A method for stochastic optimization. International Conference on Learning Representations. arXiv:1412.6980.</w:t>
       </w:r>
     </w:p>
     <w:p>
@@ -9010,7 +11420,7 @@
         <w:rPr>
           <w:sz w:val="18"/>
         </w:rPr>
-        <w:t>24. Hamilton, W. L., R. Ying and J. Leskovec (2017) Inductive Representation Learning on Large Graphs. arXiv:1706.02216.</w:t>
+        <w:t>24. Kingma, D. P. and M. Welling (2014) Auto-encoding variational Bayes. International Conference on Learning Representations. arXiv:1312.6114.</w:t>
       </w:r>
     </w:p>
     <w:p>
@@ -9025,7 +11435,7 @@
         <w:rPr>
           <w:sz w:val="18"/>
         </w:rPr>
-        <w:t>25. Hawkes, A. G. (1971) Spectra of some self-exciting and mutually exciting point processes. Biometrika, 58(1), 83–90.</w:t>
+        <w:t>25. Kumar, A., A. Raghunathan, R. Jones, T. Ma and P. Liang (2022) Fine-tuning can distort pretrained features and underperform out-of-distribution. International Conference on Learning Representations. arXiv:2202.10054.</w:t>
       </w:r>
     </w:p>
     <w:p>
@@ -9040,7 +11450,7 @@
         <w:rPr>
           <w:sz w:val="18"/>
         </w:rPr>
-        <w:t>26. He, K., H. Fan, Y. Wu, S. Xie and R. Girshick (2020) Momentum Contrast for Unsupervised Visual Representation Learning. 2020 IEEE/CVF Conference on Computer Vision and Pattern Recognition (CVPR), 9726-9735. doi:10.1109/cvpr42600.2020.00975.</w:t>
+        <w:t>26. Kumar, S., X. Zhang and J. Leskovec (2019) Predicting dynamic embedding trajectory in temporal interaction networks. ACM SIGKDD International Conference on Knowledge Discovery and Data Mining, 1269–1278.</w:t>
       </w:r>
     </w:p>
     <w:p>
@@ -9055,7 +11465,7 @@
         <w:rPr>
           <w:sz w:val="18"/>
         </w:rPr>
-        <w:t>27. Hinton, G. E., N. Srivastava, A. Krizhevsky, I. Sutskever and R. R. Salakhutdinov (2012) Improving neural networks by preventing co-adaptation of feature detectors. arXiv:1207.0580.</w:t>
+        <w:t>27. Loshchilov, I. and F. Hutter (2017) Decoupled Weight Decay Regularization. arXiv:1711.05101.</w:t>
       </w:r>
     </w:p>
     <w:p>
@@ -9070,7 +11480,7 @@
         <w:rPr>
           <w:sz w:val="18"/>
         </w:rPr>
-        <w:t>28. Holme, P. and J. Saramäki (2012) Temporal Networks. Physics Reports, 519(3), 97–125. doi:10.1016/j.physrep.2012.03.001.</w:t>
+        <w:t>28. Luo, Y. and P. Li (2022) Neighborhood-aware scalable temporal network representation learning. Proceedings of the First Learning on Graphs Conference, PMLR, 198, 1:1–1:18.</w:t>
       </w:r>
     </w:p>
     <w:p>
@@ -9085,7 +11495,7 @@
         <w:rPr>
           <w:sz w:val="18"/>
         </w:rPr>
-        <w:t>29. Hou, Z., X. Liu, Y. Cen, Y. Dong, H. Yang, C. Wang, et al. (2022) GraphMAE: Self-Supervised Masked Graph Autoencoders. Proceedings of the 28th ACM SIGKDD Conference on Knowledge Discovery and Data Mining, 594-604. doi:10.1145/3534678.3539321.</w:t>
+        <w:t>29. Paszke, A., S. Gross, F. Massa, A. Lerer, J. Bradbury, G. Chanan, et al. (2019) PyTorch: An Imperative Style, High-Performance Deep Learning Library. arXiv:1912.01703.</w:t>
       </w:r>
     </w:p>
     <w:p>
@@ -9100,7 +11510,7 @@
         <w:rPr>
           <w:sz w:val="18"/>
         </w:rPr>
-        <w:t>30. Hu, W., M. Fey, M. Zitnik, Y. Dong, H. Ren, B. Liu, et al. (2020) Open Graph Benchmark: Datasets for Machine Learning on Graphs. arXiv:2005.00687.</w:t>
+        <w:t>30. Poole, B., S. Ozair, A. van den Oord, A. A. Alemi and G. Tucker (2019) On Variational Bounds of Mutual Information. arXiv:1905.06922.</w:t>
       </w:r>
     </w:p>
     <w:p>
@@ -9115,7 +11525,7 @@
         <w:rPr>
           <w:sz w:val="18"/>
         </w:rPr>
-        <w:t>31. Huang, S., F. Poursafaei, J. Danovitch, M. Fey, W. Hu, E. Rossi, J. Leskovec, M. Bronstein, G. Rabusseau and R. Rabbany (2023) Temporal graph benchmark for machine learning on temporal graphs. Advances in Neural Information Processing Systems, 36. arXiv:2307.01026.</w:t>
+        <w:t>31. Poursafaei, F., S. Huang, K. Pelrine and R. Rabbany (2022) Towards better evaluation for dynamic link prediction. Advances in Neural Information Processing Systems, 35. arXiv:2207.10128.</w:t>
       </w:r>
     </w:p>
     <w:p>
@@ -9130,7 +11540,7 @@
         <w:rPr>
           <w:sz w:val="18"/>
         </w:rPr>
-        <w:t>32. Kapoor, S. and A. Narayanan (2022) Leakage and the Reproducibility Crisis in ML-based Science. arXiv:2207.07048.</w:t>
+        <w:t>32. Rossi, E., B. Chamberlain, F. Frasca, D. Eynard, F. Monti and M. Bronstein (2020) Temporal graph networks for deep learning on dynamic graphs. ICML Workshop on Graph Representation Learning and Beyond. arXiv:2006.10637.</w:t>
       </w:r>
     </w:p>
     <w:p>
@@ -9145,7 +11555,7 @@
         <w:rPr>
           <w:sz w:val="18"/>
         </w:rPr>
-        <w:t>33. Kazemi, S. M., R. Goel, K. Jain, I. Kobyzev, A. Sethi, P. Forsyth, et al. (2019) Representation Learning for Dynamic Graphs: A Survey. arXiv:1905.11485.</w:t>
+        <w:t>33. Shchur, O., M. Mumme, A. Bojchevski and S. Günnemann (2018) Pitfalls of Graph Neural Network Evaluation. arXiv:1811.05868.</w:t>
       </w:r>
     </w:p>
     <w:p>
@@ -9160,7 +11570,7 @@
         <w:rPr>
           <w:sz w:val="18"/>
         </w:rPr>
-        <w:t>34. Khosla, P., P. Teterwak, C. Wang, A. Sarna, Y. Tian, P. Isola, et al. (2020) Supervised Contrastive Learning. arXiv:2004.11362.</w:t>
+        <w:t>34. Tishby, N., F. C. Pereira and W. Bialek (1999) The information bottleneck method. Proceedings of the Allerton Conference on Communication, Control and Computing. Preprint: arXiv:physics/0004057.</w:t>
       </w:r>
     </w:p>
     <w:p>
@@ -9175,7 +11585,7 @@
         <w:rPr>
           <w:sz w:val="18"/>
         </w:rPr>
-        <w:t>35. Kingma, D. P. and J. Ba (2015) Adam: A method for stochastic optimization. International Conference on Learning Representations. arXiv:1412.6980.</w:t>
+        <w:t>35. Trivedi, R., M. Farajtabar, P. Biswal and H. Zha (2019) DyRep: Learning representations over dynamic graphs. International Conference on Learning Representations.</w:t>
       </w:r>
     </w:p>
     <w:p>
@@ -9190,7 +11600,7 @@
         <w:rPr>
           <w:sz w:val="18"/>
         </w:rPr>
-        <w:t>36. Kingma, D. P. and M. Welling (2014) Auto-encoding variational Bayes. International Conference on Learning Representations. arXiv:1312.6114.</w:t>
+        <w:t>36. Wang, Y., Y.-Y. Chang, Y. Liu, J. Leskovec and P. Li (2021) Inductive representation learning in temporal networks via causal anonymous walks. International Conference on Learning Representations. arXiv:2101.05974.</w:t>
       </w:r>
     </w:p>
     <w:p>
@@ -9205,7 +11615,7 @@
         <w:rPr>
           <w:sz w:val="18"/>
         </w:rPr>
-        <w:t>37. Kipf, T. N. and M. Welling (2016) Semi-Supervised Classification with Graph Convolutional Networks. arXiv:1609.02907.</w:t>
+        <w:t>37. Welford, B. P. (1962) Note on a method for calculating corrected sums of squares and products. Technometrics, 4(3), 419–420.</w:t>
       </w:r>
     </w:p>
     <w:p>
@@ -9220,7 +11630,7 @@
         <w:rPr>
           <w:sz w:val="18"/>
         </w:rPr>
-        <w:t>38. Kipf, T. N. and M. Welling (2016) Variational Graph Auto-Encoders. arXiv:1611.07308.</w:t>
+        <w:t>38. Xu, D., C. Ruan, E. Korpeoglu, S. Kumar and K. Achan (2020) Inductive representation learning on temporal graphs. International Conference on Learning Representations. arXiv:2002.07962.</w:t>
       </w:r>
     </w:p>
     <w:p>
@@ -9235,7 +11645,7 @@
         <w:rPr>
           <w:sz w:val="18"/>
         </w:rPr>
-        <w:t>39. Koh, P. W., S. Sagawa, H. Marklund, S. M. Xie, M. Zhang, A. Balsubramani, et al. (2020) WILDS: A Benchmark of in-the-Wild Distribution Shifts. arXiv:2012.07421.</w:t>
+        <w:t>39. Yu, L., L. Sun, B. Du and W. Lv (2023) Towards better dynamic graph learning: New architecture and unified library. Advances in Neural Information Processing Systems, 36. arXiv:2303.13047.</w:t>
       </w:r>
     </w:p>
     <w:p>
@@ -9250,487 +11660,7 @@
         <w:rPr>
           <w:sz w:val="18"/>
         </w:rPr>
-        <w:t>40. Kumar, A., A. Raghunathan, R. Jones, T. Ma and P. Liang (2022) Fine-tuning can distort pretrained features and underperform out-of-distribution. International Conference on Learning Representations. arXiv:2202.10054.</w:t>
-      </w:r>
-    </w:p>
-    <w:p>
-      <w:pPr>
-        <w:pStyle w:val="Normal"/>
-        <w:widowControl/>
-        <w:spacing w:before="0" w:after="60" w:line="270" w:lineRule="atLeast"/>
-        <w:ind w:left="283" w:hanging="283"/>
-        <w:jc w:val="left"/>
-      </w:pPr>
-      <w:r>
-        <w:rPr>
-          <w:sz w:val="18"/>
-        </w:rPr>
-        <w:t>41. Kumar, S., X. Zhang and J. Leskovec (2019) Predicting dynamic embedding trajectory in temporal interaction networks. ACM SIGKDD International Conference on Knowledge Discovery and Data Mining, 1269–1278.</w:t>
-      </w:r>
-    </w:p>
-    <w:p>
-      <w:pPr>
-        <w:pStyle w:val="Normal"/>
-        <w:widowControl/>
-        <w:spacing w:before="0" w:after="60" w:line="270" w:lineRule="atLeast"/>
-        <w:ind w:left="283" w:hanging="283"/>
-        <w:jc w:val="left"/>
-      </w:pPr>
-      <w:r>
-        <w:rPr>
-          <w:sz w:val="18"/>
-        </w:rPr>
-        <w:t>42. Lee, J. B., G. Nguyen, R. A. Rossi, N. K. Ahmed, E. Koh and S. Kim (2019) Dynamic Node Embeddings from Edge Streams. arXiv:1904.06449.</w:t>
-      </w:r>
-    </w:p>
-    <w:p>
-      <w:pPr>
-        <w:pStyle w:val="Normal"/>
-        <w:widowControl/>
-        <w:spacing w:before="0" w:after="60" w:line="270" w:lineRule="atLeast"/>
-        <w:ind w:left="283" w:hanging="283"/>
-        <w:jc w:val="left"/>
-      </w:pPr>
-      <w:r>
-        <w:rPr>
-          <w:sz w:val="18"/>
-        </w:rPr>
-        <w:t>43. Loshchilov, I. and F. Hutter (2017) Decoupled Weight Decay Regularization. arXiv:1711.05101.</w:t>
-      </w:r>
-    </w:p>
-    <w:p>
-      <w:pPr>
-        <w:pStyle w:val="Normal"/>
-        <w:widowControl/>
-        <w:spacing w:before="0" w:after="60" w:line="270" w:lineRule="atLeast"/>
-        <w:ind w:left="283" w:hanging="283"/>
-        <w:jc w:val="left"/>
-      </w:pPr>
-      <w:r>
-        <w:rPr>
-          <w:sz w:val="18"/>
-        </w:rPr>
-        <w:t>44. Luo, Y. and P. Li (2022) Neighborhood-aware scalable temporal network representation learning. Proceedings of the First Learning on Graphs Conference, PMLR, 198, 1:1–1:18.</w:t>
-      </w:r>
-    </w:p>
-    <w:p>
-      <w:pPr>
-        <w:pStyle w:val="Normal"/>
-        <w:widowControl/>
-        <w:spacing w:before="0" w:after="60" w:line="270" w:lineRule="atLeast"/>
-        <w:ind w:left="283" w:hanging="283"/>
-        <w:jc w:val="left"/>
-      </w:pPr>
-      <w:r>
-        <w:rPr>
-          <w:sz w:val="18"/>
-        </w:rPr>
-        <w:t>45. Mahdavi, S., S. Khoshraftar and A. An (2018) dynnode2vec: Scalable Dynamic Network Embedding. arXiv:1812.02356.</w:t>
-      </w:r>
-    </w:p>
-    <w:p>
-      <w:pPr>
-        <w:pStyle w:val="Normal"/>
-        <w:widowControl/>
-        <w:spacing w:before="0" w:after="60" w:line="270" w:lineRule="atLeast"/>
-        <w:ind w:left="283" w:hanging="283"/>
-        <w:jc w:val="left"/>
-      </w:pPr>
-      <w:r>
-        <w:rPr>
-          <w:sz w:val="18"/>
-        </w:rPr>
-        <w:t>46. Pareja, A., G. Domeniconi, J. Chen, T. Ma, T. Suzumura, H. Kanezashi, et al. (2019) EvolveGCN: Evolving Graph Convolutional Networks for Dynamic Graphs. arXiv:1902.10191.</w:t>
-      </w:r>
-    </w:p>
-    <w:p>
-      <w:pPr>
-        <w:pStyle w:val="Normal"/>
-        <w:widowControl/>
-        <w:spacing w:before="0" w:after="60" w:line="270" w:lineRule="atLeast"/>
-        <w:ind w:left="283" w:hanging="283"/>
-        <w:jc w:val="left"/>
-      </w:pPr>
-      <w:r>
-        <w:rPr>
-          <w:sz w:val="18"/>
-        </w:rPr>
-        <w:t>47. Paszke, A., S. Gross, F. Massa, A. Lerer, J. Bradbury, G. Chanan, et al. (2019) PyTorch: An Imperative Style, High-Performance Deep Learning Library. arXiv:1912.01703.</w:t>
-      </w:r>
-    </w:p>
-    <w:p>
-      <w:pPr>
-        <w:pStyle w:val="Normal"/>
-        <w:widowControl/>
-        <w:spacing w:before="0" w:after="60" w:line="270" w:lineRule="atLeast"/>
-        <w:ind w:left="283" w:hanging="283"/>
-        <w:jc w:val="left"/>
-      </w:pPr>
-      <w:r>
-        <w:rPr>
-          <w:sz w:val="18"/>
-        </w:rPr>
-        <w:t>48. Perozzi, B., R. Al-Rfou and S. Skiena (2014) DeepWalk: Online Learning of Social Representations. arXiv:1403.6652.</w:t>
-      </w:r>
-    </w:p>
-    <w:p>
-      <w:pPr>
-        <w:pStyle w:val="Normal"/>
-        <w:widowControl/>
-        <w:spacing w:before="0" w:after="60" w:line="270" w:lineRule="atLeast"/>
-        <w:ind w:left="283" w:hanging="283"/>
-        <w:jc w:val="left"/>
-      </w:pPr>
-      <w:r>
-        <w:rPr>
-          <w:sz w:val="18"/>
-        </w:rPr>
-        <w:t>49. Poole, B., S. Ozair, A. van den Oord, A. A. Alemi and G. Tucker (2019) On Variational Bounds of Mutual Information. arXiv:1905.06922.</w:t>
-      </w:r>
-    </w:p>
-    <w:p>
-      <w:pPr>
-        <w:pStyle w:val="Normal"/>
-        <w:widowControl/>
-        <w:spacing w:before="0" w:after="60" w:line="270" w:lineRule="atLeast"/>
-        <w:ind w:left="283" w:hanging="283"/>
-        <w:jc w:val="left"/>
-      </w:pPr>
-      <w:r>
-        <w:rPr>
-          <w:sz w:val="18"/>
-        </w:rPr>
-        <w:t>50. Poursafaei, F., S. Huang, K. Pelrine and R. Rabbany (2022) Towards better evaluation for dynamic link prediction. Advances in Neural Information Processing Systems, 35. arXiv:2207.10128.</w:t>
-      </w:r>
-    </w:p>
-    <w:p>
-      <w:pPr>
-        <w:pStyle w:val="Normal"/>
-        <w:widowControl/>
-        <w:spacing w:before="0" w:after="60" w:line="270" w:lineRule="atLeast"/>
-        <w:ind w:left="283" w:hanging="283"/>
-        <w:jc w:val="left"/>
-      </w:pPr>
-      <w:r>
-        <w:rPr>
-          <w:sz w:val="18"/>
-        </w:rPr>
-        <w:t>51. Rossi, E., B. Chamberlain, F. Frasca, D. Eynard, F. Monti and M. Bronstein (2020) Temporal graph networks for deep learning on dynamic graphs. ICML Workshop on Graph Representation Learning and Beyond. arXiv:2006.10637.</w:t>
-      </w:r>
-    </w:p>
-    <w:p>
-      <w:pPr>
-        <w:pStyle w:val="Normal"/>
-        <w:widowControl/>
-        <w:spacing w:before="0" w:after="60" w:line="270" w:lineRule="atLeast"/>
-        <w:ind w:left="283" w:hanging="283"/>
-        <w:jc w:val="left"/>
-      </w:pPr>
-      <w:r>
-        <w:rPr>
-          <w:sz w:val="18"/>
-        </w:rPr>
-        <w:t>52. Sankar, A., Y. Wu, L. Gou, W. Zhang and H. Yang (2018) Dynamic Graph Representation Learning via Self-Attention Networks. arXiv:1812.09430.</w:t>
-      </w:r>
-    </w:p>
-    <w:p>
-      <w:pPr>
-        <w:pStyle w:val="Normal"/>
-        <w:widowControl/>
-        <w:spacing w:before="0" w:after="60" w:line="270" w:lineRule="atLeast"/>
-        <w:ind w:left="283" w:hanging="283"/>
-        <w:jc w:val="left"/>
-      </w:pPr>
-      <w:r>
-        <w:rPr>
-          <w:sz w:val="18"/>
-        </w:rPr>
-        <w:t>53. Shchur, O., M. Mumme, A. Bojchevski and S. Günnemann (2018) Pitfalls of Graph Neural Network Evaluation. arXiv:1811.05868.</w:t>
-      </w:r>
-    </w:p>
-    <w:p>
-      <w:pPr>
-        <w:pStyle w:val="Normal"/>
-        <w:widowControl/>
-        <w:spacing w:before="0" w:after="60" w:line="270" w:lineRule="atLeast"/>
-        <w:ind w:left="283" w:hanging="283"/>
-        <w:jc w:val="left"/>
-      </w:pPr>
-      <w:r>
-        <w:rPr>
-          <w:sz w:val="18"/>
-        </w:rPr>
-        <w:t>54. Tang, J., M. Qu, M. Wang, M. Zhang, J. Yan and Q. Mei (2015) LINE: Large-scale Information Network Embedding. arXiv:1503.03578.</w:t>
-      </w:r>
-    </w:p>
-    <w:p>
-      <w:pPr>
-        <w:pStyle w:val="Normal"/>
-        <w:widowControl/>
-        <w:spacing w:before="0" w:after="60" w:line="270" w:lineRule="atLeast"/>
-        <w:ind w:left="283" w:hanging="283"/>
-        <w:jc w:val="left"/>
-      </w:pPr>
-      <w:r>
-        <w:rPr>
-          <w:sz w:val="18"/>
-        </w:rPr>
-        <w:t>55. Thakoor, S., C. Tallec, M. G. Azar, M. Azabou, E. L. Dyer, R. Munos, et al. (2021) Large-Scale Representation Learning on Graphs via Bootstrapping. arXiv:2102.06514.</w:t>
-      </w:r>
-    </w:p>
-    <w:p>
-      <w:pPr>
-        <w:pStyle w:val="Normal"/>
-        <w:widowControl/>
-        <w:spacing w:before="0" w:after="60" w:line="270" w:lineRule="atLeast"/>
-        <w:ind w:left="283" w:hanging="283"/>
-        <w:jc w:val="left"/>
-      </w:pPr>
-      <w:r>
-        <w:rPr>
-          <w:sz w:val="18"/>
-        </w:rPr>
-        <w:t>56. Tishby, N., F. C. Pereira and W. Bialek (1999) The information bottleneck method. Proceedings of the Allerton Conference on Communication, Control and Computing. Preprint: arXiv:physics/0004057.</w:t>
-      </w:r>
-    </w:p>
-    <w:p>
-      <w:pPr>
-        <w:pStyle w:val="Normal"/>
-        <w:widowControl/>
-        <w:spacing w:before="0" w:after="60" w:line="270" w:lineRule="atLeast"/>
-        <w:ind w:left="283" w:hanging="283"/>
-        <w:jc w:val="left"/>
-      </w:pPr>
-      <w:r>
-        <w:rPr>
-          <w:sz w:val="18"/>
-        </w:rPr>
-        <w:t>57. Trivedi, R., H. Dai, Y. Wang and L. Song (2017) Know-Evolve: Deep Temporal Reasoning for Dynamic Knowledge Graphs. arXiv:1705.05742.</w:t>
-      </w:r>
-    </w:p>
-    <w:p>
-      <w:pPr>
-        <w:pStyle w:val="Normal"/>
-        <w:widowControl/>
-        <w:spacing w:before="0" w:after="60" w:line="270" w:lineRule="atLeast"/>
-        <w:ind w:left="283" w:hanging="283"/>
-        <w:jc w:val="left"/>
-      </w:pPr>
-      <w:r>
-        <w:rPr>
-          <w:sz w:val="18"/>
-        </w:rPr>
-        <w:t>58. Trivedi, R., M. Farajtabar, P. Biswal and H. Zha (2019) DyRep: Learning representations over dynamic graphs. International Conference on Learning Representations.</w:t>
-      </w:r>
-    </w:p>
-    <w:p>
-      <w:pPr>
-        <w:pStyle w:val="Normal"/>
-        <w:widowControl/>
-        <w:spacing w:before="0" w:after="60" w:line="270" w:lineRule="atLeast"/>
-        <w:ind w:left="283" w:hanging="283"/>
-        <w:jc w:val="left"/>
-      </w:pPr>
-      <w:r>
-        <w:rPr>
-          <w:sz w:val="18"/>
-        </w:rPr>
-        <w:t>59. van den Oord, A., Y. Li and O. Vinyals (2018) Representation Learning with Contrastive Predictive Coding. arXiv:1807.03748.</w:t>
-      </w:r>
-    </w:p>
-    <w:p>
-      <w:pPr>
-        <w:pStyle w:val="Normal"/>
-        <w:widowControl/>
-        <w:spacing w:before="0" w:after="60" w:line="270" w:lineRule="atLeast"/>
-        <w:ind w:left="283" w:hanging="283"/>
-        <w:jc w:val="left"/>
-      </w:pPr>
-      <w:r>
-        <w:rPr>
-          <w:sz w:val="18"/>
-        </w:rPr>
-        <w:t>60. Vaswani, A., N. Shazeer, N. Parmar, J. Uszkoreit, L. Jones, A. N. Gomez, et al. (2017) Attention Is All You Need. arXiv:1706.03762.</w:t>
-      </w:r>
-    </w:p>
-    <w:p>
-      <w:pPr>
-        <w:pStyle w:val="Normal"/>
-        <w:widowControl/>
-        <w:spacing w:before="0" w:after="60" w:line="270" w:lineRule="atLeast"/>
-        <w:ind w:left="283" w:hanging="283"/>
-        <w:jc w:val="left"/>
-      </w:pPr>
-      <w:r>
-        <w:rPr>
-          <w:sz w:val="18"/>
-        </w:rPr>
-        <w:t>61. Veličković, P., G. Cucurull, A. Casanova, A. Romero, P. Liò and Y. Bengio (2017) Graph Attention Networks. arXiv:1710.10903.</w:t>
-      </w:r>
-    </w:p>
-    <w:p>
-      <w:pPr>
-        <w:pStyle w:val="Normal"/>
-        <w:widowControl/>
-        <w:spacing w:before="0" w:after="60" w:line="270" w:lineRule="atLeast"/>
-        <w:ind w:left="283" w:hanging="283"/>
-        <w:jc w:val="left"/>
-      </w:pPr>
-      <w:r>
-        <w:rPr>
-          <w:sz w:val="18"/>
-        </w:rPr>
-        <w:t>62. Veličković, P., W. Fedus, W. L. Hamilton, P. Liò, Y. Bengio and R. D. Hjelm (2018) Deep Graph Infomax. arXiv:1809.10341.</w:t>
-      </w:r>
-    </w:p>
-    <w:p>
-      <w:pPr>
-        <w:pStyle w:val="Normal"/>
-        <w:widowControl/>
-        <w:spacing w:before="0" w:after="60" w:line="270" w:lineRule="atLeast"/>
-        <w:ind w:left="283" w:hanging="283"/>
-        <w:jc w:val="left"/>
-      </w:pPr>
-      <w:r>
-        <w:rPr>
-          <w:sz w:val="18"/>
-        </w:rPr>
-        <w:t>63. Wang, L., X. Chang, S. Li, Y. Chu, H. Li, W. Zhang, X. He, L. Song, J. Zhou and H. Yang (2021) TCL: Transformer-based dynamic graph modelling via contrastive learning. arXiv:2105.07944.</w:t>
-      </w:r>
-    </w:p>
-    <w:p>
-      <w:pPr>
-        <w:pStyle w:val="Normal"/>
-        <w:widowControl/>
-        <w:spacing w:before="0" w:after="60" w:line="270" w:lineRule="atLeast"/>
-        <w:ind w:left="283" w:hanging="283"/>
-        <w:jc w:val="left"/>
-      </w:pPr>
-      <w:r>
-        <w:rPr>
-          <w:sz w:val="18"/>
-        </w:rPr>
-        <w:t>64. Wang, Y., Y.-Y. Chang, Y. Liu, J. Leskovec and P. Li (2021) Inductive representation learning in temporal networks via causal anonymous walks. International Conference on Learning Representations. arXiv:2101.05974.</w:t>
-      </w:r>
-    </w:p>
-    <w:p>
-      <w:pPr>
-        <w:pStyle w:val="Normal"/>
-        <w:widowControl/>
-        <w:spacing w:before="0" w:after="60" w:line="270" w:lineRule="atLeast"/>
-        <w:ind w:left="283" w:hanging="283"/>
-        <w:jc w:val="left"/>
-      </w:pPr>
-      <w:r>
-        <w:rPr>
-          <w:sz w:val="18"/>
-        </w:rPr>
-        <w:t>65. Welford, B. P. (1962) Note on a method for calculating corrected sums of squares and products. Technometrics, 4(3), 419–420.</w:t>
-      </w:r>
-    </w:p>
-    <w:p>
-      <w:pPr>
-        <w:pStyle w:val="Normal"/>
-        <w:widowControl/>
-        <w:spacing w:before="0" w:after="60" w:line="270" w:lineRule="atLeast"/>
-        <w:ind w:left="283" w:hanging="283"/>
-        <w:jc w:val="left"/>
-      </w:pPr>
-      <w:r>
-        <w:rPr>
-          <w:sz w:val="18"/>
-        </w:rPr>
-        <w:t>66. Xu, D., C. Ruan, E. Korpeoglu, S. Kumar and K. Achan (2020) Inductive representation learning on temporal graphs. International Conference on Learning Representations. arXiv:2002.07962.</w:t>
-      </w:r>
-    </w:p>
-    <w:p>
-      <w:pPr>
-        <w:pStyle w:val="Normal"/>
-        <w:widowControl/>
-        <w:spacing w:before="0" w:after="60" w:line="270" w:lineRule="atLeast"/>
-        <w:ind w:left="283" w:hanging="283"/>
-        <w:jc w:val="left"/>
-      </w:pPr>
-      <w:r>
-        <w:rPr>
-          <w:sz w:val="18"/>
-        </w:rPr>
-        <w:t>67. Xu, K., W. Hu, J. Leskovec and S. Jegelka (2018) How Powerful are Graph Neural Networks? arXiv:1810.00826.</w:t>
-      </w:r>
-    </w:p>
-    <w:p>
-      <w:pPr>
-        <w:pStyle w:val="Normal"/>
-        <w:widowControl/>
-        <w:spacing w:before="0" w:after="60" w:line="270" w:lineRule="atLeast"/>
-        <w:ind w:left="283" w:hanging="283"/>
-        <w:jc w:val="left"/>
-      </w:pPr>
-      <w:r>
-        <w:rPr>
-          <w:sz w:val="18"/>
-        </w:rPr>
-        <w:t>68. You, Y., T. Chen, Y. Sui, T. Chen, Z. Wang and Y. Shen (2020) Graph Contrastive Learning with Augmentations. arXiv:2010.13902.</w:t>
-      </w:r>
-    </w:p>
-    <w:p>
-      <w:pPr>
-        <w:pStyle w:val="Normal"/>
-        <w:widowControl/>
-        <w:spacing w:before="0" w:after="60" w:line="270" w:lineRule="atLeast"/>
-        <w:ind w:left="283" w:hanging="283"/>
-        <w:jc w:val="left"/>
-      </w:pPr>
-      <w:r>
-        <w:rPr>
-          <w:sz w:val="18"/>
-        </w:rPr>
-        <w:t>69. Yu, L., L. Sun, B. Du and W. Lv (2023) Towards better dynamic graph learning: New architecture and unified library. Advances in Neural Information Processing Systems, 36. arXiv:2303.13047.</w:t>
-      </w:r>
-    </w:p>
-    <w:p>
-      <w:pPr>
-        <w:pStyle w:val="Normal"/>
-        <w:widowControl/>
-        <w:spacing w:before="0" w:after="60" w:line="270" w:lineRule="atLeast"/>
-        <w:ind w:left="283" w:hanging="283"/>
-        <w:jc w:val="left"/>
-      </w:pPr>
-      <w:r>
-        <w:rPr>
-          <w:sz w:val="18"/>
-        </w:rPr>
-        <w:t>70. Zbontar, J., L. Jing, I. Misra, Y. LeCun and S. Deny (2021) Barlow Twins: Self-Supervised Learning via Redundancy Reduction. arXiv:2103.03230.</w:t>
-      </w:r>
-    </w:p>
-    <w:p>
-      <w:pPr>
-        <w:pStyle w:val="Normal"/>
-        <w:widowControl/>
-        <w:spacing w:before="0" w:after="60" w:line="270" w:lineRule="atLeast"/>
-        <w:ind w:left="283" w:hanging="283"/>
-        <w:jc w:val="left"/>
-      </w:pPr>
-      <w:r>
-        <w:rPr>
-          <w:sz w:val="18"/>
-        </w:rPr>
-        <w:t>71. Zhang, M. and Y. Chen (2018) Link Prediction Based on Graph Neural Networks. arXiv:1802.09691.</w:t>
-      </w:r>
-    </w:p>
-    <w:p>
-      <w:pPr>
-        <w:pStyle w:val="Normal"/>
-        <w:widowControl/>
-        <w:spacing w:before="0" w:after="60" w:line="270" w:lineRule="atLeast"/>
-        <w:ind w:left="283" w:hanging="283"/>
-        <w:jc w:val="left"/>
-      </w:pPr>
-      <w:r>
-        <w:rPr>
-          <w:sz w:val="18"/>
-        </w:rPr>
-        <w:t>72. Zhu, Y., Y. Xu, F. Yu, Q. Liu, S. Wu and L. Wang (2020) Deep Graph Contrastive Representation Learning. arXiv:2006.04131.</w:t>
+        <w:t>40. Zhang, M. and Y. Chen (2018) Link Prediction Based on Graph Neural Networks. arXiv:1802.09691.</w:t>
       </w:r>
     </w:p>
     <w:p>
@@ -10033,7 +11963,7 @@
           <w:color w:val="000000"/>
           <w:sz w:val="18"/>
         </w:rPr>
-        <w:t xml:space="preserve">共享來源，且其事件建構包含事後資訊；候選取樣未限制目的端節點類型，記憶更新亦混合批次與循序語意。歷史實驗依設定差異加以辨識，不與目前結果合併。本研究提供可重現的梯度路由及時序評估說明，並界定效能比較的適用範圍。</w:t>
+        <w:t xml:space="preserve">共享來源，且其事件建構包含事後資訊；候選取樣未限制目的端節點類型，記憶更新亦混合批次與循序語意。此外，回溯實驗涵蓋設計設定、預測器與閘門消融、較難候選池、骨幹移除及凍結探測，顯示預測器選擇與學習表徵在已記錄設定中的作用；各組依設定及資料版本分別呈現，不與目前結果合併。本研究提供可重現的梯度路由及時序評估說明，並界定效能比較的適用範圍。</w:t>
       </w:r>
     </w:p>
     <w:p>
@@ -10063,7 +11993,7 @@
         <w:t xml:space="preserve">時序圖，歸納式連結預測，梯度解耦，循環記憶，可重現評估</w:t>
       </w:r>
     </w:p>
-    <w:bookmarkEnd w:id="98"/>
+    <w:bookmarkEnd w:id="70"/>
     <w:sectPr>
       <w:headerReference r:id="rId2" w:type="even"/>
       <w:headerReference r:id="rId3" w:type="default"/>

</xml_diff>

<commit_message>
Add institutional mailing addresses to journal affiliations
</commit_message>
<xml_diff>
--- a/paper/journal/DYU/Word/DYU_Journal_Manuscript.docx
+++ b/paper/journal/DYU/Word/DYU_Journal_Manuscript.docx
@@ -127,7 +127,7 @@
           <w:color w:val="000000"/>
           <w:sz w:val="18"/>
         </w:rPr>
-        <w:t xml:space="preserve">Department of Computer Science, Da-Yeh University, Changhua, Taiwan</w:t>
+        <w:t xml:space="preserve">Department of Computer Science, Da-Yeh University</w:t>
       </w:r>
       <w:r>
         <w:rPr>
@@ -144,9 +144,16 @@
           <w:iCs/>
           <w:color w:val="000000"/>
           <w:sz w:val="18"/>
-          <w:vertAlign w:val="superscript"/>
-        </w:rPr>
-        <w:t xml:space="preserve">b</w:t>
+        </w:rPr>
+        <w:t xml:space="preserve">No. 168, University Rd., Dacun, Changhua 515006, Taiwan</w:t>
+      </w:r>
+      <w:r>
+        <w:rPr>
+          <w:rFonts w:ascii="Times New Roman" w:hAnsi="Times New Roman" w:eastAsia="Songti TC"/>
+          <w:color w:val="000000"/>
+          <w:sz w:val="18"/>
+        </w:rPr>
+        <w:br/>
       </w:r>
       <w:r>
         <w:rPr>
@@ -155,8 +162,37 @@
           <w:iCs/>
           <w:color w:val="000000"/>
           <w:sz w:val="18"/>
-        </w:rPr>
-        <w:t xml:space="preserve">Department of Computer Science, Kent State University, Ohio, United States</w:t>
+          <w:vertAlign w:val="superscript"/>
+        </w:rPr>
+        <w:t xml:space="preserve">b</w:t>
+      </w:r>
+      <w:r>
+        <w:rPr>
+          <w:rFonts w:ascii="Times New Roman" w:hAnsi="Times New Roman" w:eastAsia="Songti TC"/>
+          <w:i/>
+          <w:iCs/>
+          <w:color w:val="000000"/>
+          <w:sz w:val="18"/>
+        </w:rPr>
+        <w:t xml:space="preserve">Department of Computer Science, Kent State University</w:t>
+      </w:r>
+      <w:r>
+        <w:rPr>
+          <w:rFonts w:ascii="Times New Roman" w:hAnsi="Times New Roman" w:eastAsia="Songti TC"/>
+          <w:color w:val="000000"/>
+          <w:sz w:val="18"/>
+        </w:rPr>
+        <w:br/>
+      </w:r>
+      <w:r>
+        <w:rPr>
+          <w:rFonts w:ascii="Times New Roman" w:hAnsi="Times New Roman" w:eastAsia="Songti TC"/>
+          <w:i/>
+          <w:iCs/>
+          <w:color w:val="000000"/>
+          <w:sz w:val="18"/>
+        </w:rPr>
+        <w:t xml:space="preserve">P.O. Box 5190, Kent, OH 44242-0001, United States</w:t>
       </w:r>
     </w:p>
     <w:p>
@@ -11806,7 +11842,7 @@
           <w:color w:val="000000"/>
           <w:sz w:val="18"/>
         </w:rPr>
-        <w:t xml:space="preserve">大葉大學，臺灣彰化</w:t>
+        <w:t xml:space="preserve">大葉大學</w:t>
       </w:r>
       <w:r>
         <w:rPr>
@@ -11821,6 +11857,30 @@
           <w:rFonts w:ascii="Times New Roman" w:hAnsi="Times New Roman" w:eastAsia="Songti TC"/>
           <w:color w:val="000000"/>
           <w:sz w:val="18"/>
+        </w:rPr>
+        <w:t xml:space="preserve">515006 </w:t>
+      </w:r>
+      <w:r>
+        <w:rPr>
+          <w:rFonts w:hint="eastAsia" w:ascii="Times New Roman" w:hAnsi="Times New Roman" w:eastAsia="Songti TC"/>
+          <w:color w:val="000000"/>
+          <w:sz w:val="18"/>
+        </w:rPr>
+        <w:t xml:space="preserve">臺灣彰化縣大村鄉學府路168號</w:t>
+      </w:r>
+      <w:r>
+        <w:rPr>
+          <w:rFonts w:ascii="Times New Roman" w:hAnsi="Times New Roman" w:eastAsia="Songti TC"/>
+          <w:color w:val="000000"/>
+          <w:sz w:val="18"/>
+        </w:rPr>
+        <w:br/>
+      </w:r>
+      <w:r>
+        <w:rPr>
+          <w:rFonts w:ascii="Times New Roman" w:hAnsi="Times New Roman" w:eastAsia="Songti TC"/>
+          <w:color w:val="000000"/>
+          <w:sz w:val="18"/>
           <w:vertAlign w:val="superscript"/>
         </w:rPr>
         <w:t xml:space="preserve">b</w:t>
@@ -11831,7 +11891,23 @@
           <w:color w:val="000000"/>
           <w:sz w:val="18"/>
         </w:rPr>
-        <w:t xml:space="preserve">肯特州立大學，美國俄亥俄州</w:t>
+        <w:t xml:space="preserve">肯特州立大學</w:t>
+      </w:r>
+      <w:r>
+        <w:rPr>
+          <w:rFonts w:ascii="Times New Roman" w:hAnsi="Times New Roman" w:eastAsia="Songti TC"/>
+          <w:color w:val="000000"/>
+          <w:sz w:val="18"/>
+        </w:rPr>
+        <w:br/>
+      </w:r>
+      <w:r>
+        <w:rPr>
+          <w:rFonts w:ascii="Times New Roman" w:hAnsi="Times New Roman" w:eastAsia="Songti TC"/>
+          <w:color w:val="000000"/>
+          <w:sz w:val="18"/>
+        </w:rPr>
+        <w:t xml:space="preserve">P.O. Box 5190, Kent, OH 44242-0001, United States</w:t>
       </w:r>
       <w:r>
         <w:rPr>

</xml_diff>

<commit_message>
Place bilingual abstracts together before the introduction
</commit_message>
<xml_diff>
--- a/paper/journal/DYU/Word/DYU_Journal_Manuscript.docx
+++ b/paper/journal/DYU/Word/DYU_Journal_Manuscript.docx
@@ -297,6 +297,376 @@
           <w:sz w:val="18"/>
         </w:rPr>
         <w:t xml:space="preserve">temporal graphs, inductive link prediction, gradient decoupling, recurrent memory, reproducible evaluation</w:t>
+      </w:r>
+    </w:p>
+    <w:p>
+      <w:pPr>
+        <w:pStyle w:val="BodyText"/>
+        <w:widowControl/>
+        <w:spacing w:before="0" w:after="0" w:line="270" w:lineRule="atLeast"/>
+        <w:sectPr>
+          <w:headerReference r:id="rId2" w:type="even"/>
+          <w:headerReference r:id="rId3" w:type="default"/>
+          <w:headerReference r:id="rId4" w:type="first"/>
+          <w:footerReference r:id="rId5" w:type="even"/>
+          <w:footerReference r:id="rId6" w:type="default"/>
+          <w:footerReference r:id="rId7" w:type="first"/>
+          <w:pgSz w:h="16838" w:w="11906"/>
+          <w:pgMar w:bottom="1134" w:footer="680" w:gutter="0" w:header="567" w:left="1134" w:right="1134" w:top="1984"/>
+          <w:formProt w:val="false"/>
+          <w:textDirection w:val="lrTb"/>
+          <w:docGrid w:charSpace="0" w:linePitch="360" w:type="default"/>
+          <w:type w:val="nextPage"/>
+          <w:cols w:num="1" w:space="424"/>
+        </w:sectPr>
+      </w:pPr>
+    </w:p>
+    <w:p>
+      <w:pPr>
+        <w:pStyle w:val="Title"/>
+        <w:widowControl/>
+        <w:spacing w:before="0" w:after="240" w:line="300" w:lineRule="auto"/>
+        <w:ind w:firstLine="0"/>
+        <w:jc w:val="center"/>
+      </w:pPr>
+      <w:r>
+        <w:rPr>
+          <w:rFonts w:hint="eastAsia" w:ascii="Times New Roman" w:hAnsi="Times New Roman" w:eastAsia="Songti TC"/>
+          <w:b/>
+          <w:bCs/>
+          <w:color w:val="000000"/>
+          <w:sz w:val="36"/>
+        </w:rPr>
+        <w:t xml:space="preserve">歸納式時序連結預測中的梯度解耦：</w:t>
+      </w:r>
+      <w:r>
+        <w:rPr>
+          <w:rFonts w:ascii="Times New Roman" w:hAnsi="Times New Roman" w:eastAsia="Songti TC"/>
+          <w:b/>
+          <w:color w:val="000000"/>
+          <w:sz w:val="36"/>
+        </w:rPr>
+        <w:br/>
+      </w:r>
+      <w:r>
+        <w:rPr>
+          <w:rFonts w:hint="eastAsia" w:ascii="Times New Roman" w:hAnsi="Times New Roman" w:eastAsia="Songti TC"/>
+          <w:b/>
+          <w:bCs/>
+          <w:color w:val="000000"/>
+          <w:sz w:val="36"/>
+        </w:rPr>
+        <w:t xml:space="preserve">具狀態表徵的受控研究</w:t>
+      </w:r>
+    </w:p>
+    <w:p>
+      <w:pPr>
+        <w:pStyle w:val="BodyText"/>
+        <w:widowControl/>
+        <w:spacing w:before="0" w:after="120" w:line="270" w:lineRule="atLeast"/>
+        <w:ind w:firstLine="0"/>
+        <w:jc w:val="center"/>
+      </w:pPr>
+      <w:r>
+        <w:rPr>
+          <w:rFonts w:ascii="Times New Roman" w:hAnsi="Times New Roman" w:eastAsia="Songti TC"/>
+          <w:color w:val="000000"/>
+          <w:sz w:val="20"/>
+        </w:rPr>
+        <w:t xml:space="preserve">Duong Viet Hoang</w:t>
+      </w:r>
+      <w:r>
+        <w:rPr>
+          <w:rFonts w:ascii="Times New Roman" w:hAnsi="Times New Roman" w:eastAsia="Songti TC"/>
+          <w:color w:val="000000"/>
+          <w:sz w:val="20"/>
+          <w:vertAlign w:val="superscript"/>
+        </w:rPr>
+        <w:t xml:space="preserve">a,*</w:t>
+      </w:r>
+      <w:r>
+        <w:rPr>
+          <w:rFonts w:ascii="Times New Roman" w:hAnsi="Times New Roman" w:eastAsia="Songti TC"/>
+          <w:color w:val="000000"/>
+          <w:sz w:val="20"/>
+        </w:rPr>
+        <w:t xml:space="preserve">, Duong Viet Huy</w:t>
+      </w:r>
+      <w:r>
+        <w:rPr>
+          <w:rFonts w:ascii="Times New Roman" w:hAnsi="Times New Roman" w:eastAsia="Songti TC"/>
+          <w:color w:val="000000"/>
+          <w:sz w:val="20"/>
+          <w:vertAlign w:val="superscript"/>
+        </w:rPr>
+        <w:t xml:space="preserve">b</w:t>
+      </w:r>
+      <w:r>
+        <w:rPr>
+          <w:rFonts w:ascii="Times New Roman" w:hAnsi="Times New Roman" w:eastAsia="Songti TC"/>
+          <w:color w:val="000000"/>
+          <w:sz w:val="20"/>
+        </w:rPr>
+        <w:t xml:space="preserve">, Lun-Min Shih</w:t>
+      </w:r>
+      <w:r>
+        <w:rPr>
+          <w:rFonts w:ascii="Times New Roman" w:hAnsi="Times New Roman" w:eastAsia="Songti TC"/>
+          <w:color w:val="000000"/>
+          <w:sz w:val="20"/>
+          <w:vertAlign w:val="superscript"/>
+        </w:rPr>
+        <w:t xml:space="preserve">a</w:t>
+      </w:r>
+    </w:p>
+    <w:p>
+      <w:pPr>
+        <w:pStyle w:val="BodyText"/>
+        <w:widowControl/>
+        <w:spacing w:before="0" w:after="0" w:line="270" w:lineRule="atLeast"/>
+        <w:ind w:firstLine="0"/>
+        <w:jc w:val="center"/>
+      </w:pPr>
+      <w:r>
+        <w:rPr>
+          <w:rFonts w:ascii="Times New Roman" w:hAnsi="Times New Roman" w:eastAsia="Songti TC"/>
+          <w:color w:val="000000"/>
+          <w:sz w:val="18"/>
+          <w:vertAlign w:val="superscript"/>
+        </w:rPr>
+        <w:t xml:space="preserve">a</w:t>
+      </w:r>
+      <w:r>
+        <w:rPr>
+          <w:rFonts w:hint="eastAsia" w:ascii="Times New Roman" w:hAnsi="Times New Roman" w:eastAsia="Songti TC"/>
+          <w:color w:val="000000"/>
+          <w:sz w:val="18"/>
+        </w:rPr>
+        <w:t xml:space="preserve">大葉大學</w:t>
+      </w:r>
+      <w:r>
+        <w:rPr>
+          <w:rFonts w:ascii="Times New Roman" w:hAnsi="Times New Roman" w:eastAsia="Songti TC"/>
+          <w:color w:val="000000"/>
+          <w:sz w:val="18"/>
+        </w:rPr>
+        <w:br/>
+      </w:r>
+      <w:r>
+        <w:rPr>
+          <w:rFonts w:ascii="Times New Roman" w:hAnsi="Times New Roman" w:eastAsia="Songti TC"/>
+          <w:color w:val="000000"/>
+          <w:sz w:val="18"/>
+        </w:rPr>
+        <w:t xml:space="preserve">515006 </w:t>
+      </w:r>
+      <w:r>
+        <w:rPr>
+          <w:rFonts w:hint="eastAsia" w:ascii="Times New Roman" w:hAnsi="Times New Roman" w:eastAsia="Songti TC"/>
+          <w:color w:val="000000"/>
+          <w:sz w:val="18"/>
+        </w:rPr>
+        <w:t xml:space="preserve">臺灣彰化縣大村鄉學府路168號</w:t>
+      </w:r>
+      <w:r>
+        <w:rPr>
+          <w:rFonts w:ascii="Times New Roman" w:hAnsi="Times New Roman" w:eastAsia="Songti TC"/>
+          <w:color w:val="000000"/>
+          <w:sz w:val="18"/>
+        </w:rPr>
+        <w:br/>
+      </w:r>
+      <w:r>
+        <w:rPr>
+          <w:rFonts w:ascii="Times New Roman" w:hAnsi="Times New Roman" w:eastAsia="Songti TC"/>
+          <w:color w:val="000000"/>
+          <w:sz w:val="18"/>
+          <w:vertAlign w:val="superscript"/>
+        </w:rPr>
+        <w:t xml:space="preserve">b</w:t>
+      </w:r>
+      <w:r>
+        <w:rPr>
+          <w:rFonts w:hint="eastAsia" w:ascii="Times New Roman" w:hAnsi="Times New Roman" w:eastAsia="Songti TC"/>
+          <w:color w:val="000000"/>
+          <w:sz w:val="18"/>
+        </w:rPr>
+        <w:t xml:space="preserve">肯特州立大學</w:t>
+      </w:r>
+      <w:r>
+        <w:rPr>
+          <w:rFonts w:ascii="Times New Roman" w:hAnsi="Times New Roman" w:eastAsia="Songti TC"/>
+          <w:color w:val="000000"/>
+          <w:sz w:val="18"/>
+        </w:rPr>
+        <w:br/>
+      </w:r>
+      <w:r>
+        <w:rPr>
+          <w:rFonts w:ascii="Times New Roman" w:hAnsi="Times New Roman" w:eastAsia="Songti TC"/>
+          <w:color w:val="000000"/>
+          <w:sz w:val="18"/>
+        </w:rPr>
+        <w:t xml:space="preserve">P.O. Box 5190, Kent, OH 44242-0001, United States</w:t>
+      </w:r>
+      <w:r>
+        <w:rPr>
+          <w:rFonts w:ascii="Times New Roman" w:hAnsi="Times New Roman" w:eastAsia="Songti TC"/>
+          <w:color w:val="000000"/>
+          <w:sz w:val="18"/>
+        </w:rPr>
+        <w:br/>
+      </w:r>
+      <w:r>
+        <w:rPr>
+          <w:rFonts w:hint="eastAsia" w:ascii="Times New Roman" w:hAnsi="Times New Roman" w:eastAsia="Songti TC"/>
+          <w:color w:val="000000"/>
+          <w:sz w:val="18"/>
+        </w:rPr>
+        <w:t xml:space="preserve">*通訊作者：Hoangduong4316@icloud.com</w:t>
+      </w:r>
+    </w:p>
+    <w:p>
+      <w:pPr>
+        <w:pStyle w:val="Normal"/>
+        <w:widowControl/>
+        <w:spacing w:before="320" w:after="160" w:line="270" w:lineRule="atLeast"/>
+        <w:ind w:firstLine="0"/>
+        <w:jc w:val="center"/>
+      </w:pPr>
+      <w:r>
+        <w:rPr>
+          <w:rFonts w:hint="eastAsia" w:ascii="Times New Roman" w:hAnsi="Times New Roman" w:eastAsia="Songti TC"/>
+          <w:b/>
+          <w:bCs/>
+          <w:color w:val="000000"/>
+          <w:sz w:val="22"/>
+        </w:rPr>
+        <w:t xml:space="preserve">摘要</w:t>
+      </w:r>
+    </w:p>
+    <w:p>
+      <w:pPr>
+        <w:pStyle w:val="BodyText"/>
+        <w:widowControl/>
+        <w:spacing w:before="0" w:after="0" w:line="270" w:lineRule="atLeast"/>
+        <w:ind w:firstLine="0" w:left="1134" w:right="1134"/>
+        <w:jc w:val="both"/>
+      </w:pPr>
+      <w:r>
+        <w:rPr>
+          <w:rFonts w:hint="eastAsia" w:ascii="Times New Roman" w:hAnsi="Times New Roman" w:eastAsia="Songti TC"/>
+          <w:color w:val="000000"/>
+          <w:sz w:val="18"/>
+        </w:rPr>
+        <w:t xml:space="preserve">歸納式時序連結預測需要處理先前觀測中未出現的節點。本研究以結合事件編碼、循環節點記憶、確定性節點對歷史訊號與階層讀出器的</w:t>
+      </w:r>
+      <w:r>
+        <w:rPr>
+          <w:rFonts w:ascii="Times New Roman" w:hAnsi="Times New Roman" w:eastAsia="Songti TC"/>
+          <w:color w:val="000000"/>
+          <w:sz w:val="18"/>
+        </w:rPr>
+        <w:t xml:space="preserve"> </w:t>
+      </w:r>
+      <w:r>
+        <w:rPr>
+          <w:rFonts w:hint="eastAsia" w:ascii="Times New Roman" w:hAnsi="Times New Roman" w:eastAsia="Songti TC"/>
+          <w:color w:val="000000"/>
+          <w:sz w:val="18"/>
+        </w:rPr>
+        <w:t xml:space="preserve">SR-GNN，探討評分路徑的梯度是否應更新時序表徵。我們明確區分梯度邊界、參數學習與事件狀態演化，並在相同已註冊讀出器下比較耦合及解耦訓練；另以先訓練再凍結並重新訓練預測頭的方法作為不同訓練流程的對照。研究採用</w:t>
+      </w:r>
+      <w:r>
+        <w:rPr>
+          <w:rFonts w:ascii="Times New Roman" w:hAnsi="Times New Roman" w:eastAsia="Songti TC"/>
+          <w:color w:val="000000"/>
+          <w:sz w:val="18"/>
+        </w:rPr>
+        <w:t xml:space="preserve"> CoEdit、Wikipedia </w:t>
+      </w:r>
+      <w:r>
+        <w:rPr>
+          <w:rFonts w:hint="eastAsia" w:ascii="Times New Roman" w:hAnsi="Times New Roman" w:eastAsia="Songti TC"/>
+          <w:color w:val="000000"/>
+          <w:sz w:val="18"/>
+        </w:rPr>
+        <w:t xml:space="preserve">與</w:t>
+      </w:r>
+      <w:r>
+        <w:rPr>
+          <w:rFonts w:ascii="Times New Roman" w:hAnsi="Times New Roman" w:eastAsia="Songti TC"/>
+          <w:color w:val="000000"/>
+          <w:sz w:val="18"/>
+        </w:rPr>
+        <w:t xml:space="preserve"> MOOC </w:t>
+      </w:r>
+      <w:r>
+        <w:rPr>
+          <w:rFonts w:hint="eastAsia" w:ascii="Times New Roman" w:hAnsi="Times New Roman" w:eastAsia="Songti TC"/>
+          <w:color w:val="000000"/>
+          <w:sz w:val="18"/>
+        </w:rPr>
+        <w:t xml:space="preserve">的時間切分及固定隨機負樣本協定。具校驗碼的封存結果顯示，解耦組在各語料上的平均歸納式平均精確率均高於耦合組。此結果支持協定內的觀察比較，而非端到端學習普遍有害的結論。CoEdit</w:t>
+      </w:r>
+      <w:r>
+        <w:rPr>
+          <w:rFonts w:ascii="Times New Roman" w:hAnsi="Times New Roman" w:eastAsia="Songti TC"/>
+          <w:color w:val="000000"/>
+          <w:sz w:val="18"/>
+        </w:rPr>
+        <w:t xml:space="preserve"> </w:t>
+      </w:r>
+      <w:r>
+        <w:rPr>
+          <w:rFonts w:hint="eastAsia" w:ascii="Times New Roman" w:hAnsi="Times New Roman" w:eastAsia="Songti TC"/>
+          <w:color w:val="000000"/>
+          <w:sz w:val="18"/>
+        </w:rPr>
+        <w:t xml:space="preserve">與</w:t>
+      </w:r>
+      <w:r>
+        <w:rPr>
+          <w:rFonts w:ascii="Times New Roman" w:hAnsi="Times New Roman" w:eastAsia="Songti TC"/>
+          <w:color w:val="000000"/>
+          <w:sz w:val="18"/>
+        </w:rPr>
+        <w:t xml:space="preserve"> Wikipedia </w:t>
+      </w:r>
+      <w:r>
+        <w:rPr>
+          <w:rFonts w:hint="eastAsia" w:ascii="Times New Roman" w:hAnsi="Times New Roman" w:eastAsia="Songti TC"/>
+          <w:color w:val="000000"/>
+          <w:sz w:val="18"/>
+        </w:rPr>
+        <w:t xml:space="preserve">共享來源，且其事件建構包含事後資訊；候選取樣未限制目的端節點類型，記憶更新亦混合批次與循序語意。此外，回溯實驗涵蓋設計設定、預測器與閘門消融、較難候選池、骨幹移除及凍結探測，顯示預測器選擇與學習表徵在已記錄設定中的作用；各組依設定及資料版本分別呈現，不與目前結果合併。本研究提供可重現的梯度路由及時序評估說明，並界定效能比較的適用範圍。</w:t>
+      </w:r>
+    </w:p>
+    <w:p>
+      <w:pPr>
+        <w:pStyle w:val="BodyText"/>
+        <w:widowControl/>
+        <w:spacing w:before="200" w:after="0" w:line="270" w:lineRule="atLeast"/>
+        <w:ind w:firstLine="0" w:left="1134" w:right="1134"/>
+        <w:jc w:val="both"/>
+      </w:pPr>
+      <w:r>
+        <w:rPr>
+          <w:rFonts w:hint="eastAsia" w:ascii="Times New Roman" w:hAnsi="Times New Roman" w:eastAsia="Songti TC"/>
+          <w:b/>
+          <w:bCs/>
+          <w:color w:val="000000"/>
+          <w:sz w:val="18"/>
+        </w:rPr>
+        <w:t xml:space="preserve">關鍵詞：</w:t>
+      </w:r>
+      <w:r>
+        <w:rPr>
+          <w:rFonts w:hint="eastAsia" w:ascii="Times New Roman" w:hAnsi="Times New Roman" w:eastAsia="Songti TC"/>
+          <w:color w:val="000000"/>
+          <w:sz w:val="18"/>
+        </w:rPr>
+        <w:t xml:space="preserve">時序圖，歸納式連結預測，梯度解耦，循環記憶，可重現評估</w:t>
       </w:r>
     </w:p>
     <w:p>
@@ -11699,376 +12069,6 @@
         <w:t>40. Zhang, M. and Y. Chen (2018) Link Prediction Based on Graph Neural Networks. arXiv:1802.09691.</w:t>
       </w:r>
     </w:p>
-    <w:p>
-      <w:pPr>
-        <w:pStyle w:val="BodyText"/>
-        <w:widowControl/>
-        <w:spacing w:before="0" w:after="0" w:line="270" w:lineRule="atLeast"/>
-        <w:sectPr>
-          <w:headerReference r:id="rId2" w:type="even"/>
-          <w:headerReference r:id="rId3" w:type="default"/>
-          <w:headerReference r:id="rId4" w:type="first"/>
-          <w:footerReference r:id="rId5" w:type="even"/>
-          <w:footerReference r:id="rId6" w:type="default"/>
-          <w:footerReference r:id="rId7" w:type="first"/>
-          <w:pgSz w:h="16838" w:w="11906"/>
-          <w:pgMar w:bottom="1134" w:footer="680" w:gutter="0" w:header="567" w:left="1134" w:right="1134" w:top="1984"/>
-          <w:formProt w:val="false"/>
-          <w:textDirection w:val="lrTb"/>
-          <w:docGrid w:charSpace="0" w:linePitch="360" w:type="default"/>
-          <w:type w:val="nextPage"/>
-          <w:cols w:num="2" w:space="424"/>
-        </w:sectPr>
-      </w:pPr>
-    </w:p>
-    <w:p>
-      <w:pPr>
-        <w:pStyle w:val="Title"/>
-        <w:widowControl/>
-        <w:spacing w:before="0" w:after="240" w:line="300" w:lineRule="auto"/>
-        <w:ind w:firstLine="0"/>
-        <w:jc w:val="center"/>
-      </w:pPr>
-      <w:r>
-        <w:rPr>
-          <w:rFonts w:hint="eastAsia" w:ascii="Times New Roman" w:hAnsi="Times New Roman" w:eastAsia="Songti TC"/>
-          <w:b/>
-          <w:bCs/>
-          <w:color w:val="000000"/>
-          <w:sz w:val="36"/>
-        </w:rPr>
-        <w:t xml:space="preserve">歸納式時序連結預測中的梯度解耦：</w:t>
-      </w:r>
-      <w:r>
-        <w:rPr>
-          <w:rFonts w:ascii="Times New Roman" w:hAnsi="Times New Roman" w:eastAsia="Songti TC"/>
-          <w:b/>
-          <w:color w:val="000000"/>
-          <w:sz w:val="36"/>
-        </w:rPr>
-        <w:br/>
-      </w:r>
-      <w:r>
-        <w:rPr>
-          <w:rFonts w:hint="eastAsia" w:ascii="Times New Roman" w:hAnsi="Times New Roman" w:eastAsia="Songti TC"/>
-          <w:b/>
-          <w:bCs/>
-          <w:color w:val="000000"/>
-          <w:sz w:val="36"/>
-        </w:rPr>
-        <w:t xml:space="preserve">具狀態表徵的受控研究</w:t>
-      </w:r>
-    </w:p>
-    <w:p>
-      <w:pPr>
-        <w:pStyle w:val="BodyText"/>
-        <w:widowControl/>
-        <w:spacing w:before="0" w:after="120" w:line="270" w:lineRule="atLeast"/>
-        <w:ind w:firstLine="0"/>
-        <w:jc w:val="center"/>
-      </w:pPr>
-      <w:r>
-        <w:rPr>
-          <w:rFonts w:ascii="Times New Roman" w:hAnsi="Times New Roman" w:eastAsia="Songti TC"/>
-          <w:color w:val="000000"/>
-          <w:sz w:val="20"/>
-        </w:rPr>
-        <w:t xml:space="preserve">Duong Viet Hoang</w:t>
-      </w:r>
-      <w:r>
-        <w:rPr>
-          <w:rFonts w:ascii="Times New Roman" w:hAnsi="Times New Roman" w:eastAsia="Songti TC"/>
-          <w:color w:val="000000"/>
-          <w:sz w:val="20"/>
-          <w:vertAlign w:val="superscript"/>
-        </w:rPr>
-        <w:t xml:space="preserve">a,*</w:t>
-      </w:r>
-      <w:r>
-        <w:rPr>
-          <w:rFonts w:ascii="Times New Roman" w:hAnsi="Times New Roman" w:eastAsia="Songti TC"/>
-          <w:color w:val="000000"/>
-          <w:sz w:val="20"/>
-        </w:rPr>
-        <w:t xml:space="preserve">, Duong Viet Huy</w:t>
-      </w:r>
-      <w:r>
-        <w:rPr>
-          <w:rFonts w:ascii="Times New Roman" w:hAnsi="Times New Roman" w:eastAsia="Songti TC"/>
-          <w:color w:val="000000"/>
-          <w:sz w:val="20"/>
-          <w:vertAlign w:val="superscript"/>
-        </w:rPr>
-        <w:t xml:space="preserve">b</w:t>
-      </w:r>
-      <w:r>
-        <w:rPr>
-          <w:rFonts w:ascii="Times New Roman" w:hAnsi="Times New Roman" w:eastAsia="Songti TC"/>
-          <w:color w:val="000000"/>
-          <w:sz w:val="20"/>
-        </w:rPr>
-        <w:t xml:space="preserve">, Lun-Min Shih</w:t>
-      </w:r>
-      <w:r>
-        <w:rPr>
-          <w:rFonts w:ascii="Times New Roman" w:hAnsi="Times New Roman" w:eastAsia="Songti TC"/>
-          <w:color w:val="000000"/>
-          <w:sz w:val="20"/>
-          <w:vertAlign w:val="superscript"/>
-        </w:rPr>
-        <w:t xml:space="preserve">a</w:t>
-      </w:r>
-    </w:p>
-    <w:p>
-      <w:pPr>
-        <w:pStyle w:val="BodyText"/>
-        <w:widowControl/>
-        <w:spacing w:before="0" w:after="0" w:line="270" w:lineRule="atLeast"/>
-        <w:ind w:firstLine="0"/>
-        <w:jc w:val="center"/>
-      </w:pPr>
-      <w:r>
-        <w:rPr>
-          <w:rFonts w:ascii="Times New Roman" w:hAnsi="Times New Roman" w:eastAsia="Songti TC"/>
-          <w:color w:val="000000"/>
-          <w:sz w:val="18"/>
-          <w:vertAlign w:val="superscript"/>
-        </w:rPr>
-        <w:t xml:space="preserve">a</w:t>
-      </w:r>
-      <w:r>
-        <w:rPr>
-          <w:rFonts w:hint="eastAsia" w:ascii="Times New Roman" w:hAnsi="Times New Roman" w:eastAsia="Songti TC"/>
-          <w:color w:val="000000"/>
-          <w:sz w:val="18"/>
-        </w:rPr>
-        <w:t xml:space="preserve">大葉大學</w:t>
-      </w:r>
-      <w:r>
-        <w:rPr>
-          <w:rFonts w:ascii="Times New Roman" w:hAnsi="Times New Roman" w:eastAsia="Songti TC"/>
-          <w:color w:val="000000"/>
-          <w:sz w:val="18"/>
-        </w:rPr>
-        <w:br/>
-      </w:r>
-      <w:r>
-        <w:rPr>
-          <w:rFonts w:ascii="Times New Roman" w:hAnsi="Times New Roman" w:eastAsia="Songti TC"/>
-          <w:color w:val="000000"/>
-          <w:sz w:val="18"/>
-        </w:rPr>
-        <w:t xml:space="preserve">515006 </w:t>
-      </w:r>
-      <w:r>
-        <w:rPr>
-          <w:rFonts w:hint="eastAsia" w:ascii="Times New Roman" w:hAnsi="Times New Roman" w:eastAsia="Songti TC"/>
-          <w:color w:val="000000"/>
-          <w:sz w:val="18"/>
-        </w:rPr>
-        <w:t xml:space="preserve">臺灣彰化縣大村鄉學府路168號</w:t>
-      </w:r>
-      <w:r>
-        <w:rPr>
-          <w:rFonts w:ascii="Times New Roman" w:hAnsi="Times New Roman" w:eastAsia="Songti TC"/>
-          <w:color w:val="000000"/>
-          <w:sz w:val="18"/>
-        </w:rPr>
-        <w:br/>
-      </w:r>
-      <w:r>
-        <w:rPr>
-          <w:rFonts w:ascii="Times New Roman" w:hAnsi="Times New Roman" w:eastAsia="Songti TC"/>
-          <w:color w:val="000000"/>
-          <w:sz w:val="18"/>
-          <w:vertAlign w:val="superscript"/>
-        </w:rPr>
-        <w:t xml:space="preserve">b</w:t>
-      </w:r>
-      <w:r>
-        <w:rPr>
-          <w:rFonts w:hint="eastAsia" w:ascii="Times New Roman" w:hAnsi="Times New Roman" w:eastAsia="Songti TC"/>
-          <w:color w:val="000000"/>
-          <w:sz w:val="18"/>
-        </w:rPr>
-        <w:t xml:space="preserve">肯特州立大學</w:t>
-      </w:r>
-      <w:r>
-        <w:rPr>
-          <w:rFonts w:ascii="Times New Roman" w:hAnsi="Times New Roman" w:eastAsia="Songti TC"/>
-          <w:color w:val="000000"/>
-          <w:sz w:val="18"/>
-        </w:rPr>
-        <w:br/>
-      </w:r>
-      <w:r>
-        <w:rPr>
-          <w:rFonts w:ascii="Times New Roman" w:hAnsi="Times New Roman" w:eastAsia="Songti TC"/>
-          <w:color w:val="000000"/>
-          <w:sz w:val="18"/>
-        </w:rPr>
-        <w:t xml:space="preserve">P.O. Box 5190, Kent, OH 44242-0001, United States</w:t>
-      </w:r>
-      <w:r>
-        <w:rPr>
-          <w:rFonts w:ascii="Times New Roman" w:hAnsi="Times New Roman" w:eastAsia="Songti TC"/>
-          <w:color w:val="000000"/>
-          <w:sz w:val="18"/>
-        </w:rPr>
-        <w:br/>
-      </w:r>
-      <w:r>
-        <w:rPr>
-          <w:rFonts w:hint="eastAsia" w:ascii="Times New Roman" w:hAnsi="Times New Roman" w:eastAsia="Songti TC"/>
-          <w:color w:val="000000"/>
-          <w:sz w:val="18"/>
-        </w:rPr>
-        <w:t xml:space="preserve">*通訊作者：Hoangduong4316@icloud.com</w:t>
-      </w:r>
-    </w:p>
-    <w:p>
-      <w:pPr>
-        <w:pStyle w:val="Normal"/>
-        <w:widowControl/>
-        <w:spacing w:before="320" w:after="160" w:line="270" w:lineRule="atLeast"/>
-        <w:ind w:firstLine="0"/>
-        <w:jc w:val="center"/>
-      </w:pPr>
-      <w:r>
-        <w:rPr>
-          <w:rFonts w:hint="eastAsia" w:ascii="Times New Roman" w:hAnsi="Times New Roman" w:eastAsia="Songti TC"/>
-          <w:b/>
-          <w:bCs/>
-          <w:color w:val="000000"/>
-          <w:sz w:val="22"/>
-        </w:rPr>
-        <w:t xml:space="preserve">摘要</w:t>
-      </w:r>
-    </w:p>
-    <w:p>
-      <w:pPr>
-        <w:pStyle w:val="BodyText"/>
-        <w:widowControl/>
-        <w:spacing w:before="0" w:after="0" w:line="270" w:lineRule="atLeast"/>
-        <w:ind w:firstLine="0" w:left="1134" w:right="1134"/>
-        <w:jc w:val="both"/>
-      </w:pPr>
-      <w:r>
-        <w:rPr>
-          <w:rFonts w:hint="eastAsia" w:ascii="Times New Roman" w:hAnsi="Times New Roman" w:eastAsia="Songti TC"/>
-          <w:color w:val="000000"/>
-          <w:sz w:val="18"/>
-        </w:rPr>
-        <w:t xml:space="preserve">歸納式時序連結預測需要處理先前觀測中未出現的節點。本研究以結合事件編碼、循環節點記憶、確定性節點對歷史訊號與階層讀出器的</w:t>
-      </w:r>
-      <w:r>
-        <w:rPr>
-          <w:rFonts w:ascii="Times New Roman" w:hAnsi="Times New Roman" w:eastAsia="Songti TC"/>
-          <w:color w:val="000000"/>
-          <w:sz w:val="18"/>
-        </w:rPr>
-        <w:t xml:space="preserve"> </w:t>
-      </w:r>
-      <w:r>
-        <w:rPr>
-          <w:rFonts w:hint="eastAsia" w:ascii="Times New Roman" w:hAnsi="Times New Roman" w:eastAsia="Songti TC"/>
-          <w:color w:val="000000"/>
-          <w:sz w:val="18"/>
-        </w:rPr>
-        <w:t xml:space="preserve">SR-GNN，探討評分路徑的梯度是否應更新時序表徵。我們明確區分梯度邊界、參數學習與事件狀態演化，並在相同已註冊讀出器下比較耦合及解耦訓練；另以先訓練再凍結並重新訓練預測頭的方法作為不同訓練流程的對照。研究採用</w:t>
-      </w:r>
-      <w:r>
-        <w:rPr>
-          <w:rFonts w:ascii="Times New Roman" w:hAnsi="Times New Roman" w:eastAsia="Songti TC"/>
-          <w:color w:val="000000"/>
-          <w:sz w:val="18"/>
-        </w:rPr>
-        <w:t xml:space="preserve"> CoEdit、Wikipedia </w:t>
-      </w:r>
-      <w:r>
-        <w:rPr>
-          <w:rFonts w:hint="eastAsia" w:ascii="Times New Roman" w:hAnsi="Times New Roman" w:eastAsia="Songti TC"/>
-          <w:color w:val="000000"/>
-          <w:sz w:val="18"/>
-        </w:rPr>
-        <w:t xml:space="preserve">與</w:t>
-      </w:r>
-      <w:r>
-        <w:rPr>
-          <w:rFonts w:ascii="Times New Roman" w:hAnsi="Times New Roman" w:eastAsia="Songti TC"/>
-          <w:color w:val="000000"/>
-          <w:sz w:val="18"/>
-        </w:rPr>
-        <w:t xml:space="preserve"> MOOC </w:t>
-      </w:r>
-      <w:r>
-        <w:rPr>
-          <w:rFonts w:hint="eastAsia" w:ascii="Times New Roman" w:hAnsi="Times New Roman" w:eastAsia="Songti TC"/>
-          <w:color w:val="000000"/>
-          <w:sz w:val="18"/>
-        </w:rPr>
-        <w:t xml:space="preserve">的時間切分及固定隨機負樣本協定。具校驗碼的封存結果顯示，解耦組在各語料上的平均歸納式平均精確率均高於耦合組。此結果支持協定內的觀察比較，而非端到端學習普遍有害的結論。CoEdit</w:t>
-      </w:r>
-      <w:r>
-        <w:rPr>
-          <w:rFonts w:ascii="Times New Roman" w:hAnsi="Times New Roman" w:eastAsia="Songti TC"/>
-          <w:color w:val="000000"/>
-          <w:sz w:val="18"/>
-        </w:rPr>
-        <w:t xml:space="preserve"> </w:t>
-      </w:r>
-      <w:r>
-        <w:rPr>
-          <w:rFonts w:hint="eastAsia" w:ascii="Times New Roman" w:hAnsi="Times New Roman" w:eastAsia="Songti TC"/>
-          <w:color w:val="000000"/>
-          <w:sz w:val="18"/>
-        </w:rPr>
-        <w:t xml:space="preserve">與</w:t>
-      </w:r>
-      <w:r>
-        <w:rPr>
-          <w:rFonts w:ascii="Times New Roman" w:hAnsi="Times New Roman" w:eastAsia="Songti TC"/>
-          <w:color w:val="000000"/>
-          <w:sz w:val="18"/>
-        </w:rPr>
-        <w:t xml:space="preserve"> Wikipedia </w:t>
-      </w:r>
-      <w:r>
-        <w:rPr>
-          <w:rFonts w:hint="eastAsia" w:ascii="Times New Roman" w:hAnsi="Times New Roman" w:eastAsia="Songti TC"/>
-          <w:color w:val="000000"/>
-          <w:sz w:val="18"/>
-        </w:rPr>
-        <w:t xml:space="preserve">共享來源，且其事件建構包含事後資訊；候選取樣未限制目的端節點類型，記憶更新亦混合批次與循序語意。此外，回溯實驗涵蓋設計設定、預測器與閘門消融、較難候選池、骨幹移除及凍結探測，顯示預測器選擇與學習表徵在已記錄設定中的作用；各組依設定及資料版本分別呈現，不與目前結果合併。本研究提供可重現的梯度路由及時序評估說明，並界定效能比較的適用範圍。</w:t>
-      </w:r>
-    </w:p>
-    <w:p>
-      <w:pPr>
-        <w:pStyle w:val="BodyText"/>
-        <w:widowControl/>
-        <w:spacing w:before="200" w:after="0" w:line="270" w:lineRule="atLeast"/>
-        <w:ind w:firstLine="0" w:left="1134" w:right="1134"/>
-        <w:jc w:val="both"/>
-      </w:pPr>
-      <w:r>
-        <w:rPr>
-          <w:rFonts w:hint="eastAsia" w:ascii="Times New Roman" w:hAnsi="Times New Roman" w:eastAsia="Songti TC"/>
-          <w:b/>
-          <w:bCs/>
-          <w:color w:val="000000"/>
-          <w:sz w:val="18"/>
-        </w:rPr>
-        <w:t xml:space="preserve">關鍵詞：</w:t>
-      </w:r>
-      <w:r>
-        <w:rPr>
-          <w:rFonts w:hint="eastAsia" w:ascii="Times New Roman" w:hAnsi="Times New Roman" w:eastAsia="Songti TC"/>
-          <w:color w:val="000000"/>
-          <w:sz w:val="18"/>
-        </w:rPr>
-        <w:t xml:space="preserve">時序圖，歸納式連結預測，梯度解耦，循環記憶，可重現評估</w:t>
-      </w:r>
-    </w:p>
     <w:bookmarkEnd w:id="70"/>
     <w:sectPr>
       <w:headerReference r:id="rId2" w:type="even"/>
@@ -12083,7 +12083,7 @@
       <w:textDirection w:val="lrTb"/>
       <w:docGrid w:charSpace="0" w:linePitch="360" w:type="default"/>
       <w:type w:val="nextPage"/>
-      <w:cols w:num="1" w:space="424"/>
+      <w:cols w:num="2" w:space="424"/>
     </w:sectPr>
   </w:body>
 </w:document>

</xml_diff>

<commit_message>
Clarify model development and contribution in the manuscript
</commit_message>
<xml_diff>
--- a/paper/journal/DYU/Word/DYU_Journal_Manuscript.docx
+++ b/paper/journal/DYU/Word/DYU_Journal_Manuscript.docx
@@ -261,7 +261,7 @@
           <w:color w:val="000000"/>
           <w:sz w:val="18"/>
         </w:rPr>
-        <w:t xml:space="preserve">Inductive temporal link prediction requires a model to score interactions involving entities absent from earlier observations. Jointly optimizing a temporal representation and its link readout is a natural design choice, but it need not be the most effective choice for a particular inductive protocol. This study investigates gradient routing in SR-GNN, a temporal model combining event encoding, recurrent node memory, deterministic pair-history signals and a hierarchical readout. We specify the scored gradient boundary, distinguish parameter learning from event-state evolution, and compare coupled and decoupled versions of the same registered readout. A separate freeze-then-probe procedure examines a different training trajectory. Experiments use chronological partitions of CoEdit, Wikipedia and MOOC and a fixed random-destination evaluation procedure. Checksum-bound results are reported as mean inductive average precision and sample standard deviation across the registered seeds. The observed decoupled arm has higher mean inductive average precision than the coupled arm on each corpus. This supports a bounded within-protocol comparison rather than a general claim that end-to-end learning is harmful. The analysis identifies important interpretation limits: CoEdit shares its source with Wikipedia, its event construction includes retrospective information, the candidate sampler is not destination-type constrained, and temporal memory follows mixed batch and sequential semantics. Retrospective experiments additionally examine design presets, predictor and gate ablations, harder candidate pools, backbone removal and frozen probes. They show that predictor choice and learned features matter in the recorded configurations, while remaining separate from the current same-readout comparison. The study contributes an explicit account of gradient routing and temporal evaluation that makes the observed comparison reproducible and its scope assessable.</w:t>
+        <w:t xml:space="preserve">Inductive temporal link prediction requires a model to score interactions involving entities absent from earlier observations. Jointly optimizing a temporal representation and its link readout is a natural design choice, but it need not be the most effective choice for a particular inductive protocol. We develop a stateful temporal-link model that combines event encoding, recurrent node memory, deterministic pair-history signals and a hierarchical readout, and investigate gradient routing within this model. We specify the scored gradient boundary, distinguish parameter learning from event-state evolution, and compare coupled and decoupled versions of the same registered readout. A separate freeze-then-probe procedure examines a different training trajectory. Experiments use chronological partitions of CoEdit, Wikipedia and MOOC and a fixed random-destination evaluation procedure. Checksum-bound results are reported as mean inductive average precision and sample standard deviation across the registered seeds. The observed decoupled arm has higher mean inductive average precision than the coupled arm on each corpus. This supports a bounded within-protocol comparison rather than a general claim that end-to-end learning is harmful. The analysis identifies important interpretation limits: CoEdit shares its source with Wikipedia, its event construction includes retrospective information, the candidate sampler is not destination-type constrained, and temporal memory follows mixed batch and sequential semantics. Retrospective experiments additionally examine design presets, predictor and gate ablations, harder candidate pools, backbone removal and frozen probes. They show that predictor choice and learned features matter in the recorded configurations, while remaining separate from the current same-readout comparison. The study contributes an explicit account of gradient routing and temporal evaluation that makes the observed comparison reproducible and its scope assessable.</w:t>
       </w:r>
     </w:p>
     <w:p>
@@ -559,23 +559,7 @@
           <w:color w:val="000000"/>
           <w:sz w:val="18"/>
         </w:rPr>
-        <w:t xml:space="preserve">歸納式時序連結預測需要處理先前觀測中未出現的節點。本研究以結合事件編碼、循環節點記憶、確定性節點對歷史訊號與階層讀出器的</w:t>
-      </w:r>
-      <w:r>
-        <w:rPr>
-          <w:rFonts w:ascii="Times New Roman" w:hAnsi="Times New Roman" w:eastAsia="Songti TC"/>
-          <w:color w:val="000000"/>
-          <w:sz w:val="18"/>
-        </w:rPr>
-        <w:t xml:space="preserve"> </w:t>
-      </w:r>
-      <w:r>
-        <w:rPr>
-          <w:rFonts w:hint="eastAsia" w:ascii="Times New Roman" w:hAnsi="Times New Roman" w:eastAsia="Songti TC"/>
-          <w:color w:val="000000"/>
-          <w:sz w:val="18"/>
-        </w:rPr>
-        <w:t xml:space="preserve">SR-GNN，探討評分路徑的梯度是否應更新時序表徵。我們明確區分梯度邊界、參數學習與事件狀態演化，並在相同已註冊讀出器下比較耦合及解耦訓練；另以先訓練再凍結並重新訓練預測頭的方法作為不同訓練流程的對照。研究採用</w:t>
+        <w:t xml:space="preserve">歸納式時序連結預測需要處理先前觀測中未出現的節點。本研究建立一個結合事件編碼、循環節點記憶、確定性節點對歷史訊號與階層讀出器的時序連結預測模型，並探討評分路徑的梯度是否應更新時序表徵。我們明確區分梯度邊界、參數學習與事件狀態演化，並在相同已註冊讀出器下比較耦合及解耦訓練；另以先訓練再凍結並重新訓練預測頭的方法作為不同訓練流程的對照。研究採用</w:t>
       </w:r>
       <w:r>
         <w:rPr>
@@ -790,7 +774,7 @@
           <w:color w:val="000000"/>
           <w:sz w:val="18"/>
         </w:rPr>
-        <w:t xml:space="preserve">We study this distinction in SR-GNN, the implementation provided by the accompanying research repository [10]. Its temporal representation combines an event encoder, recurrent node memory and a bank of pair-history signals. A hierarchical readout produces the scored link output. The primary experiment changes whether that readout receives detached features while preserving the registered readout configuration. A separate freeze-then-probe arm uses pretraining followed by a newly initialized prediction head. These are deliberately interpreted as different experimental procedures.</w:t>
+        <w:t xml:space="preserve">We develop a stateful temporal-link model to study this distinction. The model combines an event encoder, recurrent node memory and a bank of deterministic pair-history signals, with a hierarchical readout producing link scores. The accompanying repository provides the implementation and experimental records for this study [10]; it is a software artifact of the present work, not a previously published model used as an external baseline. The primary experiment changes whether that readout receives detached features while preserving the registered readout configuration. A separate freeze-then-probe arm uses pretraining followed by a newly initialized prediction head. These are deliberately interpreted as different experimental procedures.</w:t>
       </w:r>
     </w:p>
     <w:p>
@@ -807,7 +791,7 @@
           <w:color w:val="000000"/>
           <w:sz w:val="18"/>
         </w:rPr>
-        <w:t xml:space="preserve">We ask whether the same temporal readout generalizes differently when its scored features are connected to or detached from the backbone during training. To interpret that comparison, we specify the derivative boundary and the event-state updates separately. The experiments then compare the registered profiles using matched evaluation conventions. The resulting claim concerns this intervention in SR-GNN; extending it to other architectures or candidate populations requires further experiments.</w:t>
+        <w:t xml:space="preserve">We ask whether the same temporal readout generalizes differently when its scored features are connected to or detached from the backbone during training. To interpret that comparison, we specify the derivative boundary and the event-state updates separately. The experiments then compare the registered profiles using matched evaluation conventions. The resulting claim concerns this intervention in the model developed here; extending it to other architectures or candidate populations requires further experiments.</w:t>
       </w:r>
     </w:p>
     <w:bookmarkEnd w:id="18"/>
@@ -1034,6 +1018,23 @@
           <w:sz w:val="22"/>
         </w:rPr>
         <w:t>III. Problem and Model Specification</w:t>
+      </w:r>
+    </w:p>
+    <w:p>
+      <w:pPr>
+        <w:pStyle w:val="Normal"/>
+        <w:widowControl/>
+        <w:spacing w:before="0" w:after="0" w:line="270" w:lineRule="atLeast"/>
+        <w:ind w:firstLine="270"/>
+        <w:jc w:val="both"/>
+      </w:pPr>
+      <w:r>
+        <w:rPr>
+          <w:rFonts w:ascii="Times New Roman" w:hAnsi="Times New Roman" w:eastAsia="Songti TC"/>
+          <w:color w:val="000000"/>
+          <w:sz w:val="18"/>
+        </w:rPr>
+        <w:t xml:space="preserve">The proposed model integrates established event-encoding and recurrent-memory components with deterministic pair histories and a hierarchical link readout. We do not claim these individual ingredients as new. Our contribution is their explicit specification within a common model and the controlled comparison of connected and detached scored-feature paths. The source code uses the internal name SR-GNN for this implementation; that name does not denote a separate published model. The following definitions specify the architecture used in our experiments.</w:t>
       </w:r>
     </w:p>
     <w:bookmarkStart w:id="23" w:name="_ce4a8bc07a6e583c33681aebf76404fe2dd1c6d"/>
@@ -8396,7 +8397,7 @@
           <w:color w:val="000000"/>
           <w:sz w:val="18"/>
         </w:rPr>
-        <w:t xml:space="preserve">Under the registered current-corpus protocol, the observed decoupled SR-GNN arm has higher mean inductive average precision than the coupled end-to-end arm on each registered corpus. The observed differences apply to the shared-readout configurations and candidate population specified above.</w:t>
+        <w:t xml:space="preserve">Under the registered current-corpus protocol, the observed decoupled arm of our model has higher mean inductive average precision than the coupled end-to-end arm on each registered corpus. The observed differences apply to the shared-readout configurations and candidate population specified above.</w:t>
       </w:r>
     </w:p>
     <w:p>
@@ -11429,7 +11430,7 @@
           <w:color w:val="000000"/>
           <w:sz w:val="18"/>
         </w:rPr>
-        <w:t xml:space="preserve">This study compares connected and detached scored-feature paths in a registered SR-GNN implementation for inductive temporal link prediction. The observed decoupled arm has higher mean inductive average precision on each registered corpus. The result supports evaluating gradient routing as an explicit design choice within the stated model and candidate-sampling protocol.</w:t>
+        <w:t xml:space="preserve">This study develops a stateful model for inductive temporal link prediction and compares connected and detached scored-feature paths within that model. The observed decoupled arm has higher mean inductive average precision on each registered corpus. The result supports evaluating gradient routing as an explicit design choice within the stated model and candidate-sampling protocol.</w:t>
       </w:r>
     </w:p>
     <w:p>

</xml_diff>

<commit_message>
Match Chinese abstract paragraph formatting to the journal template
</commit_message>
<xml_diff>
--- a/paper/journal/DYU/Word/DYU_Journal_Manuscript.docx
+++ b/paper/journal/DYU/Word/DYU_Journal_Manuscript.docx
@@ -549,79 +549,88 @@
       <w:pPr>
         <w:pStyle w:val="BodyText"/>
         <w:widowControl/>
-        <w:spacing w:before="0" w:after="0" w:line="270" w:lineRule="atLeast"/>
-        <w:ind w:firstLine="0" w:left="1134" w:right="1134"/>
-        <w:jc w:val="both"/>
-      </w:pPr>
-      <w:r>
-        <w:rPr>
-          <w:rFonts w:hint="eastAsia" w:ascii="Times New Roman" w:hAnsi="Times New Roman" w:eastAsia="Songti TC"/>
-          <w:color w:val="000000"/>
-          <w:sz w:val="18"/>
+        <w:spacing w:before="0" w:after="0" w:line="360" w:lineRule="auto"/>
+        <w:ind w:left="1134" w:right="1134" w:firstLine="360"/>
+        <w:jc w:val="left"/>
+      </w:pPr>
+      <w:r>
+        <w:rPr>
+          <w:rFonts w:hint="eastAsia" w:ascii="Times New Roman" w:hAnsi="Times New Roman" w:eastAsia="MingLiU"/>
+          <w:color w:val="000000"/>
+          <w:sz w:val="18"/>
+          <w:lang w:eastAsia="zh-TW" w:val="en-US"/>
         </w:rPr>
         <w:t xml:space="preserve">歸納式時序連結預測需要處理先前觀測中未出現的節點。本研究建立一個結合事件編碼、循環節點記憶、確定性節點對歷史訊號與階層讀出器的時序連結預測模型，並探討評分路徑的梯度是否應更新時序表徵。我們明確區分梯度邊界、參數學習與事件狀態演化，並在相同已註冊讀出器下比較耦合及解耦訓練；另以先訓練再凍結並重新訓練預測頭的方法作為不同訓練流程的對照。研究採用</w:t>
       </w:r>
       <w:r>
         <w:rPr>
-          <w:rFonts w:ascii="Times New Roman" w:hAnsi="Times New Roman" w:eastAsia="Songti TC"/>
-          <w:color w:val="000000"/>
-          <w:sz w:val="18"/>
+          <w:rFonts w:ascii="Times New Roman" w:hAnsi="Times New Roman" w:eastAsia="MingLiU"/>
+          <w:color w:val="000000"/>
+          <w:sz w:val="18"/>
+          <w:lang w:eastAsia="zh-TW" w:val="en-US"/>
         </w:rPr>
         <w:t xml:space="preserve"> CoEdit、Wikipedia </w:t>
       </w:r>
       <w:r>
         <w:rPr>
-          <w:rFonts w:hint="eastAsia" w:ascii="Times New Roman" w:hAnsi="Times New Roman" w:eastAsia="Songti TC"/>
-          <w:color w:val="000000"/>
-          <w:sz w:val="18"/>
+          <w:rFonts w:hint="eastAsia" w:ascii="Times New Roman" w:hAnsi="Times New Roman" w:eastAsia="MingLiU"/>
+          <w:color w:val="000000"/>
+          <w:sz w:val="18"/>
+          <w:lang w:eastAsia="zh-TW" w:val="en-US"/>
         </w:rPr>
         <w:t xml:space="preserve">與</w:t>
       </w:r>
       <w:r>
         <w:rPr>
-          <w:rFonts w:ascii="Times New Roman" w:hAnsi="Times New Roman" w:eastAsia="Songti TC"/>
-          <w:color w:val="000000"/>
-          <w:sz w:val="18"/>
+          <w:rFonts w:ascii="Times New Roman" w:hAnsi="Times New Roman" w:eastAsia="MingLiU"/>
+          <w:color w:val="000000"/>
+          <w:sz w:val="18"/>
+          <w:lang w:eastAsia="zh-TW" w:val="en-US"/>
         </w:rPr>
         <w:t xml:space="preserve"> MOOC </w:t>
       </w:r>
       <w:r>
         <w:rPr>
-          <w:rFonts w:hint="eastAsia" w:ascii="Times New Roman" w:hAnsi="Times New Roman" w:eastAsia="Songti TC"/>
-          <w:color w:val="000000"/>
-          <w:sz w:val="18"/>
+          <w:rFonts w:hint="eastAsia" w:ascii="Times New Roman" w:hAnsi="Times New Roman" w:eastAsia="MingLiU"/>
+          <w:color w:val="000000"/>
+          <w:sz w:val="18"/>
+          <w:lang w:eastAsia="zh-TW" w:val="en-US"/>
         </w:rPr>
         <w:t xml:space="preserve">的時間切分及固定隨機負樣本協定。具校驗碼的封存結果顯示，解耦組在各語料上的平均歸納式平均精確率均高於耦合組。此結果支持協定內的觀察比較，而非端到端學習普遍有害的結論。CoEdit</w:t>
       </w:r>
       <w:r>
         <w:rPr>
-          <w:rFonts w:ascii="Times New Roman" w:hAnsi="Times New Roman" w:eastAsia="Songti TC"/>
-          <w:color w:val="000000"/>
-          <w:sz w:val="18"/>
+          <w:rFonts w:ascii="Times New Roman" w:hAnsi="Times New Roman" w:eastAsia="MingLiU"/>
+          <w:color w:val="000000"/>
+          <w:sz w:val="18"/>
+          <w:lang w:eastAsia="zh-TW" w:val="en-US"/>
         </w:rPr>
         <w:t xml:space="preserve"> </w:t>
       </w:r>
       <w:r>
         <w:rPr>
-          <w:rFonts w:hint="eastAsia" w:ascii="Times New Roman" w:hAnsi="Times New Roman" w:eastAsia="Songti TC"/>
-          <w:color w:val="000000"/>
-          <w:sz w:val="18"/>
+          <w:rFonts w:hint="eastAsia" w:ascii="Times New Roman" w:hAnsi="Times New Roman" w:eastAsia="MingLiU"/>
+          <w:color w:val="000000"/>
+          <w:sz w:val="18"/>
+          <w:lang w:eastAsia="zh-TW" w:val="en-US"/>
         </w:rPr>
         <w:t xml:space="preserve">與</w:t>
       </w:r>
       <w:r>
         <w:rPr>
-          <w:rFonts w:ascii="Times New Roman" w:hAnsi="Times New Roman" w:eastAsia="Songti TC"/>
-          <w:color w:val="000000"/>
-          <w:sz w:val="18"/>
+          <w:rFonts w:ascii="Times New Roman" w:hAnsi="Times New Roman" w:eastAsia="MingLiU"/>
+          <w:color w:val="000000"/>
+          <w:sz w:val="18"/>
+          <w:lang w:eastAsia="zh-TW" w:val="en-US"/>
         </w:rPr>
         <w:t xml:space="preserve"> Wikipedia </w:t>
       </w:r>
       <w:r>
         <w:rPr>
-          <w:rFonts w:hint="eastAsia" w:ascii="Times New Roman" w:hAnsi="Times New Roman" w:eastAsia="Songti TC"/>
-          <w:color w:val="000000"/>
-          <w:sz w:val="18"/>
+          <w:rFonts w:hint="eastAsia" w:ascii="Times New Roman" w:hAnsi="Times New Roman" w:eastAsia="MingLiU"/>
+          <w:color w:val="000000"/>
+          <w:sz w:val="18"/>
+          <w:lang w:eastAsia="zh-TW" w:val="en-US"/>
         </w:rPr>
         <w:t xml:space="preserve">共享來源，且其事件建構包含事後資訊；候選取樣未限制目的端節點類型，記憶更新亦混合批次與循序語意。此外，回溯實驗涵蓋設計設定、預測器與閘門消融、較難候選池、骨幹移除及凍結探測，顯示預測器選擇與學習表徵在已記錄設定中的作用；各組依設定及資料版本分別呈現，不與目前結果合併。本研究提供可重現的梯度路由及時序評估說明，並界定效能比較的適用範圍。</w:t>
       </w:r>
@@ -630,25 +639,27 @@
       <w:pPr>
         <w:pStyle w:val="BodyText"/>
         <w:widowControl/>
-        <w:spacing w:before="200" w:after="0" w:line="270" w:lineRule="atLeast"/>
-        <w:ind w:firstLine="0" w:left="1134" w:right="1134"/>
-        <w:jc w:val="both"/>
-      </w:pPr>
-      <w:r>
-        <w:rPr>
-          <w:rFonts w:hint="eastAsia" w:ascii="Times New Roman" w:hAnsi="Times New Roman" w:eastAsia="Songti TC"/>
+        <w:spacing w:before="200" w:after="0" w:line="360" w:lineRule="auto"/>
+        <w:ind w:left="1134" w:right="1134" w:firstLine="0"/>
+        <w:jc w:val="left"/>
+      </w:pPr>
+      <w:r>
+        <w:rPr>
+          <w:rFonts w:hint="eastAsia" w:ascii="Times New Roman" w:hAnsi="Times New Roman" w:eastAsia="MingLiU"/>
           <w:b/>
           <w:bCs/>
           <w:color w:val="000000"/>
           <w:sz w:val="18"/>
+          <w:lang w:eastAsia="zh-TW" w:val="en-US"/>
         </w:rPr>
         <w:t xml:space="preserve">關鍵詞：</w:t>
       </w:r>
       <w:r>
         <w:rPr>
-          <w:rFonts w:hint="eastAsia" w:ascii="Times New Roman" w:hAnsi="Times New Roman" w:eastAsia="Songti TC"/>
-          <w:color w:val="000000"/>
-          <w:sz w:val="18"/>
+          <w:rFonts w:hint="eastAsia" w:ascii="Times New Roman" w:hAnsi="Times New Roman" w:eastAsia="MingLiU"/>
+          <w:color w:val="000000"/>
+          <w:sz w:val="18"/>
+          <w:lang w:eastAsia="zh-TW" w:val="en-US"/>
         </w:rPr>
         <w:t xml:space="preserve">時序圖，歸納式連結預測，梯度解耦，循環記憶，可重現評估</w:t>
       </w:r>

</xml_diff>

<commit_message>
Restore manuscript diagram and correct Word pagination
</commit_message>
<xml_diff>
--- a/paper/journal/DYU/Word/DYU_Journal_Manuscript.docx
+++ b/paper/journal/DYU/Word/DYU_Journal_Manuscript.docx
@@ -691,7 +691,7 @@
       <w:pPr>
         <w:pStyle w:val="Heading1"/>
         <w:widowControl/>
-        <w:spacing w:before="240" w:after="120" w:line="270" w:lineRule="atLeast"/>
+        <w:spacing w:before="0" w:after="0" w:line="270" w:lineRule="atLeast"/>
         <w:ind w:firstLine="0"/>
         <w:jc w:val="center"/>
       </w:pPr>
@@ -811,7 +811,7 @@
       <w:pPr>
         <w:pStyle w:val="Heading1"/>
         <w:widowControl/>
-        <w:spacing w:before="240" w:after="120" w:line="270" w:lineRule="atLeast"/>
+        <w:spacing w:before="0" w:after="0" w:line="270" w:lineRule="atLeast"/>
         <w:ind w:firstLine="0"/>
         <w:jc w:val="center"/>
       </w:pPr>
@@ -828,7 +828,7 @@
       <w:pPr>
         <w:pStyle w:val="Heading2"/>
         <w:widowControl/>
-        <w:spacing w:before="160" w:after="60" w:line="270" w:lineRule="atLeast"/>
+        <w:spacing w:before="0" w:after="0" w:line="270" w:lineRule="atLeast"/>
         <w:ind w:firstLine="0"/>
         <w:jc w:val="left"/>
       </w:pPr>
@@ -897,7 +897,7 @@
       <w:pPr>
         <w:pStyle w:val="Heading2"/>
         <w:widowControl/>
-        <w:spacing w:before="160" w:after="60" w:line="270" w:lineRule="atLeast"/>
+        <w:spacing w:before="0" w:after="0" w:line="270" w:lineRule="atLeast"/>
         <w:ind w:firstLine="0"/>
         <w:jc w:val="left"/>
       </w:pPr>
@@ -949,7 +949,7 @@
       <w:pPr>
         <w:pStyle w:val="Heading2"/>
         <w:widowControl/>
-        <w:spacing w:before="160" w:after="60" w:line="270" w:lineRule="atLeast"/>
+        <w:spacing w:before="0" w:after="0" w:line="270" w:lineRule="atLeast"/>
         <w:ind w:firstLine="0"/>
         <w:jc w:val="left"/>
       </w:pPr>
@@ -1019,7 +1019,7 @@
       <w:pPr>
         <w:pStyle w:val="Heading1"/>
         <w:widowControl/>
-        <w:spacing w:before="240" w:after="120" w:line="270" w:lineRule="atLeast"/>
+        <w:spacing w:before="0" w:after="0" w:line="270" w:lineRule="atLeast"/>
         <w:ind w:firstLine="0"/>
         <w:jc w:val="center"/>
       </w:pPr>
@@ -1053,7 +1053,7 @@
       <w:pPr>
         <w:pStyle w:val="Heading2"/>
         <w:widowControl/>
-        <w:spacing w:before="160" w:after="60" w:line="270" w:lineRule="atLeast"/>
+        <w:spacing w:before="0" w:after="0" w:line="270" w:lineRule="atLeast"/>
         <w:ind w:firstLine="0"/>
         <w:jc w:val="left"/>
       </w:pPr>
@@ -1072,6 +1072,10 @@
         <w:spacing w:before="0" w:after="0" w:line="270" w:lineRule="atLeast"/>
         <w:ind w:firstLine="270"/>
         <w:jc w:val="both"/>
+        <w:rPr>
+          <w:sz w:val="18"/>
+          <w:szCs w:val="18"/>
+        </w:rPr>
       </w:pPr>
       <w:r>
         <w:rPr>
@@ -1390,9 +1394,13 @@
         <w:pStyle w:val="BodyText"/>
         <w:keepLines/>
         <w:widowControl/>
-        <w:spacing w:before="100" w:after="100" w:line="240" w:lineRule="auto"/>
+        <w:spacing w:before="60" w:after="60" w:line="240" w:lineRule="auto"/>
         <w:ind w:firstLine="0"/>
         <w:jc w:val="center"/>
+        <w:rPr>
+          <w:sz w:val="18"/>
+          <w:szCs w:val="18"/>
+        </w:rPr>
       </w:pPr>
       <m:oMathPara>
         <m:oMathParaPr>
@@ -1777,6 +1785,10 @@
         <w:spacing w:before="0" w:after="0" w:line="270" w:lineRule="atLeast"/>
         <w:ind w:firstLine="270"/>
         <w:jc w:val="both"/>
+        <w:rPr>
+          <w:sz w:val="18"/>
+          <w:szCs w:val="18"/>
+        </w:rPr>
       </w:pPr>
       <w:r>
         <w:rPr>
@@ -1937,7 +1949,7 @@
       <w:pPr>
         <w:pStyle w:val="Heading2"/>
         <w:widowControl/>
-        <w:spacing w:before="160" w:after="60" w:line="270" w:lineRule="atLeast"/>
+        <w:spacing w:before="0" w:after="0" w:line="270" w:lineRule="atLeast"/>
         <w:ind w:firstLine="0"/>
         <w:jc w:val="left"/>
       </w:pPr>
@@ -1956,6 +1968,10 @@
         <w:spacing w:before="0" w:after="0" w:line="270" w:lineRule="atLeast"/>
         <w:ind w:firstLine="270"/>
         <w:jc w:val="both"/>
+        <w:rPr>
+          <w:sz w:val="18"/>
+          <w:szCs w:val="18"/>
+        </w:rPr>
       </w:pPr>
       <w:r>
         <w:rPr>
@@ -2119,9 +2135,13 @@
         <w:pStyle w:val="BodyText"/>
         <w:keepLines/>
         <w:widowControl/>
-        <w:spacing w:before="100" w:after="100" w:line="240" w:lineRule="auto"/>
+        <w:spacing w:before="60" w:after="60" w:line="240" w:lineRule="auto"/>
         <w:ind w:firstLine="0"/>
         <w:jc w:val="center"/>
+        <w:rPr>
+          <w:sz w:val="18"/>
+          <w:szCs w:val="18"/>
+        </w:rPr>
       </w:pPr>
       <m:oMathPara>
         <m:oMathParaPr>
@@ -2582,9 +2602,13 @@
         <w:pStyle w:val="BodyText"/>
         <w:keepLines/>
         <w:widowControl/>
-        <w:spacing w:before="100" w:after="100" w:line="240" w:lineRule="auto"/>
+        <w:spacing w:before="60" w:after="60" w:line="240" w:lineRule="auto"/>
         <w:ind w:firstLine="0"/>
         <w:jc w:val="center"/>
+        <w:rPr>
+          <w:sz w:val="18"/>
+          <w:szCs w:val="18"/>
+        </w:rPr>
       </w:pPr>
       <m:oMathPara>
         <m:oMathParaPr>
@@ -2785,9 +2809,13 @@
         <w:pStyle w:val="BodyText"/>
         <w:keepLines/>
         <w:widowControl/>
-        <w:spacing w:before="100" w:after="100" w:line="240" w:lineRule="auto"/>
+        <w:spacing w:before="60" w:after="60" w:line="240" w:lineRule="auto"/>
         <w:ind w:firstLine="0"/>
         <w:jc w:val="center"/>
+        <w:rPr>
+          <w:sz w:val="18"/>
+          <w:szCs w:val="18"/>
+        </w:rPr>
       </w:pPr>
       <m:oMathPara>
         <m:oMathParaPr>
@@ -3023,6 +3051,10 @@
         <w:spacing w:before="0" w:after="0" w:line="270" w:lineRule="atLeast"/>
         <w:ind w:firstLine="270"/>
         <w:jc w:val="both"/>
+        <w:rPr>
+          <w:sz w:val="18"/>
+          <w:szCs w:val="18"/>
+        </w:rPr>
       </w:pPr>
       <w:r>
         <w:rPr>
@@ -3128,6 +3160,10 @@
         <w:spacing w:before="0" w:after="0" w:line="270" w:lineRule="atLeast"/>
         <w:ind w:firstLine="270"/>
         <w:jc w:val="both"/>
+        <w:rPr>
+          <w:sz w:val="18"/>
+          <w:szCs w:val="18"/>
+        </w:rPr>
       </w:pPr>
       <w:r>
         <w:rPr>
@@ -3263,9 +3299,13 @@
         <w:pStyle w:val="BodyText"/>
         <w:keepLines/>
         <w:widowControl/>
-        <w:spacing w:before="100" w:after="100" w:line="240" w:lineRule="auto"/>
+        <w:spacing w:before="60" w:after="60" w:line="240" w:lineRule="auto"/>
         <w:ind w:firstLine="0"/>
         <w:jc w:val="center"/>
+        <w:rPr>
+          <w:sz w:val="18"/>
+          <w:szCs w:val="18"/>
+        </w:rPr>
       </w:pPr>
       <m:oMathPara>
         <m:oMathParaPr>
@@ -3670,7 +3710,7 @@
       <w:pPr>
         <w:pStyle w:val="Heading2"/>
         <w:widowControl/>
-        <w:spacing w:before="160" w:after="60" w:line="270" w:lineRule="atLeast"/>
+        <w:spacing w:before="0" w:after="0" w:line="270" w:lineRule="atLeast"/>
         <w:ind w:firstLine="0"/>
         <w:jc w:val="left"/>
       </w:pPr>
@@ -3689,6 +3729,10 @@
         <w:spacing w:before="0" w:after="0" w:line="270" w:lineRule="atLeast"/>
         <w:ind w:firstLine="270"/>
         <w:jc w:val="both"/>
+        <w:rPr>
+          <w:sz w:val="18"/>
+          <w:szCs w:val="18"/>
+        </w:rPr>
       </w:pPr>
       <w:r>
         <w:rPr>
@@ -3889,9 +3933,13 @@
         <w:pStyle w:val="BodyText"/>
         <w:keepLines/>
         <w:widowControl/>
-        <w:spacing w:before="100" w:after="100" w:line="240" w:lineRule="auto"/>
+        <w:spacing w:before="60" w:after="60" w:line="240" w:lineRule="auto"/>
         <w:ind w:firstLine="0"/>
         <w:jc w:val="center"/>
+        <w:rPr>
+          <w:sz w:val="18"/>
+          <w:szCs w:val="18"/>
+        </w:rPr>
       </w:pPr>
       <m:oMathPara>
         <m:oMathParaPr>
@@ -4064,6 +4112,10 @@
         <w:spacing w:before="0" w:after="0" w:line="270" w:lineRule="atLeast"/>
         <w:ind w:firstLine="270"/>
         <w:jc w:val="both"/>
+        <w:rPr>
+          <w:sz w:val="18"/>
+          <w:szCs w:val="18"/>
+        </w:rPr>
       </w:pPr>
       <w:r>
         <w:rPr>
@@ -4159,9 +4211,13 @@
         <w:pStyle w:val="BodyText"/>
         <w:keepLines/>
         <w:widowControl/>
-        <w:spacing w:before="100" w:after="100" w:line="240" w:lineRule="auto"/>
+        <w:spacing w:before="60" w:after="60" w:line="240" w:lineRule="auto"/>
         <w:ind w:firstLine="0"/>
         <w:jc w:val="center"/>
+        <w:rPr>
+          <w:sz w:val="18"/>
+          <w:szCs w:val="18"/>
+        </w:rPr>
       </w:pPr>
       <m:oMathPara>
         <m:oMathParaPr>
@@ -4462,6 +4518,10 @@
         <w:spacing w:before="0" w:after="0" w:line="270" w:lineRule="atLeast"/>
         <w:ind w:firstLine="270"/>
         <w:jc w:val="both"/>
+        <w:rPr>
+          <w:sz w:val="18"/>
+          <w:szCs w:val="18"/>
+        </w:rPr>
       </w:pPr>
       <w:r>
         <w:rPr>
@@ -4513,9 +4573,13 @@
         <w:pStyle w:val="BodyText"/>
         <w:keepLines/>
         <w:widowControl/>
-        <w:spacing w:before="100" w:after="100" w:line="240" w:lineRule="auto"/>
+        <w:spacing w:before="60" w:after="60" w:line="240" w:lineRule="auto"/>
         <w:ind w:firstLine="0"/>
         <w:jc w:val="center"/>
+        <w:rPr>
+          <w:sz w:val="18"/>
+          <w:szCs w:val="18"/>
+        </w:rPr>
       </w:pPr>
       <m:oMathPara>
         <m:oMathParaPr>
@@ -4933,157 +4997,47 @@
     <w:p>
       <w:pPr>
         <w:pStyle w:val="Normal"/>
-        <w:widowControl/>
-        <w:spacing w:before="0" w:after="0" w:line="270" w:lineRule="atLeast"/>
+        <w:keepNext/>
+        <w:widowControl/>
+        <w:spacing w:before="60" w:after="0" w:line="270" w:lineRule="atLeast"/>
+        <w:ind w:firstLine="0"/>
         <w:jc w:val="center"/>
       </w:pPr>
-    </w:p>
-    <w:tbl>
-      <w:tblPr>
-        <w:tblW w:type="auto" w:w="0"/>
-        <w:tblLayout w:type="fixed"/>
-        <w:tblLook w:firstColumn="1" w:firstRow="1" w:lastColumn="0" w:lastRow="0" w:noHBand="0" w:noVBand="1" w:val="04A0"/>
-        <w:tblBorders>
-          <w:top w:val="single" w:sz="4" w:color="AAAAAA"/>
-          <w:bottom w:val="single" w:sz="4" w:color="AAAAAA"/>
-          <w:left w:val="single" w:sz="4" w:color="AAAAAA"/>
-          <w:right w:val="single" w:sz="4" w:color="AAAAAA"/>
-          <w:insideH w:val="single" w:sz="4" w:color="AAAAAA"/>
-          <w:insideV w:val="single" w:sz="4" w:color="AAAAAA"/>
-        </w:tblBorders>
-      </w:tblPr>
-      <w:tblGrid>
-        <w:gridCol w:w="3798"/>
-      </w:tblGrid>
-      <w:tr>
-        <w:trPr>
-          <w:cantSplit/>
-        </w:trPr>
-        <w:tc>
-          <w:tcPr>
-            <w:tcW w:type="dxa" w:w="3798"/>
-            <w:tcBorders>
-              <w:top w:val="single" w:sz="4" w:color="444444"/>
-              <w:left w:val="single" w:sz="4" w:color="444444"/>
-              <w:bottom w:val="single" w:sz="4" w:color="444444"/>
-              <w:right w:val="single" w:sz="4" w:color="444444"/>
-            </w:tcBorders>
-          </w:tcPr>
-          <w:p>
-            <w:pPr>
-              <w:keepNext/>
-              <w:spacing w:before="40" w:after="40" w:line="288" w:lineRule="auto"/>
-              <w:jc w:val="center"/>
-            </w:pPr>
-            <w:r>
-              <w:rPr>
-                <w:rFonts w:ascii="Times New Roman" w:hAnsi="Times New Roman"/>
-                <w:sz w:val="16"/>
-              </w:rPr>
-              <w:t>Retained event history and candidate attributes</w:t>
-              <w:br/>
-              <w:t>Node memory and pair-history context ↓</w:t>
-            </w:r>
-          </w:p>
-        </w:tc>
-      </w:tr>
-      <w:tr>
-        <w:trPr>
-          <w:cantSplit/>
-        </w:trPr>
-        <w:tc>
-          <w:tcPr>
-            <w:tcW w:type="dxa" w:w="3798"/>
-            <w:tcBorders>
-              <w:top w:val="single" w:sz="4" w:color="444444"/>
-              <w:left w:val="single" w:sz="4" w:color="444444"/>
-              <w:bottom w:val="single" w:sz="4" w:color="444444"/>
-              <w:right w:val="single" w:sz="4" w:color="444444"/>
-            </w:tcBorders>
-          </w:tcPr>
-          <w:p>
-            <w:pPr>
-              <w:keepNext/>
-              <w:spacing w:before="40" w:after="40" w:line="288" w:lineRule="auto"/>
-              <w:jc w:val="center"/>
-            </w:pPr>
-            <w:r>
-              <w:rPr>
-                <w:rFonts w:ascii="Times New Roman" w:hAnsi="Times New Roman"/>
-                <w:sz w:val="16"/>
-              </w:rPr>
-              <w:t>Temporal backbone Fθ</w:t>
-              <w:br/>
-              <w:t>Candidate representation h ↓</w:t>
-            </w:r>
-          </w:p>
-        </w:tc>
-      </w:tr>
-      <w:tr>
-        <w:trPr>
-          <w:cantSplit/>
-        </w:trPr>
-        <w:tc>
-          <w:tcPr>
-            <w:tcW w:type="dxa" w:w="3798"/>
-            <w:tcBorders>
-              <w:top w:val="single" w:sz="4" w:color="444444"/>
-              <w:left w:val="single" w:sz="4" w:color="444444"/>
-              <w:bottom w:val="single" w:sz="4" w:color="444444"/>
-              <w:right w:val="single" w:sz="4" w:color="444444"/>
-            </w:tcBorders>
-          </w:tcPr>
-          <w:p>
-            <w:pPr>
-              <w:keepNext/>
-              <w:spacing w:before="40" w:after="40" w:line="288" w:lineRule="auto"/>
-              <w:jc w:val="center"/>
-            </w:pPr>
-            <w:r>
-              <w:rPr>
-                <w:rFonts w:ascii="Times New Roman" w:hAnsi="Times New Roman"/>
-                <w:sz w:val="16"/>
-              </w:rPr>
-              <w:t>Shared scored boundary</w:t>
-              <w:br/>
-              <w:t>Connected h or detached sg(h) ↓</w:t>
-            </w:r>
-          </w:p>
-        </w:tc>
-      </w:tr>
-      <w:tr>
-        <w:trPr>
-          <w:cantSplit/>
-        </w:trPr>
-        <w:tc>
-          <w:tcPr>
-            <w:tcW w:type="dxa" w:w="3798"/>
-            <w:tcBorders>
-              <w:top w:val="single" w:sz="4" w:color="444444"/>
-              <w:left w:val="single" w:sz="4" w:color="444444"/>
-              <w:bottom w:val="single" w:sz="4" w:color="444444"/>
-              <w:right w:val="single" w:sz="4" w:color="444444"/>
-            </w:tcBorders>
-          </w:tcPr>
-          <w:p>
-            <w:pPr>
-              <w:keepNext w:val="0"/>
-              <w:spacing w:before="40" w:after="40" w:line="288" w:lineRule="auto"/>
-              <w:jc w:val="center"/>
-            </w:pPr>
-            <w:r>
-              <w:rPr>
-                <w:rFonts w:ascii="Times New Roman" w:hAnsi="Times New Roman"/>
-                <w:sz w:val="16"/>
-              </w:rPr>
-              <w:t>Registered hierarchical readout Gψ</w:t>
-              <w:br/>
-              <w:t>Positive and negative link scores</w:t>
-            </w:r>
-          </w:p>
-        </w:tc>
-      </w:tr>
-    </w:tbl>
+      <w:r>
+        <w:drawing>
+          <wp:inline>
+            <wp:extent cx="2610000" cy="1802469"/>
+            <wp:docPr id="1" name="Picture 1" descr="Retained event history and candidate attributes pass through the temporal backbone, connected or detached scored boundary, and shared hierarchical readout."/>
+            <wp:cNvGraphicFramePr>
+              <a:graphicFrameLocks noChangeAspect="1"/>
+            </wp:cNvGraphicFramePr>
+            <a:graphic>
+              <a:graphicData uri="http://schemas.openxmlformats.org/drawingml/2006/picture">
+                <pic:pic>
+                  <pic:nvPicPr>
+                    <pic:cNvPr id="0" name="scored-feature-path.png"/>
+                    <pic:cNvPicPr/>
+                  </pic:nvPicPr>
+                  <pic:blipFill>
+                    <a:blip r:embed="rId1"/>
+                    <a:stretch>
+                      <a:fillRect/>
+                    </a:stretch>
+                  </pic:blipFill>
+                  <pic:spPr>
+                    <a:xfrm>
+                      <a:off x="0" y="0"/>
+                      <a:ext cx="2610000" cy="1802469"/>
+                    </a:xfrm>
+                    <a:prstGeom prst="rect"/>
+                  </pic:spPr>
+                </pic:pic>
+              </a:graphicData>
+            </a:graphic>
+          </wp:inline>
+        </w:drawing>
+      </w:r>
+    </w:p>
     <w:p>
       <w:pPr>
         <w:pStyle w:val="BodyText"/>
@@ -5127,7 +5081,7 @@
       <w:pPr>
         <w:pStyle w:val="Heading2"/>
         <w:widowControl/>
-        <w:spacing w:before="160" w:after="60" w:line="270" w:lineRule="atLeast"/>
+        <w:spacing w:before="0" w:after="0" w:line="270" w:lineRule="atLeast"/>
         <w:ind w:firstLine="0"/>
         <w:jc w:val="left"/>
       </w:pPr>
@@ -5146,6 +5100,10 @@
         <w:spacing w:before="0" w:after="0" w:line="270" w:lineRule="atLeast"/>
         <w:ind w:firstLine="270"/>
         <w:jc w:val="both"/>
+        <w:rPr>
+          <w:sz w:val="18"/>
+          <w:szCs w:val="18"/>
+        </w:rPr>
       </w:pPr>
       <w:r>
         <w:rPr>
@@ -5217,9 +5175,13 @@
         <w:pStyle w:val="BodyText"/>
         <w:keepLines/>
         <w:widowControl/>
-        <w:spacing w:before="100" w:after="100" w:line="240" w:lineRule="auto"/>
+        <w:spacing w:before="60" w:after="60" w:line="240" w:lineRule="auto"/>
         <w:ind w:firstLine="0"/>
         <w:jc w:val="center"/>
+        <w:rPr>
+          <w:sz w:val="18"/>
+          <w:szCs w:val="18"/>
+        </w:rPr>
       </w:pPr>
       <m:oMathPara>
         <m:oMathParaPr>
@@ -5491,9 +5453,13 @@
         <w:pStyle w:val="BodyText"/>
         <w:keepLines/>
         <w:widowControl/>
-        <w:spacing w:before="100" w:after="100" w:line="240" w:lineRule="auto"/>
+        <w:spacing w:before="60" w:after="60" w:line="240" w:lineRule="auto"/>
         <w:ind w:firstLine="0"/>
         <w:jc w:val="center"/>
+        <w:rPr>
+          <w:sz w:val="18"/>
+          <w:szCs w:val="18"/>
+        </w:rPr>
       </w:pPr>
       <m:oMathPara>
         <m:oMathParaPr>
@@ -5904,7 +5870,7 @@
       <w:pPr>
         <w:pStyle w:val="Heading2"/>
         <w:widowControl/>
-        <w:spacing w:before="160" w:after="60" w:line="270" w:lineRule="atLeast"/>
+        <w:spacing w:before="0" w:after="0" w:line="270" w:lineRule="atLeast"/>
         <w:ind w:firstLine="0"/>
         <w:jc w:val="left"/>
       </w:pPr>
@@ -5973,7 +5939,7 @@
       <w:pPr>
         <w:pStyle w:val="Heading2"/>
         <w:widowControl/>
-        <w:spacing w:before="160" w:after="60" w:line="270" w:lineRule="atLeast"/>
+        <w:spacing w:before="0" w:after="0" w:line="270" w:lineRule="atLeast"/>
         <w:ind w:firstLine="0"/>
         <w:jc w:val="left"/>
       </w:pPr>
@@ -6009,7 +5975,7 @@
       <w:pPr>
         <w:pStyle w:val="Heading1"/>
         <w:widowControl/>
-        <w:spacing w:before="240" w:after="120" w:line="270" w:lineRule="atLeast"/>
+        <w:spacing w:before="0" w:after="0" w:line="270" w:lineRule="atLeast"/>
         <w:ind w:firstLine="0"/>
         <w:jc w:val="center"/>
       </w:pPr>
@@ -6026,7 +5992,7 @@
       <w:pPr>
         <w:pStyle w:val="Heading2"/>
         <w:widowControl/>
-        <w:spacing w:before="160" w:after="60" w:line="270" w:lineRule="atLeast"/>
+        <w:spacing w:before="0" w:after="0" w:line="270" w:lineRule="atLeast"/>
         <w:ind w:firstLine="0"/>
         <w:jc w:val="left"/>
       </w:pPr>
@@ -6112,7 +6078,7 @@
       <w:pPr>
         <w:pStyle w:val="Heading2"/>
         <w:widowControl/>
-        <w:spacing w:before="160" w:after="60" w:line="270" w:lineRule="atLeast"/>
+        <w:spacing w:before="0" w:after="0" w:line="270" w:lineRule="atLeast"/>
         <w:ind w:firstLine="0"/>
         <w:jc w:val="left"/>
       </w:pPr>
@@ -6181,7 +6147,7 @@
       <w:pPr>
         <w:pStyle w:val="Heading2"/>
         <w:widowControl/>
-        <w:spacing w:before="160" w:after="60" w:line="270" w:lineRule="atLeast"/>
+        <w:spacing w:before="0" w:after="0" w:line="270" w:lineRule="atLeast"/>
         <w:ind w:firstLine="0"/>
         <w:jc w:val="left"/>
       </w:pPr>
@@ -6250,7 +6216,7 @@
       <w:pPr>
         <w:pStyle w:val="Heading2"/>
         <w:widowControl/>
-        <w:spacing w:before="160" w:after="60" w:line="270" w:lineRule="atLeast"/>
+        <w:spacing w:before="0" w:after="0" w:line="270" w:lineRule="atLeast"/>
         <w:ind w:firstLine="0"/>
         <w:jc w:val="left"/>
       </w:pPr>
@@ -6284,7 +6250,7 @@
         <w:pStyle w:val="BodyText"/>
         <w:keepNext/>
         <w:widowControl/>
-        <w:spacing w:before="120" w:after="100" w:line="270" w:lineRule="atLeast"/>
+        <w:spacing w:before="60" w:after="60" w:line="270" w:lineRule="atLeast"/>
         <w:ind w:firstLine="0"/>
         <w:jc w:val="center"/>
       </w:pPr>
@@ -6316,6 +6282,7 @@
       <w:tr>
         <w:trPr>
           <w:cantSplit/>
+          <w:tblHeader/>
         </w:trPr>
         <w:tc>
           <w:tcPr>
@@ -6324,7 +6291,7 @@
           <w:p>
             <w:pPr>
               <w:keepNext/>
-              <w:spacing w:line="288" w:lineRule="auto" w:after="40" w:before="40"/>
+              <w:spacing w:line="288" w:lineRule="auto" w:after="0" w:before="0"/>
             </w:pPr>
             <w:r>
               <w:rPr>
@@ -6342,7 +6309,7 @@
           <w:p>
             <w:pPr>
               <w:keepNext/>
-              <w:spacing w:line="288" w:lineRule="auto" w:after="40" w:before="40"/>
+              <w:spacing w:line="288" w:lineRule="auto" w:after="0" w:before="0"/>
             </w:pPr>
             <w:r>
               <w:rPr>
@@ -6364,8 +6331,8 @@
           </w:tcPr>
           <w:p>
             <w:pPr>
-              <w:keepNext/>
-              <w:spacing w:line="288" w:lineRule="auto" w:after="40" w:before="40"/>
+              <w:keepNext w:val="0"/>
+              <w:spacing w:line="288" w:lineRule="auto" w:after="0" w:before="0"/>
             </w:pPr>
             <w:r>
               <w:rPr>
@@ -6382,8 +6349,8 @@
           </w:tcPr>
           <w:p>
             <w:pPr>
-              <w:keepNext/>
-              <w:spacing w:line="288" w:lineRule="auto" w:after="40" w:before="40"/>
+              <w:keepNext w:val="0"/>
+              <w:spacing w:line="288" w:lineRule="auto" w:after="0" w:before="0"/>
             </w:pPr>
             <w:r>
               <w:rPr>
@@ -6405,8 +6372,8 @@
           </w:tcPr>
           <w:p>
             <w:pPr>
-              <w:keepNext/>
-              <w:spacing w:line="288" w:lineRule="auto" w:after="40" w:before="40"/>
+              <w:keepNext w:val="0"/>
+              <w:spacing w:line="288" w:lineRule="auto" w:after="0" w:before="0"/>
             </w:pPr>
             <w:r>
               <w:rPr>
@@ -6423,8 +6390,8 @@
           </w:tcPr>
           <w:p>
             <w:pPr>
-              <w:keepNext/>
-              <w:spacing w:line="288" w:lineRule="auto" w:after="40" w:before="40"/>
+              <w:keepNext w:val="0"/>
+              <w:spacing w:line="288" w:lineRule="auto" w:after="0" w:before="0"/>
             </w:pPr>
             <w:r>
               <w:rPr>
@@ -6446,8 +6413,8 @@
           </w:tcPr>
           <w:p>
             <w:pPr>
-              <w:keepNext/>
-              <w:spacing w:line="288" w:lineRule="auto" w:after="40" w:before="40"/>
+              <w:keepNext w:val="0"/>
+              <w:spacing w:line="288" w:lineRule="auto" w:after="0" w:before="0"/>
             </w:pPr>
             <w:r>
               <w:rPr>
@@ -6464,8 +6431,8 @@
           </w:tcPr>
           <w:p>
             <w:pPr>
-              <w:keepNext/>
-              <w:spacing w:line="288" w:lineRule="auto" w:after="40" w:before="40"/>
+              <w:keepNext w:val="0"/>
+              <w:spacing w:line="288" w:lineRule="auto" w:after="0" w:before="0"/>
             </w:pPr>
             <w:r>
               <w:rPr>
@@ -6487,8 +6454,8 @@
           </w:tcPr>
           <w:p>
             <w:pPr>
-              <w:keepNext/>
-              <w:spacing w:line="288" w:lineRule="auto" w:after="40" w:before="40"/>
+              <w:keepNext w:val="0"/>
+              <w:spacing w:line="288" w:lineRule="auto" w:after="0" w:before="0"/>
             </w:pPr>
             <w:r>
               <w:rPr>
@@ -6505,8 +6472,8 @@
           </w:tcPr>
           <w:p>
             <w:pPr>
-              <w:keepNext/>
-              <w:spacing w:line="288" w:lineRule="auto" w:after="40" w:before="40"/>
+              <w:keepNext w:val="0"/>
+              <w:spacing w:line="288" w:lineRule="auto" w:after="0" w:before="0"/>
             </w:pPr>
             <w:r>
               <w:rPr>
@@ -6528,8 +6495,8 @@
           </w:tcPr>
           <w:p>
             <w:pPr>
-              <w:keepNext/>
-              <w:spacing w:line="288" w:lineRule="auto" w:after="40" w:before="40"/>
+              <w:keepNext w:val="0"/>
+              <w:spacing w:line="288" w:lineRule="auto" w:after="0" w:before="0"/>
             </w:pPr>
             <w:r>
               <w:rPr>
@@ -6546,8 +6513,8 @@
           </w:tcPr>
           <w:p>
             <w:pPr>
-              <w:keepNext/>
-              <w:spacing w:line="288" w:lineRule="auto" w:after="40" w:before="40"/>
+              <w:keepNext w:val="0"/>
+              <w:spacing w:line="288" w:lineRule="auto" w:after="0" w:before="0"/>
             </w:pPr>
             <w:r>
               <w:rPr>
@@ -6569,8 +6536,8 @@
           </w:tcPr>
           <w:p>
             <w:pPr>
-              <w:keepNext/>
-              <w:spacing w:line="288" w:lineRule="auto" w:after="40" w:before="40"/>
+              <w:keepNext w:val="0"/>
+              <w:spacing w:line="288" w:lineRule="auto" w:after="0" w:before="0"/>
             </w:pPr>
             <w:r>
               <w:rPr>
@@ -6587,8 +6554,8 @@
           </w:tcPr>
           <w:p>
             <w:pPr>
-              <w:keepNext/>
-              <w:spacing w:line="288" w:lineRule="auto" w:after="40" w:before="40"/>
+              <w:keepNext w:val="0"/>
+              <w:spacing w:line="288" w:lineRule="auto" w:after="0" w:before="0"/>
             </w:pPr>
             <w:r>
               <w:rPr>
@@ -6610,8 +6577,8 @@
           </w:tcPr>
           <w:p>
             <w:pPr>
-              <w:keepNext/>
-              <w:spacing w:line="288" w:lineRule="auto" w:after="40" w:before="40"/>
+              <w:keepNext w:val="0"/>
+              <w:spacing w:line="288" w:lineRule="auto" w:after="0" w:before="0"/>
             </w:pPr>
             <w:r>
               <w:rPr>
@@ -6628,8 +6595,8 @@
           </w:tcPr>
           <w:p>
             <w:pPr>
-              <w:keepNext/>
-              <w:spacing w:line="288" w:lineRule="auto" w:after="40" w:before="40"/>
+              <w:keepNext w:val="0"/>
+              <w:spacing w:line="288" w:lineRule="auto" w:after="0" w:before="0"/>
             </w:pPr>
             <w:r>
               <w:rPr>
@@ -6651,8 +6618,8 @@
           </w:tcPr>
           <w:p>
             <w:pPr>
-              <w:keepNext/>
-              <w:spacing w:line="288" w:lineRule="auto" w:after="40" w:before="40"/>
+              <w:keepNext w:val="0"/>
+              <w:spacing w:line="288" w:lineRule="auto" w:after="0" w:before="0"/>
             </w:pPr>
             <w:r>
               <w:rPr>
@@ -6669,8 +6636,8 @@
           </w:tcPr>
           <w:p>
             <w:pPr>
-              <w:keepNext/>
-              <w:spacing w:line="288" w:lineRule="auto" w:after="40" w:before="40"/>
+              <w:keepNext w:val="0"/>
+              <w:spacing w:line="288" w:lineRule="auto" w:after="0" w:before="0"/>
             </w:pPr>
             <w:r>
               <w:rPr>
@@ -6692,8 +6659,8 @@
           </w:tcPr>
           <w:p>
             <w:pPr>
-              <w:keepNext/>
-              <w:spacing w:line="288" w:lineRule="auto" w:after="40" w:before="40"/>
+              <w:keepNext w:val="0"/>
+              <w:spacing w:line="288" w:lineRule="auto" w:after="0" w:before="0"/>
             </w:pPr>
             <w:r>
               <w:rPr>
@@ -6710,8 +6677,8 @@
           </w:tcPr>
           <w:p>
             <w:pPr>
-              <w:keepNext/>
-              <w:spacing w:line="288" w:lineRule="auto" w:after="40" w:before="40"/>
+              <w:keepNext w:val="0"/>
+              <w:spacing w:line="288" w:lineRule="auto" w:after="0" w:before="0"/>
             </w:pPr>
             <w:r>
               <w:rPr>
@@ -6733,8 +6700,8 @@
           </w:tcPr>
           <w:p>
             <w:pPr>
-              <w:keepNext/>
-              <w:spacing w:line="288" w:lineRule="auto" w:after="40" w:before="40"/>
+              <w:keepNext w:val="0"/>
+              <w:spacing w:line="288" w:lineRule="auto" w:after="0" w:before="0"/>
             </w:pPr>
             <w:r>
               <w:rPr>
@@ -6751,8 +6718,8 @@
           </w:tcPr>
           <w:p>
             <w:pPr>
-              <w:keepNext/>
-              <w:spacing w:line="288" w:lineRule="auto" w:after="40" w:before="40"/>
+              <w:keepNext w:val="0"/>
+              <w:spacing w:line="288" w:lineRule="auto" w:after="0" w:before="0"/>
             </w:pPr>
             <w:r>
               <w:rPr>
@@ -6774,8 +6741,8 @@
           </w:tcPr>
           <w:p>
             <w:pPr>
-              <w:keepNext/>
-              <w:spacing w:line="288" w:lineRule="auto" w:after="40" w:before="40"/>
+              <w:keepNext w:val="0"/>
+              <w:spacing w:line="288" w:lineRule="auto" w:after="0" w:before="0"/>
             </w:pPr>
             <w:r>
               <w:rPr>
@@ -6792,8 +6759,8 @@
           </w:tcPr>
           <w:p>
             <w:pPr>
-              <w:keepNext/>
-              <w:spacing w:line="288" w:lineRule="auto" w:after="40" w:before="40"/>
+              <w:keepNext w:val="0"/>
+              <w:spacing w:line="288" w:lineRule="auto" w:after="0" w:before="0"/>
             </w:pPr>
             <w:r>
               <w:rPr>
@@ -6815,8 +6782,8 @@
           </w:tcPr>
           <w:p>
             <w:pPr>
-              <w:keepNext/>
-              <w:spacing w:line="288" w:lineRule="auto" w:after="40" w:before="40"/>
+              <w:keepNext w:val="0"/>
+              <w:spacing w:line="288" w:lineRule="auto" w:after="0" w:before="0"/>
             </w:pPr>
             <w:r>
               <w:rPr>
@@ -6833,8 +6800,8 @@
           </w:tcPr>
           <w:p>
             <w:pPr>
-              <w:keepNext/>
-              <w:spacing w:line="288" w:lineRule="auto" w:after="40" w:before="40"/>
+              <w:keepNext w:val="0"/>
+              <w:spacing w:line="288" w:lineRule="auto" w:after="0" w:before="0"/>
             </w:pPr>
             <w:r>
               <w:rPr>
@@ -6856,8 +6823,8 @@
           </w:tcPr>
           <w:p>
             <w:pPr>
-              <w:keepNext/>
-              <w:spacing w:line="288" w:lineRule="auto" w:after="40" w:before="40"/>
+              <w:keepNext w:val="0"/>
+              <w:spacing w:line="288" w:lineRule="auto" w:after="0" w:before="0"/>
             </w:pPr>
             <w:r>
               <w:rPr>
@@ -6874,8 +6841,8 @@
           </w:tcPr>
           <w:p>
             <w:pPr>
-              <w:keepNext/>
-              <w:spacing w:line="288" w:lineRule="auto" w:after="40" w:before="40"/>
+              <w:keepNext w:val="0"/>
+              <w:spacing w:line="288" w:lineRule="auto" w:after="0" w:before="0"/>
             </w:pPr>
             <w:r>
               <w:rPr>
@@ -6898,7 +6865,7 @@
           <w:p>
             <w:pPr>
               <w:keepNext w:val="0"/>
-              <w:spacing w:line="288" w:lineRule="auto" w:after="40" w:before="40"/>
+              <w:spacing w:line="288" w:lineRule="auto" w:after="0" w:before="0"/>
             </w:pPr>
             <w:r>
               <w:rPr>
@@ -6916,7 +6883,7 @@
           <w:p>
             <w:pPr>
               <w:keepNext w:val="0"/>
-              <w:spacing w:line="288" w:lineRule="auto" w:after="40" w:before="40"/>
+              <w:spacing w:line="288" w:lineRule="auto" w:after="0" w:before="0"/>
             </w:pPr>
             <w:r>
               <w:rPr>
@@ -6952,7 +6919,7 @@
       <w:pPr>
         <w:pStyle w:val="Heading2"/>
         <w:widowControl/>
-        <w:spacing w:before="160" w:after="60" w:line="270" w:lineRule="atLeast"/>
+        <w:spacing w:before="0" w:after="0" w:line="270" w:lineRule="atLeast"/>
         <w:ind w:firstLine="0"/>
         <w:jc w:val="left"/>
       </w:pPr>
@@ -6971,6 +6938,10 @@
         <w:spacing w:before="0" w:after="0" w:line="270" w:lineRule="atLeast"/>
         <w:ind w:firstLine="270"/>
         <w:jc w:val="both"/>
+        <w:rPr>
+          <w:sz w:val="18"/>
+          <w:szCs w:val="18"/>
+        </w:rPr>
       </w:pPr>
       <w:r>
         <w:rPr>
@@ -7010,9 +6981,13 @@
         <w:pStyle w:val="BodyText"/>
         <w:keepLines/>
         <w:widowControl/>
-        <w:spacing w:before="100" w:after="100" w:line="240" w:lineRule="auto"/>
+        <w:spacing w:before="60" w:after="60" w:line="240" w:lineRule="auto"/>
         <w:ind w:firstLine="0"/>
         <w:jc w:val="center"/>
+        <w:rPr>
+          <w:sz w:val="18"/>
+          <w:szCs w:val="18"/>
+        </w:rPr>
       </w:pPr>
       <m:oMathPara>
         <m:oMathParaPr>
@@ -7181,6 +7156,10 @@
         <w:spacing w:before="0" w:after="0" w:line="270" w:lineRule="atLeast"/>
         <w:ind w:firstLine="270"/>
         <w:jc w:val="both"/>
+        <w:rPr>
+          <w:sz w:val="18"/>
+          <w:szCs w:val="18"/>
+        </w:rPr>
       </w:pPr>
       <w:r>
         <w:rPr>
@@ -7286,6 +7265,10 @@
         <w:spacing w:before="0" w:after="0" w:line="270" w:lineRule="atLeast"/>
         <w:ind w:firstLine="270"/>
         <w:jc w:val="both"/>
+        <w:rPr>
+          <w:sz w:val="18"/>
+          <w:szCs w:val="18"/>
+        </w:rPr>
       </w:pPr>
       <w:r>
         <w:rPr>
@@ -7382,9 +7365,13 @@
         <w:pStyle w:val="BodyText"/>
         <w:keepLines/>
         <w:widowControl/>
-        <w:spacing w:before="100" w:after="100" w:line="240" w:lineRule="auto"/>
+        <w:spacing w:before="60" w:after="60" w:line="240" w:lineRule="auto"/>
         <w:ind w:firstLine="0"/>
         <w:jc w:val="center"/>
+        <w:rPr>
+          <w:sz w:val="18"/>
+          <w:szCs w:val="18"/>
+        </w:rPr>
       </w:pPr>
       <m:oMathPara>
         <m:oMathParaPr>
@@ -7728,7 +7715,7 @@
       <w:pPr>
         <w:pStyle w:val="Heading1"/>
         <w:widowControl/>
-        <w:spacing w:before="240" w:after="120" w:line="270" w:lineRule="atLeast"/>
+        <w:spacing w:before="0" w:after="0" w:line="270" w:lineRule="atLeast"/>
         <w:ind w:firstLine="0"/>
         <w:jc w:val="center"/>
       </w:pPr>
@@ -7745,7 +7732,7 @@
       <w:pPr>
         <w:pStyle w:val="Heading2"/>
         <w:widowControl/>
-        <w:spacing w:before="160" w:after="60" w:line="270" w:lineRule="atLeast"/>
+        <w:spacing w:before="0" w:after="0" w:line="270" w:lineRule="atLeast"/>
         <w:ind w:firstLine="0"/>
         <w:jc w:val="left"/>
       </w:pPr>
@@ -7779,7 +7766,7 @@
         <w:pStyle w:val="BodyText"/>
         <w:keepNext/>
         <w:widowControl/>
-        <w:spacing w:before="120" w:after="100" w:line="270" w:lineRule="atLeast"/>
+        <w:spacing w:before="60" w:after="60" w:line="270" w:lineRule="atLeast"/>
         <w:ind w:firstLine="0"/>
         <w:jc w:val="center"/>
       </w:pPr>
@@ -7812,6 +7799,7 @@
       <w:tr>
         <w:trPr>
           <w:cantSplit/>
+          <w:tblHeader/>
         </w:trPr>
         <w:tc>
           <w:tcPr>
@@ -7820,7 +7808,7 @@
           <w:p>
             <w:pPr>
               <w:keepNext/>
-              <w:spacing w:line="288" w:lineRule="auto" w:after="40" w:before="40"/>
+              <w:spacing w:line="288" w:lineRule="auto" w:after="0" w:before="0"/>
             </w:pPr>
             <w:r>
               <w:rPr>
@@ -7838,7 +7826,7 @@
           <w:p>
             <w:pPr>
               <w:keepNext/>
-              <w:spacing w:line="288" w:lineRule="auto" w:after="40" w:before="40"/>
+              <w:spacing w:line="288" w:lineRule="auto" w:after="0" w:before="0"/>
             </w:pPr>
             <w:r>
               <w:rPr>
@@ -7856,7 +7844,7 @@
           <w:p>
             <w:pPr>
               <w:keepNext/>
-              <w:spacing w:line="288" w:lineRule="auto" w:after="40" w:before="40"/>
+              <w:spacing w:line="288" w:lineRule="auto" w:after="0" w:before="0"/>
             </w:pPr>
             <w:r>
               <w:rPr>
@@ -7879,7 +7867,7 @@
           <w:p>
             <w:pPr>
               <w:keepNext/>
-              <w:spacing w:line="288" w:lineRule="auto" w:after="40" w:before="40"/>
+              <w:spacing w:line="288" w:lineRule="auto" w:after="0" w:before="0"/>
             </w:pPr>
             <w:r>
               <w:rPr>
@@ -7897,7 +7885,7 @@
           <w:p>
             <w:pPr>
               <w:keepNext/>
-              <w:spacing w:line="288" w:lineRule="auto" w:after="40" w:before="40"/>
+              <w:spacing w:line="288" w:lineRule="auto" w:after="0" w:before="0"/>
             </w:pPr>
             <w:r>
               <w:rPr>
@@ -7915,7 +7903,7 @@
           <w:p>
             <w:pPr>
               <w:keepNext/>
-              <w:spacing w:line="288" w:lineRule="auto" w:after="40" w:before="40"/>
+              <w:spacing w:line="288" w:lineRule="auto" w:after="0" w:before="0"/>
             </w:pPr>
             <w:r>
               <w:rPr>
@@ -7938,7 +7926,7 @@
           <w:p>
             <w:pPr>
               <w:keepNext/>
-              <w:spacing w:line="288" w:lineRule="auto" w:after="40" w:before="40"/>
+              <w:spacing w:line="288" w:lineRule="auto" w:after="0" w:before="0"/>
             </w:pPr>
             <w:r>
               <w:rPr>
@@ -7955,7 +7943,7 @@
           <w:p>
             <w:pPr>
               <w:keepNext/>
-              <w:spacing w:line="288" w:lineRule="auto" w:after="40" w:before="40"/>
+              <w:spacing w:line="288" w:lineRule="auto" w:after="0" w:before="0"/>
             </w:pPr>
             <w:r>
               <w:rPr>
@@ -7973,7 +7961,7 @@
           <w:p>
             <w:pPr>
               <w:keepNext/>
-              <w:spacing w:line="288" w:lineRule="auto" w:after="40" w:before="40"/>
+              <w:spacing w:line="288" w:lineRule="auto" w:after="0" w:before="0"/>
             </w:pPr>
             <w:r>
               <w:rPr>
@@ -7996,7 +7984,7 @@
           <w:p>
             <w:pPr>
               <w:keepNext/>
-              <w:spacing w:line="288" w:lineRule="auto" w:after="40" w:before="40"/>
+              <w:spacing w:line="288" w:lineRule="auto" w:after="0" w:before="0"/>
             </w:pPr>
             <w:r>
               <w:rPr>
@@ -8013,7 +8001,7 @@
           <w:p>
             <w:pPr>
               <w:keepNext/>
-              <w:spacing w:line="288" w:lineRule="auto" w:after="40" w:before="40"/>
+              <w:spacing w:line="288" w:lineRule="auto" w:after="0" w:before="0"/>
             </w:pPr>
             <w:r>
               <w:rPr>
@@ -8031,7 +8019,7 @@
           <w:p>
             <w:pPr>
               <w:keepNext/>
-              <w:spacing w:line="288" w:lineRule="auto" w:after="40" w:before="40"/>
+              <w:spacing w:line="288" w:lineRule="auto" w:after="0" w:before="0"/>
             </w:pPr>
             <w:r>
               <w:rPr>
@@ -8054,7 +8042,7 @@
           <w:p>
             <w:pPr>
               <w:keepNext/>
-              <w:spacing w:line="288" w:lineRule="auto" w:after="40" w:before="40"/>
+              <w:spacing w:line="288" w:lineRule="auto" w:after="0" w:before="0"/>
             </w:pPr>
             <w:r>
               <w:rPr>
@@ -8072,7 +8060,7 @@
           <w:p>
             <w:pPr>
               <w:keepNext/>
-              <w:spacing w:line="288" w:lineRule="auto" w:after="40" w:before="40"/>
+              <w:spacing w:line="288" w:lineRule="auto" w:after="0" w:before="0"/>
             </w:pPr>
             <w:r>
               <w:rPr>
@@ -8090,7 +8078,7 @@
           <w:p>
             <w:pPr>
               <w:keepNext/>
-              <w:spacing w:line="288" w:lineRule="auto" w:after="40" w:before="40"/>
+              <w:spacing w:line="288" w:lineRule="auto" w:after="0" w:before="0"/>
             </w:pPr>
             <w:r>
               <w:rPr>
@@ -8113,7 +8101,7 @@
           <w:p>
             <w:pPr>
               <w:keepNext/>
-              <w:spacing w:line="288" w:lineRule="auto" w:after="40" w:before="40"/>
+              <w:spacing w:line="288" w:lineRule="auto" w:after="0" w:before="0"/>
             </w:pPr>
             <w:r>
               <w:rPr>
@@ -8130,7 +8118,7 @@
           <w:p>
             <w:pPr>
               <w:keepNext/>
-              <w:spacing w:line="288" w:lineRule="auto" w:after="40" w:before="40"/>
+              <w:spacing w:line="288" w:lineRule="auto" w:after="0" w:before="0"/>
             </w:pPr>
             <w:r>
               <w:rPr>
@@ -8148,7 +8136,7 @@
           <w:p>
             <w:pPr>
               <w:keepNext/>
-              <w:spacing w:line="288" w:lineRule="auto" w:after="40" w:before="40"/>
+              <w:spacing w:line="288" w:lineRule="auto" w:after="0" w:before="0"/>
             </w:pPr>
             <w:r>
               <w:rPr>
@@ -8171,7 +8159,7 @@
           <w:p>
             <w:pPr>
               <w:keepNext/>
-              <w:spacing w:line="288" w:lineRule="auto" w:after="40" w:before="40"/>
+              <w:spacing w:line="288" w:lineRule="auto" w:after="0" w:before="0"/>
             </w:pPr>
             <w:r>
               <w:rPr>
@@ -8188,7 +8176,7 @@
           <w:p>
             <w:pPr>
               <w:keepNext/>
-              <w:spacing w:line="288" w:lineRule="auto" w:after="40" w:before="40"/>
+              <w:spacing w:line="288" w:lineRule="auto" w:after="0" w:before="0"/>
             </w:pPr>
             <w:r>
               <w:rPr>
@@ -8206,7 +8194,7 @@
           <w:p>
             <w:pPr>
               <w:keepNext/>
-              <w:spacing w:line="288" w:lineRule="auto" w:after="40" w:before="40"/>
+              <w:spacing w:line="288" w:lineRule="auto" w:after="0" w:before="0"/>
             </w:pPr>
             <w:r>
               <w:rPr>
@@ -8229,7 +8217,7 @@
           <w:p>
             <w:pPr>
               <w:keepNext/>
-              <w:spacing w:line="288" w:lineRule="auto" w:after="40" w:before="40"/>
+              <w:spacing w:line="288" w:lineRule="auto" w:after="0" w:before="0"/>
             </w:pPr>
             <w:r>
               <w:rPr>
@@ -8247,7 +8235,7 @@
           <w:p>
             <w:pPr>
               <w:keepNext/>
-              <w:spacing w:line="288" w:lineRule="auto" w:after="40" w:before="40"/>
+              <w:spacing w:line="288" w:lineRule="auto" w:after="0" w:before="0"/>
             </w:pPr>
             <w:r>
               <w:rPr>
@@ -8265,7 +8253,7 @@
           <w:p>
             <w:pPr>
               <w:keepNext/>
-              <w:spacing w:line="288" w:lineRule="auto" w:after="40" w:before="40"/>
+              <w:spacing w:line="288" w:lineRule="auto" w:after="0" w:before="0"/>
             </w:pPr>
             <w:r>
               <w:rPr>
@@ -8288,7 +8276,7 @@
           <w:p>
             <w:pPr>
               <w:keepNext/>
-              <w:spacing w:line="288" w:lineRule="auto" w:after="40" w:before="40"/>
+              <w:spacing w:line="288" w:lineRule="auto" w:after="0" w:before="0"/>
             </w:pPr>
             <w:r>
               <w:rPr>
@@ -8305,7 +8293,7 @@
           <w:p>
             <w:pPr>
               <w:keepNext/>
-              <w:spacing w:line="288" w:lineRule="auto" w:after="40" w:before="40"/>
+              <w:spacing w:line="288" w:lineRule="auto" w:after="0" w:before="0"/>
             </w:pPr>
             <w:r>
               <w:rPr>
@@ -8323,7 +8311,7 @@
           <w:p>
             <w:pPr>
               <w:keepNext/>
-              <w:spacing w:line="288" w:lineRule="auto" w:after="40" w:before="40"/>
+              <w:spacing w:line="288" w:lineRule="auto" w:after="0" w:before="0"/>
             </w:pPr>
             <w:r>
               <w:rPr>
@@ -8346,7 +8334,7 @@
           <w:p>
             <w:pPr>
               <w:keepNext w:val="0"/>
-              <w:spacing w:line="288" w:lineRule="auto" w:after="40" w:before="40"/>
+              <w:spacing w:line="288" w:lineRule="auto" w:after="0" w:before="0"/>
             </w:pPr>
             <w:r>
               <w:rPr>
@@ -8363,7 +8351,7 @@
           <w:p>
             <w:pPr>
               <w:keepNext w:val="0"/>
-              <w:spacing w:line="288" w:lineRule="auto" w:after="40" w:before="40"/>
+              <w:spacing w:line="288" w:lineRule="auto" w:after="0" w:before="0"/>
             </w:pPr>
             <w:r>
               <w:rPr>
@@ -8381,7 +8369,7 @@
           <w:p>
             <w:pPr>
               <w:keepNext w:val="0"/>
-              <w:spacing w:line="288" w:lineRule="auto" w:after="40" w:before="40"/>
+              <w:spacing w:line="288" w:lineRule="auto" w:after="0" w:before="0"/>
             </w:pPr>
             <w:r>
               <w:rPr>
@@ -8451,7 +8439,7 @@
       <w:pPr>
         <w:pStyle w:val="Heading2"/>
         <w:widowControl/>
-        <w:spacing w:before="160" w:after="60" w:line="270" w:lineRule="atLeast"/>
+        <w:spacing w:before="0" w:after="0" w:line="270" w:lineRule="atLeast"/>
         <w:ind w:firstLine="0"/>
         <w:jc w:val="left"/>
       </w:pPr>
@@ -8503,7 +8491,7 @@
       <w:pPr>
         <w:pStyle w:val="Heading2"/>
         <w:widowControl/>
-        <w:spacing w:before="160" w:after="60" w:line="270" w:lineRule="atLeast"/>
+        <w:spacing w:before="0" w:after="0" w:line="270" w:lineRule="atLeast"/>
         <w:ind w:firstLine="0"/>
         <w:jc w:val="left"/>
       </w:pPr>
@@ -8537,7 +8525,7 @@
         <w:pStyle w:val="BodyText"/>
         <w:keepNext/>
         <w:widowControl/>
-        <w:spacing w:before="120" w:after="100" w:line="270" w:lineRule="atLeast"/>
+        <w:spacing w:before="60" w:after="60" w:line="270" w:lineRule="atLeast"/>
         <w:ind w:firstLine="0"/>
         <w:jc w:val="center"/>
       </w:pPr>
@@ -8570,6 +8558,7 @@
       <w:tr>
         <w:trPr>
           <w:cantSplit/>
+          <w:tblHeader/>
         </w:trPr>
         <w:tc>
           <w:tcPr>
@@ -8578,7 +8567,7 @@
           <w:p>
             <w:pPr>
               <w:keepNext/>
-              <w:spacing w:line="288" w:lineRule="auto" w:after="40" w:before="40"/>
+              <w:spacing w:line="288" w:lineRule="auto" w:after="0" w:before="0"/>
             </w:pPr>
             <w:r>
               <w:rPr>
@@ -8596,7 +8585,7 @@
           <w:p>
             <w:pPr>
               <w:keepNext/>
-              <w:spacing w:line="288" w:lineRule="auto" w:after="40" w:before="40"/>
+              <w:spacing w:line="288" w:lineRule="auto" w:after="0" w:before="0"/>
             </w:pPr>
             <w:r>
               <w:rPr>
@@ -8614,7 +8603,7 @@
           <w:p>
             <w:pPr>
               <w:keepNext/>
-              <w:spacing w:line="288" w:lineRule="auto" w:after="40" w:before="40"/>
+              <w:spacing w:line="288" w:lineRule="auto" w:after="0" w:before="0"/>
             </w:pPr>
             <w:r>
               <w:rPr>
@@ -8637,7 +8626,7 @@
           <w:p>
             <w:pPr>
               <w:keepNext/>
-              <w:spacing w:line="288" w:lineRule="auto" w:after="40" w:before="40"/>
+              <w:spacing w:line="288" w:lineRule="auto" w:after="0" w:before="0"/>
             </w:pPr>
             <w:r>
               <w:rPr>
@@ -8655,7 +8644,7 @@
           <w:p>
             <w:pPr>
               <w:keepNext/>
-              <w:spacing w:line="288" w:lineRule="auto" w:after="40" w:before="40"/>
+              <w:spacing w:line="288" w:lineRule="auto" w:after="0" w:before="0"/>
             </w:pPr>
             <w:r>
               <w:rPr>
@@ -8673,7 +8662,7 @@
           <w:p>
             <w:pPr>
               <w:keepNext/>
-              <w:spacing w:line="288" w:lineRule="auto" w:after="40" w:before="40"/>
+              <w:spacing w:line="288" w:lineRule="auto" w:after="0" w:before="0"/>
             </w:pPr>
             <w:r>
               <w:rPr>
@@ -8696,7 +8685,7 @@
           <w:p>
             <w:pPr>
               <w:keepNext/>
-              <w:spacing w:line="288" w:lineRule="auto" w:after="40" w:before="40"/>
+              <w:spacing w:line="288" w:lineRule="auto" w:after="0" w:before="0"/>
             </w:pPr>
             <w:r>
               <w:rPr>
@@ -8714,7 +8703,7 @@
           <w:p>
             <w:pPr>
               <w:keepNext/>
-              <w:spacing w:line="288" w:lineRule="auto" w:after="40" w:before="40"/>
+              <w:spacing w:line="288" w:lineRule="auto" w:after="0" w:before="0"/>
             </w:pPr>
             <w:r>
               <w:rPr>
@@ -8732,7 +8721,7 @@
           <w:p>
             <w:pPr>
               <w:keepNext/>
-              <w:spacing w:line="288" w:lineRule="auto" w:after="40" w:before="40"/>
+              <w:spacing w:line="288" w:lineRule="auto" w:after="0" w:before="0"/>
             </w:pPr>
             <w:r>
               <w:rPr>
@@ -8755,7 +8744,7 @@
           <w:p>
             <w:pPr>
               <w:keepNext w:val="0"/>
-              <w:spacing w:line="288" w:lineRule="auto" w:after="40" w:before="40"/>
+              <w:spacing w:line="288" w:lineRule="auto" w:after="0" w:before="0"/>
             </w:pPr>
             <w:r>
               <w:rPr>
@@ -8773,7 +8762,7 @@
           <w:p>
             <w:pPr>
               <w:keepNext w:val="0"/>
-              <w:spacing w:line="288" w:lineRule="auto" w:after="40" w:before="40"/>
+              <w:spacing w:line="288" w:lineRule="auto" w:after="0" w:before="0"/>
             </w:pPr>
             <w:r>
               <w:rPr>
@@ -8791,7 +8780,7 @@
           <w:p>
             <w:pPr>
               <w:keepNext w:val="0"/>
-              <w:spacing w:line="288" w:lineRule="auto" w:after="40" w:before="40"/>
+              <w:spacing w:line="288" w:lineRule="auto" w:after="0" w:before="0"/>
             </w:pPr>
             <w:r>
               <w:rPr>
@@ -8843,7 +8832,7 @@
         <w:pStyle w:val="BodyText"/>
         <w:keepNext/>
         <w:widowControl/>
-        <w:spacing w:before="120" w:after="100" w:line="270" w:lineRule="atLeast"/>
+        <w:spacing w:before="60" w:after="60" w:line="270" w:lineRule="atLeast"/>
         <w:ind w:firstLine="0"/>
         <w:jc w:val="center"/>
       </w:pPr>
@@ -8876,6 +8865,7 @@
       <w:tr>
         <w:trPr>
           <w:cantSplit/>
+          <w:tblHeader/>
         </w:trPr>
         <w:tc>
           <w:tcPr>
@@ -8884,7 +8874,7 @@
           <w:p>
             <w:pPr>
               <w:keepNext/>
-              <w:spacing w:line="288" w:lineRule="auto" w:after="40" w:before="40"/>
+              <w:spacing w:line="288" w:lineRule="auto" w:after="0" w:before="0"/>
             </w:pPr>
             <w:r>
               <w:rPr>
@@ -8902,7 +8892,7 @@
           <w:p>
             <w:pPr>
               <w:keepNext/>
-              <w:spacing w:line="288" w:lineRule="auto" w:after="40" w:before="40"/>
+              <w:spacing w:line="288" w:lineRule="auto" w:after="0" w:before="0"/>
             </w:pPr>
             <w:r>
               <w:rPr>
@@ -8920,7 +8910,7 @@
           <w:p>
             <w:pPr>
               <w:keepNext/>
-              <w:spacing w:line="288" w:lineRule="auto" w:after="40" w:before="40"/>
+              <w:spacing w:line="288" w:lineRule="auto" w:after="0" w:before="0"/>
             </w:pPr>
             <w:r>
               <w:rPr>
@@ -8943,7 +8933,7 @@
           <w:p>
             <w:pPr>
               <w:keepNext/>
-              <w:spacing w:line="288" w:lineRule="auto" w:after="40" w:before="40"/>
+              <w:spacing w:line="288" w:lineRule="auto" w:after="0" w:before="0"/>
             </w:pPr>
             <w:r>
               <w:rPr>
@@ -8961,7 +8951,7 @@
           <w:p>
             <w:pPr>
               <w:keepNext/>
-              <w:spacing w:line="288" w:lineRule="auto" w:after="40" w:before="40"/>
+              <w:spacing w:line="288" w:lineRule="auto" w:after="0" w:before="0"/>
             </w:pPr>
             <w:r>
               <w:rPr>
@@ -8979,7 +8969,7 @@
           <w:p>
             <w:pPr>
               <w:keepNext/>
-              <w:spacing w:line="288" w:lineRule="auto" w:after="40" w:before="40"/>
+              <w:spacing w:line="288" w:lineRule="auto" w:after="0" w:before="0"/>
             </w:pPr>
             <w:r>
               <w:rPr>
@@ -9002,7 +8992,7 @@
           <w:p>
             <w:pPr>
               <w:keepNext/>
-              <w:spacing w:line="288" w:lineRule="auto" w:after="40" w:before="40"/>
+              <w:spacing w:line="288" w:lineRule="auto" w:after="0" w:before="0"/>
             </w:pPr>
             <w:r>
               <w:rPr>
@@ -9019,7 +9009,7 @@
           <w:p>
             <w:pPr>
               <w:keepNext/>
-              <w:spacing w:line="288" w:lineRule="auto" w:after="40" w:before="40"/>
+              <w:spacing w:line="288" w:lineRule="auto" w:after="0" w:before="0"/>
             </w:pPr>
             <w:r>
               <w:rPr>
@@ -9037,7 +9027,7 @@
           <w:p>
             <w:pPr>
               <w:keepNext/>
-              <w:spacing w:line="288" w:lineRule="auto" w:after="40" w:before="40"/>
+              <w:spacing w:line="288" w:lineRule="auto" w:after="0" w:before="0"/>
             </w:pPr>
             <w:r>
               <w:rPr>
@@ -9060,7 +9050,7 @@
           <w:p>
             <w:pPr>
               <w:keepNext/>
-              <w:spacing w:line="288" w:lineRule="auto" w:after="40" w:before="40"/>
+              <w:spacing w:line="288" w:lineRule="auto" w:after="0" w:before="0"/>
             </w:pPr>
             <w:r>
               <w:rPr>
@@ -9077,7 +9067,7 @@
           <w:p>
             <w:pPr>
               <w:keepNext/>
-              <w:spacing w:line="288" w:lineRule="auto" w:after="40" w:before="40"/>
+              <w:spacing w:line="288" w:lineRule="auto" w:after="0" w:before="0"/>
             </w:pPr>
             <w:r>
               <w:rPr>
@@ -9095,7 +9085,7 @@
           <w:p>
             <w:pPr>
               <w:keepNext/>
-              <w:spacing w:line="288" w:lineRule="auto" w:after="40" w:before="40"/>
+              <w:spacing w:line="288" w:lineRule="auto" w:after="0" w:before="0"/>
             </w:pPr>
             <w:r>
               <w:rPr>
@@ -9118,7 +9108,7 @@
           <w:p>
             <w:pPr>
               <w:keepNext/>
-              <w:spacing w:line="288" w:lineRule="auto" w:after="40" w:before="40"/>
+              <w:spacing w:line="288" w:lineRule="auto" w:after="0" w:before="0"/>
             </w:pPr>
             <w:r>
               <w:rPr>
@@ -9135,7 +9125,7 @@
           <w:p>
             <w:pPr>
               <w:keepNext/>
-              <w:spacing w:line="288" w:lineRule="auto" w:after="40" w:before="40"/>
+              <w:spacing w:line="288" w:lineRule="auto" w:after="0" w:before="0"/>
             </w:pPr>
             <w:r>
               <w:rPr>
@@ -9153,7 +9143,7 @@
           <w:p>
             <w:pPr>
               <w:keepNext/>
-              <w:spacing w:line="288" w:lineRule="auto" w:after="40" w:before="40"/>
+              <w:spacing w:line="288" w:lineRule="auto" w:after="0" w:before="0"/>
             </w:pPr>
             <w:r>
               <w:rPr>
@@ -9176,7 +9166,7 @@
           <w:p>
             <w:pPr>
               <w:keepNext/>
-              <w:spacing w:line="288" w:lineRule="auto" w:after="40" w:before="40"/>
+              <w:spacing w:line="288" w:lineRule="auto" w:after="0" w:before="0"/>
             </w:pPr>
             <w:r>
               <w:rPr>
@@ -9193,7 +9183,7 @@
           <w:p>
             <w:pPr>
               <w:keepNext/>
-              <w:spacing w:line="288" w:lineRule="auto" w:after="40" w:before="40"/>
+              <w:spacing w:line="288" w:lineRule="auto" w:after="0" w:before="0"/>
             </w:pPr>
             <w:r>
               <w:rPr>
@@ -9211,7 +9201,7 @@
           <w:p>
             <w:pPr>
               <w:keepNext/>
-              <w:spacing w:line="288" w:lineRule="auto" w:after="40" w:before="40"/>
+              <w:spacing w:line="288" w:lineRule="auto" w:after="0" w:before="0"/>
             </w:pPr>
             <w:r>
               <w:rPr>
@@ -9234,7 +9224,7 @@
           <w:p>
             <w:pPr>
               <w:keepNext/>
-              <w:spacing w:line="288" w:lineRule="auto" w:after="40" w:before="40"/>
+              <w:spacing w:line="288" w:lineRule="auto" w:after="0" w:before="0"/>
             </w:pPr>
             <w:r>
               <w:rPr>
@@ -9251,7 +9241,7 @@
           <w:p>
             <w:pPr>
               <w:keepNext/>
-              <w:spacing w:line="288" w:lineRule="auto" w:after="40" w:before="40"/>
+              <w:spacing w:line="288" w:lineRule="auto" w:after="0" w:before="0"/>
             </w:pPr>
             <w:r>
               <w:rPr>
@@ -9269,7 +9259,7 @@
           <w:p>
             <w:pPr>
               <w:keepNext/>
-              <w:spacing w:line="288" w:lineRule="auto" w:after="40" w:before="40"/>
+              <w:spacing w:line="288" w:lineRule="auto" w:after="0" w:before="0"/>
             </w:pPr>
             <w:r>
               <w:rPr>
@@ -9292,7 +9282,7 @@
           <w:p>
             <w:pPr>
               <w:keepNext/>
-              <w:spacing w:line="288" w:lineRule="auto" w:after="40" w:before="40"/>
+              <w:spacing w:line="288" w:lineRule="auto" w:after="0" w:before="0"/>
             </w:pPr>
             <w:r>
               <w:rPr>
@@ -9310,7 +9300,7 @@
           <w:p>
             <w:pPr>
               <w:keepNext/>
-              <w:spacing w:line="288" w:lineRule="auto" w:after="40" w:before="40"/>
+              <w:spacing w:line="288" w:lineRule="auto" w:after="0" w:before="0"/>
             </w:pPr>
             <w:r>
               <w:rPr>
@@ -9328,7 +9318,7 @@
           <w:p>
             <w:pPr>
               <w:keepNext/>
-              <w:spacing w:line="288" w:lineRule="auto" w:after="40" w:before="40"/>
+              <w:spacing w:line="288" w:lineRule="auto" w:after="0" w:before="0"/>
             </w:pPr>
             <w:r>
               <w:rPr>
@@ -9351,7 +9341,7 @@
           <w:p>
             <w:pPr>
               <w:keepNext/>
-              <w:spacing w:line="288" w:lineRule="auto" w:after="40" w:before="40"/>
+              <w:spacing w:line="288" w:lineRule="auto" w:after="0" w:before="0"/>
             </w:pPr>
             <w:r>
               <w:rPr>
@@ -9368,7 +9358,7 @@
           <w:p>
             <w:pPr>
               <w:keepNext/>
-              <w:spacing w:line="288" w:lineRule="auto" w:after="40" w:before="40"/>
+              <w:spacing w:line="288" w:lineRule="auto" w:after="0" w:before="0"/>
             </w:pPr>
             <w:r>
               <w:rPr>
@@ -9386,7 +9376,7 @@
           <w:p>
             <w:pPr>
               <w:keepNext/>
-              <w:spacing w:line="288" w:lineRule="auto" w:after="40" w:before="40"/>
+              <w:spacing w:line="288" w:lineRule="auto" w:after="0" w:before="0"/>
             </w:pPr>
             <w:r>
               <w:rPr>
@@ -9409,7 +9399,7 @@
           <w:p>
             <w:pPr>
               <w:keepNext/>
-              <w:spacing w:line="288" w:lineRule="auto" w:after="40" w:before="40"/>
+              <w:spacing w:line="288" w:lineRule="auto" w:after="0" w:before="0"/>
             </w:pPr>
             <w:r>
               <w:rPr>
@@ -9427,7 +9417,7 @@
           <w:p>
             <w:pPr>
               <w:keepNext/>
-              <w:spacing w:line="288" w:lineRule="auto" w:after="40" w:before="40"/>
+              <w:spacing w:line="288" w:lineRule="auto" w:after="0" w:before="0"/>
             </w:pPr>
             <w:r>
               <w:rPr>
@@ -9445,7 +9435,7 @@
           <w:p>
             <w:pPr>
               <w:keepNext/>
-              <w:spacing w:line="288" w:lineRule="auto" w:after="40" w:before="40"/>
+              <w:spacing w:line="288" w:lineRule="auto" w:after="0" w:before="0"/>
             </w:pPr>
             <w:r>
               <w:rPr>
@@ -9468,7 +9458,7 @@
           <w:p>
             <w:pPr>
               <w:keepNext w:val="0"/>
-              <w:spacing w:line="288" w:lineRule="auto" w:after="40" w:before="40"/>
+              <w:spacing w:line="288" w:lineRule="auto" w:after="0" w:before="0"/>
             </w:pPr>
             <w:r>
               <w:rPr>
@@ -9485,7 +9475,7 @@
           <w:p>
             <w:pPr>
               <w:keepNext w:val="0"/>
-              <w:spacing w:line="288" w:lineRule="auto" w:after="40" w:before="40"/>
+              <w:spacing w:line="288" w:lineRule="auto" w:after="0" w:before="0"/>
             </w:pPr>
             <w:r>
               <w:rPr>
@@ -9503,7 +9493,7 @@
           <w:p>
             <w:pPr>
               <w:keepNext w:val="0"/>
-              <w:spacing w:line="288" w:lineRule="auto" w:after="40" w:before="40"/>
+              <w:spacing w:line="288" w:lineRule="auto" w:after="0" w:before="0"/>
             </w:pPr>
             <w:r>
               <w:rPr>
@@ -9539,7 +9529,7 @@
       <w:pPr>
         <w:pStyle w:val="Heading2"/>
         <w:widowControl/>
-        <w:spacing w:before="160" w:after="60" w:line="270" w:lineRule="atLeast"/>
+        <w:spacing w:before="0" w:after="0" w:line="270" w:lineRule="atLeast"/>
         <w:ind w:firstLine="0"/>
         <w:jc w:val="left"/>
       </w:pPr>
@@ -9623,7 +9613,7 @@
         <w:pStyle w:val="BodyText"/>
         <w:keepNext/>
         <w:widowControl/>
-        <w:spacing w:before="120" w:after="100" w:line="270" w:lineRule="atLeast"/>
+        <w:spacing w:before="60" w:after="60" w:line="270" w:lineRule="atLeast"/>
         <w:ind w:firstLine="0"/>
         <w:jc w:val="center"/>
       </w:pPr>
@@ -9649,77 +9639,78 @@
         </w:tblBorders>
       </w:tblPr>
       <w:tblGrid>
+        <w:gridCol w:w="992"/>
         <w:gridCol w:w="935"/>
-        <w:gridCol w:w="935"/>
-        <w:gridCol w:w="1304"/>
-        <w:gridCol w:w="1304"/>
+        <w:gridCol w:w="1219"/>
+        <w:gridCol w:w="1219"/>
       </w:tblGrid>
       <w:tr>
         <w:trPr>
           <w:cantSplit/>
+          <w:tblHeader/>
         </w:trPr>
         <w:tc>
           <w:tcPr>
+            <w:tcW w:type="dxa" w:w="992"/>
+          </w:tcPr>
+          <w:p>
+            <w:pPr>
+              <w:keepNext/>
+              <w:spacing w:line="288" w:lineRule="auto" w:after="0" w:before="0"/>
+            </w:pPr>
+            <w:r>
+              <w:rPr>
+                <w:rFonts w:ascii="Times New Roman" w:hAnsi="Times New Roman"/>
+                <w:sz w:val="16"/>
+              </w:rPr>
+              <w:t>Corpus</w:t>
+            </w:r>
+          </w:p>
+        </w:tc>
+        <w:tc>
+          <w:tcPr>
             <w:tcW w:type="dxa" w:w="935"/>
           </w:tcPr>
           <w:p>
             <w:pPr>
               <w:keepNext/>
-              <w:spacing w:line="288" w:lineRule="auto" w:after="40" w:before="40"/>
-            </w:pPr>
-            <w:r>
-              <w:rPr>
-                <w:rFonts w:ascii="Times New Roman" w:hAnsi="Times New Roman"/>
-                <w:sz w:val="16"/>
-              </w:rPr>
-              <w:t>Corpus</w:t>
-            </w:r>
-          </w:p>
-        </w:tc>
-        <w:tc>
-          <w:tcPr>
-            <w:tcW w:type="dxa" w:w="935"/>
+              <w:spacing w:line="288" w:lineRule="auto" w:after="0" w:before="0"/>
+            </w:pPr>
+            <w:r>
+              <w:rPr>
+                <w:rFonts w:ascii="Times New Roman" w:hAnsi="Times New Roman"/>
+                <w:sz w:val="16"/>
+              </w:rPr>
+              <w:t>Pool</w:t>
+            </w:r>
+          </w:p>
+        </w:tc>
+        <w:tc>
+          <w:tcPr>
+            <w:tcW w:type="dxa" w:w="1219"/>
           </w:tcPr>
           <w:p>
             <w:pPr>
               <w:keepNext/>
-              <w:spacing w:line="288" w:lineRule="auto" w:after="40" w:before="40"/>
-            </w:pPr>
-            <w:r>
-              <w:rPr>
-                <w:rFonts w:ascii="Times New Roman" w:hAnsi="Times New Roman"/>
-                <w:sz w:val="16"/>
-              </w:rPr>
-              <w:t>Pool</w:t>
-            </w:r>
-          </w:p>
-        </w:tc>
-        <w:tc>
-          <w:tcPr>
-            <w:tcW w:type="dxa" w:w="1304"/>
+              <w:spacing w:line="288" w:lineRule="auto" w:after="0" w:before="0"/>
+            </w:pPr>
+            <w:r>
+              <w:rPr>
+                <w:rFonts w:ascii="Times New Roman" w:hAnsi="Times New Roman"/>
+                <w:sz w:val="16"/>
+              </w:rPr>
+              <w:t>B</w:t>
+            </w:r>
+          </w:p>
+        </w:tc>
+        <w:tc>
+          <w:tcPr>
+            <w:tcW w:type="dxa" w:w="1219"/>
           </w:tcPr>
           <w:p>
             <w:pPr>
               <w:keepNext/>
-              <w:spacing w:line="288" w:lineRule="auto" w:after="40" w:before="40"/>
-            </w:pPr>
-            <w:r>
-              <w:rPr>
-                <w:rFonts w:ascii="Times New Roman" w:hAnsi="Times New Roman"/>
-                <w:sz w:val="16"/>
-              </w:rPr>
-              <w:t>B</w:t>
-            </w:r>
-          </w:p>
-        </w:tc>
-        <w:tc>
-          <w:tcPr>
-            <w:tcW w:type="dxa" w:w="1304"/>
-          </w:tcPr>
-          <w:p>
-            <w:pPr>
-              <w:keepNext/>
-              <w:spacing w:line="288" w:lineRule="auto" w:after="40" w:before="40"/>
+              <w:spacing w:line="288" w:lineRule="auto" w:after="0" w:before="0"/>
             </w:pPr>
             <w:r>
               <w:rPr>
@@ -9737,66 +9728,66 @@
         </w:trPr>
         <w:tc>
           <w:tcPr>
+            <w:tcW w:type="dxa" w:w="992"/>
+          </w:tcPr>
+          <w:p>
+            <w:pPr>
+              <w:keepNext/>
+              <w:spacing w:line="288" w:lineRule="auto" w:after="0" w:before="0"/>
+            </w:pPr>
+            <w:r>
+              <w:rPr>
+                <w:rFonts w:ascii="Times New Roman" w:hAnsi="Times New Roman"/>
+                <w:sz w:val="16"/>
+              </w:rPr>
+              <w:t>CoEdit</w:t>
+            </w:r>
+          </w:p>
+        </w:tc>
+        <w:tc>
+          <w:tcPr>
             <w:tcW w:type="dxa" w:w="935"/>
           </w:tcPr>
           <w:p>
             <w:pPr>
               <w:keepNext/>
-              <w:spacing w:line="288" w:lineRule="auto" w:after="40" w:before="40"/>
-            </w:pPr>
-            <w:r>
-              <w:rPr>
-                <w:rFonts w:ascii="Times New Roman" w:hAnsi="Times New Roman"/>
-                <w:sz w:val="16"/>
-              </w:rPr>
-              <w:t>CoEdit</w:t>
-            </w:r>
-          </w:p>
-        </w:tc>
-        <w:tc>
-          <w:tcPr>
-            <w:tcW w:type="dxa" w:w="935"/>
+              <w:spacing w:line="288" w:lineRule="auto" w:after="0" w:before="0"/>
+            </w:pPr>
+            <w:r>
+              <w:rPr>
+                <w:rFonts w:ascii="Times New Roman" w:hAnsi="Times New Roman"/>
+                <w:sz w:val="16"/>
+              </w:rPr>
+              <w:t>Random</w:t>
+            </w:r>
+          </w:p>
+        </w:tc>
+        <w:tc>
+          <w:tcPr>
+            <w:tcW w:type="dxa" w:w="1219"/>
           </w:tcPr>
           <w:p>
             <w:pPr>
               <w:keepNext/>
-              <w:spacing w:line="288" w:lineRule="auto" w:after="40" w:before="40"/>
-            </w:pPr>
-            <w:r>
-              <w:rPr>
-                <w:rFonts w:ascii="Times New Roman" w:hAnsi="Times New Roman"/>
-                <w:sz w:val="16"/>
-              </w:rPr>
-              <w:t>Random</w:t>
-            </w:r>
-          </w:p>
-        </w:tc>
-        <w:tc>
-          <w:tcPr>
-            <w:tcW w:type="dxa" w:w="1304"/>
+              <w:spacing w:line="288" w:lineRule="auto" w:after="0" w:before="0"/>
+            </w:pPr>
+            <w:r>
+              <w:rPr>
+                <w:rFonts w:ascii="Times New Roman" w:hAnsi="Times New Roman"/>
+                <w:sz w:val="16"/>
+              </w:rPr>
+              <w:t>0.9898±0.0012</w:t>
+            </w:r>
+          </w:p>
+        </w:tc>
+        <w:tc>
+          <w:tcPr>
+            <w:tcW w:type="dxa" w:w="1219"/>
           </w:tcPr>
           <w:p>
             <w:pPr>
               <w:keepNext/>
-              <w:spacing w:line="288" w:lineRule="auto" w:after="40" w:before="40"/>
-            </w:pPr>
-            <w:r>
-              <w:rPr>
-                <w:rFonts w:ascii="Times New Roman" w:hAnsi="Times New Roman"/>
-                <w:sz w:val="16"/>
-              </w:rPr>
-              <w:t>0.9898±0.0012</w:t>
-            </w:r>
-          </w:p>
-        </w:tc>
-        <w:tc>
-          <w:tcPr>
-            <w:tcW w:type="dxa" w:w="1304"/>
-          </w:tcPr>
-          <w:p>
-            <w:pPr>
-              <w:keepNext/>
-              <w:spacing w:line="288" w:lineRule="auto" w:after="40" w:before="40"/>
+              <w:spacing w:line="288" w:lineRule="auto" w:after="0" w:before="0"/>
             </w:pPr>
             <w:r>
               <w:rPr>
@@ -9814,65 +9805,65 @@
         </w:trPr>
         <w:tc>
           <w:tcPr>
+            <w:tcW w:type="dxa" w:w="992"/>
+          </w:tcPr>
+          <w:p>
+            <w:pPr>
+              <w:keepNext/>
+              <w:spacing w:line="288" w:lineRule="auto" w:after="0" w:before="0"/>
+            </w:pPr>
+            <w:r>
+              <w:rPr>
+                <w:rFonts w:ascii="Times New Roman" w:hAnsi="Times New Roman"/>
+                <w:sz w:val="16"/>
+              </w:rPr>
+            </w:r>
+          </w:p>
+        </w:tc>
+        <w:tc>
+          <w:tcPr>
             <w:tcW w:type="dxa" w:w="935"/>
           </w:tcPr>
           <w:p>
             <w:pPr>
               <w:keepNext/>
-              <w:spacing w:line="288" w:lineRule="auto" w:after="40" w:before="40"/>
-            </w:pPr>
-            <w:r>
-              <w:rPr>
-                <w:rFonts w:ascii="Times New Roman" w:hAnsi="Times New Roman"/>
-                <w:sz w:val="16"/>
-              </w:rPr>
-            </w:r>
-          </w:p>
-        </w:tc>
-        <w:tc>
-          <w:tcPr>
-            <w:tcW w:type="dxa" w:w="935"/>
+              <w:spacing w:line="288" w:lineRule="auto" w:after="0" w:before="0"/>
+            </w:pPr>
+            <w:r>
+              <w:rPr>
+                <w:rFonts w:ascii="Times New Roman" w:hAnsi="Times New Roman"/>
+                <w:sz w:val="16"/>
+              </w:rPr>
+              <w:t>Historical</w:t>
+            </w:r>
+          </w:p>
+        </w:tc>
+        <w:tc>
+          <w:tcPr>
+            <w:tcW w:type="dxa" w:w="1219"/>
           </w:tcPr>
           <w:p>
             <w:pPr>
               <w:keepNext/>
-              <w:spacing w:line="288" w:lineRule="auto" w:after="40" w:before="40"/>
-            </w:pPr>
-            <w:r>
-              <w:rPr>
-                <w:rFonts w:ascii="Times New Roman" w:hAnsi="Times New Roman"/>
-                <w:sz w:val="16"/>
-              </w:rPr>
-              <w:t>Historical</w:t>
-            </w:r>
-          </w:p>
-        </w:tc>
-        <w:tc>
-          <w:tcPr>
-            <w:tcW w:type="dxa" w:w="1304"/>
+              <w:spacing w:line="288" w:lineRule="auto" w:after="0" w:before="0"/>
+            </w:pPr>
+            <w:r>
+              <w:rPr>
+                <w:rFonts w:ascii="Times New Roman" w:hAnsi="Times New Roman"/>
+                <w:sz w:val="16"/>
+              </w:rPr>
+              <w:t>0.9573±0.0031</w:t>
+            </w:r>
+          </w:p>
+        </w:tc>
+        <w:tc>
+          <w:tcPr>
+            <w:tcW w:type="dxa" w:w="1219"/>
           </w:tcPr>
           <w:p>
             <w:pPr>
               <w:keepNext/>
-              <w:spacing w:line="288" w:lineRule="auto" w:after="40" w:before="40"/>
-            </w:pPr>
-            <w:r>
-              <w:rPr>
-                <w:rFonts w:ascii="Times New Roman" w:hAnsi="Times New Roman"/>
-                <w:sz w:val="16"/>
-              </w:rPr>
-              <w:t>0.9573±0.0031</w:t>
-            </w:r>
-          </w:p>
-        </w:tc>
-        <w:tc>
-          <w:tcPr>
-            <w:tcW w:type="dxa" w:w="1304"/>
-          </w:tcPr>
-          <w:p>
-            <w:pPr>
-              <w:keepNext/>
-              <w:spacing w:line="288" w:lineRule="auto" w:after="40" w:before="40"/>
+              <w:spacing w:line="288" w:lineRule="auto" w:after="0" w:before="0"/>
             </w:pPr>
             <w:r>
               <w:rPr>
@@ -9890,65 +9881,65 @@
         </w:trPr>
         <w:tc>
           <w:tcPr>
+            <w:tcW w:type="dxa" w:w="992"/>
+          </w:tcPr>
+          <w:p>
+            <w:pPr>
+              <w:keepNext/>
+              <w:spacing w:line="288" w:lineRule="auto" w:after="0" w:before="0"/>
+            </w:pPr>
+            <w:r>
+              <w:rPr>
+                <w:rFonts w:ascii="Times New Roman" w:hAnsi="Times New Roman"/>
+                <w:sz w:val="16"/>
+              </w:rPr>
+            </w:r>
+          </w:p>
+        </w:tc>
+        <w:tc>
+          <w:tcPr>
             <w:tcW w:type="dxa" w:w="935"/>
           </w:tcPr>
           <w:p>
             <w:pPr>
               <w:keepNext/>
-              <w:spacing w:line="288" w:lineRule="auto" w:after="40" w:before="40"/>
-            </w:pPr>
-            <w:r>
-              <w:rPr>
-                <w:rFonts w:ascii="Times New Roman" w:hAnsi="Times New Roman"/>
-                <w:sz w:val="16"/>
-              </w:rPr>
-            </w:r>
-          </w:p>
-        </w:tc>
-        <w:tc>
-          <w:tcPr>
-            <w:tcW w:type="dxa" w:w="935"/>
+              <w:spacing w:line="288" w:lineRule="auto" w:after="0" w:before="0"/>
+            </w:pPr>
+            <w:r>
+              <w:rPr>
+                <w:rFonts w:ascii="Times New Roman" w:hAnsi="Times New Roman"/>
+                <w:sz w:val="16"/>
+              </w:rPr>
+              <w:t>Inductive</w:t>
+            </w:r>
+          </w:p>
+        </w:tc>
+        <w:tc>
+          <w:tcPr>
+            <w:tcW w:type="dxa" w:w="1219"/>
           </w:tcPr>
           <w:p>
             <w:pPr>
               <w:keepNext/>
-              <w:spacing w:line="288" w:lineRule="auto" w:after="40" w:before="40"/>
-            </w:pPr>
-            <w:r>
-              <w:rPr>
-                <w:rFonts w:ascii="Times New Roman" w:hAnsi="Times New Roman"/>
-                <w:sz w:val="16"/>
-              </w:rPr>
-              <w:t>Inductive</w:t>
-            </w:r>
-          </w:p>
-        </w:tc>
-        <w:tc>
-          <w:tcPr>
-            <w:tcW w:type="dxa" w:w="1304"/>
+              <w:spacing w:line="288" w:lineRule="auto" w:after="0" w:before="0"/>
+            </w:pPr>
+            <w:r>
+              <w:rPr>
+                <w:rFonts w:ascii="Times New Roman" w:hAnsi="Times New Roman"/>
+                <w:sz w:val="16"/>
+              </w:rPr>
+              <w:t>0.9625±0.0024</w:t>
+            </w:r>
+          </w:p>
+        </w:tc>
+        <w:tc>
+          <w:tcPr>
+            <w:tcW w:type="dxa" w:w="1219"/>
           </w:tcPr>
           <w:p>
             <w:pPr>
               <w:keepNext/>
-              <w:spacing w:line="288" w:lineRule="auto" w:after="40" w:before="40"/>
-            </w:pPr>
-            <w:r>
-              <w:rPr>
-                <w:rFonts w:ascii="Times New Roman" w:hAnsi="Times New Roman"/>
-                <w:sz w:val="16"/>
-              </w:rPr>
-              <w:t>0.9625±0.0024</w:t>
-            </w:r>
-          </w:p>
-        </w:tc>
-        <w:tc>
-          <w:tcPr>
-            <w:tcW w:type="dxa" w:w="1304"/>
-          </w:tcPr>
-          <w:p>
-            <w:pPr>
-              <w:keepNext/>
-              <w:spacing w:line="288" w:lineRule="auto" w:after="40" w:before="40"/>
+              <w:spacing w:line="288" w:lineRule="auto" w:after="0" w:before="0"/>
             </w:pPr>
             <w:r>
               <w:rPr>
@@ -9966,66 +9957,66 @@
         </w:trPr>
         <w:tc>
           <w:tcPr>
+            <w:tcW w:type="dxa" w:w="992"/>
+          </w:tcPr>
+          <w:p>
+            <w:pPr>
+              <w:keepNext/>
+              <w:spacing w:line="288" w:lineRule="auto" w:after="0" w:before="0"/>
+            </w:pPr>
+            <w:r>
+              <w:rPr>
+                <w:rFonts w:ascii="Times New Roman" w:hAnsi="Times New Roman"/>
+                <w:sz w:val="16"/>
+              </w:rPr>
+              <w:t>Wikipedia</w:t>
+            </w:r>
+          </w:p>
+        </w:tc>
+        <w:tc>
+          <w:tcPr>
             <w:tcW w:type="dxa" w:w="935"/>
           </w:tcPr>
           <w:p>
             <w:pPr>
               <w:keepNext/>
-              <w:spacing w:line="288" w:lineRule="auto" w:after="40" w:before="40"/>
-            </w:pPr>
-            <w:r>
-              <w:rPr>
-                <w:rFonts w:ascii="Times New Roman" w:hAnsi="Times New Roman"/>
-                <w:sz w:val="16"/>
-              </w:rPr>
-              <w:t>Wikipedia</w:t>
-            </w:r>
-          </w:p>
-        </w:tc>
-        <w:tc>
-          <w:tcPr>
-            <w:tcW w:type="dxa" w:w="935"/>
+              <w:spacing w:line="288" w:lineRule="auto" w:after="0" w:before="0"/>
+            </w:pPr>
+            <w:r>
+              <w:rPr>
+                <w:rFonts w:ascii="Times New Roman" w:hAnsi="Times New Roman"/>
+                <w:sz w:val="16"/>
+              </w:rPr>
+              <w:t>Random</w:t>
+            </w:r>
+          </w:p>
+        </w:tc>
+        <w:tc>
+          <w:tcPr>
+            <w:tcW w:type="dxa" w:w="1219"/>
           </w:tcPr>
           <w:p>
             <w:pPr>
               <w:keepNext/>
-              <w:spacing w:line="288" w:lineRule="auto" w:after="40" w:before="40"/>
-            </w:pPr>
-            <w:r>
-              <w:rPr>
-                <w:rFonts w:ascii="Times New Roman" w:hAnsi="Times New Roman"/>
-                <w:sz w:val="16"/>
-              </w:rPr>
-              <w:t>Random</w:t>
-            </w:r>
-          </w:p>
-        </w:tc>
-        <w:tc>
-          <w:tcPr>
-            <w:tcW w:type="dxa" w:w="1304"/>
+              <w:spacing w:line="288" w:lineRule="auto" w:after="0" w:before="0"/>
+            </w:pPr>
+            <w:r>
+              <w:rPr>
+                <w:rFonts w:ascii="Times New Roman" w:hAnsi="Times New Roman"/>
+                <w:sz w:val="16"/>
+              </w:rPr>
+              <w:t>0.9968±0.0005</w:t>
+            </w:r>
+          </w:p>
+        </w:tc>
+        <w:tc>
+          <w:tcPr>
+            <w:tcW w:type="dxa" w:w="1219"/>
           </w:tcPr>
           <w:p>
             <w:pPr>
               <w:keepNext/>
-              <w:spacing w:line="288" w:lineRule="auto" w:after="40" w:before="40"/>
-            </w:pPr>
-            <w:r>
-              <w:rPr>
-                <w:rFonts w:ascii="Times New Roman" w:hAnsi="Times New Roman"/>
-                <w:sz w:val="16"/>
-              </w:rPr>
-              <w:t>0.9968±0.0005</w:t>
-            </w:r>
-          </w:p>
-        </w:tc>
-        <w:tc>
-          <w:tcPr>
-            <w:tcW w:type="dxa" w:w="1304"/>
-          </w:tcPr>
-          <w:p>
-            <w:pPr>
-              <w:keepNext/>
-              <w:spacing w:line="288" w:lineRule="auto" w:after="40" w:before="40"/>
+              <w:spacing w:line="288" w:lineRule="auto" w:after="0" w:before="0"/>
             </w:pPr>
             <w:r>
               <w:rPr>
@@ -10043,65 +10034,65 @@
         </w:trPr>
         <w:tc>
           <w:tcPr>
+            <w:tcW w:type="dxa" w:w="992"/>
+          </w:tcPr>
+          <w:p>
+            <w:pPr>
+              <w:keepNext/>
+              <w:spacing w:line="288" w:lineRule="auto" w:after="0" w:before="0"/>
+            </w:pPr>
+            <w:r>
+              <w:rPr>
+                <w:rFonts w:ascii="Times New Roman" w:hAnsi="Times New Roman"/>
+                <w:sz w:val="16"/>
+              </w:rPr>
+            </w:r>
+          </w:p>
+        </w:tc>
+        <w:tc>
+          <w:tcPr>
             <w:tcW w:type="dxa" w:w="935"/>
           </w:tcPr>
           <w:p>
             <w:pPr>
               <w:keepNext/>
-              <w:spacing w:line="288" w:lineRule="auto" w:after="40" w:before="40"/>
-            </w:pPr>
-            <w:r>
-              <w:rPr>
-                <w:rFonts w:ascii="Times New Roman" w:hAnsi="Times New Roman"/>
-                <w:sz w:val="16"/>
-              </w:rPr>
-            </w:r>
-          </w:p>
-        </w:tc>
-        <w:tc>
-          <w:tcPr>
-            <w:tcW w:type="dxa" w:w="935"/>
+              <w:spacing w:line="288" w:lineRule="auto" w:after="0" w:before="0"/>
+            </w:pPr>
+            <w:r>
+              <w:rPr>
+                <w:rFonts w:ascii="Times New Roman" w:hAnsi="Times New Roman"/>
+                <w:sz w:val="16"/>
+              </w:rPr>
+              <w:t>Historical</w:t>
+            </w:r>
+          </w:p>
+        </w:tc>
+        <w:tc>
+          <w:tcPr>
+            <w:tcW w:type="dxa" w:w="1219"/>
           </w:tcPr>
           <w:p>
             <w:pPr>
               <w:keepNext/>
-              <w:spacing w:line="288" w:lineRule="auto" w:after="40" w:before="40"/>
-            </w:pPr>
-            <w:r>
-              <w:rPr>
-                <w:rFonts w:ascii="Times New Roman" w:hAnsi="Times New Roman"/>
-                <w:sz w:val="16"/>
-              </w:rPr>
-              <w:t>Historical</w:t>
-            </w:r>
-          </w:p>
-        </w:tc>
-        <w:tc>
-          <w:tcPr>
-            <w:tcW w:type="dxa" w:w="1304"/>
+              <w:spacing w:line="288" w:lineRule="auto" w:after="0" w:before="0"/>
+            </w:pPr>
+            <w:r>
+              <w:rPr>
+                <w:rFonts w:ascii="Times New Roman" w:hAnsi="Times New Roman"/>
+                <w:sz w:val="16"/>
+              </w:rPr>
+              <w:t>0.9744±0.0047</w:t>
+            </w:r>
+          </w:p>
+        </w:tc>
+        <w:tc>
+          <w:tcPr>
+            <w:tcW w:type="dxa" w:w="1219"/>
           </w:tcPr>
           <w:p>
             <w:pPr>
               <w:keepNext/>
-              <w:spacing w:line="288" w:lineRule="auto" w:after="40" w:before="40"/>
-            </w:pPr>
-            <w:r>
-              <w:rPr>
-                <w:rFonts w:ascii="Times New Roman" w:hAnsi="Times New Roman"/>
-                <w:sz w:val="16"/>
-              </w:rPr>
-              <w:t>0.9744±0.0047</w:t>
-            </w:r>
-          </w:p>
-        </w:tc>
-        <w:tc>
-          <w:tcPr>
-            <w:tcW w:type="dxa" w:w="1304"/>
-          </w:tcPr>
-          <w:p>
-            <w:pPr>
-              <w:keepNext/>
-              <w:spacing w:line="288" w:lineRule="auto" w:after="40" w:before="40"/>
+              <w:spacing w:line="288" w:lineRule="auto" w:after="0" w:before="0"/>
             </w:pPr>
             <w:r>
               <w:rPr>
@@ -10119,65 +10110,65 @@
         </w:trPr>
         <w:tc>
           <w:tcPr>
+            <w:tcW w:type="dxa" w:w="992"/>
+          </w:tcPr>
+          <w:p>
+            <w:pPr>
+              <w:keepNext w:val="0"/>
+              <w:spacing w:line="288" w:lineRule="auto" w:after="0" w:before="0"/>
+            </w:pPr>
+            <w:r>
+              <w:rPr>
+                <w:rFonts w:ascii="Times New Roman" w:hAnsi="Times New Roman"/>
+                <w:sz w:val="16"/>
+              </w:rPr>
+            </w:r>
+          </w:p>
+        </w:tc>
+        <w:tc>
+          <w:tcPr>
             <w:tcW w:type="dxa" w:w="935"/>
           </w:tcPr>
           <w:p>
             <w:pPr>
               <w:keepNext w:val="0"/>
-              <w:spacing w:line="288" w:lineRule="auto" w:after="40" w:before="40"/>
-            </w:pPr>
-            <w:r>
-              <w:rPr>
-                <w:rFonts w:ascii="Times New Roman" w:hAnsi="Times New Roman"/>
-                <w:sz w:val="16"/>
-              </w:rPr>
-            </w:r>
-          </w:p>
-        </w:tc>
-        <w:tc>
-          <w:tcPr>
-            <w:tcW w:type="dxa" w:w="935"/>
+              <w:spacing w:line="288" w:lineRule="auto" w:after="0" w:before="0"/>
+            </w:pPr>
+            <w:r>
+              <w:rPr>
+                <w:rFonts w:ascii="Times New Roman" w:hAnsi="Times New Roman"/>
+                <w:sz w:val="16"/>
+              </w:rPr>
+              <w:t>Inductive</w:t>
+            </w:r>
+          </w:p>
+        </w:tc>
+        <w:tc>
+          <w:tcPr>
+            <w:tcW w:type="dxa" w:w="1219"/>
           </w:tcPr>
           <w:p>
             <w:pPr>
               <w:keepNext w:val="0"/>
-              <w:spacing w:line="288" w:lineRule="auto" w:after="40" w:before="40"/>
-            </w:pPr>
-            <w:r>
-              <w:rPr>
-                <w:rFonts w:ascii="Times New Roman" w:hAnsi="Times New Roman"/>
-                <w:sz w:val="16"/>
-              </w:rPr>
-              <w:t>Inductive</w:t>
-            </w:r>
-          </w:p>
-        </w:tc>
-        <w:tc>
-          <w:tcPr>
-            <w:tcW w:type="dxa" w:w="1304"/>
+              <w:spacing w:line="288" w:lineRule="auto" w:after="0" w:before="0"/>
+            </w:pPr>
+            <w:r>
+              <w:rPr>
+                <w:rFonts w:ascii="Times New Roman" w:hAnsi="Times New Roman"/>
+                <w:sz w:val="16"/>
+              </w:rPr>
+              <w:t>0.9682±0.0035</w:t>
+            </w:r>
+          </w:p>
+        </w:tc>
+        <w:tc>
+          <w:tcPr>
+            <w:tcW w:type="dxa" w:w="1219"/>
           </w:tcPr>
           <w:p>
             <w:pPr>
               <w:keepNext w:val="0"/>
-              <w:spacing w:line="288" w:lineRule="auto" w:after="40" w:before="40"/>
-            </w:pPr>
-            <w:r>
-              <w:rPr>
-                <w:rFonts w:ascii="Times New Roman" w:hAnsi="Times New Roman"/>
-                <w:sz w:val="16"/>
-              </w:rPr>
-              <w:t>0.9682±0.0035</w:t>
-            </w:r>
-          </w:p>
-        </w:tc>
-        <w:tc>
-          <w:tcPr>
-            <w:tcW w:type="dxa" w:w="1304"/>
-          </w:tcPr>
-          <w:p>
-            <w:pPr>
-              <w:keepNext w:val="0"/>
-              <w:spacing w:line="288" w:lineRule="auto" w:after="40" w:before="40"/>
+              <w:spacing w:line="288" w:lineRule="auto" w:after="0" w:before="0"/>
             </w:pPr>
             <w:r>
               <w:rPr>
@@ -10230,7 +10221,7 @@
       <w:pPr>
         <w:pStyle w:val="Heading2"/>
         <w:widowControl/>
-        <w:spacing w:before="160" w:after="60" w:line="270" w:lineRule="atLeast"/>
+        <w:spacing w:before="0" w:after="0" w:line="270" w:lineRule="atLeast"/>
         <w:ind w:firstLine="0"/>
         <w:jc w:val="left"/>
       </w:pPr>
@@ -10264,7 +10255,7 @@
         <w:pStyle w:val="BodyText"/>
         <w:keepNext/>
         <w:widowControl/>
-        <w:spacing w:before="120" w:after="100" w:line="270" w:lineRule="atLeast"/>
+        <w:spacing w:before="60" w:after="60" w:line="270" w:lineRule="atLeast"/>
         <w:ind w:firstLine="0"/>
         <w:jc w:val="center"/>
       </w:pPr>
@@ -10297,6 +10288,7 @@
       <w:tr>
         <w:trPr>
           <w:cantSplit/>
+          <w:tblHeader/>
         </w:trPr>
         <w:tc>
           <w:tcPr>
@@ -10305,7 +10297,7 @@
           <w:p>
             <w:pPr>
               <w:keepNext/>
-              <w:spacing w:line="288" w:lineRule="auto" w:after="40" w:before="40"/>
+              <w:spacing w:line="288" w:lineRule="auto" w:after="0" w:before="0"/>
             </w:pPr>
             <w:r>
               <w:rPr>
@@ -10323,7 +10315,7 @@
           <w:p>
             <w:pPr>
               <w:keepNext/>
-              <w:spacing w:line="288" w:lineRule="auto" w:after="40" w:before="40"/>
+              <w:spacing w:line="288" w:lineRule="auto" w:after="0" w:before="0"/>
             </w:pPr>
             <w:r>
               <w:rPr>
@@ -10341,7 +10333,7 @@
           <w:p>
             <w:pPr>
               <w:keepNext/>
-              <w:spacing w:line="288" w:lineRule="auto" w:after="40" w:before="40"/>
+              <w:spacing w:line="288" w:lineRule="auto" w:after="0" w:before="0"/>
             </w:pPr>
             <w:r>
               <w:rPr>
@@ -10364,7 +10356,7 @@
           <w:p>
             <w:pPr>
               <w:keepNext/>
-              <w:spacing w:line="288" w:lineRule="auto" w:after="40" w:before="40"/>
+              <w:spacing w:line="288" w:lineRule="auto" w:after="0" w:before="0"/>
             </w:pPr>
             <w:r>
               <w:rPr>
@@ -10382,7 +10374,7 @@
           <w:p>
             <w:pPr>
               <w:keepNext/>
-              <w:spacing w:line="288" w:lineRule="auto" w:after="40" w:before="40"/>
+              <w:spacing w:line="288" w:lineRule="auto" w:after="0" w:before="0"/>
             </w:pPr>
             <w:r>
               <w:rPr>
@@ -10400,7 +10392,7 @@
           <w:p>
             <w:pPr>
               <w:keepNext/>
-              <w:spacing w:line="288" w:lineRule="auto" w:after="40" w:before="40"/>
+              <w:spacing w:line="288" w:lineRule="auto" w:after="0" w:before="0"/>
             </w:pPr>
             <w:r>
               <w:rPr>
@@ -10423,7 +10415,7 @@
           <w:p>
             <w:pPr>
               <w:keepNext/>
-              <w:spacing w:line="288" w:lineRule="auto" w:after="40" w:before="40"/>
+              <w:spacing w:line="288" w:lineRule="auto" w:after="0" w:before="0"/>
             </w:pPr>
             <w:r>
               <w:rPr>
@@ -10440,7 +10432,7 @@
           <w:p>
             <w:pPr>
               <w:keepNext/>
-              <w:spacing w:line="288" w:lineRule="auto" w:after="40" w:before="40"/>
+              <w:spacing w:line="288" w:lineRule="auto" w:after="0" w:before="0"/>
             </w:pPr>
             <w:r>
               <w:rPr>
@@ -10458,7 +10450,7 @@
           <w:p>
             <w:pPr>
               <w:keepNext/>
-              <w:spacing w:line="288" w:lineRule="auto" w:after="40" w:before="40"/>
+              <w:spacing w:line="288" w:lineRule="auto" w:after="0" w:before="0"/>
             </w:pPr>
             <w:r>
               <w:rPr>
@@ -10481,7 +10473,7 @@
           <w:p>
             <w:pPr>
               <w:keepNext/>
-              <w:spacing w:line="288" w:lineRule="auto" w:after="40" w:before="40"/>
+              <w:spacing w:line="288" w:lineRule="auto" w:after="0" w:before="0"/>
             </w:pPr>
             <w:r>
               <w:rPr>
@@ -10499,7 +10491,7 @@
           <w:p>
             <w:pPr>
               <w:keepNext/>
-              <w:spacing w:line="288" w:lineRule="auto" w:after="40" w:before="40"/>
+              <w:spacing w:line="288" w:lineRule="auto" w:after="0" w:before="0"/>
             </w:pPr>
             <w:r>
               <w:rPr>
@@ -10517,7 +10509,7 @@
           <w:p>
             <w:pPr>
               <w:keepNext/>
-              <w:spacing w:line="288" w:lineRule="auto" w:after="40" w:before="40"/>
+              <w:spacing w:line="288" w:lineRule="auto" w:after="0" w:before="0"/>
             </w:pPr>
             <w:r>
               <w:rPr>
@@ -10540,7 +10532,7 @@
           <w:p>
             <w:pPr>
               <w:keepNext w:val="0"/>
-              <w:spacing w:line="288" w:lineRule="auto" w:after="40" w:before="40"/>
+              <w:spacing w:line="288" w:lineRule="auto" w:after="0" w:before="0"/>
             </w:pPr>
             <w:r>
               <w:rPr>
@@ -10557,7 +10549,7 @@
           <w:p>
             <w:pPr>
               <w:keepNext w:val="0"/>
-              <w:spacing w:line="288" w:lineRule="auto" w:after="40" w:before="40"/>
+              <w:spacing w:line="288" w:lineRule="auto" w:after="0" w:before="0"/>
             </w:pPr>
             <w:r>
               <w:rPr>
@@ -10575,7 +10567,7 @@
           <w:p>
             <w:pPr>
               <w:keepNext w:val="0"/>
-              <w:spacing w:line="288" w:lineRule="auto" w:after="40" w:before="40"/>
+              <w:spacing w:line="288" w:lineRule="auto" w:after="0" w:before="0"/>
             </w:pPr>
             <w:r>
               <w:rPr>
@@ -10611,7 +10603,7 @@
       <w:pPr>
         <w:pStyle w:val="Heading2"/>
         <w:widowControl/>
-        <w:spacing w:before="160" w:after="60" w:line="270" w:lineRule="atLeast"/>
+        <w:spacing w:before="0" w:after="0" w:line="270" w:lineRule="atLeast"/>
         <w:ind w:firstLine="0"/>
         <w:jc w:val="left"/>
       </w:pPr>
@@ -10645,7 +10637,7 @@
         <w:pStyle w:val="BodyText"/>
         <w:keepNext/>
         <w:widowControl/>
-        <w:spacing w:before="120" w:after="100" w:line="270" w:lineRule="atLeast"/>
+        <w:spacing w:before="60" w:after="60" w:line="270" w:lineRule="atLeast"/>
         <w:ind w:firstLine="0"/>
         <w:jc w:val="center"/>
       </w:pPr>
@@ -10678,6 +10670,7 @@
       <w:tr>
         <w:trPr>
           <w:cantSplit/>
+          <w:tblHeader/>
         </w:trPr>
         <w:tc>
           <w:tcPr>
@@ -10686,7 +10679,7 @@
           <w:p>
             <w:pPr>
               <w:keepNext/>
-              <w:spacing w:line="288" w:lineRule="auto" w:after="40" w:before="40"/>
+              <w:spacing w:line="288" w:lineRule="auto" w:after="0" w:before="0"/>
             </w:pPr>
             <w:r>
               <w:rPr>
@@ -10704,7 +10697,7 @@
           <w:p>
             <w:pPr>
               <w:keepNext/>
-              <w:spacing w:line="288" w:lineRule="auto" w:after="40" w:before="40"/>
+              <w:spacing w:line="288" w:lineRule="auto" w:after="0" w:before="0"/>
             </w:pPr>
             <w:r>
               <w:rPr>
@@ -10722,7 +10715,7 @@
           <w:p>
             <w:pPr>
               <w:keepNext/>
-              <w:spacing w:line="288" w:lineRule="auto" w:after="40" w:before="40"/>
+              <w:spacing w:line="288" w:lineRule="auto" w:after="0" w:before="0"/>
             </w:pPr>
             <w:r>
               <w:rPr>
@@ -10745,7 +10738,7 @@
           <w:p>
             <w:pPr>
               <w:keepNext/>
-              <w:spacing w:line="288" w:lineRule="auto" w:after="40" w:before="40"/>
+              <w:spacing w:line="288" w:lineRule="auto" w:after="0" w:before="0"/>
             </w:pPr>
             <w:r>
               <w:rPr>
@@ -10763,7 +10756,7 @@
           <w:p>
             <w:pPr>
               <w:keepNext/>
-              <w:spacing w:line="288" w:lineRule="auto" w:after="40" w:before="40"/>
+              <w:spacing w:line="288" w:lineRule="auto" w:after="0" w:before="0"/>
             </w:pPr>
             <w:r>
               <w:rPr>
@@ -10781,7 +10774,7 @@
           <w:p>
             <w:pPr>
               <w:keepNext/>
-              <w:spacing w:line="288" w:lineRule="auto" w:after="40" w:before="40"/>
+              <w:spacing w:line="288" w:lineRule="auto" w:after="0" w:before="0"/>
             </w:pPr>
             <w:r>
               <w:rPr>
@@ -10804,7 +10797,7 @@
           <w:p>
             <w:pPr>
               <w:keepNext/>
-              <w:spacing w:line="288" w:lineRule="auto" w:after="40" w:before="40"/>
+              <w:spacing w:line="288" w:lineRule="auto" w:after="0" w:before="0"/>
             </w:pPr>
             <w:r>
               <w:rPr>
@@ -10821,7 +10814,7 @@
           <w:p>
             <w:pPr>
               <w:keepNext/>
-              <w:spacing w:line="288" w:lineRule="auto" w:after="40" w:before="40"/>
+              <w:spacing w:line="288" w:lineRule="auto" w:after="0" w:before="0"/>
             </w:pPr>
             <w:r>
               <w:rPr>
@@ -10839,7 +10832,7 @@
           <w:p>
             <w:pPr>
               <w:keepNext/>
-              <w:spacing w:line="288" w:lineRule="auto" w:after="40" w:before="40"/>
+              <w:spacing w:line="288" w:lineRule="auto" w:after="0" w:before="0"/>
             </w:pPr>
             <w:r>
               <w:rPr>
@@ -10862,7 +10855,7 @@
           <w:p>
             <w:pPr>
               <w:keepNext/>
-              <w:spacing w:line="288" w:lineRule="auto" w:after="40" w:before="40"/>
+              <w:spacing w:line="288" w:lineRule="auto" w:after="0" w:before="0"/>
             </w:pPr>
             <w:r>
               <w:rPr>
@@ -10880,7 +10873,7 @@
           <w:p>
             <w:pPr>
               <w:keepNext/>
-              <w:spacing w:line="288" w:lineRule="auto" w:after="40" w:before="40"/>
+              <w:spacing w:line="288" w:lineRule="auto" w:after="0" w:before="0"/>
             </w:pPr>
             <w:r>
               <w:rPr>
@@ -10898,7 +10891,7 @@
           <w:p>
             <w:pPr>
               <w:keepNext/>
-              <w:spacing w:line="288" w:lineRule="auto" w:after="40" w:before="40"/>
+              <w:spacing w:line="288" w:lineRule="auto" w:after="0" w:before="0"/>
             </w:pPr>
             <w:r>
               <w:rPr>
@@ -10921,7 +10914,7 @@
           <w:p>
             <w:pPr>
               <w:keepNext/>
-              <w:spacing w:line="288" w:lineRule="auto" w:after="40" w:before="40"/>
+              <w:spacing w:line="288" w:lineRule="auto" w:after="0" w:before="0"/>
             </w:pPr>
             <w:r>
               <w:rPr>
@@ -10938,7 +10931,7 @@
           <w:p>
             <w:pPr>
               <w:keepNext/>
-              <w:spacing w:line="288" w:lineRule="auto" w:after="40" w:before="40"/>
+              <w:spacing w:line="288" w:lineRule="auto" w:after="0" w:before="0"/>
             </w:pPr>
             <w:r>
               <w:rPr>
@@ -10956,7 +10949,7 @@
           <w:p>
             <w:pPr>
               <w:keepNext/>
-              <w:spacing w:line="288" w:lineRule="auto" w:after="40" w:before="40"/>
+              <w:spacing w:line="288" w:lineRule="auto" w:after="0" w:before="0"/>
             </w:pPr>
             <w:r>
               <w:rPr>
@@ -10979,7 +10972,7 @@
           <w:p>
             <w:pPr>
               <w:keepNext w:val="0"/>
-              <w:spacing w:line="288" w:lineRule="auto" w:after="40" w:before="40"/>
+              <w:spacing w:line="288" w:lineRule="auto" w:after="0" w:before="0"/>
             </w:pPr>
             <w:r>
               <w:rPr>
@@ -10997,7 +10990,7 @@
           <w:p>
             <w:pPr>
               <w:keepNext w:val="0"/>
-              <w:spacing w:line="288" w:lineRule="auto" w:after="40" w:before="40"/>
+              <w:spacing w:line="288" w:lineRule="auto" w:after="0" w:before="0"/>
             </w:pPr>
             <w:r>
               <w:rPr>
@@ -11015,7 +11008,7 @@
           <w:p>
             <w:pPr>
               <w:keepNext w:val="0"/>
-              <w:spacing w:line="288" w:lineRule="auto" w:after="40" w:before="40"/>
+              <w:spacing w:line="288" w:lineRule="auto" w:after="0" w:before="0"/>
             </w:pPr>
             <w:r>
               <w:rPr>
@@ -11052,7 +11045,7 @@
       <w:pPr>
         <w:pStyle w:val="Heading1"/>
         <w:widowControl/>
-        <w:spacing w:before="240" w:after="120" w:line="270" w:lineRule="atLeast"/>
+        <w:spacing w:before="0" w:after="0" w:line="270" w:lineRule="atLeast"/>
         <w:ind w:firstLine="0"/>
         <w:jc w:val="center"/>
       </w:pPr>
@@ -11069,7 +11062,7 @@
       <w:pPr>
         <w:pStyle w:val="Heading2"/>
         <w:widowControl/>
-        <w:spacing w:before="160" w:after="60" w:line="270" w:lineRule="atLeast"/>
+        <w:spacing w:before="0" w:after="0" w:line="270" w:lineRule="atLeast"/>
         <w:ind w:firstLine="0"/>
         <w:jc w:val="left"/>
       </w:pPr>
@@ -11138,7 +11131,7 @@
       <w:pPr>
         <w:pStyle w:val="Heading2"/>
         <w:widowControl/>
-        <w:spacing w:before="160" w:after="60" w:line="270" w:lineRule="atLeast"/>
+        <w:spacing w:before="0" w:after="0" w:line="270" w:lineRule="atLeast"/>
         <w:ind w:firstLine="0"/>
         <w:jc w:val="left"/>
       </w:pPr>
@@ -11190,7 +11183,7 @@
       <w:pPr>
         <w:pStyle w:val="Heading2"/>
         <w:widowControl/>
-        <w:spacing w:before="160" w:after="60" w:line="270" w:lineRule="atLeast"/>
+        <w:spacing w:before="0" w:after="0" w:line="270" w:lineRule="atLeast"/>
         <w:ind w:firstLine="0"/>
         <w:jc w:val="left"/>
       </w:pPr>
@@ -11259,7 +11252,7 @@
       <w:pPr>
         <w:pStyle w:val="Heading2"/>
         <w:widowControl/>
-        <w:spacing w:before="160" w:after="60" w:line="270" w:lineRule="atLeast"/>
+        <w:spacing w:before="0" w:after="0" w:line="270" w:lineRule="atLeast"/>
         <w:ind w:firstLine="0"/>
         <w:jc w:val="left"/>
       </w:pPr>
@@ -11328,7 +11321,7 @@
       <w:pPr>
         <w:pStyle w:val="Heading2"/>
         <w:widowControl/>
-        <w:spacing w:before="160" w:after="60" w:line="270" w:lineRule="atLeast"/>
+        <w:spacing w:before="0" w:after="0" w:line="270" w:lineRule="atLeast"/>
         <w:ind w:firstLine="0"/>
         <w:jc w:val="left"/>
       </w:pPr>
@@ -11415,7 +11408,7 @@
       <w:pPr>
         <w:pStyle w:val="Heading1"/>
         <w:widowControl/>
-        <w:spacing w:before="240" w:after="120" w:line="270" w:lineRule="atLeast"/>
+        <w:spacing w:before="0" w:after="0" w:line="270" w:lineRule="atLeast"/>
         <w:ind w:firstLine="0"/>
         <w:jc w:val="center"/>
       </w:pPr>
@@ -11467,7 +11460,7 @@
       <w:pPr>
         <w:pStyle w:val="Heading1"/>
         <w:widowControl/>
-        <w:spacing w:before="240" w:after="120" w:line="270" w:lineRule="atLeast"/>
+        <w:spacing w:before="0" w:after="0" w:line="270" w:lineRule="atLeast"/>
         <w:ind w:firstLine="0"/>
         <w:jc w:val="center"/>
       </w:pPr>
@@ -11485,7 +11478,7 @@
       <w:pPr>
         <w:pStyle w:val="Normal"/>
         <w:widowControl/>
-        <w:spacing w:before="0" w:after="60" w:line="270" w:lineRule="atLeast"/>
+        <w:spacing w:before="0" w:after="0" w:line="270" w:lineRule="atLeast"/>
         <w:ind w:left="283" w:hanging="283"/>
         <w:jc w:val="left"/>
       </w:pPr>
@@ -11500,7 +11493,7 @@
       <w:pPr>
         <w:pStyle w:val="Normal"/>
         <w:widowControl/>
-        <w:spacing w:before="0" w:after="60" w:line="270" w:lineRule="atLeast"/>
+        <w:spacing w:before="0" w:after="0" w:line="270" w:lineRule="atLeast"/>
         <w:ind w:left="283" w:hanging="283"/>
         <w:jc w:val="left"/>
       </w:pPr>
@@ -11515,7 +11508,7 @@
       <w:pPr>
         <w:pStyle w:val="Normal"/>
         <w:widowControl/>
-        <w:spacing w:before="0" w:after="60" w:line="270" w:lineRule="atLeast"/>
+        <w:spacing w:before="0" w:after="0" w:line="270" w:lineRule="atLeast"/>
         <w:ind w:left="283" w:hanging="283"/>
         <w:jc w:val="left"/>
       </w:pPr>
@@ -11530,7 +11523,7 @@
       <w:pPr>
         <w:pStyle w:val="Normal"/>
         <w:widowControl/>
-        <w:spacing w:before="0" w:after="60" w:line="270" w:lineRule="atLeast"/>
+        <w:spacing w:before="0" w:after="0" w:line="270" w:lineRule="atLeast"/>
         <w:ind w:left="283" w:hanging="283"/>
         <w:jc w:val="left"/>
       </w:pPr>
@@ -11545,7 +11538,7 @@
       <w:pPr>
         <w:pStyle w:val="Normal"/>
         <w:widowControl/>
-        <w:spacing w:before="0" w:after="60" w:line="270" w:lineRule="atLeast"/>
+        <w:spacing w:before="0" w:after="0" w:line="270" w:lineRule="atLeast"/>
         <w:ind w:left="283" w:hanging="283"/>
         <w:jc w:val="left"/>
       </w:pPr>
@@ -11560,7 +11553,7 @@
       <w:pPr>
         <w:pStyle w:val="Normal"/>
         <w:widowControl/>
-        <w:spacing w:before="0" w:after="60" w:line="270" w:lineRule="atLeast"/>
+        <w:spacing w:before="0" w:after="0" w:line="270" w:lineRule="atLeast"/>
         <w:ind w:left="283" w:hanging="283"/>
         <w:jc w:val="left"/>
       </w:pPr>
@@ -11575,7 +11568,7 @@
       <w:pPr>
         <w:pStyle w:val="Normal"/>
         <w:widowControl/>
-        <w:spacing w:before="0" w:after="60" w:line="270" w:lineRule="atLeast"/>
+        <w:spacing w:before="0" w:after="0" w:line="270" w:lineRule="atLeast"/>
         <w:ind w:left="283" w:hanging="283"/>
         <w:jc w:val="left"/>
       </w:pPr>
@@ -11590,7 +11583,7 @@
       <w:pPr>
         <w:pStyle w:val="Normal"/>
         <w:widowControl/>
-        <w:spacing w:before="0" w:after="60" w:line="270" w:lineRule="atLeast"/>
+        <w:spacing w:before="0" w:after="0" w:line="270" w:lineRule="atLeast"/>
         <w:ind w:left="283" w:hanging="283"/>
         <w:jc w:val="left"/>
       </w:pPr>
@@ -11605,7 +11598,7 @@
       <w:pPr>
         <w:pStyle w:val="Normal"/>
         <w:widowControl/>
-        <w:spacing w:before="0" w:after="60" w:line="270" w:lineRule="atLeast"/>
+        <w:spacing w:before="0" w:after="0" w:line="270" w:lineRule="atLeast"/>
         <w:ind w:left="283" w:hanging="283"/>
         <w:jc w:val="left"/>
       </w:pPr>
@@ -11620,7 +11613,7 @@
       <w:pPr>
         <w:pStyle w:val="Normal"/>
         <w:widowControl/>
-        <w:spacing w:before="0" w:after="60" w:line="270" w:lineRule="atLeast"/>
+        <w:spacing w:before="0" w:after="0" w:line="270" w:lineRule="atLeast"/>
         <w:ind w:left="283" w:hanging="283"/>
         <w:jc w:val="left"/>
       </w:pPr>
@@ -11635,7 +11628,7 @@
       <w:pPr>
         <w:pStyle w:val="Normal"/>
         <w:widowControl/>
-        <w:spacing w:before="0" w:after="60" w:line="270" w:lineRule="atLeast"/>
+        <w:spacing w:before="0" w:after="0" w:line="270" w:lineRule="atLeast"/>
         <w:ind w:left="283" w:hanging="283"/>
         <w:jc w:val="left"/>
       </w:pPr>
@@ -11650,7 +11643,7 @@
       <w:pPr>
         <w:pStyle w:val="Normal"/>
         <w:widowControl/>
-        <w:spacing w:before="0" w:after="60" w:line="270" w:lineRule="atLeast"/>
+        <w:spacing w:before="0" w:after="0" w:line="270" w:lineRule="atLeast"/>
         <w:ind w:left="283" w:hanging="283"/>
         <w:jc w:val="left"/>
       </w:pPr>
@@ -11665,7 +11658,7 @@
       <w:pPr>
         <w:pStyle w:val="Normal"/>
         <w:widowControl/>
-        <w:spacing w:before="0" w:after="60" w:line="270" w:lineRule="atLeast"/>
+        <w:spacing w:before="0" w:after="0" w:line="270" w:lineRule="atLeast"/>
         <w:ind w:left="283" w:hanging="283"/>
         <w:jc w:val="left"/>
       </w:pPr>
@@ -11680,7 +11673,7 @@
       <w:pPr>
         <w:pStyle w:val="Normal"/>
         <w:widowControl/>
-        <w:spacing w:before="0" w:after="60" w:line="270" w:lineRule="atLeast"/>
+        <w:spacing w:before="0" w:after="0" w:line="270" w:lineRule="atLeast"/>
         <w:ind w:left="283" w:hanging="283"/>
         <w:jc w:val="left"/>
       </w:pPr>
@@ -11695,7 +11688,7 @@
       <w:pPr>
         <w:pStyle w:val="Normal"/>
         <w:widowControl/>
-        <w:spacing w:before="0" w:after="60" w:line="270" w:lineRule="atLeast"/>
+        <w:spacing w:before="0" w:after="0" w:line="270" w:lineRule="atLeast"/>
         <w:ind w:left="283" w:hanging="283"/>
         <w:jc w:val="left"/>
       </w:pPr>
@@ -11710,7 +11703,7 @@
       <w:pPr>
         <w:pStyle w:val="Normal"/>
         <w:widowControl/>
-        <w:spacing w:before="0" w:after="60" w:line="270" w:lineRule="atLeast"/>
+        <w:spacing w:before="0" w:after="0" w:line="270" w:lineRule="atLeast"/>
         <w:ind w:left="283" w:hanging="283"/>
         <w:jc w:val="left"/>
       </w:pPr>
@@ -11725,7 +11718,7 @@
       <w:pPr>
         <w:pStyle w:val="Normal"/>
         <w:widowControl/>
-        <w:spacing w:before="0" w:after="60" w:line="270" w:lineRule="atLeast"/>
+        <w:spacing w:before="0" w:after="0" w:line="270" w:lineRule="atLeast"/>
         <w:ind w:left="283" w:hanging="283"/>
         <w:jc w:val="left"/>
       </w:pPr>
@@ -11740,7 +11733,7 @@
       <w:pPr>
         <w:pStyle w:val="Normal"/>
         <w:widowControl/>
-        <w:spacing w:before="0" w:after="60" w:line="270" w:lineRule="atLeast"/>
+        <w:spacing w:before="0" w:after="0" w:line="270" w:lineRule="atLeast"/>
         <w:ind w:left="283" w:hanging="283"/>
         <w:jc w:val="left"/>
       </w:pPr>
@@ -11755,7 +11748,7 @@
       <w:pPr>
         <w:pStyle w:val="Normal"/>
         <w:widowControl/>
-        <w:spacing w:before="0" w:after="60" w:line="270" w:lineRule="atLeast"/>
+        <w:spacing w:before="0" w:after="0" w:line="270" w:lineRule="atLeast"/>
         <w:ind w:left="283" w:hanging="283"/>
         <w:jc w:val="left"/>
       </w:pPr>
@@ -11770,7 +11763,7 @@
       <w:pPr>
         <w:pStyle w:val="Normal"/>
         <w:widowControl/>
-        <w:spacing w:before="0" w:after="60" w:line="270" w:lineRule="atLeast"/>
+        <w:spacing w:before="0" w:after="0" w:line="270" w:lineRule="atLeast"/>
         <w:ind w:left="283" w:hanging="283"/>
         <w:jc w:val="left"/>
       </w:pPr>
@@ -11785,7 +11778,7 @@
       <w:pPr>
         <w:pStyle w:val="Normal"/>
         <w:widowControl/>
-        <w:spacing w:before="0" w:after="60" w:line="270" w:lineRule="atLeast"/>
+        <w:spacing w:before="0" w:after="0" w:line="270" w:lineRule="atLeast"/>
         <w:ind w:left="283" w:hanging="283"/>
         <w:jc w:val="left"/>
       </w:pPr>
@@ -11800,7 +11793,7 @@
       <w:pPr>
         <w:pStyle w:val="Normal"/>
         <w:widowControl/>
-        <w:spacing w:before="0" w:after="60" w:line="270" w:lineRule="atLeast"/>
+        <w:spacing w:before="0" w:after="0" w:line="270" w:lineRule="atLeast"/>
         <w:ind w:left="283" w:hanging="283"/>
         <w:jc w:val="left"/>
       </w:pPr>
@@ -11815,7 +11808,7 @@
       <w:pPr>
         <w:pStyle w:val="Normal"/>
         <w:widowControl/>
-        <w:spacing w:before="0" w:after="60" w:line="270" w:lineRule="atLeast"/>
+        <w:spacing w:before="0" w:after="0" w:line="270" w:lineRule="atLeast"/>
         <w:ind w:left="283" w:hanging="283"/>
         <w:jc w:val="left"/>
       </w:pPr>
@@ -11830,7 +11823,7 @@
       <w:pPr>
         <w:pStyle w:val="Normal"/>
         <w:widowControl/>
-        <w:spacing w:before="0" w:after="60" w:line="270" w:lineRule="atLeast"/>
+        <w:spacing w:before="0" w:after="0" w:line="270" w:lineRule="atLeast"/>
         <w:ind w:left="283" w:hanging="283"/>
         <w:jc w:val="left"/>
       </w:pPr>
@@ -11845,7 +11838,7 @@
       <w:pPr>
         <w:pStyle w:val="Normal"/>
         <w:widowControl/>
-        <w:spacing w:before="0" w:after="60" w:line="270" w:lineRule="atLeast"/>
+        <w:spacing w:before="0" w:after="0" w:line="270" w:lineRule="atLeast"/>
         <w:ind w:left="283" w:hanging="283"/>
         <w:jc w:val="left"/>
       </w:pPr>
@@ -11860,7 +11853,7 @@
       <w:pPr>
         <w:pStyle w:val="Normal"/>
         <w:widowControl/>
-        <w:spacing w:before="0" w:after="60" w:line="270" w:lineRule="atLeast"/>
+        <w:spacing w:before="0" w:after="0" w:line="270" w:lineRule="atLeast"/>
         <w:ind w:left="283" w:hanging="283"/>
         <w:jc w:val="left"/>
       </w:pPr>
@@ -11875,7 +11868,7 @@
       <w:pPr>
         <w:pStyle w:val="Normal"/>
         <w:widowControl/>
-        <w:spacing w:before="0" w:after="60" w:line="270" w:lineRule="atLeast"/>
+        <w:spacing w:before="0" w:after="0" w:line="270" w:lineRule="atLeast"/>
         <w:ind w:left="283" w:hanging="283"/>
         <w:jc w:val="left"/>
       </w:pPr>
@@ -11890,7 +11883,7 @@
       <w:pPr>
         <w:pStyle w:val="Normal"/>
         <w:widowControl/>
-        <w:spacing w:before="0" w:after="60" w:line="270" w:lineRule="atLeast"/>
+        <w:spacing w:before="0" w:after="0" w:line="270" w:lineRule="atLeast"/>
         <w:ind w:left="283" w:hanging="283"/>
         <w:jc w:val="left"/>
       </w:pPr>
@@ -11905,7 +11898,7 @@
       <w:pPr>
         <w:pStyle w:val="Normal"/>
         <w:widowControl/>
-        <w:spacing w:before="0" w:after="60" w:line="270" w:lineRule="atLeast"/>
+        <w:spacing w:before="0" w:after="0" w:line="270" w:lineRule="atLeast"/>
         <w:ind w:left="283" w:hanging="283"/>
         <w:jc w:val="left"/>
       </w:pPr>
@@ -11920,7 +11913,7 @@
       <w:pPr>
         <w:pStyle w:val="Normal"/>
         <w:widowControl/>
-        <w:spacing w:before="0" w:after="60" w:line="270" w:lineRule="atLeast"/>
+        <w:spacing w:before="0" w:after="0" w:line="270" w:lineRule="atLeast"/>
         <w:ind w:left="283" w:hanging="283"/>
         <w:jc w:val="left"/>
       </w:pPr>
@@ -11935,7 +11928,7 @@
       <w:pPr>
         <w:pStyle w:val="Normal"/>
         <w:widowControl/>
-        <w:spacing w:before="0" w:after="60" w:line="270" w:lineRule="atLeast"/>
+        <w:spacing w:before="0" w:after="0" w:line="270" w:lineRule="atLeast"/>
         <w:ind w:left="283" w:hanging="283"/>
         <w:jc w:val="left"/>
       </w:pPr>
@@ -11950,7 +11943,7 @@
       <w:pPr>
         <w:pStyle w:val="Normal"/>
         <w:widowControl/>
-        <w:spacing w:before="0" w:after="60" w:line="270" w:lineRule="atLeast"/>
+        <w:spacing w:before="0" w:after="0" w:line="270" w:lineRule="atLeast"/>
         <w:ind w:left="283" w:hanging="283"/>
         <w:jc w:val="left"/>
       </w:pPr>
@@ -11965,7 +11958,7 @@
       <w:pPr>
         <w:pStyle w:val="Normal"/>
         <w:widowControl/>
-        <w:spacing w:before="0" w:after="60" w:line="270" w:lineRule="atLeast"/>
+        <w:spacing w:before="0" w:after="0" w:line="270" w:lineRule="atLeast"/>
         <w:ind w:left="283" w:hanging="283"/>
         <w:jc w:val="left"/>
       </w:pPr>
@@ -11980,7 +11973,7 @@
       <w:pPr>
         <w:pStyle w:val="Normal"/>
         <w:widowControl/>
-        <w:spacing w:before="0" w:after="60" w:line="270" w:lineRule="atLeast"/>
+        <w:spacing w:before="0" w:after="0" w:line="270" w:lineRule="atLeast"/>
         <w:ind w:left="283" w:hanging="283"/>
         <w:jc w:val="left"/>
       </w:pPr>
@@ -11995,7 +11988,7 @@
       <w:pPr>
         <w:pStyle w:val="Normal"/>
         <w:widowControl/>
-        <w:spacing w:before="0" w:after="60" w:line="270" w:lineRule="atLeast"/>
+        <w:spacing w:before="0" w:after="0" w:line="270" w:lineRule="atLeast"/>
         <w:ind w:left="283" w:hanging="283"/>
         <w:jc w:val="left"/>
       </w:pPr>
@@ -12010,7 +12003,7 @@
       <w:pPr>
         <w:pStyle w:val="Normal"/>
         <w:widowControl/>
-        <w:spacing w:before="0" w:after="60" w:line="270" w:lineRule="atLeast"/>
+        <w:spacing w:before="0" w:after="0" w:line="270" w:lineRule="atLeast"/>
         <w:ind w:left="283" w:hanging="283"/>
         <w:jc w:val="left"/>
       </w:pPr>
@@ -12025,7 +12018,7 @@
       <w:pPr>
         <w:pStyle w:val="Normal"/>
         <w:widowControl/>
-        <w:spacing w:before="0" w:after="60" w:line="270" w:lineRule="atLeast"/>
+        <w:spacing w:before="0" w:after="0" w:line="270" w:lineRule="atLeast"/>
         <w:ind w:left="283" w:hanging="283"/>
         <w:jc w:val="left"/>
       </w:pPr>
@@ -12040,7 +12033,7 @@
       <w:pPr>
         <w:pStyle w:val="Normal"/>
         <w:widowControl/>
-        <w:spacing w:before="0" w:after="60" w:line="270" w:lineRule="atLeast"/>
+        <w:spacing w:before="0" w:after="0" w:line="270" w:lineRule="atLeast"/>
         <w:ind w:left="283" w:hanging="283"/>
         <w:jc w:val="left"/>
       </w:pPr>
@@ -12055,7 +12048,7 @@
       <w:pPr>
         <w:pStyle w:val="Normal"/>
         <w:widowControl/>
-        <w:spacing w:before="0" w:after="60" w:line="270" w:lineRule="atLeast"/>
+        <w:spacing w:before="0" w:after="0" w:line="270" w:lineRule="atLeast"/>
         <w:ind w:left="283" w:hanging="283"/>
         <w:jc w:val="left"/>
       </w:pPr>
@@ -12070,7 +12063,7 @@
       <w:pPr>
         <w:pStyle w:val="Normal"/>
         <w:widowControl/>
-        <w:spacing w:before="0" w:after="60" w:line="270" w:lineRule="atLeast"/>
+        <w:spacing w:before="0" w:after="0" w:line="270" w:lineRule="atLeast"/>
         <w:ind w:left="283" w:hanging="283"/>
         <w:jc w:val="left"/>
       </w:pPr>
@@ -12417,14 +12410,14 @@
     <w:rPrDefault>
       <w:rPr>
         <w:rFonts w:ascii="Liberation Serif" w:cs="Noto Sans" w:eastAsia="Linux Libertine G" w:hAnsi="Liberation Serif"/>
-        <w:sz w:val="24"/>
-        <w:szCs w:val="24"/>
+        <w:sz w:val="18"/>
+        <w:szCs w:val="18"/>
         <w:lang w:bidi="hi-IN" w:eastAsia="zh-CN" w:val="vi-VN"/>
       </w:rPr>
     </w:rPrDefault>
     <w:pPrDefault>
       <w:pPr>
-        <w:suppressAutoHyphens w:val="true"/>
+        <w:suppressAutoHyphens w:val="false"/>
       </w:pPr>
     </w:pPrDefault>
   </w:docDefaults>

</xml_diff>